<commit_message>
Your First YouTube Channel That Rocks: Ch 10 VII adds disclosure-is-not-ownership paragraph (human authorship, Thaler v. Perlmutter) + sources
</commit_message>
<xml_diff>
--- a/Your First YouTube Channel That Rocks/Your First YouTube Channel That Rocks.docx
+++ b/Your First YouTube Channel That Rocks/Your First YouTube Channel That Rocks.docx
@@ -14065,6 +14065,27 @@
       </w:r>
     </w:p>
     <w:p>
+      <w:r>
+        <w:rPr>
+          <w:rFonts w:ascii="Calibri" w:hAnsi="Calibri"/>
+        </w:rPr>
+        <w:t xml:space="preserve">A disclosure settles what the viewer is told. It does not settle who owns the words. In the United States, copyright needs a human author: the U.S. Court of Appeals for the D.C. Circuit held so in </w:t>
+      </w:r>
+      <w:r>
+        <w:rPr>
+          <w:rFonts w:ascii="Calibri" w:hAnsi="Calibri"/>
+          <w:i/>
+        </w:rPr>
+        <w:t>Thaler v. Perlmutter</w:t>
+      </w:r>
+      <w:r>
+        <w:rPr>
+          <w:rFonts w:ascii="Calibri" w:hAnsi="Calibri"/>
+        </w:rPr>
+        <w:t xml:space="preserve"> in March 2025, and the Supreme Court declined to review that ruling on March 2, 2026. A tool’s terms may say a generated script is yours to use. That is permission, not ownership. A script an assistant wrote, read out word for word, is yours to perform and nobody’s to own, and another channel could reuse the same sentences. The lines you wrote yourself, and your own creative rewrites of a draft, are protected as usual, and so are the delivery, the edit, and the footage you shot. The practical rule is the one this chapter keeps arriving at: put your own explanation on the track. It is what the inauthentic-content policy in §VIII rewards, and it is the only part of a script anyone can be stopped from copying.</w:t>
+      </w:r>
+    </w:p>
+    <w:p>
       <w:bookmarkStart w:id="86" w:name="toc85"/>
       <w:pPr>
         <w:pStyle w:val="Heading2"/>
@@ -14858,7 +14879,7 @@
           <w:rFonts w:ascii="Calibri" w:hAnsi="Calibri"/>
           <w:i/>
         </w:rPr>
-        <w:t>. Spam, fake engagement, and external-link rules are from the policy pages linked in §II. Checked October 2026. Not legal advice and not an official YouTube publication.</w:t>
+        <w:t>. The human-authorship rule is from Thaler v. Perlmutter, 130 F.4th 1039 (D.C. Cir. 2025), cert. denied (U.S. Mar. 2, 2026), and the U.S. Copyright Office’s Copyright and Artificial Intelligence, Part 2: Copyrightability (January 2025). Spam, fake engagement, and external-link rules are from the policy pages linked in §II. Checked October 2026. Not legal advice and not an official YouTube publication.</w:t>
       </w:r>
     </w:p>
     <w:p>

</xml_diff>

<commit_message>
YouTube book: add h3h3Productions and Ali Abdaal case studies, rebuild docx
Hosseinzadeh v. Klein fair-use ruling in the copyright-strikes section of
chapter 10; Abdaal's own disclosed sponsor-timing figures in chapter 13.
Both sourced and disclosed per the verification standard noted in
notes/_STATUS.md.

Co-Authored-By: Claude Sonnet 5 <noreply@anthropic.com>
Claude-Session: https://claude.ai/code/session_01SRhcHKTsmWne9LTaP7asUs
</commit_message>
<xml_diff>
--- a/Your First YouTube Channel That Rocks/Your First YouTube Channel That Rocks.docx
+++ b/Your First YouTube Channel That Rocks/Your First YouTube Channel That Rocks.docx
@@ -13731,6 +13731,59 @@
         <w:t xml:space="preserve"> A legal statement that the removal was a mistake, or that the use qualifies as an exception such as fair use. YouTube says it cannot decide ownership or mediate between you and the rights holder. A counter notification is a legal step. Treat it as one.</w:t>
       </w:r>
     </w:p>
+    <w:tbl>
+      <w:tblPr>
+        <w:tblW w:type="auto" w:w="0"/>
+        <w:tblLayout w:type="fixed"/>
+        <w:tblLook w:firstColumn="1" w:firstRow="1" w:lastColumn="0" w:lastRow="0" w:noHBand="0" w:noVBand="1" w:val="04A0"/>
+      </w:tblPr>
+      <w:tblGrid>
+        <w:gridCol w:w="8064"/>
+      </w:tblGrid>
+      <w:tr>
+        <w:tc>
+          <w:tcPr>
+            <w:tcW w:type="dxa" w:w="8064"/>
+            <w:tcW w:w="8063" w:type="dxa"/>
+            <w:shd w:val="clear" w:color="auto" w:fill="F3F1EA"/>
+          </w:tcPr>
+          <w:p>
+            <w:pPr>
+              <w:spacing w:after="40" w:before="40"/>
+            </w:pPr>
+            <w:r>
+              <w:rPr>
+                <w:rFonts w:ascii="Calibri" w:hAnsi="Calibri"/>
+                <w:sz w:val="22"/>
+              </w:rPr>
+            </w:r>
+            <w:r>
+              <w:rPr>
+                <w:rFonts w:ascii="Calibri" w:hAnsi="Calibri"/>
+                <w:sz w:val="22"/>
+              </w:rPr>
+              <w:t xml:space="preserve">Case study: In 2015, Ethan and Hila Klein’s channel, h3h3Productions, posted a reaction video responding to a short film by another creator, Matt Hosseinzadeh, playing short portions of it between their own commentary. Hosseinzadeh skipped YouTube’s copyright process and sued the Kleins directly in federal court for infringement. In August 2017, after roughly a year and a half of litigation, the US District Court for the Southern District of New York ruled for the Kleins on summary judgment in </w:t>
+            </w:r>
+            <w:r>
+              <w:rPr>
+                <w:rFonts w:ascii="Calibri" w:hAnsi="Calibri"/>
+                <w:i/>
+                <w:sz w:val="22"/>
+              </w:rPr>
+              <w:t>Hosseinzadeh v. Klein</w:t>
+            </w:r>
+            <w:r>
+              <w:rPr>
+                <w:rFonts w:ascii="Calibri" w:hAnsi="Calibri"/>
+                <w:sz w:val="22"/>
+              </w:rPr>
+              <w:t>, finding their use fair as a matter of law because the video was, in the court’s words, quintessential criticism and comment. A counter notification or a fair-use defense can win. Reaching that answer in this case took eighteen months and real legal fees, not a form in Studio.</w:t>
+            </w:r>
+          </w:p>
+        </w:tc>
+      </w:tr>
+    </w:tbl>
+    <w:p/>
     <w:p>
       <w:r>
         <w:rPr>
@@ -14730,6 +14783,71 @@
           <w:rFonts w:ascii="Calibri" w:hAnsi="Calibri"/>
           <w:i/>
         </w:rPr>
+        <w:t xml:space="preserve">. The h3h3Productions case study is </w:t>
+      </w:r>
+      <w:r>
+        <w:rPr>
+          <w:rFonts w:ascii="Calibri" w:hAnsi="Calibri"/>
+          <w:i/>
+        </w:rPr>
+        <w:t>Hosseinzadeh v. Klein</w:t>
+      </w:r>
+      <w:r>
+        <w:rPr>
+          <w:rFonts w:ascii="Calibri" w:hAnsi="Calibri"/>
+          <w:i/>
+        </w:rPr>
+        <w:t xml:space="preserve">, 276 F. Supp. 3d 34 (S.D.N.Y. 2017); the ruling date, the quoted holding, and the case background are corroborated across the </w:t>
+      </w:r>
+      <w:hyperlink r:id="rId124">
+        <w:r>
+          <w:rPr>
+            <w:rStyle w:val="Hyperlink"/>
+            <w:sz w:val="22"/>
+            <w:rFonts w:ascii="Calibri" w:hAnsi="Calibri"/>
+          </w:rPr>
+          <w:t xml:space="preserve">US Copyright Office’s own fair-use case summary</w:t>
+        </w:r>
+      </w:hyperlink>
+      <w:r>
+        <w:rPr>
+          <w:rFonts w:ascii="Calibri" w:hAnsi="Calibri"/>
+          <w:i/>
+        </w:rPr>
+        <w:t xml:space="preserve"> and independent legal reporting at the time, including </w:t>
+      </w:r>
+      <w:hyperlink r:id="rId125">
+        <w:r>
+          <w:rPr>
+            <w:rStyle w:val="Hyperlink"/>
+            <w:sz w:val="22"/>
+            <w:rFonts w:ascii="Calibri" w:hAnsi="Calibri"/>
+          </w:rPr>
+          <w:t xml:space="preserve">Plagiarism Today</w:t>
+        </w:r>
+      </w:hyperlink>
+      <w:r>
+        <w:rPr>
+          <w:rFonts w:ascii="Calibri" w:hAnsi="Calibri"/>
+          <w:i/>
+        </w:rPr>
+        <w:t xml:space="preserve"> and a law firm client alert from </w:t>
+      </w:r>
+      <w:hyperlink r:id="rId126">
+        <w:r>
+          <w:rPr>
+            <w:rStyle w:val="Hyperlink"/>
+            <w:sz w:val="22"/>
+            <w:rFonts w:ascii="Calibri" w:hAnsi="Calibri"/>
+          </w:rPr>
+          <w:t xml:space="preserve">Loeb &amp; Loeb</w:t>
+        </w:r>
+      </w:hyperlink>
+      <w:r>
+        <w:rPr>
+          <w:rFonts w:ascii="Calibri" w:hAnsi="Calibri"/>
+          <w:i/>
+        </w:rPr>
         <w:t xml:space="preserve">. Content ID claim policies and the Shorts blocking rule are from </w:t>
       </w:r>
       <w:hyperlink r:id="rId115">
@@ -14885,7 +15003,7 @@
         </w:rPr>
         <w:t xml:space="preserve">. The FTC’s </w:t>
       </w:r>
-      <w:hyperlink r:id="rId124">
+      <w:hyperlink r:id="rId127">
         <w:r>
           <w:rPr>
             <w:rStyle w:val="Hyperlink"/>
@@ -14902,7 +15020,7 @@
         </w:rPr>
         <w:t xml:space="preserve"> and </w:t>
       </w:r>
-      <w:hyperlink r:id="rId125">
+      <w:hyperlink r:id="rId128">
         <w:r>
           <w:rPr>
             <w:rStyle w:val="Hyperlink"/>
@@ -15004,7 +15122,7 @@
       </w:r>
     </w:p>
     <w:p>
-      <w:hyperlink r:id="rId128">
+      <w:hyperlink r:id="rId131">
         <w:r>
           <w:rPr>
             <w:rStyle w:val="Hyperlink"/>
@@ -15612,7 +15730,7 @@
         </w:rPr>
         <w:t xml:space="preserve">Shorts ads run between videos in the Shorts feed, not beside one video, so YouTube pools them. </w:t>
       </w:r>
-      <w:hyperlink r:id="rId129">
+      <w:hyperlink r:id="rId132">
         <w:r>
           <w:rPr>
             <w:rStyle w:val="Hyperlink"/>
@@ -16022,7 +16140,7 @@
         </w:rPr>
         <w:t xml:space="preserve">Sources: Ad formats, mid-rolls, and Watch While ads are from </w:t>
       </w:r>
-      <w:hyperlink r:id="rId128">
+      <w:hyperlink r:id="rId131">
         <w:r>
           <w:rPr>
             <w:rStyle w:val="Hyperlink"/>
@@ -16090,7 +16208,7 @@
         </w:rPr>
         <w:t xml:space="preserve">. The 55% long-form share is from YouTube’s </w:t>
       </w:r>
-      <w:hyperlink r:id="rId130">
+      <w:hyperlink r:id="rId133">
         <w:r>
           <w:rPr>
             <w:rStyle w:val="Hyperlink"/>
@@ -16124,7 +16242,7 @@
         </w:rPr>
         <w:t xml:space="preserve">. The Shorts Creator Pool, its example, the module date, ineligible views, and targeted Shorts ads are from </w:t>
       </w:r>
-      <w:hyperlink r:id="rId129">
+      <w:hyperlink r:id="rId132">
         <w:r>
           <w:rPr>
             <w:rStyle w:val="Hyperlink"/>
@@ -16145,8 +16263,8 @@
     <w:p>
       <w:pPr>
         <w:sectPr>
-          <w:headerReference w:type="default" r:id="rId126"/>
-          <w:footerReference w:type="default" r:id="rId127"/>
+          <w:headerReference w:type="default" r:id="rId129"/>
+          <w:footerReference w:type="default" r:id="rId130"/>
           <w:pgSz w:w="10080" w:h="14400"/>
           <w:pgMar w:top="1008" w:right="1008" w:bottom="1008" w:left="1008" w:header="504" w:footer="504" w:gutter="0"/>
           <w:cols w:space="720"/>
@@ -16201,7 +16319,7 @@
       <w:bookmarkEnd w:id="100"/>
     </w:p>
     <w:p>
-      <w:hyperlink r:id="rId133">
+      <w:hyperlink r:id="rId136">
         <w:r>
           <w:rPr>
             <w:rStyle w:val="Hyperlink"/>
@@ -16295,7 +16413,7 @@
         </w:rPr>
         <w:t xml:space="preserve">A membership is a monthly payment from a viewer in return for perks you choose. </w:t>
       </w:r>
-      <w:hyperlink r:id="rId134">
+      <w:hyperlink r:id="rId137">
         <w:r>
           <w:rPr>
             <w:rStyle w:val="Hyperlink"/>
@@ -16319,7 +16437,7 @@
         </w:rPr>
         <w:t xml:space="preserve">The structure, from </w:t>
       </w:r>
-      <w:hyperlink r:id="rId135">
+      <w:hyperlink r:id="rId138">
         <w:r>
           <w:rPr>
             <w:rStyle w:val="Hyperlink"/>
@@ -16368,7 +16486,7 @@
         </w:rPr>
         <w:t xml:space="preserve">Prices come from a fixed list for each country. </w:t>
       </w:r>
-      <w:hyperlink r:id="rId136">
+      <w:hyperlink r:id="rId139">
         <w:r>
           <w:rPr>
             <w:rStyle w:val="Hyperlink"/>
@@ -16437,7 +16555,7 @@
         </w:rPr>
         <w:t xml:space="preserve">These two belong to live: live streams and premieres with live chat turned on. A viewer pays to highlight a message in the chat, or to send an animated sticker. </w:t>
       </w:r>
-      <w:hyperlink r:id="rId137">
+      <w:hyperlink r:id="rId140">
         <w:r>
           <w:rPr>
             <w:rStyle w:val="Hyperlink"/>
@@ -16455,7 +16573,7 @@
       </w:r>
     </w:p>
     <w:p>
-      <w:hyperlink r:id="rId138">
+      <w:hyperlink r:id="rId141">
         <w:r>
           <w:rPr>
             <w:rStyle w:val="Hyperlink"/>
@@ -16513,7 +16631,7 @@
         </w:rPr>
         <w:t xml:space="preserve">Super Thanks is the one fan-funding feature that does not need you live. A viewer buys a one-time animation on a long-form video or a Short and gets a highlighted comment in the comments section. </w:t>
       </w:r>
-      <w:hyperlink r:id="rId139">
+      <w:hyperlink r:id="rId142">
         <w:r>
           <w:rPr>
             <w:rStyle w:val="Hyperlink"/>
@@ -16553,7 +16671,7 @@
         </w:rPr>
         <w:t xml:space="preserve">YouTube’s </w:t>
       </w:r>
-      <w:hyperlink r:id="rId140">
+      <w:hyperlink r:id="rId143">
         <w:r>
           <w:rPr>
             <w:rStyle w:val="Hyperlink"/>
@@ -16780,7 +16898,7 @@
         </w:rPr>
         <w:t xml:space="preserve">Sources: Minimum requirements and the four features are from </w:t>
       </w:r>
-      <w:hyperlink r:id="rId133">
+      <w:hyperlink r:id="rId136">
         <w:r>
           <w:rPr>
             <w:rStyle w:val="Hyperlink"/>
@@ -16797,7 +16915,7 @@
         </w:rPr>
         <w:t xml:space="preserve">. Membership eligibility, banned perks, and paused mode are from </w:t>
       </w:r>
-      <w:hyperlink r:id="rId134">
+      <w:hyperlink r:id="rId137">
         <w:r>
           <w:rPr>
             <w:rStyle w:val="Hyperlink"/>
@@ -16814,7 +16932,7 @@
         </w:rPr>
         <w:t xml:space="preserve">; levels and perks from </w:t>
       </w:r>
-      <w:hyperlink r:id="rId135">
+      <w:hyperlink r:id="rId138">
         <w:r>
           <w:rPr>
             <w:rStyle w:val="Hyperlink"/>
@@ -16831,7 +16949,7 @@
         </w:rPr>
         <w:t xml:space="preserve">; US prices from </w:t>
       </w:r>
-      <w:hyperlink r:id="rId136">
+      <w:hyperlink r:id="rId139">
         <w:r>
           <w:rPr>
             <w:rStyle w:val="Hyperlink"/>
@@ -16848,7 +16966,7 @@
         </w:rPr>
         <w:t xml:space="preserve">; the 70% share from </w:t>
       </w:r>
-      <w:hyperlink r:id="rId141">
+      <w:hyperlink r:id="rId144">
         <w:r>
           <w:rPr>
             <w:rStyle w:val="Hyperlink"/>
@@ -16865,7 +16983,7 @@
         </w:rPr>
         <w:t xml:space="preserve"> and the pricing guidance from </w:t>
       </w:r>
-      <w:hyperlink r:id="rId142">
+      <w:hyperlink r:id="rId145">
         <w:r>
           <w:rPr>
             <w:rStyle w:val="Hyperlink"/>
@@ -16882,7 +17000,7 @@
         </w:rPr>
         <w:t xml:space="preserve">. Super Chat and Super Stickers rules and the 70% share are from </w:t>
       </w:r>
-      <w:hyperlink r:id="rId137">
+      <w:hyperlink r:id="rId140">
         <w:r>
           <w:rPr>
             <w:rStyle w:val="Hyperlink"/>
@@ -16899,7 +17017,7 @@
         </w:rPr>
         <w:t xml:space="preserve"> and </w:t>
       </w:r>
-      <w:hyperlink r:id="rId138">
+      <w:hyperlink r:id="rId141">
         <w:r>
           <w:rPr>
             <w:rStyle w:val="Hyperlink"/>
@@ -16916,7 +17034,7 @@
         </w:rPr>
         <w:t xml:space="preserve">. Super Thanks rules and its 70% share are from </w:t>
       </w:r>
-      <w:hyperlink r:id="rId139">
+      <w:hyperlink r:id="rId142">
         <w:r>
           <w:rPr>
             <w:rStyle w:val="Hyperlink"/>
@@ -16933,7 +17051,7 @@
         </w:rPr>
         <w:t xml:space="preserve"> and </w:t>
       </w:r>
-      <w:hyperlink r:id="rId143">
+      <w:hyperlink r:id="rId146">
         <w:r>
           <w:rPr>
             <w:rStyle w:val="Hyperlink"/>
@@ -16950,7 +17068,7 @@
         </w:rPr>
         <w:t xml:space="preserve">; the tips from </w:t>
       </w:r>
-      <w:hyperlink r:id="rId140">
+      <w:hyperlink r:id="rId143">
         <w:r>
           <w:rPr>
             <w:rStyle w:val="Hyperlink"/>
@@ -16971,8 +17089,8 @@
     <w:p>
       <w:pPr>
         <w:sectPr>
-          <w:headerReference w:type="default" r:id="rId131"/>
-          <w:footerReference w:type="default" r:id="rId132"/>
+          <w:headerReference w:type="default" r:id="rId134"/>
+          <w:footerReference w:type="default" r:id="rId135"/>
           <w:pgSz w:w="10080" w:h="14400"/>
           <w:pgMar w:top="1008" w:right="1008" w:bottom="1008" w:left="1008" w:header="504" w:footer="504" w:gutter="0"/>
           <w:cols w:space="720"/>
@@ -17042,6 +17160,44 @@
         <w:t>That is why a small channel with a precise viewer can be worth more to the right sponsor than a large channel with a vague one. It is also why the first sponsor usually arrives after the channel has a record: a sponsor will look at your recent videos, how many people watch each one, and who comments.</w:t>
       </w:r>
     </w:p>
+    <w:tbl>
+      <w:tblPr>
+        <w:tblW w:type="auto" w:w="0"/>
+        <w:tblLayout w:type="fixed"/>
+        <w:tblLook w:firstColumn="1" w:firstRow="1" w:lastColumn="0" w:lastRow="0" w:noHBand="0" w:noVBand="1" w:val="04A0"/>
+      </w:tblPr>
+      <w:tblGrid>
+        <w:gridCol w:w="8064"/>
+      </w:tblGrid>
+      <w:tr>
+        <w:tc>
+          <w:tcPr>
+            <w:tcW w:type="dxa" w:w="8064"/>
+            <w:tcW w:w="8063" w:type="dxa"/>
+            <w:shd w:val="clear" w:color="auto" w:fill="F3F1EA"/>
+          </w:tcPr>
+          <w:p>
+            <w:pPr>
+              <w:spacing w:after="40" w:before="40"/>
+            </w:pPr>
+            <w:r>
+              <w:rPr>
+                <w:rFonts w:ascii="Calibri" w:hAnsi="Calibri"/>
+                <w:sz w:val="22"/>
+              </w:rPr>
+            </w:r>
+            <w:r>
+              <w:rPr>
+                <w:rFonts w:ascii="Calibri" w:hAnsi="Calibri"/>
+                <w:sz w:val="22"/>
+              </w:rPr>
+              <w:t>Case study: Ali Abdaal, a doctor turned YouTuber, has said publicly that his first sponsored video came a full year after he started the channel — by which point he had posted nearly 150 videos and had around 50,000 subscribers. Fifty thousand subscribers is fifty times this book’s ad-gate threshold. The record a sponsor was waiting for was not the subscriber count. It was 150 videos of evidence about who watched and how.</w:t>
+            </w:r>
+          </w:p>
+        </w:tc>
+      </w:tr>
+    </w:tbl>
+    <w:p/>
     <w:p>
       <w:r>
         <w:rPr>
@@ -17122,7 +17278,7 @@
         </w:rPr>
         <w:t xml:space="preserve">YouTube runs its own matching tool between brands and creators. </w:t>
       </w:r>
-      <w:hyperlink r:id="rId146">
+      <w:hyperlink r:id="rId149">
         <w:r>
           <w:rPr>
             <w:rStyle w:val="Hyperlink"/>
@@ -17529,7 +17685,7 @@
         </w:rPr>
         <w:t xml:space="preserve">An </w:t>
       </w:r>
-      <w:hyperlink r:id="rId147">
+      <w:hyperlink r:id="rId150">
         <w:r>
           <w:rPr>
             <w:rStyle w:val="Hyperlink"/>
@@ -17579,7 +17735,7 @@
         </w:rPr>
         <w:t xml:space="preserve">YouTube also runs its own affiliate program, which lets a channel tag products from participating brands inside its videos and earn a commission on purchases. On </w:t>
       </w:r>
-      <w:hyperlink r:id="rId148">
+      <w:hyperlink r:id="rId151">
         <w:r>
           <w:rPr>
             <w:rStyle w:val="Hyperlink"/>
@@ -17597,7 +17753,7 @@
       </w:r>
     </w:p>
     <w:p>
-      <w:hyperlink r:id="rId149">
+      <w:hyperlink r:id="rId152">
         <w:r>
           <w:rPr>
             <w:rStyle w:val="Hyperlink"/>
@@ -17776,9 +17932,26 @@
           <w:rFonts w:ascii="Calibri" w:hAnsi="Calibri"/>
           <w:i/>
         </w:rPr>
-        <w:t xml:space="preserve">Sources: Creator Partnerships eligibility is from </w:t>
-      </w:r>
-      <w:hyperlink r:id="rId146">
+        <w:t xml:space="preserve">Sources: The Ali Abdaal case study is his own disclosed account, posted to his X (formerly Twitter) account </w:t>
+      </w:r>
+      <w:hyperlink r:id="rId153">
+        <w:r>
+          <w:rPr>
+            <w:rStyle w:val="Hyperlink"/>
+            <w:sz w:val="22"/>
+            <w:rFonts w:ascii="Calibri" w:hAnsi="Calibri"/>
+          </w:rPr>
+          <w:t xml:space="preserve">@AliAbdaal</w:t>
+        </w:r>
+      </w:hyperlink>
+      <w:r>
+        <w:rPr>
+          <w:rFonts w:ascii="Calibri" w:hAnsi="Calibri"/>
+          <w:i/>
+        </w:rPr>
+        <w:t xml:space="preserve">; this book could not fetch that post directly, so the figures are treated as the verification standard actually met — his own stated numbers, as indexed and quoted consistently by search results, not an independently audited record. Creator Partnerships eligibility is from </w:t>
+      </w:r>
+      <w:hyperlink r:id="rId149">
         <w:r>
           <w:rPr>
             <w:rStyle w:val="Hyperlink"/>
@@ -17846,7 +18019,7 @@
         </w:rPr>
         <w:t xml:space="preserve">; cards and end screens from </w:t>
       </w:r>
-      <w:hyperlink r:id="rId147">
+      <w:hyperlink r:id="rId150">
         <w:r>
           <w:rPr>
             <w:rStyle w:val="Hyperlink"/>
@@ -17897,7 +18070,7 @@
         </w:rPr>
         <w:t xml:space="preserve">. The Shopping affiliate threshold is from the </w:t>
       </w:r>
-      <w:hyperlink r:id="rId148">
+      <w:hyperlink r:id="rId151">
         <w:r>
           <w:rPr>
             <w:rStyle w:val="Hyperlink"/>
@@ -17914,7 +18087,7 @@
         </w:rPr>
         <w:t xml:space="preserve"> and its conditions from </w:t>
       </w:r>
-      <w:hyperlink r:id="rId149">
+      <w:hyperlink r:id="rId152">
         <w:r>
           <w:rPr>
             <w:rStyle w:val="Hyperlink"/>
@@ -17931,7 +18104,7 @@
         </w:rPr>
         <w:t xml:space="preserve">. US disclosure guidance is the FTC’s </w:t>
       </w:r>
-      <w:hyperlink r:id="rId124">
+      <w:hyperlink r:id="rId127">
         <w:r>
           <w:rPr>
             <w:rStyle w:val="Hyperlink"/>
@@ -17948,7 +18121,7 @@
         </w:rPr>
         <w:t xml:space="preserve"> and </w:t>
       </w:r>
-      <w:hyperlink r:id="rId125">
+      <w:hyperlink r:id="rId128">
         <w:r>
           <w:rPr>
             <w:rStyle w:val="Hyperlink"/>
@@ -17969,8 +18142,8 @@
     <w:p>
       <w:pPr>
         <w:sectPr>
-          <w:headerReference w:type="default" r:id="rId144"/>
-          <w:footerReference w:type="default" r:id="rId145"/>
+          <w:headerReference w:type="default" r:id="rId147"/>
+          <w:footerReference w:type="default" r:id="rId148"/>
           <w:pgSz w:w="10080" w:h="14400"/>
           <w:pgMar w:top="1008" w:right="1008" w:bottom="1008" w:left="1008" w:header="504" w:footer="504" w:gutter="0"/>
           <w:cols w:space="720"/>
@@ -18398,7 +18571,7 @@
                     <pic:cNvPicPr/>
                   </pic:nvPicPr>
                   <pic:blipFill>
-                    <a:blip r:embed="rId152"/>
+                    <a:blip r:embed="rId156"/>
                     <a:stretch>
                       <a:fillRect/>
                     </a:stretch>
@@ -18450,7 +18623,7 @@
       </w:r>
     </w:p>
     <w:p>
-      <w:hyperlink r:id="rId153">
+      <w:hyperlink r:id="rId157">
         <w:r>
           <w:rPr>
             <w:rStyle w:val="Hyperlink"/>
@@ -18475,7 +18648,7 @@
       </w:r>
     </w:p>
     <w:p>
-      <w:hyperlink r:id="rId154">
+      <w:hyperlink r:id="rId158">
         <w:r>
           <w:rPr>
             <w:rStyle w:val="Hyperlink"/>
@@ -18500,7 +18673,7 @@
       </w:r>
     </w:p>
     <w:p>
-      <w:hyperlink r:id="rId155">
+      <w:hyperlink r:id="rId159">
         <w:r>
           <w:rPr>
             <w:rStyle w:val="Hyperlink"/>
@@ -18525,7 +18698,7 @@
       </w:r>
     </w:p>
     <w:p>
-      <w:hyperlink r:id="rId156">
+      <w:hyperlink r:id="rId160">
         <w:r>
           <w:rPr>
             <w:rStyle w:val="Hyperlink"/>
@@ -18550,7 +18723,7 @@
       </w:r>
     </w:p>
     <w:p>
-      <w:hyperlink r:id="rId157">
+      <w:hyperlink r:id="rId161">
         <w:r>
           <w:rPr>
             <w:rStyle w:val="Hyperlink"/>
@@ -18575,7 +18748,7 @@
       </w:r>
     </w:p>
     <w:p>
-      <w:hyperlink r:id="rId158">
+      <w:hyperlink r:id="rId162">
         <w:r>
           <w:rPr>
             <w:rStyle w:val="Hyperlink"/>
@@ -18948,8 +19121,8 @@
     <w:p>
       <w:pPr>
         <w:sectPr>
-          <w:headerReference w:type="default" r:id="rId150"/>
-          <w:footerReference w:type="default" r:id="rId151"/>
+          <w:headerReference w:type="default" r:id="rId154"/>
+          <w:footerReference w:type="default" r:id="rId155"/>
           <w:pgSz w:w="10080" w:h="14400"/>
           <w:pgMar w:top="1008" w:right="1008" w:bottom="1008" w:left="1008" w:header="504" w:footer="504" w:gutter="0"/>
           <w:cols w:space="720"/>
@@ -19984,7 +20157,7 @@
         </w:rPr>
         <w:t xml:space="preserve">Sources: This workbook is editorial structure for the rest of this book. The bathroom-repair sheet and its money line are hypothetical illustrations, not a measured channel. The membership share is YouTube’s 70% after taxes and fees, from chapter 12. Affiliate disclosure follows chapter 13 and the FTC’s </w:t>
       </w:r>
-      <w:hyperlink r:id="rId124">
+      <w:hyperlink r:id="rId127">
         <w:r>
           <w:rPr>
             <w:rStyle w:val="Hyperlink"/>
@@ -20005,8 +20178,8 @@
     <w:p>
       <w:pPr>
         <w:sectPr>
-          <w:headerReference w:type="default" r:id="rId159"/>
-          <w:footerReference w:type="default" r:id="rId160"/>
+          <w:headerReference w:type="default" r:id="rId163"/>
+          <w:footerReference w:type="default" r:id="rId164"/>
           <w:pgSz w:w="10080" w:h="14400"/>
           <w:pgMar w:top="1008" w:right="1008" w:bottom="1008" w:left="1008" w:header="504" w:footer="504" w:gutter="0"/>
           <w:cols w:space="720"/>
@@ -20060,8 +20233,8 @@
     <w:p>
       <w:pPr>
         <w:sectPr>
-          <w:headerReference w:type="default" r:id="rId161"/>
-          <w:footerReference w:type="default" r:id="rId162"/>
+          <w:headerReference w:type="default" r:id="rId165"/>
+          <w:footerReference w:type="default" r:id="rId166"/>
           <w:pgSz w:w="10080" w:h="14400"/>
           <w:pgMar w:top="1008" w:right="1008" w:bottom="1008" w:left="1008" w:header="504" w:footer="504" w:gutter="0"/>
           <w:cols w:space="720"/>
@@ -20796,8 +20969,8 @@
     <w:p>
       <w:pPr>
         <w:sectPr>
-          <w:headerReference w:type="default" r:id="rId163"/>
-          <w:footerReference w:type="default" r:id="rId164"/>
+          <w:headerReference w:type="default" r:id="rId167"/>
+          <w:footerReference w:type="default" r:id="rId168"/>
           <w:pgSz w:w="10080" w:h="14400"/>
           <w:pgMar w:top="1008" w:right="1008" w:bottom="1008" w:left="1008" w:header="504" w:footer="504" w:gutter="0"/>
           <w:cols w:space="720"/>
@@ -21090,7 +21263,7 @@
         </w:rPr>
         <w:t xml:space="preserve">, </w:t>
       </w:r>
-      <w:hyperlink r:id="rId147">
+      <w:hyperlink r:id="rId150">
         <w:r>
           <w:rPr>
             <w:rStyle w:val="Hyperlink"/>
@@ -21140,7 +21313,7 @@
         </w:rPr>
         <w:t xml:space="preserve">, </w:t>
       </w:r>
-      <w:hyperlink r:id="rId130">
+      <w:hyperlink r:id="rId133">
         <w:r>
           <w:rPr>
             <w:rStyle w:val="Hyperlink"/>
@@ -21156,7 +21329,7 @@
         </w:rPr>
         <w:t xml:space="preserve">, </w:t>
       </w:r>
-      <w:hyperlink r:id="rId128">
+      <w:hyperlink r:id="rId131">
         <w:r>
           <w:rPr>
             <w:rStyle w:val="Hyperlink"/>
@@ -21188,7 +21361,7 @@
         </w:rPr>
         <w:t xml:space="preserve">, </w:t>
       </w:r>
-      <w:hyperlink r:id="rId129">
+      <w:hyperlink r:id="rId132">
         <w:r>
           <w:rPr>
             <w:rStyle w:val="Hyperlink"/>
@@ -21222,7 +21395,7 @@
       </w:r>
     </w:p>
     <w:p>
-      <w:hyperlink r:id="rId133">
+      <w:hyperlink r:id="rId136">
         <w:r>
           <w:rPr>
             <w:rStyle w:val="Hyperlink"/>
@@ -21238,7 +21411,7 @@
         </w:rPr>
         <w:t xml:space="preserve">, </w:t>
       </w:r>
-      <w:hyperlink r:id="rId134">
+      <w:hyperlink r:id="rId137">
         <w:r>
           <w:rPr>
             <w:rStyle w:val="Hyperlink"/>
@@ -21254,7 +21427,7 @@
         </w:rPr>
         <w:t xml:space="preserve">, </w:t>
       </w:r>
-      <w:hyperlink r:id="rId135">
+      <w:hyperlink r:id="rId138">
         <w:r>
           <w:rPr>
             <w:rStyle w:val="Hyperlink"/>
@@ -21270,7 +21443,7 @@
         </w:rPr>
         <w:t xml:space="preserve">, </w:t>
       </w:r>
-      <w:hyperlink r:id="rId136">
+      <w:hyperlink r:id="rId139">
         <w:r>
           <w:rPr>
             <w:rStyle w:val="Hyperlink"/>
@@ -21286,7 +21459,7 @@
         </w:rPr>
         <w:t xml:space="preserve">, </w:t>
       </w:r>
-      <w:hyperlink r:id="rId137">
+      <w:hyperlink r:id="rId140">
         <w:r>
           <w:rPr>
             <w:rStyle w:val="Hyperlink"/>
@@ -21302,7 +21475,7 @@
         </w:rPr>
         <w:t xml:space="preserve">, </w:t>
       </w:r>
-      <w:hyperlink r:id="rId138">
+      <w:hyperlink r:id="rId141">
         <w:r>
           <w:rPr>
             <w:rStyle w:val="Hyperlink"/>
@@ -21318,7 +21491,7 @@
         </w:rPr>
         <w:t xml:space="preserve">, </w:t>
       </w:r>
-      <w:hyperlink r:id="rId139">
+      <w:hyperlink r:id="rId142">
         <w:r>
           <w:rPr>
             <w:rStyle w:val="Hyperlink"/>
@@ -21334,7 +21507,7 @@
         </w:rPr>
         <w:t xml:space="preserve">, </w:t>
       </w:r>
-      <w:hyperlink r:id="rId140">
+      <w:hyperlink r:id="rId143">
         <w:r>
           <w:rPr>
             <w:rStyle w:val="Hyperlink"/>
@@ -21352,7 +21525,7 @@
       </w:r>
     </w:p>
     <w:p>
-      <w:hyperlink r:id="rId146">
+      <w:hyperlink r:id="rId149">
         <w:r>
           <w:rPr>
             <w:rStyle w:val="Hyperlink"/>
@@ -21368,7 +21541,7 @@
         </w:rPr>
         <w:t xml:space="preserve">, </w:t>
       </w:r>
-      <w:hyperlink r:id="rId149">
+      <w:hyperlink r:id="rId152">
         <w:r>
           <w:rPr>
             <w:rStyle w:val="Hyperlink"/>
@@ -21384,7 +21557,7 @@
         </w:rPr>
         <w:t xml:space="preserve">, </w:t>
       </w:r>
-      <w:hyperlink r:id="rId148">
+      <w:hyperlink r:id="rId151">
         <w:r>
           <w:rPr>
             <w:rStyle w:val="Hyperlink"/>
@@ -21402,7 +21575,7 @@
       </w:r>
     </w:p>
     <w:p>
-      <w:hyperlink r:id="rId167">
+      <w:hyperlink r:id="rId171">
         <w:r>
           <w:rPr>
             <w:rStyle w:val="Hyperlink"/>
@@ -21418,7 +21591,7 @@
         </w:rPr>
         <w:t xml:space="preserve"> and </w:t>
       </w:r>
-      <w:hyperlink r:id="rId168">
+      <w:hyperlink r:id="rId172">
         <w:r>
           <w:rPr>
             <w:rStyle w:val="Hyperlink"/>
@@ -21434,7 +21607,7 @@
         </w:rPr>
         <w:t xml:space="preserve">. </w:t>
       </w:r>
-      <w:hyperlink r:id="rId169">
+      <w:hyperlink r:id="rId173">
         <w:r>
           <w:rPr>
             <w:rStyle w:val="Hyperlink"/>
@@ -21452,7 +21625,7 @@
       </w:r>
     </w:p>
     <w:p>
-      <w:hyperlink r:id="rId124">
+      <w:hyperlink r:id="rId127">
         <w:r>
           <w:rPr>
             <w:rStyle w:val="Hyperlink"/>
@@ -21468,7 +21641,7 @@
         </w:rPr>
         <w:t xml:space="preserve"> and </w:t>
       </w:r>
-      <w:hyperlink r:id="rId125">
+      <w:hyperlink r:id="rId128">
         <w:r>
           <w:rPr>
             <w:rStyle w:val="Hyperlink"/>
@@ -21782,8 +21955,8 @@
     <w:p>
       <w:pPr>
         <w:sectPr>
-          <w:headerReference w:type="default" r:id="rId165"/>
-          <w:footerReference w:type="default" r:id="rId166"/>
+          <w:headerReference w:type="default" r:id="rId169"/>
+          <w:footerReference w:type="default" r:id="rId170"/>
           <w:pgSz w:w="10080" w:h="14400"/>
           <w:pgMar w:top="1008" w:right="1008" w:bottom="1008" w:left="1008" w:header="504" w:footer="504" w:gutter="0"/>
           <w:cols w:space="720"/>
@@ -22268,8 +22441,8 @@
       </w:r>
     </w:p>
     <w:sectPr>
-      <w:headerReference w:type="default" r:id="rId170"/>
-      <w:footerReference w:type="default" r:id="rId171"/>
+      <w:headerReference w:type="default" r:id="rId174"/>
+      <w:footerReference w:type="default" r:id="rId175"/>
       <w:pgSz w:w="10080" w:h="14400"/>
       <w:pgMar w:top="1008" w:right="1008" w:bottom="1008" w:left="1008" w:header="504" w:footer="504" w:gutter="0"/>
       <w:cols w:space="720"/>

</xml_diff>

<commit_message>
Your First YouTube Channel That Rocks: ch3 names two AI examples (ElevenLabs, Runway); ch14 X requirements confirmed
- ch3 VII: ElevenLabs and Runway as examples, not endorsements, checked on their own pricing/terms pages Oct 2026
- ch14 IV: X Original Content Rewards figures confirmed from X Help Center (Internet Archive copy, 22 Sep 2026); 'not confirmed' label removed; X stays in Figure 14.1
- sources, status note; docx rebuilt (33,040 words)
</commit_message>
<xml_diff>
--- a/Your First YouTube Channel That Rocks/Your First YouTube Channel That Rocks.docx
+++ b/Your First YouTube Channel That Rocks/Your First YouTube Channel That Rocks.docx
@@ -7450,7 +7450,7 @@
         <w:rPr>
           <w:rFonts w:ascii="Calibri" w:hAnsi="Calibri"/>
         </w:rPr>
-        <w:t>Text-to-video tools, generated presenters, and voice tools change monthly, so this edition names none. Use one only for the shot the default stack cannot make. Before you do, answer the five questions in §I, plus three more:</w:t>
+        <w:t>Text-to-video tools, generated presenters, and voice tools change monthly. Use one only for the shot the default stack cannot make. Before you do, answer the five questions in §I, plus three more:</w:t>
       </w:r>
     </w:p>
     <w:p>
@@ -7505,6 +7505,100 @@
           <w:rFonts w:ascii="Calibri" w:hAnsi="Calibri"/>
         </w:rPr>
         <w:t xml:space="preserve"> See the callout below.</w:t>
+      </w:r>
+    </w:p>
+    <w:p>
+      <w:r>
+        <w:rPr>
+          <w:rFonts w:ascii="Calibri" w:hAnsi="Calibri"/>
+        </w:rPr>
+        <w:t>Two examples, so the questions have something to bite on. They are not endorsements, and both pages were read in October 2026; plans and credits change, so open them again before you choose.</w:t>
+      </w:r>
+    </w:p>
+    <w:p>
+      <w:pPr>
+        <w:pStyle w:val="ListBullet"/>
+      </w:pPr>
+      <w:r>
+        <w:rPr>
+          <w:rFonts w:ascii="Calibri" w:hAnsi="Calibri"/>
+          <w:b/>
+        </w:rPr>
+        <w:t xml:space="preserve">Voice: </w:t>
+      </w:r>
+      <w:hyperlink r:id="rId54">
+        <w:r>
+          <w:rPr>
+            <w:rStyle w:val="Hyperlink"/>
+            <w:sz w:val="22"/>
+            <w:rFonts w:ascii="Calibri" w:hAnsi="Calibri"/>
+          </w:rPr>
+          <w:t xml:space="preserve">ElevenLabs</w:t>
+        </w:r>
+      </w:hyperlink>
+      <w:r>
+        <w:rPr>
+          <w:rFonts w:ascii="Calibri" w:hAnsi="Calibri"/>
+          <w:b/>
+        </w:rPr>
+        <w:t>.</w:t>
+      </w:r>
+      <w:r>
+        <w:rPr>
+          <w:rFonts w:ascii="Calibri" w:hAnsi="Calibri"/>
+        </w:rPr>
+        <w:t xml:space="preserve"> Text to speech, sound effects, music, and voice cloning. The pricing page lists a free plan at $0 with 10,000 credits a month, and puts the Commercial License and Instant Voice Cloning on the paid Starter plan ($6 a month) and above. That answers the first extra question: free-tier narration is for trying the tool, not for a monetized video.</w:t>
+      </w:r>
+    </w:p>
+    <w:p>
+      <w:pPr>
+        <w:pStyle w:val="ListBullet"/>
+      </w:pPr>
+      <w:r>
+        <w:rPr>
+          <w:rFonts w:ascii="Calibri" w:hAnsi="Calibri"/>
+          <w:b/>
+        </w:rPr>
+        <w:t xml:space="preserve">Footage: </w:t>
+      </w:r>
+      <w:hyperlink r:id="rId55">
+        <w:r>
+          <w:rPr>
+            <w:rStyle w:val="Hyperlink"/>
+            <w:sz w:val="22"/>
+            <w:rFonts w:ascii="Calibri" w:hAnsi="Calibri"/>
+          </w:rPr>
+          <w:t xml:space="preserve">Runway</w:t>
+        </w:r>
+      </w:hyperlink>
+      <w:r>
+        <w:rPr>
+          <w:rFonts w:ascii="Calibri" w:hAnsi="Calibri"/>
+          <w:b/>
+        </w:rPr>
+        <w:t>.</w:t>
+      </w:r>
+      <w:r>
+        <w:rPr>
+          <w:rFonts w:ascii="Calibri" w:hAnsi="Calibri"/>
+        </w:rPr>
+        <w:t xml:space="preserve"> Text-to-video and image generation. The pricing page lists a free plan with 125 one-time credits, and a Standard plan at $15 a month ($12 billed yearly) with 625 credits a month, listing “No watermarks” among its features. Runway’s </w:t>
+      </w:r>
+      <w:hyperlink r:id="rId56">
+        <w:r>
+          <w:rPr>
+            <w:rStyle w:val="Hyperlink"/>
+            <w:sz w:val="22"/>
+            <w:rFonts w:ascii="Calibri" w:hAnsi="Calibri"/>
+          </w:rPr>
+          <w:t xml:space="preserve">terms of use</w:t>
+        </w:r>
+      </w:hyperlink>
+      <w:r>
+        <w:rPr>
+          <w:rFonts w:ascii="Calibri" w:hAnsi="Calibri"/>
+        </w:rPr>
+        <w:t xml:space="preserve"> say the company does not claim ownership of your outputs and does not restrict their commercial use, subject to the agreement, and that inputs and outputs may be used to train its models. Do not upload footage you have no right to share.</w:t>
       </w:r>
     </w:p>
     <w:p>
@@ -7773,7 +7867,7 @@
         </w:rPr>
         <w:t xml:space="preserve">. </w:t>
       </w:r>
-      <w:hyperlink r:id="rId54">
+      <w:hyperlink r:id="rId57">
         <w:r>
           <w:rPr>
             <w:rStyle w:val="Hyperlink"/>
@@ -7807,7 +7901,7 @@
         </w:rPr>
         <w:t xml:space="preserve">, </w:t>
       </w:r>
-      <w:hyperlink r:id="rId55">
+      <w:hyperlink r:id="rId58">
         <w:r>
           <w:rPr>
             <w:rStyle w:val="Hyperlink"/>
@@ -7875,7 +7969,7 @@
         </w:rPr>
         <w:t xml:space="preserve"> and </w:t>
       </w:r>
-      <w:hyperlink r:id="rId56">
+      <w:hyperlink r:id="rId59">
         <w:r>
           <w:rPr>
             <w:rStyle w:val="Hyperlink"/>
@@ -7900,6 +7994,57 @@
             <w:rFonts w:ascii="Calibri" w:hAnsi="Calibri"/>
           </w:rPr>
           <w:t xml:space="preserve">OBS Studio</w:t>
+        </w:r>
+      </w:hyperlink>
+      <w:r>
+        <w:rPr>
+          <w:rFonts w:ascii="Calibri" w:hAnsi="Calibri"/>
+          <w:i/>
+        </w:rPr>
+        <w:t xml:space="preserve">. AI examples: </w:t>
+      </w:r>
+      <w:hyperlink r:id="rId54">
+        <w:r>
+          <w:rPr>
+            <w:rStyle w:val="Hyperlink"/>
+            <w:sz w:val="22"/>
+            <w:rFonts w:ascii="Calibri" w:hAnsi="Calibri"/>
+          </w:rPr>
+          <w:t xml:space="preserve">ElevenLabs pricing</w:t>
+        </w:r>
+      </w:hyperlink>
+      <w:r>
+        <w:rPr>
+          <w:rFonts w:ascii="Calibri" w:hAnsi="Calibri"/>
+          <w:i/>
+        </w:rPr>
+        <w:t xml:space="preserve">, </w:t>
+      </w:r>
+      <w:hyperlink r:id="rId55">
+        <w:r>
+          <w:rPr>
+            <w:rStyle w:val="Hyperlink"/>
+            <w:sz w:val="22"/>
+            <w:rFonts w:ascii="Calibri" w:hAnsi="Calibri"/>
+          </w:rPr>
+          <w:t xml:space="preserve">Runway pricing</w:t>
+        </w:r>
+      </w:hyperlink>
+      <w:r>
+        <w:rPr>
+          <w:rFonts w:ascii="Calibri" w:hAnsi="Calibri"/>
+          <w:i/>
+        </w:rPr>
+        <w:t xml:space="preserve"> and </w:t>
+      </w:r>
+      <w:hyperlink r:id="rId56">
+        <w:r>
+          <w:rPr>
+            <w:rStyle w:val="Hyperlink"/>
+            <w:sz w:val="22"/>
+            <w:rFonts w:ascii="Calibri" w:hAnsi="Calibri"/>
+          </w:rPr>
+          <w:t xml:space="preserve">terms of use</w:t>
         </w:r>
       </w:hyperlink>
       <w:r>
@@ -8382,7 +8527,7 @@
               </w:rPr>
               <w:t xml:space="preserve">Worked example. Spoken English for a teaching video often lands somewhere around 130 to 160 words a minute. Treat that as a starting guess and time yourself; yours will differ. A 1,200-word script at 150 words a minute is about eight minutes before any demonstration is added. If the method takes three minutes to show on screen, the video is about eleven minutes. Length has one published money rule (official rule): </w:t>
             </w:r>
-            <w:hyperlink r:id="rId59">
+            <w:hyperlink r:id="rId62">
               <w:r>
                 <w:rPr>
                   <w:rStyle w:val="Hyperlink"/>
@@ -8827,7 +8972,7 @@
         </w:rPr>
         <w:t>Then add video chapters. Official rule (</w:t>
       </w:r>
-      <w:hyperlink r:id="rId60">
+      <w:hyperlink r:id="rId63">
         <w:r>
           <w:rPr>
             <w:rStyle w:val="Hyperlink"/>
@@ -8885,7 +9030,7 @@
         </w:rPr>
         <w:t xml:space="preserve">Official rule: </w:t>
       </w:r>
-      <w:hyperlink r:id="rId61">
+      <w:hyperlink r:id="rId64">
         <w:r>
           <w:rPr>
             <w:rStyle w:val="Hyperlink"/>
@@ -9099,7 +9244,7 @@
         </w:rPr>
         <w:t xml:space="preserve">Sources: </w:t>
       </w:r>
-      <w:hyperlink r:id="rId59">
+      <w:hyperlink r:id="rId62">
         <w:r>
           <w:rPr>
             <w:rStyle w:val="Hyperlink"/>
@@ -9116,7 +9261,7 @@
         </w:rPr>
         <w:t xml:space="preserve"> (eight-minute rule, natural breaks). </w:t>
       </w:r>
-      <w:hyperlink r:id="rId60">
+      <w:hyperlink r:id="rId63">
         <w:r>
           <w:rPr>
             <w:rStyle w:val="Hyperlink"/>
@@ -9133,7 +9278,7 @@
         </w:rPr>
         <w:t xml:space="preserve">. </w:t>
       </w:r>
-      <w:hyperlink r:id="rId61">
+      <w:hyperlink r:id="rId64">
         <w:r>
           <w:rPr>
             <w:rStyle w:val="Hyperlink"/>
@@ -9154,8 +9299,8 @@
     <w:p>
       <w:pPr>
         <w:sectPr>
-          <w:headerReference w:type="default" r:id="rId57"/>
-          <w:footerReference w:type="default" r:id="rId58"/>
+          <w:headerReference w:type="default" r:id="rId60"/>
+          <w:footerReference w:type="default" r:id="rId61"/>
           <w:pgSz w:w="10080" w:h="14400"/>
           <w:pgMar w:top="1008" w:right="1008" w:bottom="1008" w:left="1008" w:header="504" w:footer="504" w:gutter="0"/>
           <w:cols w:space="720"/>
@@ -9599,7 +9744,7 @@
         </w:rPr>
         <w:t xml:space="preserve">Sources: </w:t>
       </w:r>
-      <w:hyperlink r:id="rId59">
+      <w:hyperlink r:id="rId62">
         <w:r>
           <w:rPr>
             <w:rStyle w:val="Hyperlink"/>
@@ -9654,8 +9799,8 @@
     <w:p>
       <w:pPr>
         <w:sectPr>
-          <w:headerReference w:type="default" r:id="rId62"/>
-          <w:footerReference w:type="default" r:id="rId63"/>
+          <w:headerReference w:type="default" r:id="rId65"/>
+          <w:footerReference w:type="default" r:id="rId66"/>
           <w:pgSz w:w="10080" w:h="14400"/>
           <w:pgMar w:top="1008" w:right="1008" w:bottom="1008" w:left="1008" w:header="504" w:footer="504" w:gutter="0"/>
           <w:cols w:space="720"/>
@@ -10017,8 +10162,8 @@
     <w:p>
       <w:pPr>
         <w:sectPr>
-          <w:headerReference w:type="default" r:id="rId64"/>
-          <w:footerReference w:type="default" r:id="rId65"/>
+          <w:headerReference w:type="default" r:id="rId67"/>
+          <w:footerReference w:type="default" r:id="rId68"/>
           <w:pgSz w:w="10080" w:h="14400"/>
           <w:pgMar w:top="1008" w:right="1008" w:bottom="1008" w:left="1008" w:header="504" w:footer="504" w:gutter="0"/>
           <w:cols w:space="720"/>
@@ -10504,7 +10649,7 @@
         </w:rPr>
         <w:t xml:space="preserve">An impression, in Studio, is not every time your video exists somewhere. YouTube’s </w:t>
       </w:r>
-      <w:hyperlink r:id="rId68">
+      <w:hyperlink r:id="rId71">
         <w:r>
           <w:rPr>
             <w:rStyle w:val="Hyperlink"/>
@@ -10528,7 +10673,7 @@
         </w:rPr>
         <w:t xml:space="preserve">YouTube’s </w:t>
       </w:r>
-      <w:hyperlink r:id="rId69">
+      <w:hyperlink r:id="rId72">
         <w:r>
           <w:rPr>
             <w:rStyle w:val="Hyperlink"/>
@@ -10642,7 +10787,7 @@
         </w:rPr>
         <w:t xml:space="preserve">Open a video’s Analytics and choose Reach. The report YouTube’s </w:t>
       </w:r>
-      <w:hyperlink r:id="rId70">
+      <w:hyperlink r:id="rId73">
         <w:r>
           <w:rPr>
             <w:rStyle w:val="Hyperlink"/>
@@ -11408,7 +11553,7 @@
         </w:rPr>
         <w:t xml:space="preserve">Studio’s </w:t>
       </w:r>
-      <w:hyperlink r:id="rId71">
+      <w:hyperlink r:id="rId74">
         <w:r>
           <w:rPr>
             <w:rStyle w:val="Hyperlink"/>
@@ -11726,7 +11871,7 @@
         </w:rPr>
         <w:t xml:space="preserve"> (what qualifies). </w:t>
       </w:r>
-      <w:hyperlink r:id="rId68">
+      <w:hyperlink r:id="rId71">
         <w:r>
           <w:rPr>
             <w:rStyle w:val="Hyperlink"/>
@@ -11743,7 +11888,7 @@
         </w:rPr>
         <w:t xml:space="preserve">. </w:t>
       </w:r>
-      <w:hyperlink r:id="rId69">
+      <w:hyperlink r:id="rId72">
         <w:r>
           <w:rPr>
             <w:rStyle w:val="Hyperlink"/>
@@ -11760,7 +11905,7 @@
         </w:rPr>
         <w:t xml:space="preserve">. </w:t>
       </w:r>
-      <w:hyperlink r:id="rId70">
+      <w:hyperlink r:id="rId73">
         <w:r>
           <w:rPr>
             <w:rStyle w:val="Hyperlink"/>
@@ -11777,7 +11922,7 @@
         </w:rPr>
         <w:t xml:space="preserve"> (traffic sources, search terms, content suggesting this video). </w:t>
       </w:r>
-      <w:hyperlink r:id="rId71">
+      <w:hyperlink r:id="rId74">
         <w:r>
           <w:rPr>
             <w:rStyle w:val="Hyperlink"/>
@@ -11798,8 +11943,8 @@
     <w:p>
       <w:pPr>
         <w:sectPr>
-          <w:headerReference w:type="default" r:id="rId66"/>
-          <w:footerReference w:type="default" r:id="rId67"/>
+          <w:headerReference w:type="default" r:id="rId69"/>
+          <w:footerReference w:type="default" r:id="rId70"/>
           <w:pgSz w:w="10080" w:h="14400"/>
           <w:pgMar w:top="1008" w:right="1008" w:bottom="1008" w:left="1008" w:header="504" w:footer="504" w:gutter="0"/>
           <w:cols w:space="720"/>
@@ -12149,7 +12294,7 @@
         </w:rPr>
         <w:t xml:space="preserve"> </w:t>
       </w:r>
-      <w:hyperlink r:id="rId61">
+      <w:hyperlink r:id="rId64">
         <w:r>
           <w:rPr>
             <w:rStyle w:val="Hyperlink"/>
@@ -12315,7 +12460,7 @@
         </w:rPr>
         <w:t xml:space="preserve"> YouTube’s </w:t>
       </w:r>
-      <w:hyperlink r:id="rId74">
+      <w:hyperlink r:id="rId77">
         <w:r>
           <w:rPr>
             <w:rStyle w:val="Hyperlink"/>
@@ -12522,7 +12667,7 @@
         </w:rPr>
         <w:t xml:space="preserve"> (paid campaign and follow-on views). </w:t>
       </w:r>
-      <w:hyperlink r:id="rId61">
+      <w:hyperlink r:id="rId64">
         <w:r>
           <w:rPr>
             <w:rStyle w:val="Hyperlink"/>
@@ -12539,7 +12684,7 @@
         </w:rPr>
         <w:t xml:space="preserve">. </w:t>
       </w:r>
-      <w:hyperlink r:id="rId74">
+      <w:hyperlink r:id="rId77">
         <w:r>
           <w:rPr>
             <w:rStyle w:val="Hyperlink"/>
@@ -12556,7 +12701,7 @@
         </w:rPr>
         <w:t xml:space="preserve"> and </w:t>
       </w:r>
-      <w:hyperlink r:id="rId75">
+      <w:hyperlink r:id="rId78">
         <w:r>
           <w:rPr>
             <w:rStyle w:val="Hyperlink"/>
@@ -12577,8 +12722,8 @@
     <w:p>
       <w:pPr>
         <w:sectPr>
-          <w:headerReference w:type="default" r:id="rId72"/>
-          <w:footerReference w:type="default" r:id="rId73"/>
+          <w:headerReference w:type="default" r:id="rId75"/>
+          <w:footerReference w:type="default" r:id="rId76"/>
           <w:pgSz w:w="10080" w:h="14400"/>
           <w:pgMar w:top="1008" w:right="1008" w:bottom="1008" w:left="1008" w:header="504" w:footer="504" w:gutter="0"/>
           <w:cols w:space="720"/>
@@ -13979,8 +14124,8 @@
     <w:p>
       <w:pPr>
         <w:sectPr>
-          <w:headerReference w:type="default" r:id="rId76"/>
-          <w:footerReference w:type="default" r:id="rId77"/>
+          <w:headerReference w:type="default" r:id="rId79"/>
+          <w:footerReference w:type="default" r:id="rId80"/>
           <w:pgSz w:w="10080" w:h="14400"/>
           <w:pgMar w:top="1008" w:right="1008" w:bottom="1008" w:left="1008" w:header="504" w:footer="504" w:gutter="0"/>
           <w:cols w:space="720"/>
@@ -14536,7 +14681,7 @@
         </w:rPr>
         <w:t xml:space="preserve">YouTube’s </w:t>
       </w:r>
-      <w:hyperlink r:id="rId80">
+      <w:hyperlink r:id="rId83">
         <w:r>
           <w:rPr>
             <w:rStyle w:val="Hyperlink"/>
@@ -14622,7 +14767,7 @@
         </w:rPr>
         <w:t xml:space="preserve"> stops you posting for one week. YouTube’s </w:t>
       </w:r>
-      <w:hyperlink r:id="rId81">
+      <w:hyperlink r:id="rId84">
         <w:r>
           <w:rPr>
             <w:rStyle w:val="Hyperlink"/>
@@ -14726,7 +14871,7 @@
         </w:rPr>
         <w:t xml:space="preserve"> YouTube’s </w:t>
       </w:r>
-      <w:hyperlink r:id="rId75">
+      <w:hyperlink r:id="rId78">
         <w:r>
           <w:rPr>
             <w:rStyle w:val="Hyperlink"/>
@@ -14760,7 +14905,7 @@
         </w:rPr>
         <w:t xml:space="preserve"> Paying a service for views, subscribers, or likes falls under YouTube’s </w:t>
       </w:r>
-      <w:hyperlink r:id="rId74">
+      <w:hyperlink r:id="rId77">
         <w:r>
           <w:rPr>
             <w:rStyle w:val="Hyperlink"/>
@@ -14794,7 +14939,7 @@
         </w:rPr>
         <w:t xml:space="preserve"> YouTube’s </w:t>
       </w:r>
-      <w:hyperlink r:id="rId82">
+      <w:hyperlink r:id="rId85">
         <w:r>
           <w:rPr>
             <w:rStyle w:val="Hyperlink"/>
@@ -14874,7 +15019,7 @@
         </w:rPr>
         <w:t xml:space="preserve">A copyright strike comes from a person or company sending YouTube a formal removal request. YouTube’s </w:t>
       </w:r>
-      <w:hyperlink r:id="rId83">
+      <w:hyperlink r:id="rId86">
         <w:r>
           <w:rPr>
             <w:rStyle w:val="Hyperlink"/>
@@ -14890,7 +15035,7 @@
         </w:rPr>
         <w:t xml:space="preserve"> says these requests are reviewed, and that if one appears valid, YouTube has to remove the content to comply with copyright law. The </w:t>
       </w:r>
-      <w:hyperlink r:id="rId84">
+      <w:hyperlink r:id="rId87">
         <w:r>
           <w:rPr>
             <w:rStyle w:val="Hyperlink"/>
@@ -14914,7 +15059,7 @@
         </w:rPr>
         <w:t xml:space="preserve">Some removal requests are scheduled. YouTube’s </w:t>
       </w:r>
-      <w:hyperlink r:id="rId85">
+      <w:hyperlink r:id="rId88">
         <w:r>
           <w:rPr>
             <w:rStyle w:val="Hyperlink"/>
@@ -15030,7 +15175,7 @@
         </w:rPr>
         <w:t xml:space="preserve">A Content ID claim is generated automatically when an upload matches a reference file a rights holder has given YouTube. YouTube’s </w:t>
       </w:r>
-      <w:hyperlink r:id="rId86">
+      <w:hyperlink r:id="rId89">
         <w:r>
           <w:rPr>
             <w:rStyle w:val="Hyperlink"/>
@@ -15284,7 +15429,7 @@
         </w:rPr>
         <w:t xml:space="preserve">If a video features branded content, sponsorships, endorsements, or other commercial relationships, YouTube’s </w:t>
       </w:r>
-      <w:hyperlink r:id="rId87">
+      <w:hyperlink r:id="rId90">
         <w:r>
           <w:rPr>
             <w:rStyle w:val="Hyperlink"/>
@@ -15300,7 +15445,7 @@
         </w:rPr>
         <w:t xml:space="preserve"> says you have to tell YouTube by selecting the paid promotion option in the video’s details. In the upload flow it appears under “Paid promotion.” YouTube then adds a disclosure label at the start of the video. YouTube’s </w:t>
       </w:r>
-      <w:hyperlink r:id="rId88">
+      <w:hyperlink r:id="rId91">
         <w:r>
           <w:rPr>
             <w:rStyle w:val="Hyperlink"/>
@@ -15358,7 +15503,7 @@
         </w:rPr>
         <w:t xml:space="preserve">YouTube’s </w:t>
       </w:r>
-      <w:hyperlink r:id="rId54">
+      <w:hyperlink r:id="rId57">
         <w:r>
           <w:rPr>
             <w:rStyle w:val="Hyperlink"/>
@@ -15382,7 +15527,7 @@
         </w:rPr>
         <w:t xml:space="preserve">What does not need it, per the same page and YouTube’s </w:t>
       </w:r>
-      <w:hyperlink r:id="rId89">
+      <w:hyperlink r:id="rId92">
         <w:r>
           <w:rPr>
             <w:rStyle w:val="Hyperlink"/>
@@ -15414,7 +15559,7 @@
         </w:rPr>
         <w:t xml:space="preserve">Two changes are worth knowing. YouTube’s </w:t>
       </w:r>
-      <w:hyperlink r:id="rId90">
+      <w:hyperlink r:id="rId93">
         <w:r>
           <w:rPr>
             <w:rStyle w:val="Hyperlink"/>
@@ -15515,7 +15660,7 @@
         </w:rPr>
         <w:t xml:space="preserve">The policies above judge a video. </w:t>
       </w:r>
-      <w:hyperlink r:id="rId91">
+      <w:hyperlink r:id="rId94">
         <w:r>
           <w:rPr>
             <w:rStyle w:val="Hyperlink"/>
@@ -15647,7 +15792,7 @@
         </w:rPr>
         <w:t xml:space="preserve">Every channel and every video has an audience setting: made for kids, or not. YouTube’s </w:t>
       </w:r>
-      <w:hyperlink r:id="rId92">
+      <w:hyperlink r:id="rId95">
         <w:r>
           <w:rPr>
             <w:rStyle w:val="Hyperlink"/>
@@ -15903,7 +16048,7 @@
         </w:rPr>
         <w:t xml:space="preserve">Sources: Warning, training, strike, and termination rules are from </w:t>
       </w:r>
-      <w:hyperlink r:id="rId80">
+      <w:hyperlink r:id="rId83">
         <w:r>
           <w:rPr>
             <w:rStyle w:val="Hyperlink"/>
@@ -15920,7 +16065,7 @@
         </w:rPr>
         <w:t xml:space="preserve">, its </w:t>
       </w:r>
-      <w:hyperlink r:id="rId81">
+      <w:hyperlink r:id="rId84">
         <w:r>
           <w:rPr>
             <w:rStyle w:val="Hyperlink"/>
@@ -15937,7 +16082,7 @@
         </w:rPr>
         <w:t xml:space="preserve">, and its </w:t>
       </w:r>
-      <w:hyperlink r:id="rId84">
+      <w:hyperlink r:id="rId87">
         <w:r>
           <w:rPr>
             <w:rStyle w:val="Hyperlink"/>
@@ -15954,7 +16099,7 @@
         </w:rPr>
         <w:t xml:space="preserve">. Copyright strike resolution is from </w:t>
       </w:r>
-      <w:hyperlink r:id="rId83">
+      <w:hyperlink r:id="rId86">
         <w:r>
           <w:rPr>
             <w:rStyle w:val="Hyperlink"/>
@@ -15971,7 +16116,7 @@
         </w:rPr>
         <w:t xml:space="preserve"> and its </w:t>
       </w:r>
-      <w:hyperlink r:id="rId85">
+      <w:hyperlink r:id="rId88">
         <w:r>
           <w:rPr>
             <w:rStyle w:val="Hyperlink"/>
@@ -15988,7 +16133,7 @@
         </w:rPr>
         <w:t xml:space="preserve">. Content ID claim policies and the Shorts blocking rule are from </w:t>
       </w:r>
-      <w:hyperlink r:id="rId86">
+      <w:hyperlink r:id="rId89">
         <w:r>
           <w:rPr>
             <w:rStyle w:val="Hyperlink"/>
@@ -16022,7 +16167,7 @@
         </w:rPr>
         <w:t xml:space="preserve">. That claimed videos lose Super Thanks and music-claimed videos count against memberships is from YouTube’s Super Thanks and memberships eligibility pages, cited in chapter 12. The paid promotion setting and disclosure label are from </w:t>
       </w:r>
-      <w:hyperlink r:id="rId87">
+      <w:hyperlink r:id="rId90">
         <w:r>
           <w:rPr>
             <w:rStyle w:val="Hyperlink"/>
@@ -16039,7 +16184,7 @@
         </w:rPr>
         <w:t xml:space="preserve"> and its </w:t>
       </w:r>
-      <w:hyperlink r:id="rId88">
+      <w:hyperlink r:id="rId91">
         <w:r>
           <w:rPr>
             <w:rStyle w:val="Hyperlink"/>
@@ -16056,7 +16201,7 @@
         </w:rPr>
         <w:t xml:space="preserve">. AI disclosure requirements are from </w:t>
       </w:r>
-      <w:hyperlink r:id="rId54">
+      <w:hyperlink r:id="rId57">
         <w:r>
           <w:rPr>
             <w:rStyle w:val="Hyperlink"/>
@@ -16073,7 +16218,7 @@
         </w:rPr>
         <w:t xml:space="preserve">, the </w:t>
       </w:r>
-      <w:hyperlink r:id="rId89">
+      <w:hyperlink r:id="rId92">
         <w:r>
           <w:rPr>
             <w:rStyle w:val="Hyperlink"/>
@@ -16090,7 +16235,7 @@
         </w:rPr>
         <w:t xml:space="preserve">, and the </w:t>
       </w:r>
-      <w:hyperlink r:id="rId90">
+      <w:hyperlink r:id="rId93">
         <w:r>
           <w:rPr>
             <w:rStyle w:val="Hyperlink"/>
@@ -16107,7 +16252,7 @@
         </w:rPr>
         <w:t xml:space="preserve">. The reused content, inauthentic content, and AI persona rules are from </w:t>
       </w:r>
-      <w:hyperlink r:id="rId91">
+      <w:hyperlink r:id="rId94">
         <w:r>
           <w:rPr>
             <w:rStyle w:val="Hyperlink"/>
@@ -16141,7 +16286,7 @@
         </w:rPr>
         <w:t xml:space="preserve">. The FTC’s </w:t>
       </w:r>
-      <w:hyperlink r:id="rId93">
+      <w:hyperlink r:id="rId96">
         <w:r>
           <w:rPr>
             <w:rStyle w:val="Hyperlink"/>
@@ -16158,7 +16303,7 @@
         </w:rPr>
         <w:t xml:space="preserve"> and </w:t>
       </w:r>
-      <w:hyperlink r:id="rId94">
+      <w:hyperlink r:id="rId97">
         <w:r>
           <w:rPr>
             <w:rStyle w:val="Hyperlink"/>
@@ -16175,7 +16320,7 @@
         </w:rPr>
         <w:t xml:space="preserve"> are US guidance. Made-for-kids features are from </w:t>
       </w:r>
-      <w:hyperlink r:id="rId92">
+      <w:hyperlink r:id="rId95">
         <w:r>
           <w:rPr>
             <w:rStyle w:val="Hyperlink"/>
@@ -16196,8 +16341,8 @@
     <w:p>
       <w:pPr>
         <w:sectPr>
-          <w:headerReference w:type="default" r:id="rId78"/>
-          <w:footerReference w:type="default" r:id="rId79"/>
+          <w:headerReference w:type="default" r:id="rId81"/>
+          <w:footerReference w:type="default" r:id="rId82"/>
           <w:pgSz w:w="10080" w:h="14400"/>
           <w:pgMar w:top="1008" w:right="1008" w:bottom="1008" w:left="1008" w:header="504" w:footer="504" w:gutter="0"/>
           <w:cols w:space="720"/>
@@ -16267,7 +16412,7 @@
         </w:rPr>
         <w:t xml:space="preserve">Inside the Partner Program, with the Watch Page Monetization Module accepted, a long-form video can earn from ads shown before, during, after, and around it on the watch page. That includes the video embedded on another site in YouTube’s player. Official rule: YouTube’s </w:t>
       </w:r>
-      <w:hyperlink r:id="rId97">
+      <w:hyperlink r:id="rId100">
         <w:r>
           <w:rPr>
             <w:rStyle w:val="Hyperlink"/>
@@ -16285,7 +16430,7 @@
       </w:r>
     </w:p>
     <w:p>
-      <w:hyperlink r:id="rId98">
+      <w:hyperlink r:id="rId101">
         <w:r>
           <w:rPr>
             <w:rStyle w:val="Hyperlink"/>
@@ -16337,7 +16482,7 @@
         </w:rPr>
         <w:t xml:space="preserve"> </w:t>
       </w:r>
-      <w:hyperlink r:id="rId59">
+      <w:hyperlink r:id="rId62">
         <w:r>
           <w:rPr>
             <w:rStyle w:val="Hyperlink"/>
@@ -16893,7 +17038,7 @@
         </w:rPr>
         <w:t xml:space="preserve">Shorts ads run between videos in the Shorts feed, not beside one video, so YouTube pools them. </w:t>
       </w:r>
-      <w:hyperlink r:id="rId99">
+      <w:hyperlink r:id="rId102">
         <w:r>
           <w:rPr>
             <w:rStyle w:val="Hyperlink"/>
@@ -17288,7 +17433,7 @@
         </w:rPr>
         <w:t xml:space="preserve">Sources: </w:t>
       </w:r>
-      <w:hyperlink r:id="rId98">
+      <w:hyperlink r:id="rId101">
         <w:r>
           <w:rPr>
             <w:rStyle w:val="Hyperlink"/>
@@ -17305,7 +17450,7 @@
         </w:rPr>
         <w:t xml:space="preserve"> and </w:t>
       </w:r>
-      <w:hyperlink r:id="rId59">
+      <w:hyperlink r:id="rId62">
         <w:r>
           <w:rPr>
             <w:rStyle w:val="Hyperlink"/>
@@ -17356,7 +17501,7 @@
         </w:rPr>
         <w:t xml:space="preserve"> (CPM, playback-based CPM, RPM). </w:t>
       </w:r>
-      <w:hyperlink r:id="rId97">
+      <w:hyperlink r:id="rId100">
         <w:r>
           <w:rPr>
             <w:rStyle w:val="Hyperlink"/>
@@ -17407,7 +17552,7 @@
         </w:rPr>
         <w:t xml:space="preserve"> (Premium and Premium Lite pools, Shorts floor, targeted Shorts ads). </w:t>
       </w:r>
-      <w:hyperlink r:id="rId99">
+      <w:hyperlink r:id="rId102">
         <w:r>
           <w:rPr>
             <w:rStyle w:val="Hyperlink"/>
@@ -17428,8 +17573,8 @@
     <w:p>
       <w:pPr>
         <w:sectPr>
-          <w:headerReference w:type="default" r:id="rId95"/>
-          <w:footerReference w:type="default" r:id="rId96"/>
+          <w:headerReference w:type="default" r:id="rId98"/>
+          <w:footerReference w:type="default" r:id="rId99"/>
           <w:pgSz w:w="10080" w:h="14400"/>
           <w:pgMar w:top="1008" w:right="1008" w:bottom="1008" w:left="1008" w:header="504" w:footer="504" w:gutter="0"/>
           <w:cols w:space="720"/>
@@ -17493,7 +17638,7 @@
       <w:bookmarkEnd w:id="104"/>
     </w:p>
     <w:p>
-      <w:hyperlink r:id="rId102">
+      <w:hyperlink r:id="rId105">
         <w:r>
           <w:rPr>
             <w:rStyle w:val="Hyperlink"/>
@@ -17625,7 +17770,7 @@
         </w:rPr>
         <w:t xml:space="preserve">A membership is a monthly payment from a viewer in return for perks you choose. </w:t>
       </w:r>
-      <w:hyperlink r:id="rId103">
+      <w:hyperlink r:id="rId106">
         <w:r>
           <w:rPr>
             <w:rStyle w:val="Hyperlink"/>
@@ -17649,7 +17794,7 @@
         </w:rPr>
         <w:t xml:space="preserve">The structure, from </w:t>
       </w:r>
-      <w:hyperlink r:id="rId104">
+      <w:hyperlink r:id="rId107">
         <w:r>
           <w:rPr>
             <w:rStyle w:val="Hyperlink"/>
@@ -17698,7 +17843,7 @@
         </w:rPr>
         <w:t xml:space="preserve">Prices come from a fixed list for each country. </w:t>
       </w:r>
-      <w:hyperlink r:id="rId105">
+      <w:hyperlink r:id="rId108">
         <w:r>
           <w:rPr>
             <w:rStyle w:val="Hyperlink"/>
@@ -17725,7 +17870,7 @@
         </w:rPr>
         <w:t xml:space="preserve">Documented platform guidance: YouTube’s </w:t>
       </w:r>
-      <w:hyperlink r:id="rId106">
+      <w:hyperlink r:id="rId109">
         <w:r>
           <w:rPr>
             <w:rStyle w:val="Hyperlink"/>
@@ -17783,7 +17928,7 @@
         </w:rPr>
         <w:t xml:space="preserve">These two belong to live: live streams and premieres with live chat turned on. A viewer pays to highlight a message in the chat, or to send an animated sticker. </w:t>
       </w:r>
-      <w:hyperlink r:id="rId107">
+      <w:hyperlink r:id="rId110">
         <w:r>
           <w:rPr>
             <w:rStyle w:val="Hyperlink"/>
@@ -17801,7 +17946,7 @@
       </w:r>
     </w:p>
     <w:p>
-      <w:hyperlink r:id="rId108">
+      <w:hyperlink r:id="rId111">
         <w:r>
           <w:rPr>
             <w:rStyle w:val="Hyperlink"/>
@@ -17859,7 +18004,7 @@
         </w:rPr>
         <w:t xml:space="preserve">Super Thanks is the one fan-funding feature that does not need you live. A viewer buys a one-time animation on a long-form video or a Short and gets a highlighted comment in the comments section. </w:t>
       </w:r>
-      <w:hyperlink r:id="rId109">
+      <w:hyperlink r:id="rId112">
         <w:r>
           <w:rPr>
             <w:rStyle w:val="Hyperlink"/>
@@ -17899,7 +18044,7 @@
         </w:rPr>
         <w:t xml:space="preserve">Documented platform guidance: YouTube’s </w:t>
       </w:r>
-      <w:hyperlink r:id="rId110">
+      <w:hyperlink r:id="rId113">
         <w:r>
           <w:rPr>
             <w:rStyle w:val="Hyperlink"/>
@@ -18076,7 +18221,7 @@
         </w:rPr>
         <w:t xml:space="preserve">Sources: Minimum requirements, the four features, and the not-a-donation rule are from </w:t>
       </w:r>
-      <w:hyperlink r:id="rId102">
+      <w:hyperlink r:id="rId105">
         <w:r>
           <w:rPr>
             <w:rStyle w:val="Hyperlink"/>
@@ -18093,7 +18238,7 @@
         </w:rPr>
         <w:t xml:space="preserve">. Membership eligibility, banned perks, and paused mode are from </w:t>
       </w:r>
-      <w:hyperlink r:id="rId103">
+      <w:hyperlink r:id="rId106">
         <w:r>
           <w:rPr>
             <w:rStyle w:val="Hyperlink"/>
@@ -18110,7 +18255,7 @@
         </w:rPr>
         <w:t xml:space="preserve">; levels and perks from </w:t>
       </w:r>
-      <w:hyperlink r:id="rId104">
+      <w:hyperlink r:id="rId107">
         <w:r>
           <w:rPr>
             <w:rStyle w:val="Hyperlink"/>
@@ -18127,7 +18272,7 @@
         </w:rPr>
         <w:t xml:space="preserve">; US prices from </w:t>
       </w:r>
-      <w:hyperlink r:id="rId105">
+      <w:hyperlink r:id="rId108">
         <w:r>
           <w:rPr>
             <w:rStyle w:val="Hyperlink"/>
@@ -18144,7 +18289,7 @@
         </w:rPr>
         <w:t xml:space="preserve">; the 70% share from </w:t>
       </w:r>
-      <w:hyperlink r:id="rId111">
+      <w:hyperlink r:id="rId114">
         <w:r>
           <w:rPr>
             <w:rStyle w:val="Hyperlink"/>
@@ -18161,7 +18306,7 @@
         </w:rPr>
         <w:t xml:space="preserve"> and the pricing guidance from </w:t>
       </w:r>
-      <w:hyperlink r:id="rId106">
+      <w:hyperlink r:id="rId109">
         <w:r>
           <w:rPr>
             <w:rStyle w:val="Hyperlink"/>
@@ -18178,7 +18323,7 @@
         </w:rPr>
         <w:t xml:space="preserve">. Super Chat and Super Stickers rules and the 70% share are from </w:t>
       </w:r>
-      <w:hyperlink r:id="rId107">
+      <w:hyperlink r:id="rId110">
         <w:r>
           <w:rPr>
             <w:rStyle w:val="Hyperlink"/>
@@ -18195,7 +18340,7 @@
         </w:rPr>
         <w:t xml:space="preserve"> and </w:t>
       </w:r>
-      <w:hyperlink r:id="rId108">
+      <w:hyperlink r:id="rId111">
         <w:r>
           <w:rPr>
             <w:rStyle w:val="Hyperlink"/>
@@ -18212,7 +18357,7 @@
         </w:rPr>
         <w:t xml:space="preserve">. Super Thanks rules and its 70% share are from </w:t>
       </w:r>
-      <w:hyperlink r:id="rId109">
+      <w:hyperlink r:id="rId112">
         <w:r>
           <w:rPr>
             <w:rStyle w:val="Hyperlink"/>
@@ -18229,7 +18374,7 @@
         </w:rPr>
         <w:t xml:space="preserve"> and </w:t>
       </w:r>
-      <w:hyperlink r:id="rId112">
+      <w:hyperlink r:id="rId115">
         <w:r>
           <w:rPr>
             <w:rStyle w:val="Hyperlink"/>
@@ -18246,7 +18391,7 @@
         </w:rPr>
         <w:t xml:space="preserve">; the tips from </w:t>
       </w:r>
-      <w:hyperlink r:id="rId110">
+      <w:hyperlink r:id="rId113">
         <w:r>
           <w:rPr>
             <w:rStyle w:val="Hyperlink"/>
@@ -18267,8 +18412,8 @@
     <w:p>
       <w:pPr>
         <w:sectPr>
-          <w:headerReference w:type="default" r:id="rId100"/>
-          <w:footerReference w:type="default" r:id="rId101"/>
+          <w:headerReference w:type="default" r:id="rId103"/>
+          <w:footerReference w:type="default" r:id="rId104"/>
           <w:pgSz w:w="10080" w:h="14400"/>
           <w:pgMar w:top="1008" w:right="1008" w:bottom="1008" w:left="1008" w:header="504" w:footer="504" w:gutter="0"/>
           <w:cols w:space="720"/>
@@ -18773,7 +18918,7 @@
         </w:rPr>
         <w:t xml:space="preserve"> “Affiliate link” in the same line. YouTube’s </w:t>
       </w:r>
-      <w:hyperlink r:id="rId82">
+      <w:hyperlink r:id="rId85">
         <w:r>
           <w:rPr>
             <w:rStyle w:val="Hyperlink"/>
@@ -18872,7 +19017,7 @@
         </w:rPr>
         <w:t xml:space="preserve">An </w:t>
       </w:r>
-      <w:hyperlink r:id="rId115">
+      <w:hyperlink r:id="rId118">
         <w:r>
           <w:rPr>
             <w:rStyle w:val="Hyperlink"/>
@@ -18888,7 +19033,7 @@
         </w:rPr>
         <w:t xml:space="preserve"> or </w:t>
       </w:r>
-      <w:hyperlink r:id="rId61">
+      <w:hyperlink r:id="rId64">
         <w:r>
           <w:rPr>
             <w:rStyle w:val="Hyperlink"/>
@@ -18940,7 +19085,7 @@
       </w:r>
     </w:p>
     <w:p>
-      <w:hyperlink r:id="rId116">
+      <w:hyperlink r:id="rId119">
         <w:r>
           <w:rPr>
             <w:rStyle w:val="Hyperlink"/>
@@ -19094,7 +19239,7 @@
         </w:rPr>
         <w:t xml:space="preserve">. The paid promotion setting is from </w:t>
       </w:r>
-      <w:hyperlink r:id="rId87">
+      <w:hyperlink r:id="rId90">
         <w:r>
           <w:rPr>
             <w:rStyle w:val="Hyperlink"/>
@@ -19128,7 +19273,7 @@
         </w:rPr>
         <w:t xml:space="preserve">; cards and end screens from </w:t>
       </w:r>
-      <w:hyperlink r:id="rId115">
+      <w:hyperlink r:id="rId118">
         <w:r>
           <w:rPr>
             <w:rStyle w:val="Hyperlink"/>
@@ -19145,7 +19290,7 @@
         </w:rPr>
         <w:t xml:space="preserve"> and </w:t>
       </w:r>
-      <w:hyperlink r:id="rId61">
+      <w:hyperlink r:id="rId64">
         <w:r>
           <w:rPr>
             <w:rStyle w:val="Hyperlink"/>
@@ -19162,7 +19307,7 @@
         </w:rPr>
         <w:t xml:space="preserve">. Affiliate content under the Terms of Use is from </w:t>
       </w:r>
-      <w:hyperlink r:id="rId82">
+      <w:hyperlink r:id="rId85">
         <w:r>
           <w:rPr>
             <w:rStyle w:val="Hyperlink"/>
@@ -19196,7 +19341,7 @@
         </w:rPr>
         <w:t xml:space="preserve"> and its conditions from </w:t>
       </w:r>
-      <w:hyperlink r:id="rId116">
+      <w:hyperlink r:id="rId119">
         <w:r>
           <w:rPr>
             <w:rStyle w:val="Hyperlink"/>
@@ -19213,7 +19358,7 @@
         </w:rPr>
         <w:t xml:space="preserve">. US disclosure guidance is the FTC’s </w:t>
       </w:r>
-      <w:hyperlink r:id="rId93">
+      <w:hyperlink r:id="rId96">
         <w:r>
           <w:rPr>
             <w:rStyle w:val="Hyperlink"/>
@@ -19230,7 +19375,7 @@
         </w:rPr>
         <w:t xml:space="preserve"> and </w:t>
       </w:r>
-      <w:hyperlink r:id="rId94">
+      <w:hyperlink r:id="rId97">
         <w:r>
           <w:rPr>
             <w:rStyle w:val="Hyperlink"/>
@@ -19251,8 +19396,8 @@
     <w:p>
       <w:pPr>
         <w:sectPr>
-          <w:headerReference w:type="default" r:id="rId113"/>
-          <w:footerReference w:type="default" r:id="rId114"/>
+          <w:headerReference w:type="default" r:id="rId116"/>
+          <w:footerReference w:type="default" r:id="rId117"/>
           <w:pgSz w:w="10080" w:h="14400"/>
           <w:pgMar w:top="1008" w:right="1008" w:bottom="1008" w:left="1008" w:header="504" w:footer="504" w:gutter="0"/>
           <w:cols w:space="720"/>
@@ -19651,7 +19796,7 @@
                     <pic:cNvPicPr/>
                   </pic:nvPicPr>
                   <pic:blipFill>
-                    <a:blip r:embed="rId119"/>
+                    <a:blip r:embed="rId122"/>
                     <a:stretch>
                       <a:fillRect/>
                     </a:stretch>
@@ -19741,7 +19886,7 @@
       </w:r>
     </w:p>
     <w:p>
-      <w:hyperlink r:id="rId120">
+      <w:hyperlink r:id="rId123">
         <w:r>
           <w:rPr>
             <w:rStyle w:val="Hyperlink"/>
@@ -19766,7 +19911,7 @@
       </w:r>
     </w:p>
     <w:p>
-      <w:hyperlink r:id="rId121">
+      <w:hyperlink r:id="rId124">
         <w:r>
           <w:rPr>
             <w:rStyle w:val="Hyperlink"/>
@@ -19791,7 +19936,7 @@
       </w:r>
     </w:p>
     <w:p>
-      <w:hyperlink r:id="rId122">
+      <w:hyperlink r:id="rId125">
         <w:r>
           <w:rPr>
             <w:rStyle w:val="Hyperlink"/>
@@ -19816,22 +19961,32 @@
       </w:r>
     </w:p>
     <w:p>
+      <w:hyperlink r:id="rId126">
+        <w:r>
+          <w:rPr>
+            <w:rStyle w:val="Hyperlink"/>
+            <w:sz w:val="22"/>
+            <w:rFonts w:ascii="Calibri" w:hAnsi="Calibri"/>
+          </w:rPr>
+          <w:t xml:space="preserve">X — Original Content Rewards</w:t>
+        </w:r>
+      </w:hyperlink>
       <w:r>
         <w:rPr>
           <w:rFonts w:ascii="Calibri" w:hAnsi="Calibri"/>
           <w:b/>
         </w:rPr>
-        <w:t>X — Original Content Rewards.</w:t>
-      </w:r>
-      <w:r>
-        <w:rPr>
-          <w:rFonts w:ascii="Calibri" w:hAnsi="Calibri"/>
-        </w:rPr>
-        <w:t xml:space="preserve"> Pay per qualified impression on original posts. Reported requirements: an active Premium subscription, 500 verified followers, and 500,000 impressions in 90 days. X’s help page would not load for this check in October 2026, so this line is not confirmed on an official page. Open X’s help before you plan from it.</w:t>
-      </w:r>
-    </w:p>
-    <w:p>
-      <w:hyperlink r:id="rId123">
+        <w:t>.</w:t>
+      </w:r>
+      <w:r>
+        <w:rPr>
+          <w:rFonts w:ascii="Calibri" w:hAnsi="Calibri"/>
+        </w:rPr>
+        <w:t xml:space="preserve"> Pay per qualified impression on original posts, paid every two weeks. X’s Help Center lists: an active X Premium, Premium+, or Premium Business subscription; 500 verified followers; 500,000 Home Timeline impressions from verified users in the last 90 days, not counting replies; age 18 or older; a Personal or Business account in good standing; and an available country. Qualified impressions are unique views by Premium users in the Home Timeline with at least half the post visible. Meeting the criteria lets you apply; it does not guarantee admission. Checked October 2026.</w:t>
+      </w:r>
+    </w:p>
+    <w:p>
+      <w:hyperlink r:id="rId127">
         <w:r>
           <w:rPr>
             <w:rStyle w:val="Hyperlink"/>
@@ -20202,9 +20357,9 @@
           <w:rFonts w:ascii="Calibri" w:hAnsi="Calibri"/>
           <w:i/>
         </w:rPr>
-        <w:t xml:space="preserve">. Other-platform lines in section IV come from the page linked on each line, opened in October 2026, except X, whose help page did not load. Snapchat’s Spotlight Rewards end date is from </w:t>
-      </w:r>
-      <w:hyperlink r:id="rId124">
+        <w:t xml:space="preserve">. Other-platform lines in section IV come from the page linked on each line, opened in October 2026,; X’s page was read in the Internet Archive’s copy of 22 September 2026, because the live page refuses automated requests. Snapchat’s Spotlight Rewards end date is from </w:t>
+      </w:r>
+      <w:hyperlink r:id="rId128">
         <w:r>
           <w:rPr>
             <w:rStyle w:val="Hyperlink"/>
@@ -20225,8 +20380,8 @@
     <w:p>
       <w:pPr>
         <w:sectPr>
-          <w:headerReference w:type="default" r:id="rId117"/>
-          <w:footerReference w:type="default" r:id="rId118"/>
+          <w:headerReference w:type="default" r:id="rId120"/>
+          <w:footerReference w:type="default" r:id="rId121"/>
           <w:pgSz w:w="10080" w:h="14400"/>
           <w:pgMar w:top="1008" w:right="1008" w:bottom="1008" w:left="1008" w:header="504" w:footer="504" w:gutter="0"/>
           <w:cols w:space="720"/>
@@ -21966,7 +22121,7 @@
         </w:rPr>
         <w:t xml:space="preserve">Sources: This workbook is the author’s structure for the rest of this book. The bathroom-repair sheet and its money line are hypothetical illustrations, not a measured channel. The membership share is YouTube’s 70% after taxes and fees, from chapter 12. Affiliate disclosure follows chapter 13 and the FTC’s </w:t>
       </w:r>
-      <w:hyperlink r:id="rId93">
+      <w:hyperlink r:id="rId96">
         <w:r>
           <w:rPr>
             <w:rStyle w:val="Hyperlink"/>
@@ -21987,782 +22142,6 @@
     <w:p>
       <w:pPr>
         <w:sectPr>
-          <w:headerReference w:type="default" r:id="rId125"/>
-          <w:footerReference w:type="default" r:id="rId126"/>
-          <w:pgSz w:w="10080" w:h="14400"/>
-          <w:pgMar w:top="1008" w:right="1008" w:bottom="1008" w:left="1008" w:header="504" w:footer="504" w:gutter="0"/>
-          <w:cols w:space="720"/>
-          <w:titlePg/>
-          <w:docGrid w:linePitch="360"/>
-        </w:sectPr>
-      </w:pPr>
-    </w:p>
-    <w:p>
-      <w:bookmarkStart w:id="139" w:name="toc138"/>
-      <w:pPr>
-        <w:pStyle w:val="Heading1"/>
-      </w:pPr>
-      <w:r>
-        <w:t>The last word</w:t>
-      </w:r>
-      <w:bookmarkEnd w:id="139"/>
-    </w:p>
-    <w:p>
-      <w:r>
-        <w:rPr>
-          <w:rFonts w:ascii="Calibri" w:hAnsi="Calibri"/>
-        </w:rPr>
-        <w:t>The channel in this book does not start with money. It starts with one viewer and a question they would type, and it earns the right to be paid one finished minute at a time: a title that names the problem, an opening that keeps the promise, a method given away, a next video named inside the last one.</w:t>
-      </w:r>
-    </w:p>
-    <w:p>
-      <w:r>
-        <w:rPr>
-          <w:rFonts w:ascii="Calibri" w:hAnsi="Calibri"/>
-        </w:rPr>
-        <w:t>The gates are arithmetic. Subscribers, plus hours or Shorts views, inside a window that rolls. Once you can work out how many views a day your channel needs at its own view duration, the gate stops being a mystery and becomes a distance, and chapter 4’s work on the opening becomes the cheapest way to shorten it.</w:t>
-      </w:r>
-    </w:p>
-    <w:p>
-      <w:r>
-        <w:rPr>
-          <w:rFonts w:ascii="Calibri" w:hAnsi="Calibri"/>
-        </w:rPr>
-        <w:t>Past the gate, the money comes in five kinds, and each one pays for something different. Ads pay for reach. Memberships pay for loyalty. Supers pay for presence. Sponsors pay for a precise viewer. Affiliate commissions pay for recommendations people act on. A channel that keeps all five small and honest survives the next rule change. A channel that bets on one does not.</w:t>
-      </w:r>
-    </w:p>
-    <w:p>
-      <w:r>
-        <w:rPr>
-          <w:rFonts w:ascii="Calibri" w:hAnsi="Calibri"/>
-        </w:rPr>
-        <w:t>The numbers will move again before the next edition of this book. Check the Earn tab, read the help page, write the date in the decision log. Then make the next video for the same person you named on the first page.</w:t>
-      </w:r>
-    </w:p>
-    <w:p>
-      <w:pPr>
-        <w:sectPr>
-          <w:headerReference w:type="default" r:id="rId127"/>
-          <w:footerReference w:type="default" r:id="rId128"/>
-          <w:pgSz w:w="10080" w:h="14400"/>
-          <w:pgMar w:top="1008" w:right="1008" w:bottom="1008" w:left="1008" w:header="504" w:footer="504" w:gutter="0"/>
-          <w:cols w:space="720"/>
-          <w:titlePg/>
-          <w:docGrid w:linePitch="360"/>
-        </w:sectPr>
-      </w:pPr>
-    </w:p>
-    <w:p>
-      <w:bookmarkStart w:id="140" w:name="toc139"/>
-      <w:pPr>
-        <w:pStyle w:val="Heading1"/>
-      </w:pPr>
-      <w:r>
-        <w:t>Glossary</w:t>
-      </w:r>
-      <w:bookmarkEnd w:id="140"/>
-    </w:p>
-    <w:p>
-      <w:r>
-        <w:rPr>
-          <w:rFonts w:ascii="Calibri" w:hAnsi="Calibri"/>
-        </w:rPr>
-        <w:t>Short definitions for terms this book uses. A definition here is not a substitute for the platform page cited in the chapter.</w:t>
-      </w:r>
-    </w:p>
-    <w:p>
-      <w:r>
-        <w:rPr>
-          <w:rFonts w:ascii="Calibri" w:hAnsi="Calibri"/>
-          <w:b/>
-        </w:rPr>
-        <w:t xml:space="preserve">Eight jobs. </w:t>
-      </w:r>
-      <w:r>
-        <w:rPr>
-          <w:rFonts w:ascii="Calibri" w:hAnsi="Calibri"/>
-        </w:rPr>
-        <w:t>The only set of videos this book asks you to finish: who it is for, the problem in their words, the method, proof, the comparison, one objection, the deep dive, and which video to watch next. Chapters 2, 5, and 6 use this same set.</w:t>
-      </w:r>
-    </w:p>
-    <w:p>
-      <w:r>
-        <w:rPr>
-          <w:rFonts w:ascii="Calibri" w:hAnsi="Calibri"/>
-          <w:b/>
-        </w:rPr>
-        <w:t xml:space="preserve">Deep dive. </w:t>
-      </w:r>
-      <w:r>
-        <w:rPr>
-          <w:rFonts w:ascii="Calibri" w:hAnsi="Calibri"/>
-        </w:rPr>
-        <w:t>The long, complete video in the eight jobs, built to be watched for a long time. The video that fills the hour bar, and the one that can honestly pass eight minutes for mid-roll ads.</w:t>
-      </w:r>
-    </w:p>
-    <w:p>
-      <w:r>
-        <w:rPr>
-          <w:rFonts w:ascii="Calibri" w:hAnsi="Calibri"/>
-          <w:b/>
-        </w:rPr>
-        <w:t xml:space="preserve">Expanded program. </w:t>
-      </w:r>
-      <w:r>
-        <w:rPr>
-          <w:rFonts w:ascii="Calibri" w:hAnsi="Calibri"/>
-        </w:rPr>
-        <w:t>In countries where YouTube has opened it, the earlier tier of the Partner Program: 500 subscribers, three public uploads in 90 days, and either 3,000 long-form hours in a year or 3 million Shorts views in 90 days. Fan funding, Shopping, and Creator Partnerships. Not a share of watch-page ads. Unchanged by the 2027 update.</w:t>
-      </w:r>
-    </w:p>
-    <w:p>
-      <w:r>
-        <w:rPr>
-          <w:rFonts w:ascii="Calibri" w:hAnsi="Calibri"/>
-          <w:b/>
-        </w:rPr>
-        <w:t xml:space="preserve">YouTube Partner Program. </w:t>
-      </w:r>
-      <w:r>
-        <w:rPr>
-          <w:rFonts w:ascii="Calibri" w:hAnsi="Calibri"/>
-        </w:rPr>
-        <w:t>The higher gate: 1,000 subscribers and either 4,000 long-form hours in 12 months or 10 million qualified Shorts views in 90 days. For channels that apply from 1 February 2027: 8,000 hours in 365 days or 20 million Shorts views in 90 days. This is the gate that adds watch-page ads, Shorts Feed ads, and YouTube Premium revenue. Channels already in the program keep their status.</w:t>
-      </w:r>
-    </w:p>
-    <w:p>
-      <w:r>
-        <w:rPr>
-          <w:rFonts w:ascii="Calibri" w:hAnsi="Calibri"/>
-          <w:b/>
-        </w:rPr>
-        <w:t xml:space="preserve">Qualified watch hours. </w:t>
-      </w:r>
-      <w:r>
-        <w:rPr>
-          <w:rFonts w:ascii="Calibri" w:hAnsi="Calibri"/>
-        </w:rPr>
-        <w:t>Public long-form viewing that YouTube counts toward the hour bars. Hours watched in the Shorts feed do not count. Private, unlisted, deleted, and ad-campaign views do not count.</w:t>
-      </w:r>
-    </w:p>
-    <w:p>
-      <w:r>
-        <w:rPr>
-          <w:rFonts w:ascii="Calibri" w:hAnsi="Calibri"/>
-          <w:b/>
-        </w:rPr>
-        <w:t xml:space="preserve">Qualified Shorts views. </w:t>
-      </w:r>
-      <w:r>
-        <w:rPr>
-          <w:rFonts w:ascii="Calibri" w:hAnsi="Calibri"/>
-        </w:rPr>
-        <w:t>Public views of Shorts in the Shorts feed that YouTube counts toward the Shorts bars: 3 million in 90 days for the expanded program, or 10 million in 90 days for the Partner Program (20 million for channels applying from 1 February 2027). They do not fill the long-form hour bars.</w:t>
-      </w:r>
-    </w:p>
-    <w:p>
-      <w:r>
-        <w:rPr>
-          <w:rFonts w:ascii="Calibri" w:hAnsi="Calibri"/>
-          <w:b/>
-        </w:rPr>
-        <w:t xml:space="preserve">Follow-on views. </w:t>
-      </w:r>
-      <w:r>
-        <w:rPr>
-          <w:rFonts w:ascii="Calibri" w:hAnsi="Calibri"/>
-        </w:rPr>
-        <w:t>Organic views from people who watch more of your videos after seeing a promoted one. The only part of a paid campaign that counts toward the Partner Program.</w:t>
-      </w:r>
-    </w:p>
-    <w:p>
-      <w:r>
-        <w:rPr>
-          <w:rFonts w:ascii="Calibri" w:hAnsi="Calibri"/>
-          <w:b/>
-        </w:rPr>
-        <w:t xml:space="preserve">Advanced features. </w:t>
-      </w:r>
-      <w:r>
-        <w:rPr>
-          <w:rFonts w:ascii="Calibri" w:hAnsi="Calibri"/>
-        </w:rPr>
-        <w:t>The Studio status that makes an address in a long-form description, and in a long-form comment, clickable. Phone verification comes first. A Short’s description and comments stay unclickable after it is on. The Partner Program requires it.</w:t>
-      </w:r>
-    </w:p>
-    <w:p>
-      <w:r>
-        <w:rPr>
-          <w:rFonts w:ascii="Calibri" w:hAnsi="Calibri"/>
-          <w:b/>
-        </w:rPr>
-        <w:t xml:space="preserve">AdSense. </w:t>
-      </w:r>
-      <w:r>
-        <w:rPr>
-          <w:rFonts w:ascii="Calibri" w:hAnsi="Calibri"/>
-        </w:rPr>
-        <w:t>AdSense for YouTube, the Google account YouTube uses to pay a channel it has accepted. Meeting a subscriber number does not open it. You apply, and YouTube reviews the channel.</w:t>
-      </w:r>
-    </w:p>
-    <w:p>
-      <w:r>
-        <w:rPr>
-          <w:rFonts w:ascii="Calibri" w:hAnsi="Calibri"/>
-          <w:b/>
-        </w:rPr>
-        <w:t xml:space="preserve">Modules. </w:t>
-      </w:r>
-      <w:r>
-        <w:rPr>
-          <w:rFonts w:ascii="Calibri" w:hAnsi="Calibri"/>
-        </w:rPr>
-        <w:t>The separate sets of terms you accept in Studio’s Earn tab once inside the program: Watch Page Monetization for long-form ads and Premium, Shorts Monetization for the Shorts feed, and the Commerce Product Module for fan funding.</w:t>
-      </w:r>
-    </w:p>
-    <w:p>
-      <w:r>
-        <w:rPr>
-          <w:rFonts w:ascii="Calibri" w:hAnsi="Calibri"/>
-          <w:b/>
-        </w:rPr>
-        <w:t xml:space="preserve">CPM. </w:t>
-      </w:r>
-      <w:r>
-        <w:rPr>
-          <w:rFonts w:ascii="Calibri" w:hAnsi="Calibri"/>
-        </w:rPr>
-        <w:t>What advertisers paid per 1,000 ad impressions on your videos, before YouTube’s share. Ads and Premium only, monetized views only.</w:t>
-      </w:r>
-    </w:p>
-    <w:p>
-      <w:r>
-        <w:rPr>
-          <w:rFonts w:ascii="Calibri" w:hAnsi="Calibri"/>
-          <w:b/>
-        </w:rPr>
-        <w:t xml:space="preserve">Playback-based CPM. </w:t>
-      </w:r>
-      <w:r>
-        <w:rPr>
-          <w:rFonts w:ascii="Calibri" w:hAnsi="Calibri"/>
-        </w:rPr>
-        <w:t>What advertisers paid per 1,000 playbacks that showed at least one ad. Often higher than CPM, because one playback can carry two ads.</w:t>
-      </w:r>
-    </w:p>
-    <w:p>
-      <w:r>
-        <w:rPr>
-          <w:rFonts w:ascii="Calibri" w:hAnsi="Calibri"/>
-          <w:b/>
-        </w:rPr>
-        <w:t xml:space="preserve">RPM. </w:t>
-      </w:r>
-      <w:r>
-        <w:rPr>
-          <w:rFonts w:ascii="Calibri" w:hAnsi="Calibri"/>
-        </w:rPr>
-        <w:t>Your total revenue after YouTube’s share, per 1,000 engaged views, including views with no ad. Includes ads, Premium, memberships, Super Chat, and Super Stickers. Usually lower than CPM.</w:t>
-      </w:r>
-    </w:p>
-    <w:p>
-      <w:r>
-        <w:rPr>
-          <w:rFonts w:ascii="Calibri" w:hAnsi="Calibri"/>
-          <w:b/>
-        </w:rPr>
-        <w:t xml:space="preserve">Mid-roll. </w:t>
-      </w:r>
-      <w:r>
-        <w:rPr>
-          <w:rFonts w:ascii="Calibri" w:hAnsi="Calibri"/>
-        </w:rPr>
-        <w:t>An ad break during a video. Available on monetized videos eight minutes or longer, placed automatically, by hand, or both. Breaks at natural pauses are more likely to serve an ad.</w:t>
-      </w:r>
-    </w:p>
-    <w:p>
-      <w:r>
-        <w:rPr>
-          <w:rFonts w:ascii="Calibri" w:hAnsi="Calibri"/>
-          <w:b/>
-        </w:rPr>
-        <w:t xml:space="preserve">Limited ads. </w:t>
-      </w:r>
-      <w:r>
-        <w:rPr>
-          <w:rFonts w:ascii="Calibri" w:hAnsi="Calibri"/>
-        </w:rPr>
-        <w:t>The monetization status of a video that does not fully meet the advertiser-friendly guidelines: fewer advertisers, or none. Not a strike. You can request a human review.</w:t>
-      </w:r>
-    </w:p>
-    <w:p>
-      <w:r>
-        <w:rPr>
-          <w:rFonts w:ascii="Calibri" w:hAnsi="Calibri"/>
-          <w:b/>
-        </w:rPr>
-        <w:t xml:space="preserve">Shorts Creator Pool. </w:t>
-      </w:r>
-      <w:r>
-        <w:rPr>
-          <w:rFonts w:ascii="Calibri" w:hAnsi="Calibri"/>
-        </w:rPr>
-        <w:t>The monthly pot of Shorts Feed ad revenue that YouTube shares out by each monetizing channel’s share of engaged Shorts views, after a share for music licensing. The channel keeps 45% of its allocation. From 1 February 2027, a month counts only if the channel had 10 million qualified Shorts views in the previous 90 days.</w:t>
-      </w:r>
-    </w:p>
-    <w:p>
-      <w:r>
-        <w:rPr>
-          <w:rFonts w:ascii="Calibri" w:hAnsi="Calibri"/>
-          <w:b/>
-        </w:rPr>
-        <w:t xml:space="preserve">YouTube Premium revenue. </w:t>
-      </w:r>
-      <w:r>
-        <w:rPr>
-          <w:rFonts w:ascii="Calibri" w:hAnsi="Calibri"/>
-        </w:rPr>
-        <w:t>A share of Premium and Premium Lite subscription fees, pooled and paid by members’ watch time and views: 55% for long-form, 45% for Shorts, of the pool allocated to creators.</w:t>
-      </w:r>
-    </w:p>
-    <w:p>
-      <w:r>
-        <w:rPr>
-          <w:rFonts w:ascii="Calibri" w:hAnsi="Calibri"/>
-          <w:b/>
-        </w:rPr>
-        <w:t xml:space="preserve">Channel memberships. </w:t>
-      </w:r>
-      <w:r>
-        <w:rPr>
-          <w:rFonts w:ascii="Calibri" w:hAnsi="Calibri"/>
-        </w:rPr>
-        <w:t>Monthly payments from viewers for perks you choose, in up to six levels. The channel receives 70% after taxes and fees. Downloads of YouTube content, in-person one-to-one meetings, and random prizes are not allowed as perks.</w:t>
-      </w:r>
-    </w:p>
-    <w:p>
-      <w:r>
-        <w:rPr>
-          <w:rFonts w:ascii="Calibri" w:hAnsi="Calibri"/>
-          <w:b/>
-        </w:rPr>
-        <w:t xml:space="preserve">Super Chat and Super Stickers. </w:t>
-      </w:r>
-      <w:r>
-        <w:rPr>
-          <w:rFonts w:ascii="Calibri" w:hAnsi="Calibri"/>
-        </w:rPr>
-        <w:t>Paid, highlighted messages and animated stickers in the live chat of a live stream or premiere. The channel receives 70% after taxes and fees. YouTube says they are not donation tools.</w:t>
-      </w:r>
-    </w:p>
-    <w:p>
-      <w:r>
-        <w:rPr>
-          <w:rFonts w:ascii="Calibri" w:hAnsi="Calibri"/>
-          <w:b/>
-        </w:rPr>
-        <w:t xml:space="preserve">Super Thanks. </w:t>
-      </w:r>
-      <w:r>
-        <w:rPr>
-          <w:rFonts w:ascii="Calibri" w:hAnsi="Calibri"/>
-        </w:rPr>
-        <w:t>A one-time paid animation and highlighted comment on a long-form video or a Short. Not available on claimed, unlisted, made-for-kids, or comments-off videos, or while a stream is live. The channel receives 70% after taxes and fees.</w:t>
-      </w:r>
-    </w:p>
-    <w:p>
-      <w:r>
-        <w:rPr>
-          <w:rFonts w:ascii="Calibri" w:hAnsi="Calibri"/>
-          <w:b/>
-        </w:rPr>
-        <w:t xml:space="preserve">Sponsor. </w:t>
-      </w:r>
-      <w:r>
-        <w:rPr>
-          <w:rFonts w:ascii="Calibri" w:hAnsi="Calibri"/>
-        </w:rPr>
-        <w:t>One company paying you for one video or segment. Select paid promotion in Studio, say so in the video, and say so next to the link.</w:t>
-      </w:r>
-    </w:p>
-    <w:p>
-      <w:r>
-        <w:rPr>
-          <w:rFonts w:ascii="Calibri" w:hAnsi="Calibri"/>
-          <w:b/>
-        </w:rPr>
-        <w:t xml:space="preserve">Creator Partnerships. </w:t>
-      </w:r>
-      <w:r>
-        <w:rPr>
-          <w:rFonts w:ascii="Calibri" w:hAnsi="Calibri"/>
-        </w:rPr>
-        <w:t>YouTube’s matching tool between brands and creators. Open to channels in the Partner Program, 18 or older, in available countries, with no active Community Guidelines strikes.</w:t>
-      </w:r>
-    </w:p>
-    <w:p>
-      <w:r>
-        <w:rPr>
-          <w:rFonts w:ascii="Calibri" w:hAnsi="Calibri"/>
-          <w:b/>
-        </w:rPr>
-        <w:t xml:space="preserve">Affiliate link. </w:t>
-      </w:r>
-      <w:r>
-        <w:rPr>
-          <w:rFonts w:ascii="Calibri" w:hAnsi="Calibri"/>
-        </w:rPr>
-        <w:t>A link that pays you a commission if the viewer buys a product you recommended. Say so next to the link. The FTC pages in the sources list are the US disclosure guidance this book points at.</w:t>
-      </w:r>
-    </w:p>
-    <w:p>
-      <w:r>
-        <w:rPr>
-          <w:rFonts w:ascii="Calibri" w:hAnsi="Calibri"/>
-          <w:b/>
-        </w:rPr>
-        <w:t xml:space="preserve">Shopping affiliate program. </w:t>
-      </w:r>
-      <w:r>
-        <w:rPr>
-          <w:rFonts w:ascii="Calibri" w:hAnsi="Calibri"/>
-        </w:rPr>
-        <w:t>YouTube’s own affiliate program for tagging other brands’ products in Shorts, long videos, and live streams. Open to partners with at least 500 subscribers in listed countries since March 2026.</w:t>
-      </w:r>
-    </w:p>
-    <w:p>
-      <w:r>
-        <w:rPr>
-          <w:rFonts w:ascii="Calibri" w:hAnsi="Calibri"/>
-          <w:b/>
-        </w:rPr>
-        <w:t xml:space="preserve">Inauthentic content. </w:t>
-      </w:r>
-      <w:r>
-        <w:rPr>
-          <w:rFonts w:ascii="Calibri" w:hAnsi="Calibri"/>
-        </w:rPr>
-        <w:t>YouTube’s monetization name, since July 2025, for templated, repetitive, or mass-produced videos, including generic AI-made ones. It can keep a whole channel out of the Partner Program.</w:t>
-      </w:r>
-    </w:p>
-    <w:p>
-      <w:r>
-        <w:rPr>
-          <w:rFonts w:ascii="Calibri" w:hAnsi="Calibri"/>
-          <w:b/>
-        </w:rPr>
-        <w:t xml:space="preserve">Reused content. </w:t>
-      </w:r>
-      <w:r>
-        <w:rPr>
-          <w:rFonts w:ascii="Calibri" w:hAnsi="Calibri"/>
-        </w:rPr>
-        <w:t>Someone else’s material republished without significant original commentary, modification, or educational value. A monetization policy that applies to the whole channel.</w:t>
-      </w:r>
-    </w:p>
-    <w:p>
-      <w:r>
-        <w:rPr>
-          <w:rFonts w:ascii="Calibri" w:hAnsi="Calibri"/>
-          <w:b/>
-        </w:rPr>
-        <w:t xml:space="preserve">End screen. </w:t>
-      </w:r>
-      <w:r>
-        <w:rPr>
-          <w:rFonts w:ascii="Calibri" w:hAnsi="Calibri"/>
-        </w:rPr>
-        <w:t>An element in the last 5 to 20 seconds of a video at least 25 seconds long. One that opens a site outside YouTube requires the Partner Program.</w:t>
-      </w:r>
-    </w:p>
-    <w:p>
-      <w:r>
-        <w:rPr>
-          <w:rFonts w:ascii="Calibri" w:hAnsi="Calibri"/>
-          <w:b/>
-        </w:rPr>
-        <w:t xml:space="preserve">Info card. </w:t>
-      </w:r>
-      <w:r>
-        <w:rPr>
-          <w:rFonts w:ascii="Calibri" w:hAnsi="Calibri"/>
-        </w:rPr>
-        <w:t>A small panel attached to the video. One that opens a site outside YouTube also requires the Partner Program.</w:t>
-      </w:r>
-    </w:p>
-    <w:p>
-      <w:r>
-        <w:rPr>
-          <w:rFonts w:ascii="Calibri" w:hAnsi="Calibri"/>
-          <w:b/>
-        </w:rPr>
-        <w:t xml:space="preserve">Series playlist. </w:t>
-      </w:r>
-      <w:r>
-        <w:rPr>
-          <w:rFonts w:ascii="Calibri" w:hAnsi="Calibri"/>
-        </w:rPr>
-        <w:t>A playlist YouTube can feature as the next video while someone is watching one of yours. The account has to be verified, the videos have to be yours, and a video can sit in only one series playlist.</w:t>
-      </w:r>
-    </w:p>
-    <w:p>
-      <w:r>
-        <w:rPr>
-          <w:rFonts w:ascii="Calibri" w:hAnsi="Calibri"/>
-          <w:b/>
-        </w:rPr>
-        <w:t xml:space="preserve">Short. </w:t>
-      </w:r>
-      <w:r>
-        <w:rPr>
-          <w:rFonts w:ascii="Calibri" w:hAnsi="Calibri"/>
-        </w:rPr>
-        <w:t>A vertical video, 1080 by 1920. An address in a Short’s description or comments is not clickable. A Short can point at a long video.</w:t>
-      </w:r>
-    </w:p>
-    <w:p>
-      <w:r>
-        <w:rPr>
-          <w:rFonts w:ascii="Calibri" w:hAnsi="Calibri"/>
-          <w:b/>
-        </w:rPr>
-        <w:t xml:space="preserve">H.264. </w:t>
-      </w:r>
-      <w:r>
-        <w:rPr>
-          <w:rFonts w:ascii="Calibri" w:hAnsi="Calibri"/>
-        </w:rPr>
-        <w:t>The video codec named in YouTube’s recommended upload settings for an MP4. The audio codec named beside it is AAC-LC.</w:t>
-      </w:r>
-    </w:p>
-    <w:p>
-      <w:r>
-        <w:rPr>
-          <w:rFonts w:ascii="Calibri" w:hAnsi="Calibri"/>
-          <w:b/>
-        </w:rPr>
-        <w:t xml:space="preserve">Closed captions. </w:t>
-      </w:r>
-      <w:r>
-        <w:rPr>
-          <w:rFonts w:ascii="Calibri" w:hAnsi="Calibri"/>
-        </w:rPr>
-        <w:t>A text track the viewer can turn on or off. The words can be searched. They are not burned into the picture.</w:t>
-      </w:r>
-    </w:p>
-    <w:p>
-      <w:r>
-        <w:rPr>
-          <w:rFonts w:ascii="Calibri" w:hAnsi="Calibri"/>
-          <w:b/>
-        </w:rPr>
-        <w:t xml:space="preserve">Burned-in captions. </w:t>
-      </w:r>
-      <w:r>
-        <w:rPr>
-          <w:rFonts w:ascii="Calibri" w:hAnsi="Calibri"/>
-        </w:rPr>
-        <w:t>Words that are part of the picture. They stay on. They are a different choice from closed captions.</w:t>
-      </w:r>
-    </w:p>
-    <w:p>
-      <w:r>
-        <w:rPr>
-          <w:rFonts w:ascii="Calibri" w:hAnsi="Calibri"/>
-          <w:b/>
-        </w:rPr>
-        <w:t xml:space="preserve">Fader. </w:t>
-      </w:r>
-      <w:r>
-        <w:rPr>
-          <w:rFonts w:ascii="Calibri" w:hAnsi="Calibri"/>
-        </w:rPr>
-        <w:t>The volume slider in an editor. A music fader at about a tenth to a fifth of the way up is a position on that slider, not a measurement of loudness.</w:t>
-      </w:r>
-    </w:p>
-    <w:p>
-      <w:r>
-        <w:rPr>
-          <w:rFonts w:ascii="Calibri" w:hAnsi="Calibri"/>
-          <w:b/>
-        </w:rPr>
-        <w:t xml:space="preserve">Text-to-speech. </w:t>
-      </w:r>
-      <w:r>
-        <w:rPr>
-          <w:rFonts w:ascii="Calibri" w:hAnsi="Calibri"/>
-        </w:rPr>
-        <w:t>A tool that reads a script aloud. Usable when the voice is not a clone of someone else. Cloning someone else’s voice is a consent question the tool does not answer for you.</w:t>
-      </w:r>
-    </w:p>
-    <w:p>
-      <w:r>
-        <w:rPr>
-          <w:rFonts w:ascii="Calibri" w:hAnsi="Calibri"/>
-          <w:b/>
-        </w:rPr>
-        <w:t xml:space="preserve">Stock license. </w:t>
-      </w:r>
-      <w:r>
-        <w:rPr>
-          <w:rFonts w:ascii="Calibri" w:hAnsi="Calibri"/>
-        </w:rPr>
-        <w:t>The terms on one clip or track. “Free” and “free to use commercially” are different sentences. Read the line on that file before you publish it, including on a second site.</w:t>
-      </w:r>
-    </w:p>
-    <w:p>
-      <w:r>
-        <w:rPr>
-          <w:rFonts w:ascii="Calibri" w:hAnsi="Calibri"/>
-          <w:b/>
-        </w:rPr>
-        <w:t xml:space="preserve">Impression. </w:t>
-      </w:r>
-      <w:r>
-        <w:rPr>
-          <w:rFonts w:ascii="Calibri" w:hAnsi="Calibri"/>
-        </w:rPr>
-        <w:t>In Studio, a thumbnail shown on YouTube for more than one second with at least half of it visible. Thumbnails on other websites, in end screens, and in notifications are not counted.</w:t>
-      </w:r>
-    </w:p>
-    <w:p>
-      <w:r>
-        <w:rPr>
-          <w:rFonts w:ascii="Calibri" w:hAnsi="Calibri"/>
-          <w:b/>
-        </w:rPr>
-        <w:t xml:space="preserve">Impressions click-through rate. </w:t>
-      </w:r>
-      <w:r>
-        <w:rPr>
-          <w:rFonts w:ascii="Calibri" w:hAnsi="Calibri"/>
-        </w:rPr>
-        <w:t>How often a counted impression became a view. YouTube says half of channels and videos fall between 2% and 10%. It is a band, not a target.</w:t>
-      </w:r>
-    </w:p>
-    <w:p>
-      <w:r>
-        <w:rPr>
-          <w:rFonts w:ascii="Calibri" w:hAnsi="Calibri"/>
-          <w:b/>
-        </w:rPr>
-        <w:t xml:space="preserve">Traffic source. </w:t>
-      </w:r>
-      <w:r>
-        <w:rPr>
-          <w:rFonts w:ascii="Calibri" w:hAnsi="Calibri"/>
-        </w:rPr>
-        <w:t>Studio’s label for how a viewer reached a video: search, suggested videos, browse features, playlists, external, and others. Views from links in video descriptions are filed under suggested videos.</w:t>
-      </w:r>
-    </w:p>
-    <w:p>
-      <w:r>
-        <w:rPr>
-          <w:rFonts w:ascii="Calibri" w:hAnsi="Calibri"/>
-          <w:b/>
-        </w:rPr>
-        <w:t xml:space="preserve">Video chapters. </w:t>
-      </w:r>
-      <w:r>
-        <w:rPr>
-          <w:rFonts w:ascii="Calibri" w:hAnsi="Calibri"/>
-        </w:rPr>
-        <w:t>Timestamps in the description that split a video into named parts. The first is 00:00, there are at least three, and each part is at least ten seconds.</w:t>
-      </w:r>
-    </w:p>
-    <w:p>
-      <w:r>
-        <w:rPr>
-          <w:rFonts w:ascii="Calibri" w:hAnsi="Calibri"/>
-          <w:b/>
-        </w:rPr>
-        <w:t xml:space="preserve">Community Guidelines warning. </w:t>
-      </w:r>
-      <w:r>
-        <w:rPr>
-          <w:rFonts w:ascii="Calibri" w:hAnsi="Calibri"/>
-        </w:rPr>
-        <w:t>What a first violation typically gets. An optional policy training lets it expire 90 days after the training. A further violation of the same policy in that window can become a strike.</w:t>
-      </w:r>
-    </w:p>
-    <w:p>
-      <w:r>
-        <w:rPr>
-          <w:rFonts w:ascii="Calibri" w:hAnsi="Calibri"/>
-          <w:b/>
-        </w:rPr>
-        <w:t xml:space="preserve">Copyright strike. </w:t>
-      </w:r>
-      <w:r>
-        <w:rPr>
-          <w:rFonts w:ascii="Calibri" w:hAnsi="Calibri"/>
-        </w:rPr>
-        <w:t>The result of a valid legal removal request. The video comes down. It expires 90 days after it was applied once Copyright School is done, or it can be resolved by a retraction or a counter notification.</w:t>
-      </w:r>
-    </w:p>
-    <w:p>
-      <w:r>
-        <w:rPr>
-          <w:rFonts w:ascii="Calibri" w:hAnsi="Calibri"/>
-          <w:b/>
-        </w:rPr>
-        <w:t xml:space="preserve">Content ID claim. </w:t>
-      </w:r>
-      <w:r>
-        <w:rPr>
-          <w:rFonts w:ascii="Calibri" w:hAnsi="Calibri"/>
-        </w:rPr>
-        <w:t>An automatic match against a rights holder’s file. It affects that video: monetize, track, or block. It is not a strike, unless a dispute without a valid reason leads to a removal request.</w:t>
-      </w:r>
-    </w:p>
-    <w:p>
-      <w:r>
-        <w:rPr>
-          <w:rFonts w:ascii="Calibri" w:hAnsi="Calibri"/>
-          <w:b/>
-        </w:rPr>
-        <w:t xml:space="preserve">Paid promotion setting. </w:t>
-      </w:r>
-      <w:r>
-        <w:rPr>
-          <w:rFonts w:ascii="Calibri" w:hAnsi="Calibri"/>
-        </w:rPr>
-        <w:t>The option in video details you select when a company paid you or gave you the product for a video. YouTube then shows a disclosure. Say it in the video as well.</w:t>
-      </w:r>
-    </w:p>
-    <w:p>
-      <w:r>
-        <w:rPr>
-          <w:rFonts w:ascii="Calibri" w:hAnsi="Calibri"/>
-          <w:b/>
-        </w:rPr>
-        <w:t xml:space="preserve">AI use. </w:t>
-      </w:r>
-      <w:r>
-        <w:rPr>
-          <w:rFonts w:ascii="Calibri" w:hAnsi="Calibri"/>
-        </w:rPr>
-        <w:t>The upload setting for realistic content that generative AI made or meaningfully altered, including AI-generated music that is the main focus of the video. Scripts, ideas, captions, thumbnails, and a clone of your own voice for voice-overs do not need it.</w:t>
-      </w:r>
-    </w:p>
-    <w:p>
-      <w:r>
-        <w:rPr>
-          <w:rFonts w:ascii="Calibri" w:hAnsi="Calibri"/>
-          <w:b/>
-        </w:rPr>
-        <w:t xml:space="preserve">Made for kids. </w:t>
-      </w:r>
-      <w:r>
-        <w:rPr>
-          <w:rFonts w:ascii="Calibri" w:hAnsi="Calibri"/>
-        </w:rPr>
-        <w:t>The audience setting for videos directed to children, required under US law. It turns off comments, end screens, personalized ads, memberships, Supers, and more on those videos.</w:t>
-      </w:r>
-    </w:p>
-    <w:p>
-      <w:pPr>
-        <w:sectPr>
           <w:headerReference w:type="default" r:id="rId129"/>
           <w:footerReference w:type="default" r:id="rId130"/>
           <w:pgSz w:w="10080" w:h="14400"/>
@@ -22774,6 +22153,782 @@
       </w:pPr>
     </w:p>
     <w:p>
+      <w:bookmarkStart w:id="139" w:name="toc138"/>
+      <w:pPr>
+        <w:pStyle w:val="Heading1"/>
+      </w:pPr>
+      <w:r>
+        <w:t>The last word</w:t>
+      </w:r>
+      <w:bookmarkEnd w:id="139"/>
+    </w:p>
+    <w:p>
+      <w:r>
+        <w:rPr>
+          <w:rFonts w:ascii="Calibri" w:hAnsi="Calibri"/>
+        </w:rPr>
+        <w:t>The channel in this book does not start with money. It starts with one viewer and a question they would type, and it earns the right to be paid one finished minute at a time: a title that names the problem, an opening that keeps the promise, a method given away, a next video named inside the last one.</w:t>
+      </w:r>
+    </w:p>
+    <w:p>
+      <w:r>
+        <w:rPr>
+          <w:rFonts w:ascii="Calibri" w:hAnsi="Calibri"/>
+        </w:rPr>
+        <w:t>The gates are arithmetic. Subscribers, plus hours or Shorts views, inside a window that rolls. Once you can work out how many views a day your channel needs at its own view duration, the gate stops being a mystery and becomes a distance, and chapter 4’s work on the opening becomes the cheapest way to shorten it.</w:t>
+      </w:r>
+    </w:p>
+    <w:p>
+      <w:r>
+        <w:rPr>
+          <w:rFonts w:ascii="Calibri" w:hAnsi="Calibri"/>
+        </w:rPr>
+        <w:t>Past the gate, the money comes in five kinds, and each one pays for something different. Ads pay for reach. Memberships pay for loyalty. Supers pay for presence. Sponsors pay for a precise viewer. Affiliate commissions pay for recommendations people act on. A channel that keeps all five small and honest survives the next rule change. A channel that bets on one does not.</w:t>
+      </w:r>
+    </w:p>
+    <w:p>
+      <w:r>
+        <w:rPr>
+          <w:rFonts w:ascii="Calibri" w:hAnsi="Calibri"/>
+        </w:rPr>
+        <w:t>The numbers will move again before the next edition of this book. Check the Earn tab, read the help page, write the date in the decision log. Then make the next video for the same person you named on the first page.</w:t>
+      </w:r>
+    </w:p>
+    <w:p>
+      <w:pPr>
+        <w:sectPr>
+          <w:headerReference w:type="default" r:id="rId131"/>
+          <w:footerReference w:type="default" r:id="rId132"/>
+          <w:pgSz w:w="10080" w:h="14400"/>
+          <w:pgMar w:top="1008" w:right="1008" w:bottom="1008" w:left="1008" w:header="504" w:footer="504" w:gutter="0"/>
+          <w:cols w:space="720"/>
+          <w:titlePg/>
+          <w:docGrid w:linePitch="360"/>
+        </w:sectPr>
+      </w:pPr>
+    </w:p>
+    <w:p>
+      <w:bookmarkStart w:id="140" w:name="toc139"/>
+      <w:pPr>
+        <w:pStyle w:val="Heading1"/>
+      </w:pPr>
+      <w:r>
+        <w:t>Glossary</w:t>
+      </w:r>
+      <w:bookmarkEnd w:id="140"/>
+    </w:p>
+    <w:p>
+      <w:r>
+        <w:rPr>
+          <w:rFonts w:ascii="Calibri" w:hAnsi="Calibri"/>
+        </w:rPr>
+        <w:t>Short definitions for terms this book uses. A definition here is not a substitute for the platform page cited in the chapter.</w:t>
+      </w:r>
+    </w:p>
+    <w:p>
+      <w:r>
+        <w:rPr>
+          <w:rFonts w:ascii="Calibri" w:hAnsi="Calibri"/>
+          <w:b/>
+        </w:rPr>
+        <w:t xml:space="preserve">Eight jobs. </w:t>
+      </w:r>
+      <w:r>
+        <w:rPr>
+          <w:rFonts w:ascii="Calibri" w:hAnsi="Calibri"/>
+        </w:rPr>
+        <w:t>The only set of videos this book asks you to finish: who it is for, the problem in their words, the method, proof, the comparison, one objection, the deep dive, and which video to watch next. Chapters 2, 5, and 6 use this same set.</w:t>
+      </w:r>
+    </w:p>
+    <w:p>
+      <w:r>
+        <w:rPr>
+          <w:rFonts w:ascii="Calibri" w:hAnsi="Calibri"/>
+          <w:b/>
+        </w:rPr>
+        <w:t xml:space="preserve">Deep dive. </w:t>
+      </w:r>
+      <w:r>
+        <w:rPr>
+          <w:rFonts w:ascii="Calibri" w:hAnsi="Calibri"/>
+        </w:rPr>
+        <w:t>The long, complete video in the eight jobs, built to be watched for a long time. The video that fills the hour bar, and the one that can honestly pass eight minutes for mid-roll ads.</w:t>
+      </w:r>
+    </w:p>
+    <w:p>
+      <w:r>
+        <w:rPr>
+          <w:rFonts w:ascii="Calibri" w:hAnsi="Calibri"/>
+          <w:b/>
+        </w:rPr>
+        <w:t xml:space="preserve">Expanded program. </w:t>
+      </w:r>
+      <w:r>
+        <w:rPr>
+          <w:rFonts w:ascii="Calibri" w:hAnsi="Calibri"/>
+        </w:rPr>
+        <w:t>In countries where YouTube has opened it, the earlier tier of the Partner Program: 500 subscribers, three public uploads in 90 days, and either 3,000 long-form hours in a year or 3 million Shorts views in 90 days. Fan funding, Shopping, and Creator Partnerships. Not a share of watch-page ads. Unchanged by the 2027 update.</w:t>
+      </w:r>
+    </w:p>
+    <w:p>
+      <w:r>
+        <w:rPr>
+          <w:rFonts w:ascii="Calibri" w:hAnsi="Calibri"/>
+          <w:b/>
+        </w:rPr>
+        <w:t xml:space="preserve">YouTube Partner Program. </w:t>
+      </w:r>
+      <w:r>
+        <w:rPr>
+          <w:rFonts w:ascii="Calibri" w:hAnsi="Calibri"/>
+        </w:rPr>
+        <w:t>The higher gate: 1,000 subscribers and either 4,000 long-form hours in 12 months or 10 million qualified Shorts views in 90 days. For channels that apply from 1 February 2027: 8,000 hours in 365 days or 20 million Shorts views in 90 days. This is the gate that adds watch-page ads, Shorts Feed ads, and YouTube Premium revenue. Channels already in the program keep their status.</w:t>
+      </w:r>
+    </w:p>
+    <w:p>
+      <w:r>
+        <w:rPr>
+          <w:rFonts w:ascii="Calibri" w:hAnsi="Calibri"/>
+          <w:b/>
+        </w:rPr>
+        <w:t xml:space="preserve">Qualified watch hours. </w:t>
+      </w:r>
+      <w:r>
+        <w:rPr>
+          <w:rFonts w:ascii="Calibri" w:hAnsi="Calibri"/>
+        </w:rPr>
+        <w:t>Public long-form viewing that YouTube counts toward the hour bars. Hours watched in the Shorts feed do not count. Private, unlisted, deleted, and ad-campaign views do not count.</w:t>
+      </w:r>
+    </w:p>
+    <w:p>
+      <w:r>
+        <w:rPr>
+          <w:rFonts w:ascii="Calibri" w:hAnsi="Calibri"/>
+          <w:b/>
+        </w:rPr>
+        <w:t xml:space="preserve">Qualified Shorts views. </w:t>
+      </w:r>
+      <w:r>
+        <w:rPr>
+          <w:rFonts w:ascii="Calibri" w:hAnsi="Calibri"/>
+        </w:rPr>
+        <w:t>Public views of Shorts in the Shorts feed that YouTube counts toward the Shorts bars: 3 million in 90 days for the expanded program, or 10 million in 90 days for the Partner Program (20 million for channels applying from 1 February 2027). They do not fill the long-form hour bars.</w:t>
+      </w:r>
+    </w:p>
+    <w:p>
+      <w:r>
+        <w:rPr>
+          <w:rFonts w:ascii="Calibri" w:hAnsi="Calibri"/>
+          <w:b/>
+        </w:rPr>
+        <w:t xml:space="preserve">Follow-on views. </w:t>
+      </w:r>
+      <w:r>
+        <w:rPr>
+          <w:rFonts w:ascii="Calibri" w:hAnsi="Calibri"/>
+        </w:rPr>
+        <w:t>Organic views from people who watch more of your videos after seeing a promoted one. The only part of a paid campaign that counts toward the Partner Program.</w:t>
+      </w:r>
+    </w:p>
+    <w:p>
+      <w:r>
+        <w:rPr>
+          <w:rFonts w:ascii="Calibri" w:hAnsi="Calibri"/>
+          <w:b/>
+        </w:rPr>
+        <w:t xml:space="preserve">Advanced features. </w:t>
+      </w:r>
+      <w:r>
+        <w:rPr>
+          <w:rFonts w:ascii="Calibri" w:hAnsi="Calibri"/>
+        </w:rPr>
+        <w:t>The Studio status that makes an address in a long-form description, and in a long-form comment, clickable. Phone verification comes first. A Short’s description and comments stay unclickable after it is on. The Partner Program requires it.</w:t>
+      </w:r>
+    </w:p>
+    <w:p>
+      <w:r>
+        <w:rPr>
+          <w:rFonts w:ascii="Calibri" w:hAnsi="Calibri"/>
+          <w:b/>
+        </w:rPr>
+        <w:t xml:space="preserve">AdSense. </w:t>
+      </w:r>
+      <w:r>
+        <w:rPr>
+          <w:rFonts w:ascii="Calibri" w:hAnsi="Calibri"/>
+        </w:rPr>
+        <w:t>AdSense for YouTube, the Google account YouTube uses to pay a channel it has accepted. Meeting a subscriber number does not open it. You apply, and YouTube reviews the channel.</w:t>
+      </w:r>
+    </w:p>
+    <w:p>
+      <w:r>
+        <w:rPr>
+          <w:rFonts w:ascii="Calibri" w:hAnsi="Calibri"/>
+          <w:b/>
+        </w:rPr>
+        <w:t xml:space="preserve">Modules. </w:t>
+      </w:r>
+      <w:r>
+        <w:rPr>
+          <w:rFonts w:ascii="Calibri" w:hAnsi="Calibri"/>
+        </w:rPr>
+        <w:t>The separate sets of terms you accept in Studio’s Earn tab once inside the program: Watch Page Monetization for long-form ads and Premium, Shorts Monetization for the Shorts feed, and the Commerce Product Module for fan funding.</w:t>
+      </w:r>
+    </w:p>
+    <w:p>
+      <w:r>
+        <w:rPr>
+          <w:rFonts w:ascii="Calibri" w:hAnsi="Calibri"/>
+          <w:b/>
+        </w:rPr>
+        <w:t xml:space="preserve">CPM. </w:t>
+      </w:r>
+      <w:r>
+        <w:rPr>
+          <w:rFonts w:ascii="Calibri" w:hAnsi="Calibri"/>
+        </w:rPr>
+        <w:t>What advertisers paid per 1,000 ad impressions on your videos, before YouTube’s share. Ads and Premium only, monetized views only.</w:t>
+      </w:r>
+    </w:p>
+    <w:p>
+      <w:r>
+        <w:rPr>
+          <w:rFonts w:ascii="Calibri" w:hAnsi="Calibri"/>
+          <w:b/>
+        </w:rPr>
+        <w:t xml:space="preserve">Playback-based CPM. </w:t>
+      </w:r>
+      <w:r>
+        <w:rPr>
+          <w:rFonts w:ascii="Calibri" w:hAnsi="Calibri"/>
+        </w:rPr>
+        <w:t>What advertisers paid per 1,000 playbacks that showed at least one ad. Often higher than CPM, because one playback can carry two ads.</w:t>
+      </w:r>
+    </w:p>
+    <w:p>
+      <w:r>
+        <w:rPr>
+          <w:rFonts w:ascii="Calibri" w:hAnsi="Calibri"/>
+          <w:b/>
+        </w:rPr>
+        <w:t xml:space="preserve">RPM. </w:t>
+      </w:r>
+      <w:r>
+        <w:rPr>
+          <w:rFonts w:ascii="Calibri" w:hAnsi="Calibri"/>
+        </w:rPr>
+        <w:t>Your total revenue after YouTube’s share, per 1,000 engaged views, including views with no ad. Includes ads, Premium, memberships, Super Chat, and Super Stickers. Usually lower than CPM.</w:t>
+      </w:r>
+    </w:p>
+    <w:p>
+      <w:r>
+        <w:rPr>
+          <w:rFonts w:ascii="Calibri" w:hAnsi="Calibri"/>
+          <w:b/>
+        </w:rPr>
+        <w:t xml:space="preserve">Mid-roll. </w:t>
+      </w:r>
+      <w:r>
+        <w:rPr>
+          <w:rFonts w:ascii="Calibri" w:hAnsi="Calibri"/>
+        </w:rPr>
+        <w:t>An ad break during a video. Available on monetized videos eight minutes or longer, placed automatically, by hand, or both. Breaks at natural pauses are more likely to serve an ad.</w:t>
+      </w:r>
+    </w:p>
+    <w:p>
+      <w:r>
+        <w:rPr>
+          <w:rFonts w:ascii="Calibri" w:hAnsi="Calibri"/>
+          <w:b/>
+        </w:rPr>
+        <w:t xml:space="preserve">Limited ads. </w:t>
+      </w:r>
+      <w:r>
+        <w:rPr>
+          <w:rFonts w:ascii="Calibri" w:hAnsi="Calibri"/>
+        </w:rPr>
+        <w:t>The monetization status of a video that does not fully meet the advertiser-friendly guidelines: fewer advertisers, or none. Not a strike. You can request a human review.</w:t>
+      </w:r>
+    </w:p>
+    <w:p>
+      <w:r>
+        <w:rPr>
+          <w:rFonts w:ascii="Calibri" w:hAnsi="Calibri"/>
+          <w:b/>
+        </w:rPr>
+        <w:t xml:space="preserve">Shorts Creator Pool. </w:t>
+      </w:r>
+      <w:r>
+        <w:rPr>
+          <w:rFonts w:ascii="Calibri" w:hAnsi="Calibri"/>
+        </w:rPr>
+        <w:t>The monthly pot of Shorts Feed ad revenue that YouTube shares out by each monetizing channel’s share of engaged Shorts views, after a share for music licensing. The channel keeps 45% of its allocation. From 1 February 2027, a month counts only if the channel had 10 million qualified Shorts views in the previous 90 days.</w:t>
+      </w:r>
+    </w:p>
+    <w:p>
+      <w:r>
+        <w:rPr>
+          <w:rFonts w:ascii="Calibri" w:hAnsi="Calibri"/>
+          <w:b/>
+        </w:rPr>
+        <w:t xml:space="preserve">YouTube Premium revenue. </w:t>
+      </w:r>
+      <w:r>
+        <w:rPr>
+          <w:rFonts w:ascii="Calibri" w:hAnsi="Calibri"/>
+        </w:rPr>
+        <w:t>A share of Premium and Premium Lite subscription fees, pooled and paid by members’ watch time and views: 55% for long-form, 45% for Shorts, of the pool allocated to creators.</w:t>
+      </w:r>
+    </w:p>
+    <w:p>
+      <w:r>
+        <w:rPr>
+          <w:rFonts w:ascii="Calibri" w:hAnsi="Calibri"/>
+          <w:b/>
+        </w:rPr>
+        <w:t xml:space="preserve">Channel memberships. </w:t>
+      </w:r>
+      <w:r>
+        <w:rPr>
+          <w:rFonts w:ascii="Calibri" w:hAnsi="Calibri"/>
+        </w:rPr>
+        <w:t>Monthly payments from viewers for perks you choose, in up to six levels. The channel receives 70% after taxes and fees. Downloads of YouTube content, in-person one-to-one meetings, and random prizes are not allowed as perks.</w:t>
+      </w:r>
+    </w:p>
+    <w:p>
+      <w:r>
+        <w:rPr>
+          <w:rFonts w:ascii="Calibri" w:hAnsi="Calibri"/>
+          <w:b/>
+        </w:rPr>
+        <w:t xml:space="preserve">Super Chat and Super Stickers. </w:t>
+      </w:r>
+      <w:r>
+        <w:rPr>
+          <w:rFonts w:ascii="Calibri" w:hAnsi="Calibri"/>
+        </w:rPr>
+        <w:t>Paid, highlighted messages and animated stickers in the live chat of a live stream or premiere. The channel receives 70% after taxes and fees. YouTube says they are not donation tools.</w:t>
+      </w:r>
+    </w:p>
+    <w:p>
+      <w:r>
+        <w:rPr>
+          <w:rFonts w:ascii="Calibri" w:hAnsi="Calibri"/>
+          <w:b/>
+        </w:rPr>
+        <w:t xml:space="preserve">Super Thanks. </w:t>
+      </w:r>
+      <w:r>
+        <w:rPr>
+          <w:rFonts w:ascii="Calibri" w:hAnsi="Calibri"/>
+        </w:rPr>
+        <w:t>A one-time paid animation and highlighted comment on a long-form video or a Short. Not available on claimed, unlisted, made-for-kids, or comments-off videos, or while a stream is live. The channel receives 70% after taxes and fees.</w:t>
+      </w:r>
+    </w:p>
+    <w:p>
+      <w:r>
+        <w:rPr>
+          <w:rFonts w:ascii="Calibri" w:hAnsi="Calibri"/>
+          <w:b/>
+        </w:rPr>
+        <w:t xml:space="preserve">Sponsor. </w:t>
+      </w:r>
+      <w:r>
+        <w:rPr>
+          <w:rFonts w:ascii="Calibri" w:hAnsi="Calibri"/>
+        </w:rPr>
+        <w:t>One company paying you for one video or segment. Select paid promotion in Studio, say so in the video, and say so next to the link.</w:t>
+      </w:r>
+    </w:p>
+    <w:p>
+      <w:r>
+        <w:rPr>
+          <w:rFonts w:ascii="Calibri" w:hAnsi="Calibri"/>
+          <w:b/>
+        </w:rPr>
+        <w:t xml:space="preserve">Creator Partnerships. </w:t>
+      </w:r>
+      <w:r>
+        <w:rPr>
+          <w:rFonts w:ascii="Calibri" w:hAnsi="Calibri"/>
+        </w:rPr>
+        <w:t>YouTube’s matching tool between brands and creators. Open to channels in the Partner Program, 18 or older, in available countries, with no active Community Guidelines strikes.</w:t>
+      </w:r>
+    </w:p>
+    <w:p>
+      <w:r>
+        <w:rPr>
+          <w:rFonts w:ascii="Calibri" w:hAnsi="Calibri"/>
+          <w:b/>
+        </w:rPr>
+        <w:t xml:space="preserve">Affiliate link. </w:t>
+      </w:r>
+      <w:r>
+        <w:rPr>
+          <w:rFonts w:ascii="Calibri" w:hAnsi="Calibri"/>
+        </w:rPr>
+        <w:t>A link that pays you a commission if the viewer buys a product you recommended. Say so next to the link. The FTC pages in the sources list are the US disclosure guidance this book points at.</w:t>
+      </w:r>
+    </w:p>
+    <w:p>
+      <w:r>
+        <w:rPr>
+          <w:rFonts w:ascii="Calibri" w:hAnsi="Calibri"/>
+          <w:b/>
+        </w:rPr>
+        <w:t xml:space="preserve">Shopping affiliate program. </w:t>
+      </w:r>
+      <w:r>
+        <w:rPr>
+          <w:rFonts w:ascii="Calibri" w:hAnsi="Calibri"/>
+        </w:rPr>
+        <w:t>YouTube’s own affiliate program for tagging other brands’ products in Shorts, long videos, and live streams. Open to partners with at least 500 subscribers in listed countries since March 2026.</w:t>
+      </w:r>
+    </w:p>
+    <w:p>
+      <w:r>
+        <w:rPr>
+          <w:rFonts w:ascii="Calibri" w:hAnsi="Calibri"/>
+          <w:b/>
+        </w:rPr>
+        <w:t xml:space="preserve">Inauthentic content. </w:t>
+      </w:r>
+      <w:r>
+        <w:rPr>
+          <w:rFonts w:ascii="Calibri" w:hAnsi="Calibri"/>
+        </w:rPr>
+        <w:t>YouTube’s monetization name, since July 2025, for templated, repetitive, or mass-produced videos, including generic AI-made ones. It can keep a whole channel out of the Partner Program.</w:t>
+      </w:r>
+    </w:p>
+    <w:p>
+      <w:r>
+        <w:rPr>
+          <w:rFonts w:ascii="Calibri" w:hAnsi="Calibri"/>
+          <w:b/>
+        </w:rPr>
+        <w:t xml:space="preserve">Reused content. </w:t>
+      </w:r>
+      <w:r>
+        <w:rPr>
+          <w:rFonts w:ascii="Calibri" w:hAnsi="Calibri"/>
+        </w:rPr>
+        <w:t>Someone else’s material republished without significant original commentary, modification, or educational value. A monetization policy that applies to the whole channel.</w:t>
+      </w:r>
+    </w:p>
+    <w:p>
+      <w:r>
+        <w:rPr>
+          <w:rFonts w:ascii="Calibri" w:hAnsi="Calibri"/>
+          <w:b/>
+        </w:rPr>
+        <w:t xml:space="preserve">End screen. </w:t>
+      </w:r>
+      <w:r>
+        <w:rPr>
+          <w:rFonts w:ascii="Calibri" w:hAnsi="Calibri"/>
+        </w:rPr>
+        <w:t>An element in the last 5 to 20 seconds of a video at least 25 seconds long. One that opens a site outside YouTube requires the Partner Program.</w:t>
+      </w:r>
+    </w:p>
+    <w:p>
+      <w:r>
+        <w:rPr>
+          <w:rFonts w:ascii="Calibri" w:hAnsi="Calibri"/>
+          <w:b/>
+        </w:rPr>
+        <w:t xml:space="preserve">Info card. </w:t>
+      </w:r>
+      <w:r>
+        <w:rPr>
+          <w:rFonts w:ascii="Calibri" w:hAnsi="Calibri"/>
+        </w:rPr>
+        <w:t>A small panel attached to the video. One that opens a site outside YouTube also requires the Partner Program.</w:t>
+      </w:r>
+    </w:p>
+    <w:p>
+      <w:r>
+        <w:rPr>
+          <w:rFonts w:ascii="Calibri" w:hAnsi="Calibri"/>
+          <w:b/>
+        </w:rPr>
+        <w:t xml:space="preserve">Series playlist. </w:t>
+      </w:r>
+      <w:r>
+        <w:rPr>
+          <w:rFonts w:ascii="Calibri" w:hAnsi="Calibri"/>
+        </w:rPr>
+        <w:t>A playlist YouTube can feature as the next video while someone is watching one of yours. The account has to be verified, the videos have to be yours, and a video can sit in only one series playlist.</w:t>
+      </w:r>
+    </w:p>
+    <w:p>
+      <w:r>
+        <w:rPr>
+          <w:rFonts w:ascii="Calibri" w:hAnsi="Calibri"/>
+          <w:b/>
+        </w:rPr>
+        <w:t xml:space="preserve">Short. </w:t>
+      </w:r>
+      <w:r>
+        <w:rPr>
+          <w:rFonts w:ascii="Calibri" w:hAnsi="Calibri"/>
+        </w:rPr>
+        <w:t>A vertical video, 1080 by 1920. An address in a Short’s description or comments is not clickable. A Short can point at a long video.</w:t>
+      </w:r>
+    </w:p>
+    <w:p>
+      <w:r>
+        <w:rPr>
+          <w:rFonts w:ascii="Calibri" w:hAnsi="Calibri"/>
+          <w:b/>
+        </w:rPr>
+        <w:t xml:space="preserve">H.264. </w:t>
+      </w:r>
+      <w:r>
+        <w:rPr>
+          <w:rFonts w:ascii="Calibri" w:hAnsi="Calibri"/>
+        </w:rPr>
+        <w:t>The video codec named in YouTube’s recommended upload settings for an MP4. The audio codec named beside it is AAC-LC.</w:t>
+      </w:r>
+    </w:p>
+    <w:p>
+      <w:r>
+        <w:rPr>
+          <w:rFonts w:ascii="Calibri" w:hAnsi="Calibri"/>
+          <w:b/>
+        </w:rPr>
+        <w:t xml:space="preserve">Closed captions. </w:t>
+      </w:r>
+      <w:r>
+        <w:rPr>
+          <w:rFonts w:ascii="Calibri" w:hAnsi="Calibri"/>
+        </w:rPr>
+        <w:t>A text track the viewer can turn on or off. The words can be searched. They are not burned into the picture.</w:t>
+      </w:r>
+    </w:p>
+    <w:p>
+      <w:r>
+        <w:rPr>
+          <w:rFonts w:ascii="Calibri" w:hAnsi="Calibri"/>
+          <w:b/>
+        </w:rPr>
+        <w:t xml:space="preserve">Burned-in captions. </w:t>
+      </w:r>
+      <w:r>
+        <w:rPr>
+          <w:rFonts w:ascii="Calibri" w:hAnsi="Calibri"/>
+        </w:rPr>
+        <w:t>Words that are part of the picture. They stay on. They are a different choice from closed captions.</w:t>
+      </w:r>
+    </w:p>
+    <w:p>
+      <w:r>
+        <w:rPr>
+          <w:rFonts w:ascii="Calibri" w:hAnsi="Calibri"/>
+          <w:b/>
+        </w:rPr>
+        <w:t xml:space="preserve">Fader. </w:t>
+      </w:r>
+      <w:r>
+        <w:rPr>
+          <w:rFonts w:ascii="Calibri" w:hAnsi="Calibri"/>
+        </w:rPr>
+        <w:t>The volume slider in an editor. A music fader at about a tenth to a fifth of the way up is a position on that slider, not a measurement of loudness.</w:t>
+      </w:r>
+    </w:p>
+    <w:p>
+      <w:r>
+        <w:rPr>
+          <w:rFonts w:ascii="Calibri" w:hAnsi="Calibri"/>
+          <w:b/>
+        </w:rPr>
+        <w:t xml:space="preserve">Text-to-speech. </w:t>
+      </w:r>
+      <w:r>
+        <w:rPr>
+          <w:rFonts w:ascii="Calibri" w:hAnsi="Calibri"/>
+        </w:rPr>
+        <w:t>A tool that reads a script aloud. Usable when the voice is not a clone of someone else. Cloning someone else’s voice is a consent question the tool does not answer for you.</w:t>
+      </w:r>
+    </w:p>
+    <w:p>
+      <w:r>
+        <w:rPr>
+          <w:rFonts w:ascii="Calibri" w:hAnsi="Calibri"/>
+          <w:b/>
+        </w:rPr>
+        <w:t xml:space="preserve">Stock license. </w:t>
+      </w:r>
+      <w:r>
+        <w:rPr>
+          <w:rFonts w:ascii="Calibri" w:hAnsi="Calibri"/>
+        </w:rPr>
+        <w:t>The terms on one clip or track. “Free” and “free to use commercially” are different sentences. Read the line on that file before you publish it, including on a second site.</w:t>
+      </w:r>
+    </w:p>
+    <w:p>
+      <w:r>
+        <w:rPr>
+          <w:rFonts w:ascii="Calibri" w:hAnsi="Calibri"/>
+          <w:b/>
+        </w:rPr>
+        <w:t xml:space="preserve">Impression. </w:t>
+      </w:r>
+      <w:r>
+        <w:rPr>
+          <w:rFonts w:ascii="Calibri" w:hAnsi="Calibri"/>
+        </w:rPr>
+        <w:t>In Studio, a thumbnail shown on YouTube for more than one second with at least half of it visible. Thumbnails on other websites, in end screens, and in notifications are not counted.</w:t>
+      </w:r>
+    </w:p>
+    <w:p>
+      <w:r>
+        <w:rPr>
+          <w:rFonts w:ascii="Calibri" w:hAnsi="Calibri"/>
+          <w:b/>
+        </w:rPr>
+        <w:t xml:space="preserve">Impressions click-through rate. </w:t>
+      </w:r>
+      <w:r>
+        <w:rPr>
+          <w:rFonts w:ascii="Calibri" w:hAnsi="Calibri"/>
+        </w:rPr>
+        <w:t>How often a counted impression became a view. YouTube says half of channels and videos fall between 2% and 10%. It is a band, not a target.</w:t>
+      </w:r>
+    </w:p>
+    <w:p>
+      <w:r>
+        <w:rPr>
+          <w:rFonts w:ascii="Calibri" w:hAnsi="Calibri"/>
+          <w:b/>
+        </w:rPr>
+        <w:t xml:space="preserve">Traffic source. </w:t>
+      </w:r>
+      <w:r>
+        <w:rPr>
+          <w:rFonts w:ascii="Calibri" w:hAnsi="Calibri"/>
+        </w:rPr>
+        <w:t>Studio’s label for how a viewer reached a video: search, suggested videos, browse features, playlists, external, and others. Views from links in video descriptions are filed under suggested videos.</w:t>
+      </w:r>
+    </w:p>
+    <w:p>
+      <w:r>
+        <w:rPr>
+          <w:rFonts w:ascii="Calibri" w:hAnsi="Calibri"/>
+          <w:b/>
+        </w:rPr>
+        <w:t xml:space="preserve">Video chapters. </w:t>
+      </w:r>
+      <w:r>
+        <w:rPr>
+          <w:rFonts w:ascii="Calibri" w:hAnsi="Calibri"/>
+        </w:rPr>
+        <w:t>Timestamps in the description that split a video into named parts. The first is 00:00, there are at least three, and each part is at least ten seconds.</w:t>
+      </w:r>
+    </w:p>
+    <w:p>
+      <w:r>
+        <w:rPr>
+          <w:rFonts w:ascii="Calibri" w:hAnsi="Calibri"/>
+          <w:b/>
+        </w:rPr>
+        <w:t xml:space="preserve">Community Guidelines warning. </w:t>
+      </w:r>
+      <w:r>
+        <w:rPr>
+          <w:rFonts w:ascii="Calibri" w:hAnsi="Calibri"/>
+        </w:rPr>
+        <w:t>What a first violation typically gets. An optional policy training lets it expire 90 days after the training. A further violation of the same policy in that window can become a strike.</w:t>
+      </w:r>
+    </w:p>
+    <w:p>
+      <w:r>
+        <w:rPr>
+          <w:rFonts w:ascii="Calibri" w:hAnsi="Calibri"/>
+          <w:b/>
+        </w:rPr>
+        <w:t xml:space="preserve">Copyright strike. </w:t>
+      </w:r>
+      <w:r>
+        <w:rPr>
+          <w:rFonts w:ascii="Calibri" w:hAnsi="Calibri"/>
+        </w:rPr>
+        <w:t>The result of a valid legal removal request. The video comes down. It expires 90 days after it was applied once Copyright School is done, or it can be resolved by a retraction or a counter notification.</w:t>
+      </w:r>
+    </w:p>
+    <w:p>
+      <w:r>
+        <w:rPr>
+          <w:rFonts w:ascii="Calibri" w:hAnsi="Calibri"/>
+          <w:b/>
+        </w:rPr>
+        <w:t xml:space="preserve">Content ID claim. </w:t>
+      </w:r>
+      <w:r>
+        <w:rPr>
+          <w:rFonts w:ascii="Calibri" w:hAnsi="Calibri"/>
+        </w:rPr>
+        <w:t>An automatic match against a rights holder’s file. It affects that video: monetize, track, or block. It is not a strike, unless a dispute without a valid reason leads to a removal request.</w:t>
+      </w:r>
+    </w:p>
+    <w:p>
+      <w:r>
+        <w:rPr>
+          <w:rFonts w:ascii="Calibri" w:hAnsi="Calibri"/>
+          <w:b/>
+        </w:rPr>
+        <w:t xml:space="preserve">Paid promotion setting. </w:t>
+      </w:r>
+      <w:r>
+        <w:rPr>
+          <w:rFonts w:ascii="Calibri" w:hAnsi="Calibri"/>
+        </w:rPr>
+        <w:t>The option in video details you select when a company paid you or gave you the product for a video. YouTube then shows a disclosure. Say it in the video as well.</w:t>
+      </w:r>
+    </w:p>
+    <w:p>
+      <w:r>
+        <w:rPr>
+          <w:rFonts w:ascii="Calibri" w:hAnsi="Calibri"/>
+          <w:b/>
+        </w:rPr>
+        <w:t xml:space="preserve">AI use. </w:t>
+      </w:r>
+      <w:r>
+        <w:rPr>
+          <w:rFonts w:ascii="Calibri" w:hAnsi="Calibri"/>
+        </w:rPr>
+        <w:t>The upload setting for realistic content that generative AI made or meaningfully altered, including AI-generated music that is the main focus of the video. Scripts, ideas, captions, thumbnails, and a clone of your own voice for voice-overs do not need it.</w:t>
+      </w:r>
+    </w:p>
+    <w:p>
+      <w:r>
+        <w:rPr>
+          <w:rFonts w:ascii="Calibri" w:hAnsi="Calibri"/>
+          <w:b/>
+        </w:rPr>
+        <w:t xml:space="preserve">Made for kids. </w:t>
+      </w:r>
+      <w:r>
+        <w:rPr>
+          <w:rFonts w:ascii="Calibri" w:hAnsi="Calibri"/>
+        </w:rPr>
+        <w:t>The audience setting for videos directed to children, required under US law. It turns off comments, end screens, personalized ads, memberships, Supers, and more on those videos.</w:t>
+      </w:r>
+    </w:p>
+    <w:p>
+      <w:pPr>
+        <w:sectPr>
+          <w:headerReference w:type="default" r:id="rId133"/>
+          <w:footerReference w:type="default" r:id="rId134"/>
+          <w:pgSz w:w="10080" w:h="14400"/>
+          <w:pgMar w:top="1008" w:right="1008" w:bottom="1008" w:left="1008" w:header="504" w:footer="504" w:gutter="0"/>
+          <w:cols w:space="720"/>
+          <w:titlePg/>
+          <w:docGrid w:linePitch="360"/>
+        </w:sectPr>
+      </w:pPr>
+    </w:p>
+    <w:p>
       <w:bookmarkStart w:id="141" w:name="toc140"/>
       <w:pPr>
         <w:pStyle w:val="Heading1"/>
@@ -22913,7 +23068,7 @@
           <w:rFonts w:ascii="Calibri" w:hAnsi="Calibri"/>
           <w:i/>
         </w:rPr>
-        <w:t>Chapter 14. Other platforms were checked against the linked official page in October 2026, except X, whose help page did not load; that line is labeled. The diagnostic order is the author’s recommendation.</w:t>
+        <w:t>Chapter 14. Other platforms were checked against the linked official page in October 2026. X’s Help Center page was read in the Internet Archive’s copy of 22 September 2026, because the live page refuses automated requests. The diagnostic order is the author’s recommendation.</w:t>
       </w:r>
     </w:p>
     <w:p>
@@ -23005,7 +23160,7 @@
         </w:rPr>
         <w:t xml:space="preserve">, </w:t>
       </w:r>
-      <w:hyperlink r:id="rId91">
+      <w:hyperlink r:id="rId94">
         <w:r>
           <w:rPr>
             <w:rStyle w:val="Hyperlink"/>
@@ -23037,7 +23192,7 @@
         </w:rPr>
         <w:t xml:space="preserve">, </w:t>
       </w:r>
-      <w:hyperlink r:id="rId115">
+      <w:hyperlink r:id="rId118">
         <w:r>
           <w:rPr>
             <w:rStyle w:val="Hyperlink"/>
@@ -23053,7 +23208,7 @@
         </w:rPr>
         <w:t xml:space="preserve">, </w:t>
       </w:r>
-      <w:hyperlink r:id="rId61">
+      <w:hyperlink r:id="rId64">
         <w:r>
           <w:rPr>
             <w:rStyle w:val="Hyperlink"/>
@@ -23159,7 +23314,7 @@
         </w:rPr>
         <w:t xml:space="preserve">, </w:t>
       </w:r>
-      <w:hyperlink r:id="rId55">
+      <w:hyperlink r:id="rId58">
         <w:r>
           <w:rPr>
             <w:rStyle w:val="Hyperlink"/>
@@ -23223,7 +23378,7 @@
         </w:rPr>
         <w:t xml:space="preserve"> and </w:t>
       </w:r>
-      <w:hyperlink r:id="rId56">
+      <w:hyperlink r:id="rId59">
         <w:r>
           <w:rPr>
             <w:rStyle w:val="Hyperlink"/>
@@ -23253,6 +23408,54 @@
         <w:rPr>
           <w:rFonts w:ascii="Calibri" w:hAnsi="Calibri"/>
         </w:rPr>
+        <w:t xml:space="preserve">. AI examples: </w:t>
+      </w:r>
+      <w:hyperlink r:id="rId54">
+        <w:r>
+          <w:rPr>
+            <w:rStyle w:val="Hyperlink"/>
+            <w:sz w:val="22"/>
+            <w:rFonts w:ascii="Calibri" w:hAnsi="Calibri"/>
+          </w:rPr>
+          <w:t xml:space="preserve">ElevenLabs pricing</w:t>
+        </w:r>
+      </w:hyperlink>
+      <w:r>
+        <w:rPr>
+          <w:rFonts w:ascii="Calibri" w:hAnsi="Calibri"/>
+        </w:rPr>
+        <w:t xml:space="preserve">, </w:t>
+      </w:r>
+      <w:hyperlink r:id="rId55">
+        <w:r>
+          <w:rPr>
+            <w:rStyle w:val="Hyperlink"/>
+            <w:sz w:val="22"/>
+            <w:rFonts w:ascii="Calibri" w:hAnsi="Calibri"/>
+          </w:rPr>
+          <w:t xml:space="preserve">Runway pricing</w:t>
+        </w:r>
+      </w:hyperlink>
+      <w:r>
+        <w:rPr>
+          <w:rFonts w:ascii="Calibri" w:hAnsi="Calibri"/>
+        </w:rPr>
+        <w:t xml:space="preserve"> and </w:t>
+      </w:r>
+      <w:hyperlink r:id="rId56">
+        <w:r>
+          <w:rPr>
+            <w:rStyle w:val="Hyperlink"/>
+            <w:sz w:val="22"/>
+            <w:rFonts w:ascii="Calibri" w:hAnsi="Calibri"/>
+          </w:rPr>
+          <w:t xml:space="preserve">terms of use</w:t>
+        </w:r>
+      </w:hyperlink>
+      <w:r>
+        <w:rPr>
+          <w:rFonts w:ascii="Calibri" w:hAnsi="Calibri"/>
+        </w:rPr>
         <w:t>.</w:t>
       </w:r>
     </w:p>
@@ -23273,7 +23476,7 @@
         </w:rPr>
         <w:t xml:space="preserve">, </w:t>
       </w:r>
-      <w:hyperlink r:id="rId97">
+      <w:hyperlink r:id="rId100">
         <w:r>
           <w:rPr>
             <w:rStyle w:val="Hyperlink"/>
@@ -23289,7 +23492,7 @@
         </w:rPr>
         <w:t xml:space="preserve">, </w:t>
       </w:r>
-      <w:hyperlink r:id="rId98">
+      <w:hyperlink r:id="rId101">
         <w:r>
           <w:rPr>
             <w:rStyle w:val="Hyperlink"/>
@@ -23305,7 +23508,7 @@
         </w:rPr>
         <w:t xml:space="preserve">, </w:t>
       </w:r>
-      <w:hyperlink r:id="rId59">
+      <w:hyperlink r:id="rId62">
         <w:r>
           <w:rPr>
             <w:rStyle w:val="Hyperlink"/>
@@ -23321,7 +23524,7 @@
         </w:rPr>
         <w:t xml:space="preserve">, </w:t>
       </w:r>
-      <w:hyperlink r:id="rId99">
+      <w:hyperlink r:id="rId102">
         <w:r>
           <w:rPr>
             <w:rStyle w:val="Hyperlink"/>
@@ -23355,7 +23558,7 @@
       </w:r>
     </w:p>
     <w:p>
-      <w:hyperlink r:id="rId102">
+      <w:hyperlink r:id="rId105">
         <w:r>
           <w:rPr>
             <w:rStyle w:val="Hyperlink"/>
@@ -23371,7 +23574,7 @@
         </w:rPr>
         <w:t xml:space="preserve">, </w:t>
       </w:r>
-      <w:hyperlink r:id="rId103">
+      <w:hyperlink r:id="rId106">
         <w:r>
           <w:rPr>
             <w:rStyle w:val="Hyperlink"/>
@@ -23387,7 +23590,7 @@
         </w:rPr>
         <w:t xml:space="preserve">, </w:t>
       </w:r>
-      <w:hyperlink r:id="rId104">
+      <w:hyperlink r:id="rId107">
         <w:r>
           <w:rPr>
             <w:rStyle w:val="Hyperlink"/>
@@ -23403,7 +23606,7 @@
         </w:rPr>
         <w:t xml:space="preserve">, </w:t>
       </w:r>
-      <w:hyperlink r:id="rId105">
+      <w:hyperlink r:id="rId108">
         <w:r>
           <w:rPr>
             <w:rStyle w:val="Hyperlink"/>
@@ -23419,7 +23622,7 @@
         </w:rPr>
         <w:t xml:space="preserve">, </w:t>
       </w:r>
-      <w:hyperlink r:id="rId107">
+      <w:hyperlink r:id="rId110">
         <w:r>
           <w:rPr>
             <w:rStyle w:val="Hyperlink"/>
@@ -23435,7 +23638,7 @@
         </w:rPr>
         <w:t xml:space="preserve">, </w:t>
       </w:r>
-      <w:hyperlink r:id="rId108">
+      <w:hyperlink r:id="rId111">
         <w:r>
           <w:rPr>
             <w:rStyle w:val="Hyperlink"/>
@@ -23451,7 +23654,7 @@
         </w:rPr>
         <w:t xml:space="preserve">, </w:t>
       </w:r>
-      <w:hyperlink r:id="rId109">
+      <w:hyperlink r:id="rId112">
         <w:r>
           <w:rPr>
             <w:rStyle w:val="Hyperlink"/>
@@ -23467,7 +23670,7 @@
         </w:rPr>
         <w:t xml:space="preserve">, </w:t>
       </w:r>
-      <w:hyperlink r:id="rId110">
+      <w:hyperlink r:id="rId113">
         <w:r>
           <w:rPr>
             <w:rStyle w:val="Hyperlink"/>
@@ -23501,7 +23704,7 @@
         </w:rPr>
         <w:t xml:space="preserve">, </w:t>
       </w:r>
-      <w:hyperlink r:id="rId116">
+      <w:hyperlink r:id="rId119">
         <w:r>
           <w:rPr>
             <w:rStyle w:val="Hyperlink"/>
@@ -23535,7 +23738,7 @@
       </w:r>
     </w:p>
     <w:p>
-      <w:hyperlink r:id="rId133">
+      <w:hyperlink r:id="rId137">
         <w:r>
           <w:rPr>
             <w:rStyle w:val="Hyperlink"/>
@@ -23551,7 +23754,7 @@
         </w:rPr>
         <w:t xml:space="preserve"> and </w:t>
       </w:r>
-      <w:hyperlink r:id="rId134">
+      <w:hyperlink r:id="rId138">
         <w:r>
           <w:rPr>
             <w:rStyle w:val="Hyperlink"/>
@@ -23567,7 +23770,7 @@
         </w:rPr>
         <w:t xml:space="preserve">. </w:t>
       </w:r>
-      <w:hyperlink r:id="rId135">
+      <w:hyperlink r:id="rId139">
         <w:r>
           <w:rPr>
             <w:rStyle w:val="Hyperlink"/>
@@ -23585,7 +23788,7 @@
       </w:r>
     </w:p>
     <w:p>
-      <w:hyperlink r:id="rId93">
+      <w:hyperlink r:id="rId96">
         <w:r>
           <w:rPr>
             <w:rStyle w:val="Hyperlink"/>
@@ -23601,7 +23804,7 @@
         </w:rPr>
         <w:t xml:space="preserve"> and </w:t>
       </w:r>
-      <w:hyperlink r:id="rId94">
+      <w:hyperlink r:id="rId97">
         <w:r>
           <w:rPr>
             <w:rStyle w:val="Hyperlink"/>
@@ -23619,7 +23822,7 @@
       </w:r>
     </w:p>
     <w:p>
-      <w:hyperlink r:id="rId60">
+      <w:hyperlink r:id="rId63">
         <w:r>
           <w:rPr>
             <w:rStyle w:val="Hyperlink"/>
@@ -23635,7 +23838,7 @@
         </w:rPr>
         <w:t xml:space="preserve">. </w:t>
       </w:r>
-      <w:hyperlink r:id="rId68">
+      <w:hyperlink r:id="rId71">
         <w:r>
           <w:rPr>
             <w:rStyle w:val="Hyperlink"/>
@@ -23651,7 +23854,7 @@
         </w:rPr>
         <w:t xml:space="preserve">, </w:t>
       </w:r>
-      <w:hyperlink r:id="rId69">
+      <w:hyperlink r:id="rId72">
         <w:r>
           <w:rPr>
             <w:rStyle w:val="Hyperlink"/>
@@ -23667,7 +23870,7 @@
         </w:rPr>
         <w:t xml:space="preserve">, </w:t>
       </w:r>
-      <w:hyperlink r:id="rId70">
+      <w:hyperlink r:id="rId73">
         <w:r>
           <w:rPr>
             <w:rStyle w:val="Hyperlink"/>
@@ -23683,7 +23886,7 @@
         </w:rPr>
         <w:t xml:space="preserve">, </w:t>
       </w:r>
-      <w:hyperlink r:id="rId71">
+      <w:hyperlink r:id="rId74">
         <w:r>
           <w:rPr>
             <w:rStyle w:val="Hyperlink"/>
@@ -23701,7 +23904,7 @@
       </w:r>
     </w:p>
     <w:p>
-      <w:hyperlink r:id="rId80">
+      <w:hyperlink r:id="rId83">
         <w:r>
           <w:rPr>
             <w:rStyle w:val="Hyperlink"/>
@@ -23717,7 +23920,7 @@
         </w:rPr>
         <w:t xml:space="preserve">, </w:t>
       </w:r>
-      <w:hyperlink r:id="rId83">
+      <w:hyperlink r:id="rId86">
         <w:r>
           <w:rPr>
             <w:rStyle w:val="Hyperlink"/>
@@ -23733,7 +23936,7 @@
         </w:rPr>
         <w:t xml:space="preserve">, </w:t>
       </w:r>
-      <w:hyperlink r:id="rId86">
+      <w:hyperlink r:id="rId89">
         <w:r>
           <w:rPr>
             <w:rStyle w:val="Hyperlink"/>
@@ -23749,7 +23952,7 @@
         </w:rPr>
         <w:t xml:space="preserve">, </w:t>
       </w:r>
-      <w:hyperlink r:id="rId87">
+      <w:hyperlink r:id="rId90">
         <w:r>
           <w:rPr>
             <w:rStyle w:val="Hyperlink"/>
@@ -23765,7 +23968,7 @@
         </w:rPr>
         <w:t xml:space="preserve">, </w:t>
       </w:r>
-      <w:hyperlink r:id="rId54">
+      <w:hyperlink r:id="rId57">
         <w:r>
           <w:rPr>
             <w:rStyle w:val="Hyperlink"/>
@@ -23781,7 +23984,7 @@
         </w:rPr>
         <w:t xml:space="preserve">, </w:t>
       </w:r>
-      <w:hyperlink r:id="rId92">
+      <w:hyperlink r:id="rId95">
         <w:r>
           <w:rPr>
             <w:rStyle w:val="Hyperlink"/>
@@ -23797,7 +24000,7 @@
         </w:rPr>
         <w:t xml:space="preserve">, </w:t>
       </w:r>
-      <w:hyperlink r:id="rId75">
+      <w:hyperlink r:id="rId78">
         <w:r>
           <w:rPr>
             <w:rStyle w:val="Hyperlink"/>
@@ -23813,7 +24016,7 @@
         </w:rPr>
         <w:t xml:space="preserve">, </w:t>
       </w:r>
-      <w:hyperlink r:id="rId74">
+      <w:hyperlink r:id="rId77">
         <w:r>
           <w:rPr>
             <w:rStyle w:val="Hyperlink"/>
@@ -23829,7 +24032,7 @@
         </w:rPr>
         <w:t xml:space="preserve">, </w:t>
       </w:r>
-      <w:hyperlink r:id="rId82">
+      <w:hyperlink r:id="rId85">
         <w:r>
           <w:rPr>
             <w:rStyle w:val="Hyperlink"/>
@@ -23849,8 +24052,8 @@
     <w:p>
       <w:pPr>
         <w:sectPr>
-          <w:headerReference w:type="default" r:id="rId131"/>
-          <w:footerReference w:type="default" r:id="rId132"/>
+          <w:headerReference w:type="default" r:id="rId135"/>
+          <w:footerReference w:type="default" r:id="rId136"/>
           <w:pgSz w:w="10080" w:h="14400"/>
           <w:pgMar w:top="1008" w:right="1008" w:bottom="1008" w:left="1008" w:header="504" w:footer="504" w:gutter="0"/>
           <w:cols w:space="720"/>
@@ -24335,8 +24538,8 @@
       </w:r>
     </w:p>
     <w:sectPr>
-      <w:headerReference w:type="default" r:id="rId136"/>
-      <w:footerReference w:type="default" r:id="rId137"/>
+      <w:headerReference w:type="default" r:id="rId140"/>
+      <w:footerReference w:type="default" r:id="rId141"/>
       <w:pgSz w:w="10080" w:h="14400"/>
       <w:pgMar w:top="1008" w:right="1008" w:bottom="1008" w:left="1008" w:header="504" w:footer="504" w:gutter="0"/>
       <w:cols w:space="720"/>

</xml_diff>

<commit_message>
YouTube book: add 3 more case studies (MrBeast thumbnails, Primitive Technology, Weezer analytics), rebuild docx
Chucky Appleby's thumbnail A/B-testing account in chapter 2, Primitive
Technology as the limit case of chapter 3's no-rights-to-check workflow,
and the 2008 Weezer/YouTube Insight traffic-source episode in chapter 7.
Sourcing and what wasn't independently fetched are disclosed in each
chapter's Sources paragraph and in notes/_STATUS.md, which also records
the leads tried and rejected this pass (a vendor case study, two
unnamed-channel aggregator anecdotes).

Co-Authored-By: Claude Sonnet 5 <noreply@anthropic.com>
Claude-Session: https://claude.ai/code/session_01SRhcHKTsmWne9LTaP7asUs
</commit_message>
<xml_diff>
--- a/Your First YouTube Channel That Rocks/Your First YouTube Channel That Rocks.docx
+++ b/Your First YouTube Channel That Rocks/Your First YouTube Channel That Rocks.docx
@@ -3525,6 +3525,44 @@
         <w:t xml:space="preserve"> it keeps the version that produced more watch time, not the version that only collected more clicks.</w:t>
       </w:r>
     </w:p>
+    <w:tbl>
+      <w:tblPr>
+        <w:tblW w:type="auto" w:w="0"/>
+        <w:tblLayout w:type="fixed"/>
+        <w:tblLook w:firstColumn="1" w:firstRow="1" w:lastColumn="0" w:lastRow="0" w:noHBand="0" w:noVBand="1" w:val="04A0"/>
+      </w:tblPr>
+      <w:tblGrid>
+        <w:gridCol w:w="8064"/>
+      </w:tblGrid>
+      <w:tr>
+        <w:tc>
+          <w:tcPr>
+            <w:tcW w:type="dxa" w:w="8064"/>
+            <w:tcW w:w="8063" w:type="dxa"/>
+            <w:shd w:val="clear" w:color="auto" w:fill="F3F1EA"/>
+          </w:tcPr>
+          <w:p>
+            <w:pPr>
+              <w:spacing w:after="40" w:before="40"/>
+            </w:pPr>
+            <w:r>
+              <w:rPr>
+                <w:rFonts w:ascii="Calibri" w:hAnsi="Calibri"/>
+                <w:sz w:val="22"/>
+              </w:rPr>
+            </w:r>
+            <w:r>
+              <w:rPr>
+                <w:rFonts w:ascii="Calibri" w:hAnsi="Calibri"/>
+                <w:sz w:val="22"/>
+              </w:rPr>
+              <w:t>Case study: MrBeast’s longtime thumbnail designer, Chucky Appleby, has described testing as many as fifty thumbnails for a single video before one goes live. In one test he has talked about publicly, the team compared a closed-mouth expression against an open-mouth one across roughly thirty videos; the closed-mouth version won on watch time nearly every time, a small difference per video that held up because it repeated thirty times in a row. The team also points to a simpler habit: putting the same recognizable face in every thumbnail, a practice it started in 2019, specifically to build the kind of trust that lets a subscriber click without reading the title first. Both are tests of what keeps people watching, not just what gets the click.</w:t>
+            </w:r>
+          </w:p>
+        </w:tc>
+      </w:tr>
+    </w:tbl>
+    <w:p/>
     <w:p>
       <w:bookmarkStart w:id="12" w:name="toc11"/>
       <w:pPr>
@@ -4484,7 +4522,24 @@
           <w:rFonts w:ascii="Calibri" w:hAnsi="Calibri"/>
           <w:i/>
         </w:rPr>
-        <w:t>Sources: YouTube Studio’s own upload interface (title, description, and tag character limits, and the captions workflow). YouTube’s thumbnail and title tips, its description tips, its title-and-thumbnail test, its audience-retention report, its pages on recommendation signals and on the recommendation system, its Shorts discovery page, its Shorts analytics tips, and its series-playlist settings, each cited in the section where it is used. YouTube’s advertiser-friendly content guidelines for the existence of a sensitive-content category. Which links are clickable is from YouTube’s sharing-links page. The eight jobs are the production load, spelled out again in chapter 5 and on the six-week calendar in chapter 6. YouTube does not publish that set as a quota. Confirm the live help pages before you rely on a number.</w:t>
+        <w:t xml:space="preserve">Sources: The MrBeast thumbnail case study is drawn from a YouTube-produced interview with Chucky Appleby, as reported by </w:t>
+      </w:r>
+      <w:hyperlink r:id="rId29">
+        <w:r>
+          <w:rPr>
+            <w:rStyle w:val="Hyperlink"/>
+            <w:sz w:val="22"/>
+            <w:rFonts w:ascii="Calibri" w:hAnsi="Calibri"/>
+          </w:rPr>
+          <w:t xml:space="preserve">Social Media Today</w:t>
+        </w:r>
+      </w:hyperlink>
+      <w:r>
+        <w:rPr>
+          <w:rFonts w:ascii="Calibri" w:hAnsi="Calibri"/>
+          <w:i/>
+        </w:rPr>
+        <w:t xml:space="preserve"> and corroborated by independent coverage of the same interview; this book could not fetch the original interview video directly, so the specific wording is treated as the verification standard actually met — a quote repeated consistently across independent reporting, not a verbatim transcript pulled by this book. YouTube Studio’s own upload interface (title, description, and tag character limits, and the captions workflow). YouTube’s thumbnail and title tips, its description tips, its title-and-thumbnail test, its audience-retention report, its pages on recommendation signals and on the recommendation system, its Shorts discovery page, its Shorts analytics tips, and its series-playlist settings, each cited in the section where it is used. YouTube’s advertiser-friendly content guidelines for the existence of a sensitive-content category. Which links are clickable is from YouTube’s sharing-links page. The eight jobs are the production load, spelled out again in chapter 5 and on the six-week calendar in chapter 6. YouTube does not publish that set as a quota. Confirm the live help pages before you rely on a number.</w:t>
       </w:r>
     </w:p>
     <w:p>
@@ -4567,7 +4622,7 @@
         </w:rPr>
         <w:t xml:space="preserve">The default stack is four things. Your voice, or a text-to-speech voice that is not a clone of someone else. One track from YouTube’s Audio Library. One editor that will export the whole video: </w:t>
       </w:r>
-      <w:hyperlink r:id="rId31">
+      <w:hyperlink r:id="rId32">
         <w:r>
           <w:rPr>
             <w:rStyle w:val="Hyperlink"/>
@@ -4604,7 +4659,7 @@
                     <pic:cNvPicPr/>
                   </pic:nvPicPr>
                   <pic:blipFill>
-                    <a:blip r:embed="rId32"/>
+                    <a:blip r:embed="rId33"/>
                     <a:stretch>
                       <a:fillRect/>
                     </a:stretch>
@@ -4654,7 +4709,7 @@
       <w:pPr>
         <w:pStyle w:val="ListBullet"/>
       </w:pPr>
-      <w:hyperlink r:id="rId33">
+      <w:hyperlink r:id="rId34">
         <w:r>
           <w:rPr>
             <w:rStyle w:val="Hyperlink"/>
@@ -4675,7 +4730,7 @@
       <w:pPr>
         <w:pStyle w:val="ListBullet"/>
       </w:pPr>
-      <w:hyperlink r:id="rId34">
+      <w:hyperlink r:id="rId35">
         <w:r>
           <w:rPr>
             <w:rStyle w:val="Hyperlink"/>
@@ -4691,7 +4746,7 @@
         </w:rPr>
         <w:t xml:space="preserve">, </w:t>
       </w:r>
-      <w:hyperlink r:id="rId35">
+      <w:hyperlink r:id="rId36">
         <w:r>
           <w:rPr>
             <w:rStyle w:val="Hyperlink"/>
@@ -4707,7 +4762,7 @@
         </w:rPr>
         <w:t xml:space="preserve">, </w:t>
       </w:r>
-      <w:hyperlink r:id="rId36">
+      <w:hyperlink r:id="rId37">
         <w:r>
           <w:rPr>
             <w:rStyle w:val="Hyperlink"/>
@@ -4723,7 +4778,7 @@
         </w:rPr>
         <w:t xml:space="preserve">, and </w:t>
       </w:r>
-      <w:hyperlink r:id="rId37">
+      <w:hyperlink r:id="rId38">
         <w:r>
           <w:rPr>
             <w:rStyle w:val="Hyperlink"/>
@@ -4744,7 +4799,7 @@
       <w:pPr>
         <w:pStyle w:val="ListBullet"/>
       </w:pPr>
-      <w:hyperlink r:id="rId38">
+      <w:hyperlink r:id="rId39">
         <w:r>
           <w:rPr>
             <w:rStyle w:val="Hyperlink"/>
@@ -4760,7 +4815,7 @@
         </w:rPr>
         <w:t xml:space="preserve"> and </w:t>
       </w:r>
-      <w:hyperlink r:id="rId39">
+      <w:hyperlink r:id="rId40">
         <w:r>
           <w:rPr>
             <w:rStyle w:val="Hyperlink"/>
@@ -4939,7 +4994,7 @@
                 <w:sz w:val="21"/>
               </w:rPr>
             </w:r>
-            <w:hyperlink r:id="rId40">
+            <w:hyperlink r:id="rId41">
               <w:r>
                 <w:rPr>
                   <w:rStyle w:val="Hyperlink"/>
@@ -5016,7 +5071,7 @@
                 <w:sz w:val="21"/>
               </w:rPr>
             </w:r>
-            <w:hyperlink r:id="rId41">
+            <w:hyperlink r:id="rId42">
               <w:r>
                 <w:rPr>
                   <w:rStyle w:val="Hyperlink"/>
@@ -5093,7 +5148,7 @@
                 <w:sz w:val="21"/>
               </w:rPr>
             </w:r>
-            <w:hyperlink r:id="rId42">
+            <w:hyperlink r:id="rId43">
               <w:r>
                 <w:rPr>
                   <w:rStyle w:val="Hyperlink"/>
@@ -5170,7 +5225,7 @@
                 <w:sz w:val="21"/>
               </w:rPr>
             </w:r>
-            <w:hyperlink r:id="rId43">
+            <w:hyperlink r:id="rId44">
               <w:r>
                 <w:rPr>
                   <w:rStyle w:val="Hyperlink"/>
@@ -5247,7 +5302,7 @@
                 <w:sz w:val="21"/>
               </w:rPr>
             </w:r>
-            <w:hyperlink r:id="rId44">
+            <w:hyperlink r:id="rId45">
               <w:r>
                 <w:rPr>
                   <w:rStyle w:val="Hyperlink"/>
@@ -5324,7 +5379,7 @@
                 <w:sz w:val="21"/>
               </w:rPr>
             </w:r>
-            <w:hyperlink r:id="rId45">
+            <w:hyperlink r:id="rId46">
               <w:r>
                 <w:rPr>
                   <w:rStyle w:val="Hyperlink"/>
@@ -5401,7 +5456,7 @@
                 <w:sz w:val="21"/>
               </w:rPr>
             </w:r>
-            <w:hyperlink r:id="rId46">
+            <w:hyperlink r:id="rId47">
               <w:r>
                 <w:rPr>
                   <w:rStyle w:val="Hyperlink"/>
@@ -5478,7 +5533,7 @@
                 <w:sz w:val="21"/>
               </w:rPr>
             </w:r>
-            <w:hyperlink r:id="rId47">
+            <w:hyperlink r:id="rId48">
               <w:r>
                 <w:rPr>
                   <w:rStyle w:val="Hyperlink"/>
@@ -5555,7 +5610,7 @@
                 <w:sz w:val="21"/>
               </w:rPr>
             </w:r>
-            <w:hyperlink r:id="rId48">
+            <w:hyperlink r:id="rId49">
               <w:r>
                 <w:rPr>
                   <w:rStyle w:val="Hyperlink"/>
@@ -5632,7 +5687,7 @@
                 <w:sz w:val="21"/>
               </w:rPr>
             </w:r>
-            <w:hyperlink r:id="rId49">
+            <w:hyperlink r:id="rId50">
               <w:r>
                 <w:rPr>
                   <w:rStyle w:val="Hyperlink"/>
@@ -5709,7 +5764,7 @@
                 <w:sz w:val="21"/>
               </w:rPr>
             </w:r>
-            <w:hyperlink r:id="rId50">
+            <w:hyperlink r:id="rId51">
               <w:r>
                 <w:rPr>
                   <w:rStyle w:val="Hyperlink"/>
@@ -5726,7 +5781,7 @@
               </w:rPr>
               <w:t xml:space="preserve"> / </w:t>
             </w:r>
-            <w:hyperlink r:id="rId51">
+            <w:hyperlink r:id="rId52">
               <w:r>
                 <w:rPr>
                   <w:rStyle w:val="Hyperlink"/>
@@ -5790,7 +5845,7 @@
     </w:tbl>
     <w:p/>
     <w:p>
-      <w:hyperlink r:id="rId52">
+      <w:hyperlink r:id="rId53">
         <w:r>
           <w:rPr>
             <w:rStyle w:val="Hyperlink"/>
@@ -5845,7 +5900,7 @@
         </w:rPr>
         <w:t xml:space="preserve">. </w:t>
       </w:r>
-      <w:hyperlink r:id="rId53">
+      <w:hyperlink r:id="rId54">
         <w:r>
           <w:rPr>
             <w:rStyle w:val="Hyperlink"/>
@@ -5861,7 +5916,7 @@
         </w:rPr>
         <w:t xml:space="preserve"> says it lives in YouTube Studio, on the left menu as Audio library, and also at </w:t>
       </w:r>
-      <w:hyperlink r:id="rId54">
+      <w:hyperlink r:id="rId55">
         <w:r>
           <w:rPr>
             <w:rStyle w:val="Hyperlink"/>
@@ -5885,7 +5940,7 @@
         </w:rPr>
         <w:t xml:space="preserve">Beyond it: </w:t>
       </w:r>
-      <w:hyperlink r:id="rId55">
+      <w:hyperlink r:id="rId56">
         <w:r>
           <w:rPr>
             <w:rStyle w:val="Hyperlink"/>
@@ -5901,7 +5956,7 @@
         </w:rPr>
         <w:t xml:space="preserve"> and </w:t>
       </w:r>
-      <w:hyperlink r:id="rId56">
+      <w:hyperlink r:id="rId57">
         <w:r>
           <w:rPr>
             <w:rStyle w:val="Hyperlink"/>
@@ -5917,7 +5972,7 @@
         </w:rPr>
         <w:t xml:space="preserve"> are free with no attribution required, the latter because its tracks are public domain outright. Sites built around a specific composer’s catalog, like </w:t>
       </w:r>
-      <w:hyperlink r:id="rId57">
+      <w:hyperlink r:id="rId58">
         <w:r>
           <w:rPr>
             <w:rStyle w:val="Hyperlink"/>
@@ -5933,7 +5988,7 @@
         </w:rPr>
         <w:t xml:space="preserve">, or a named creator’s free tier, like </w:t>
       </w:r>
-      <w:hyperlink r:id="rId58">
+      <w:hyperlink r:id="rId59">
         <w:r>
           <w:rPr>
             <w:rStyle w:val="Hyperlink"/>
@@ -5949,7 +6004,7 @@
         </w:rPr>
         <w:t xml:space="preserve">, commonly require crediting that person by name in the video description even when the track itself costs nothing — read the attribution wording on the specific track, not just its price. For a sound effect that is not in that tab, </w:t>
       </w:r>
-      <w:hyperlink r:id="rId59">
+      <w:hyperlink r:id="rId60">
         <w:r>
           <w:rPr>
             <w:rStyle w:val="Hyperlink"/>
@@ -5965,7 +6020,7 @@
         </w:rPr>
         <w:t xml:space="preserve"> is one library of effects; read its license the same way you read a stock clip’s. </w:t>
       </w:r>
-      <w:hyperlink r:id="rId60">
+      <w:hyperlink r:id="rId61">
         <w:r>
           <w:rPr>
             <w:rStyle w:val="Hyperlink"/>
@@ -5983,7 +6038,7 @@
       </w:r>
     </w:p>
     <w:p>
-      <w:hyperlink r:id="rId61">
+      <w:hyperlink r:id="rId62">
         <w:r>
           <w:rPr>
             <w:rStyle w:val="Hyperlink"/>
@@ -5999,7 +6054,7 @@
         </w:rPr>
         <w:t xml:space="preserve"> clears its free tracks for monetized use if you keep a one-line credit, unless you pay to drop the credit. </w:t>
       </w:r>
-      <w:hyperlink r:id="rId62">
+      <w:hyperlink r:id="rId63">
         <w:r>
           <w:rPr>
             <w:rStyle w:val="Hyperlink"/>
@@ -6015,7 +6070,7 @@
         </w:rPr>
         <w:t xml:space="preserve"> hosts independent artists. Filter for the Creative Commons tracks. The rest of that library is not yours to use. </w:t>
       </w:r>
-      <w:hyperlink r:id="rId63">
+      <w:hyperlink r:id="rId64">
         <w:r>
           <w:rPr>
             <w:rStyle w:val="Hyperlink"/>
@@ -6047,7 +6102,7 @@
         </w:rPr>
         <w:t xml:space="preserve">A full song with vocals is a different job. </w:t>
       </w:r>
-      <w:hyperlink r:id="rId64">
+      <w:hyperlink r:id="rId65">
         <w:r>
           <w:rPr>
             <w:rStyle w:val="Hyperlink"/>
@@ -6063,7 +6118,7 @@
         </w:rPr>
         <w:t xml:space="preserve"> and </w:t>
       </w:r>
-      <w:hyperlink r:id="rId65">
+      <w:hyperlink r:id="rId66">
         <w:r>
           <w:rPr>
             <w:rStyle w:val="Hyperlink"/>
@@ -6107,7 +6162,7 @@
       <w:bookmarkEnd w:id="22"/>
     </w:p>
     <w:p>
-      <w:hyperlink r:id="rId66">
+      <w:hyperlink r:id="rId67">
         <w:r>
           <w:rPr>
             <w:rStyle w:val="Hyperlink"/>
@@ -6123,7 +6178,7 @@
         </w:rPr>
         <w:t xml:space="preserve"> and </w:t>
       </w:r>
-      <w:hyperlink r:id="rId67">
+      <w:hyperlink r:id="rId68">
         <w:r>
           <w:rPr>
             <w:rStyle w:val="Hyperlink"/>
@@ -6147,7 +6202,7 @@
         </w:rPr>
         <w:t xml:space="preserve">ElevenLabs is the name creators most often call the most natural, as of this writing. Its free tier covers several short scripts a month. That reputation is creator talk. Listen to a sample on </w:t>
       </w:r>
-      <w:hyperlink r:id="rId68">
+      <w:hyperlink r:id="rId69">
         <w:r>
           <w:rPr>
             <w:rStyle w:val="Hyperlink"/>
@@ -6163,7 +6218,7 @@
         </w:rPr>
         <w:t xml:space="preserve"> before you pick it. </w:t>
       </w:r>
-      <w:hyperlink r:id="rId69">
+      <w:hyperlink r:id="rId70">
         <w:r>
           <w:rPr>
             <w:rStyle w:val="Hyperlink"/>
@@ -6179,7 +6234,7 @@
         </w:rPr>
         <w:t xml:space="preserve"> and </w:t>
       </w:r>
-      <w:hyperlink r:id="rId70">
+      <w:hyperlink r:id="rId71">
         <w:r>
           <w:rPr>
             <w:rStyle w:val="Hyperlink"/>
@@ -6237,7 +6292,7 @@
         </w:rPr>
         <w:t xml:space="preserve">Trimming, a vertical frame, a join, a burned-in caption, and a format YouTube will take: one browser editor can do those at no cost. </w:t>
       </w:r>
-      <w:hyperlink r:id="rId31">
+      <w:hyperlink r:id="rId32">
         <w:r>
           <w:rPr>
             <w:rStyle w:val="Hyperlink"/>
@@ -6253,7 +6308,7 @@
         </w:rPr>
         <w:t xml:space="preserve"> is the default. </w:t>
       </w:r>
-      <w:hyperlink r:id="rId71">
+      <w:hyperlink r:id="rId72">
         <w:r>
           <w:rPr>
             <w:rStyle w:val="Hyperlink"/>
@@ -6269,7 +6324,7 @@
         </w:rPr>
         <w:t xml:space="preserve">, </w:t>
       </w:r>
-      <w:hyperlink r:id="rId72">
+      <w:hyperlink r:id="rId73">
         <w:r>
           <w:rPr>
             <w:rStyle w:val="Hyperlink"/>
@@ -6285,7 +6340,7 @@
         </w:rPr>
         <w:t xml:space="preserve">, and </w:t>
       </w:r>
-      <w:hyperlink r:id="rId73">
+      <w:hyperlink r:id="rId74">
         <w:r>
           <w:rPr>
             <w:rStyle w:val="Hyperlink"/>
@@ -6301,7 +6356,7 @@
         </w:rPr>
         <w:t xml:space="preserve"> cover a single job when CapCut will not. </w:t>
       </w:r>
-      <w:hyperlink r:id="rId74">
+      <w:hyperlink r:id="rId75">
         <w:r>
           <w:rPr>
             <w:rStyle w:val="Hyperlink"/>
@@ -6317,7 +6372,7 @@
         </w:rPr>
         <w:t xml:space="preserve"> is enough when all you need is a trim. </w:t>
       </w:r>
-      <w:hyperlink r:id="rId75">
+      <w:hyperlink r:id="rId76">
         <w:r>
           <w:rPr>
             <w:rStyle w:val="Hyperlink"/>
@@ -6349,7 +6404,7 @@
         </w:rPr>
         <w:t xml:space="preserve">Underneath nearly all of these, doing the actual video processing, is </w:t>
       </w:r>
-      <w:hyperlink r:id="rId76">
+      <w:hyperlink r:id="rId77">
         <w:r>
           <w:rPr>
             <w:rStyle w:val="Hyperlink"/>
@@ -6386,7 +6441,7 @@
         </w:rPr>
         <w:t xml:space="preserve">Whatever tool does the final export, match </w:t>
       </w:r>
-      <w:hyperlink r:id="rId77">
+      <w:hyperlink r:id="rId78">
         <w:r>
           <w:rPr>
             <w:rStyle w:val="Hyperlink"/>
@@ -6429,6 +6484,44 @@
         <w:t>Every tool in this chapter comes with a permissions question attached to it. There is one path that does not borrow another person’s words, voice, or picture: take an idea, rewrite it entirely in your own words, record it in your own voice, and pair it with visuals you filmed, drew, or photographed yourself. Nothing in that chain belongs to someone else.</w:t>
       </w:r>
     </w:p>
+    <w:tbl>
+      <w:tblPr>
+        <w:tblW w:type="auto" w:w="0"/>
+        <w:tblLayout w:type="fixed"/>
+        <w:tblLook w:firstColumn="1" w:firstRow="1" w:lastColumn="0" w:lastRow="0" w:noHBand="0" w:noVBand="1" w:val="04A0"/>
+      </w:tblPr>
+      <w:tblGrid>
+        <w:gridCol w:w="8064"/>
+      </w:tblGrid>
+      <w:tr>
+        <w:tc>
+          <w:tcPr>
+            <w:tcW w:type="dxa" w:w="8064"/>
+            <w:tcW w:w="8063" w:type="dxa"/>
+            <w:shd w:val="clear" w:color="auto" w:fill="F3F1EA"/>
+          </w:tcPr>
+          <w:p>
+            <w:pPr>
+              <w:spacing w:after="40" w:before="40"/>
+            </w:pPr>
+            <w:r>
+              <w:rPr>
+                <w:rFonts w:ascii="Calibri" w:hAnsi="Calibri"/>
+                <w:sz w:val="22"/>
+              </w:rPr>
+            </w:r>
+            <w:r>
+              <w:rPr>
+                <w:rFonts w:ascii="Calibri" w:hAnsi="Calibri"/>
+                <w:sz w:val="22"/>
+              </w:rPr>
+              <w:t>Case study: The channel Primitive Technology, started by John Plant in Far North Queensland, Australia, in May 2015, takes that workflow further than most creators ever need to. Every video is Plant building a tool or a shelter from materials he gathers on camera, with no spoken narration at all — only the ambient sound of the work itself, and short on-screen text captions where a word is needed. There is no script to license, no voice to clone, no stock clip to check, and no music bed that could draw a copyright claim. The channel passed several million subscribers within a few years of launching and has grown well past ten million since, which is proof that “cheap” and “thin” are not the same thing: a video with no budget at all for voice, music, or licensed footage can still be the kind of video a stranger finishes.</w:t>
+            </w:r>
+          </w:p>
+        </w:tc>
+      </w:tr>
+    </w:tbl>
+    <w:p/>
     <w:p>
       <w:r>
         <w:rPr>
@@ -6624,9 +6717,9 @@
           <w:rFonts w:ascii="Calibri" w:hAnsi="Calibri"/>
           <w:i/>
         </w:rPr>
-        <w:t xml:space="preserve">Sources: Tool names and URLs in this chapter are drawn from the author’s own working bookmark lists of video, footage, music, and voice tools, current at the time of writing. Reference-image consistency, mixing as a fader position rather than a loudness law, and the workflow in §VI were taken as general technique from the author’s saved notes; specific projects were not used. Export settings are </w:t>
-      </w:r>
-      <w:hyperlink r:id="rId77">
+        <w:t xml:space="preserve">Sources: The Primitive Technology case study (launch date, location, and format) is corroborated across its Wikipedia entry and independent channel-stats coverage; subscriber figures are rounded and approximate, not a number this book pulled from the channel’s own disclosure. Tool names and URLs in this chapter are drawn from the author’s own working bookmark lists of video, footage, music, and voice tools, current at the time of writing. Reference-image consistency, mixing as a fader position rather than a loudness law, and the workflow in §VI were taken as general technique from the author’s saved notes; specific projects were not used. Export settings are </w:t>
+      </w:r>
+      <w:hyperlink r:id="rId78">
         <w:r>
           <w:rPr>
             <w:rStyle w:val="Hyperlink"/>
@@ -6660,7 +6753,7 @@
         </w:rPr>
         <w:t xml:space="preserve">. The Audio Library location is </w:t>
       </w:r>
-      <w:hyperlink r:id="rId53">
+      <w:hyperlink r:id="rId54">
         <w:r>
           <w:rPr>
             <w:rStyle w:val="Hyperlink"/>
@@ -6690,8 +6783,8 @@
     <w:p>
       <w:pPr>
         <w:sectPr>
-          <w:headerReference w:type="default" r:id="rId29"/>
-          <w:footerReference w:type="default" r:id="rId30"/>
+          <w:headerReference w:type="default" r:id="rId30"/>
+          <w:footerReference w:type="default" r:id="rId31"/>
           <w:pgSz w:w="10080" w:h="14400"/>
           <w:pgMar w:top="1008" w:right="1008" w:bottom="1008" w:left="1008" w:header="504" w:footer="504" w:gutter="0"/>
           <w:cols w:space="720"/>
@@ -7150,7 +7243,7 @@
               </w:rPr>
               <w:t xml:space="preserve">Worked example. Spoken English for a teaching video often lands somewhere around 130 to 160 words a minute. Treat that as a starting guess and time yourself; yours will differ. A 1,200-word script at 150 words a minute is about eight minutes before any demonstration is added. If the method takes three minutes to show on screen, the video is about eleven minutes. Length has one published money rule. </w:t>
             </w:r>
-            <w:hyperlink r:id="rId80">
+            <w:hyperlink r:id="rId81">
               <w:r>
                 <w:rPr>
                   <w:rStyle w:val="Hyperlink"/>
@@ -7429,7 +7522,7 @@
         </w:rPr>
         <w:t xml:space="preserve">Many of the eight jobs are better as a screen than as a face: the spreadsheet, the checklist, the software. A free screen recorder such as </w:t>
       </w:r>
-      <w:hyperlink r:id="rId81">
+      <w:hyperlink r:id="rId82">
         <w:r>
           <w:rPr>
             <w:rStyle w:val="Hyperlink"/>
@@ -7595,7 +7688,7 @@
         </w:rPr>
         <w:t xml:space="preserve">Then add chapters. YouTube’s </w:t>
       </w:r>
-      <w:hyperlink r:id="rId82">
+      <w:hyperlink r:id="rId83">
         <w:r>
           <w:rPr>
             <w:rStyle w:val="Hyperlink"/>
@@ -7653,7 +7746,7 @@
         </w:rPr>
         <w:t xml:space="preserve">YouTube’s </w:t>
       </w:r>
-      <w:hyperlink r:id="rId83">
+      <w:hyperlink r:id="rId84">
         <w:r>
           <w:rPr>
             <w:rStyle w:val="Hyperlink"/>
@@ -7928,7 +8021,7 @@
         </w:rPr>
         <w:t xml:space="preserve">Sources: The thirty-second opening refers to YouTube’s retention tip cited in chapter 2. The eight-minute mid-roll rule and the advice to place breaks at natural pauses are from </w:t>
       </w:r>
-      <w:hyperlink r:id="rId80">
+      <w:hyperlink r:id="rId81">
         <w:r>
           <w:rPr>
             <w:rStyle w:val="Hyperlink"/>
@@ -7945,7 +8038,7 @@
         </w:rPr>
         <w:t xml:space="preserve">. Video chapter rules are from </w:t>
       </w:r>
-      <w:hyperlink r:id="rId82">
+      <w:hyperlink r:id="rId83">
         <w:r>
           <w:rPr>
             <w:rStyle w:val="Hyperlink"/>
@@ -7962,7 +8055,7 @@
         </w:rPr>
         <w:t xml:space="preserve">. End screen timing is from </w:t>
       </w:r>
-      <w:hyperlink r:id="rId83">
+      <w:hyperlink r:id="rId84">
         <w:r>
           <w:rPr>
             <w:rStyle w:val="Hyperlink"/>
@@ -7979,7 +8072,7 @@
         </w:rPr>
         <w:t xml:space="preserve">; the external-link requirement is from the same page. Frame sizes and upload settings refer to chapter 3. The speaking-rate figure is a rough planning range for you to replace with your own timed reading, not a measured standard. That viewers forgive picture before sound is creator consensus, labeled as such. </w:t>
       </w:r>
-      <w:hyperlink r:id="rId81">
+      <w:hyperlink r:id="rId82">
         <w:r>
           <w:rPr>
             <w:rStyle w:val="Hyperlink"/>
@@ -8000,8 +8093,8 @@
     <w:p>
       <w:pPr>
         <w:sectPr>
-          <w:headerReference w:type="default" r:id="rId78"/>
-          <w:footerReference w:type="default" r:id="rId79"/>
+          <w:headerReference w:type="default" r:id="rId79"/>
+          <w:footerReference w:type="default" r:id="rId80"/>
           <w:pgSz w:w="10080" w:h="14400"/>
           <w:pgMar w:top="1008" w:right="1008" w:bottom="1008" w:left="1008" w:header="504" w:footer="504" w:gutter="0"/>
           <w:cols w:space="720"/>
@@ -8539,7 +8632,7 @@
         </w:rPr>
         <w:t xml:space="preserve">Sources: Title structure refers to chapter 2. Production cost refers to chapter 3. The eight-minute mid-roll rule is from </w:t>
       </w:r>
-      <w:hyperlink r:id="rId80">
+      <w:hyperlink r:id="rId81">
         <w:r>
           <w:rPr>
             <w:rStyle w:val="Hyperlink"/>
@@ -8573,7 +8666,7 @@
         </w:rPr>
         <w:t xml:space="preserve">. Brownlee’s webcam start is from </w:t>
       </w:r>
-      <w:hyperlink r:id="rId86">
+      <w:hyperlink r:id="rId87">
         <w:r>
           <w:rPr>
             <w:rStyle w:val="Hyperlink"/>
@@ -8590,7 +8683,7 @@
         </w:rPr>
         <w:t xml:space="preserve">. The Safari-for-Windows recollection, which he gives as on the order of 6,000 views, is from </w:t>
       </w:r>
-      <w:hyperlink r:id="rId87">
+      <w:hyperlink r:id="rId88">
         <w:r>
           <w:rPr>
             <w:rStyle w:val="Hyperlink"/>
@@ -8607,7 +8700,7 @@
         </w:rPr>
         <w:t xml:space="preserve">. Rea’s start is from </w:t>
       </w:r>
-      <w:hyperlink r:id="rId88">
+      <w:hyperlink r:id="rId89">
         <w:r>
           <w:rPr>
             <w:rStyle w:val="Hyperlink"/>
@@ -8624,7 +8717,7 @@
         </w:rPr>
         <w:t xml:space="preserve">. Hart’s first year, the webcam on a stack of books, the Photo Booth and iMovie workflow, and the recollection of about 80,000 views on the first episode are from </w:t>
       </w:r>
-      <w:hyperlink r:id="rId89">
+      <w:hyperlink r:id="rId90">
         <w:r>
           <w:rPr>
             <w:rStyle w:val="Hyperlink"/>
@@ -8645,8 +8738,8 @@
     <w:p>
       <w:pPr>
         <w:sectPr>
-          <w:headerReference w:type="default" r:id="rId84"/>
-          <w:footerReference w:type="default" r:id="rId85"/>
+          <w:headerReference w:type="default" r:id="rId85"/>
+          <w:footerReference w:type="default" r:id="rId86"/>
           <w:pgSz w:w="10080" w:h="14400"/>
           <w:pgMar w:top="1008" w:right="1008" w:bottom="1008" w:left="1008" w:header="504" w:footer="504" w:gutter="0"/>
           <w:cols w:space="720"/>
@@ -9153,8 +9246,8 @@
     <w:p>
       <w:pPr>
         <w:sectPr>
-          <w:headerReference w:type="default" r:id="rId90"/>
-          <w:footerReference w:type="default" r:id="rId91"/>
+          <w:headerReference w:type="default" r:id="rId91"/>
+          <w:footerReference w:type="default" r:id="rId92"/>
           <w:pgSz w:w="10080" w:h="14400"/>
           <w:pgMar w:top="1008" w:right="1008" w:bottom="1008" w:left="1008" w:header="504" w:footer="504" w:gutter="0"/>
           <w:cols w:space="720"/>
@@ -9585,7 +9678,7 @@
         </w:rPr>
         <w:t xml:space="preserve">An impression, in Studio, is not every time your video exists somewhere. YouTube’s </w:t>
       </w:r>
-      <w:hyperlink r:id="rId94">
+      <w:hyperlink r:id="rId95">
         <w:r>
           <w:rPr>
             <w:rStyle w:val="Hyperlink"/>
@@ -9609,7 +9702,7 @@
         </w:rPr>
         <w:t xml:space="preserve">YouTube’s </w:t>
       </w:r>
-      <w:hyperlink r:id="rId95">
+      <w:hyperlink r:id="rId96">
         <w:r>
           <w:rPr>
             <w:rStyle w:val="Hyperlink"/>
@@ -9723,7 +9816,7 @@
         </w:rPr>
         <w:t xml:space="preserve">Open a video’s Analytics and choose Reach. The report YouTube’s </w:t>
       </w:r>
-      <w:hyperlink r:id="rId96">
+      <w:hyperlink r:id="rId97">
         <w:r>
           <w:rPr>
             <w:rStyle w:val="Hyperlink"/>
@@ -10402,6 +10495,59 @@
         <w:t>Everything else on the Reach tab is context. It is worth a glance once a month. It is not worth a decision once a week.</w:t>
       </w:r>
     </w:p>
+    <w:tbl>
+      <w:tblPr>
+        <w:tblW w:type="auto" w:w="0"/>
+        <w:tblLayout w:type="fixed"/>
+        <w:tblLook w:firstColumn="1" w:firstRow="1" w:lastColumn="0" w:lastRow="0" w:noHBand="0" w:noVBand="1" w:val="04A0"/>
+      </w:tblPr>
+      <w:tblGrid>
+        <w:gridCol w:w="8064"/>
+      </w:tblGrid>
+      <w:tr>
+        <w:tc>
+          <w:tcPr>
+            <w:tcW w:type="dxa" w:w="8064"/>
+            <w:tcW w:w="8063" w:type="dxa"/>
+            <w:shd w:val="clear" w:color="auto" w:fill="F3F1EA"/>
+          </w:tcPr>
+          <w:p>
+            <w:pPr>
+              <w:spacing w:after="40" w:before="40"/>
+            </w:pPr>
+            <w:r>
+              <w:rPr>
+                <w:rFonts w:ascii="Calibri" w:hAnsi="Calibri"/>
+                <w:sz w:val="22"/>
+              </w:rPr>
+            </w:r>
+            <w:r>
+              <w:rPr>
+                <w:rFonts w:ascii="Calibri" w:hAnsi="Calibri"/>
+                <w:sz w:val="22"/>
+              </w:rPr>
+              <w:t xml:space="preserve">Case study: In 2008, Weezer posted a video for their song “Pork and Beans” and picked up close to two million views within days — the kind of number a channel might credit to the song or the YouTube home page. Their team opened YouTube’s traffic-source report of the time (then called Insight) and found something they had not expected: a large share of early viewers had arrived by way of technology blogs linking to the video, not by searching or browsing YouTube itself. Three days in, 38% of viewers had found the video off YouTube entirely. Ben Patterson, who worked on the band’s digital strategy, said what made the report useful was exactly the thing this section is about: not the view count, but </w:t>
+            </w:r>
+            <w:r>
+              <w:rPr>
+                <w:rFonts w:ascii="Calibri" w:hAnsi="Calibri"/>
+                <w:i/>
+                <w:sz w:val="22"/>
+              </w:rPr>
+              <w:t>how</w:t>
+            </w:r>
+            <w:r>
+              <w:rPr>
+                <w:rFonts w:ascii="Calibri" w:hAnsi="Calibri"/>
+                <w:sz w:val="22"/>
+              </w:rPr>
+              <w:t xml:space="preserve"> people found the video. The report has a different name and a different layout today. The question it answers for a creator reading Reach in Studio has not changed.</w:t>
+            </w:r>
+          </w:p>
+        </w:tc>
+      </w:tr>
+    </w:tbl>
+    <w:p/>
     <w:p>
       <w:bookmarkStart w:id="56" w:name="toc55"/>
       <w:pPr>
@@ -10489,7 +10635,7 @@
         </w:rPr>
         <w:t xml:space="preserve">Studio’s </w:t>
       </w:r>
-      <w:hyperlink r:id="rId97">
+      <w:hyperlink r:id="rId98">
         <w:r>
           <w:rPr>
             <w:rStyle w:val="Hyperlink"/>
@@ -10838,7 +10984,7 @@
           <w:rFonts w:ascii="Calibri" w:hAnsi="Calibri"/>
           <w:i/>
         </w:rPr>
-        <w:t xml:space="preserve">Sources: What counts toward the thresholds is from </w:t>
+        <w:t xml:space="preserve">Sources: The Weezer case study is from contemporaneous 2008 reporting, including an interview with YouTube’s own product management team conducted by Eric Enge, and independent news coverage of the same episode at the time; this book treats the 38% figure and the Ben Patterson quote as well-corroborated history, not a number audited by this book. YouTube Insight was the analytics tool of that era and is not the current Reach tab; the lesson about reading traffic sources carries over. What counts toward the thresholds is from </w:t>
       </w:r>
       <w:hyperlink r:id="rId13">
         <w:r>
@@ -10857,7 +11003,7 @@
         </w:rPr>
         <w:t xml:space="preserve">. Impression counting rules are from </w:t>
       </w:r>
-      <w:hyperlink r:id="rId94">
+      <w:hyperlink r:id="rId95">
         <w:r>
           <w:rPr>
             <w:rStyle w:val="Hyperlink"/>
@@ -10874,7 +11020,7 @@
         </w:rPr>
         <w:t xml:space="preserve">. The 2%–10% band, the clickbait pattern, the advice to wait before reading the rate, and views exceeding impressions are from </w:t>
       </w:r>
-      <w:hyperlink r:id="rId95">
+      <w:hyperlink r:id="rId96">
         <w:r>
           <w:rPr>
             <w:rStyle w:val="Hyperlink"/>
@@ -10891,7 +11037,7 @@
         </w:rPr>
         <w:t xml:space="preserve">. Traffic source definitions, the search terms card, and the “Content suggesting this video” card are from </w:t>
       </w:r>
-      <w:hyperlink r:id="rId96">
+      <w:hyperlink r:id="rId97">
         <w:r>
           <w:rPr>
             <w:rStyle w:val="Hyperlink"/>
@@ -10908,7 +11054,7 @@
         </w:rPr>
         <w:t xml:space="preserve">. The August 24, 2026 view-counting change, engaged views, and Key moments for audience retention are from </w:t>
       </w:r>
-      <w:hyperlink r:id="rId97">
+      <w:hyperlink r:id="rId98">
         <w:r>
           <w:rPr>
             <w:rStyle w:val="Hyperlink"/>
@@ -10929,8 +11075,8 @@
     <w:p>
       <w:pPr>
         <w:sectPr>
-          <w:headerReference w:type="default" r:id="rId92"/>
-          <w:footerReference w:type="default" r:id="rId93"/>
+          <w:headerReference w:type="default" r:id="rId93"/>
+          <w:footerReference w:type="default" r:id="rId94"/>
           <w:pgSz w:w="10080" w:h="14400"/>
           <w:pgMar w:top="1008" w:right="1008" w:bottom="1008" w:left="1008" w:header="504" w:footer="504" w:gutter="0"/>
           <w:cols w:space="720"/>
@@ -11263,7 +11409,7 @@
         </w:rPr>
         <w:t xml:space="preserve"> </w:t>
       </w:r>
-      <w:hyperlink r:id="rId83">
+      <w:hyperlink r:id="rId84">
         <w:r>
           <w:rPr>
             <w:rStyle w:val="Hyperlink"/>
@@ -11429,7 +11575,7 @@
         </w:rPr>
         <w:t xml:space="preserve"> YouTube’s </w:t>
       </w:r>
-      <w:hyperlink r:id="rId100">
+      <w:hyperlink r:id="rId101">
         <w:r>
           <w:rPr>
             <w:rStyle w:val="Hyperlink"/>
@@ -11663,7 +11809,7 @@
         </w:rPr>
         <w:t xml:space="preserve">. The Colin and Samir case study figures are from their own public interviews on the creator economy, including </w:t>
       </w:r>
-      <w:hyperlink r:id="rId101">
+      <w:hyperlink r:id="rId102">
         <w:r>
           <w:rPr>
             <w:rStyle w:val="Hyperlink"/>
@@ -11680,7 +11826,7 @@
         </w:rPr>
         <w:t xml:space="preserve">; figures are their own disclosed numbers, not independently audited. The 2027 thresholds and the Shorts revenue floor are from the </w:t>
       </w:r>
-      <w:hyperlink r:id="rId102">
+      <w:hyperlink r:id="rId103">
         <w:r>
           <w:rPr>
             <w:rStyle w:val="Hyperlink"/>
@@ -11714,7 +11860,7 @@
         </w:rPr>
         <w:t xml:space="preserve">. End screen rules are from </w:t>
       </w:r>
-      <w:hyperlink r:id="rId83">
+      <w:hyperlink r:id="rId84">
         <w:r>
           <w:rPr>
             <w:rStyle w:val="Hyperlink"/>
@@ -11731,7 +11877,7 @@
         </w:rPr>
         <w:t xml:space="preserve">. Bought engagement is covered by </w:t>
       </w:r>
-      <w:hyperlink r:id="rId100">
+      <w:hyperlink r:id="rId101">
         <w:r>
           <w:rPr>
             <w:rStyle w:val="Hyperlink"/>
@@ -11752,8 +11898,8 @@
     <w:p>
       <w:pPr>
         <w:sectPr>
-          <w:headerReference w:type="default" r:id="rId98"/>
-          <w:footerReference w:type="default" r:id="rId99"/>
+          <w:headerReference w:type="default" r:id="rId99"/>
+          <w:footerReference w:type="default" r:id="rId100"/>
           <w:pgSz w:w="10080" w:h="14400"/>
           <w:pgMar w:top="1008" w:right="1008" w:bottom="1008" w:left="1008" w:header="504" w:footer="504" w:gutter="0"/>
           <w:cols w:space="720"/>
@@ -12261,7 +12407,7 @@
         </w:rPr>
         <w:t xml:space="preserve">YouTube announced that change on </w:t>
       </w:r>
-      <w:hyperlink r:id="rId102">
+      <w:hyperlink r:id="rId103">
         <w:r>
           <w:rPr>
             <w:rStyle w:val="Hyperlink"/>
@@ -12722,7 +12868,7 @@
         </w:rPr>
         <w:t xml:space="preserve"> and </w:t>
       </w:r>
-      <w:hyperlink r:id="rId105">
+      <w:hyperlink r:id="rId106">
         <w:r>
           <w:rPr>
             <w:rStyle w:val="Hyperlink"/>
@@ -12739,7 +12885,7 @@
         </w:rPr>
         <w:t xml:space="preserve">. The 2027 thresholds are from the </w:t>
       </w:r>
-      <w:hyperlink r:id="rId102">
+      <w:hyperlink r:id="rId103">
         <w:r>
           <w:rPr>
             <w:rStyle w:val="Hyperlink"/>
@@ -12760,8 +12906,8 @@
     <w:p>
       <w:pPr>
         <w:sectPr>
-          <w:headerReference w:type="default" r:id="rId103"/>
-          <w:footerReference w:type="default" r:id="rId104"/>
+          <w:headerReference w:type="default" r:id="rId104"/>
+          <w:footerReference w:type="default" r:id="rId105"/>
           <w:pgSz w:w="10080" w:h="14400"/>
           <w:pgMar w:top="1008" w:right="1008" w:bottom="1008" w:left="1008" w:header="504" w:footer="504" w:gutter="0"/>
           <w:cols w:space="720"/>
@@ -13308,7 +13454,7 @@
         </w:rPr>
         <w:t xml:space="preserve">YouTube’s </w:t>
       </w:r>
-      <w:hyperlink r:id="rId108">
+      <w:hyperlink r:id="rId109">
         <w:r>
           <w:rPr>
             <w:rStyle w:val="Hyperlink"/>
@@ -13394,7 +13540,7 @@
         </w:rPr>
         <w:t xml:space="preserve"> stops you posting for one week. YouTube’s </w:t>
       </w:r>
-      <w:hyperlink r:id="rId109">
+      <w:hyperlink r:id="rId110">
         <w:r>
           <w:rPr>
             <w:rStyle w:val="Hyperlink"/>
@@ -13498,7 +13644,7 @@
         </w:rPr>
         <w:t xml:space="preserve"> YouTube’s </w:t>
       </w:r>
-      <w:hyperlink r:id="rId110">
+      <w:hyperlink r:id="rId111">
         <w:r>
           <w:rPr>
             <w:rStyle w:val="Hyperlink"/>
@@ -13532,7 +13678,7 @@
         </w:rPr>
         <w:t xml:space="preserve"> Paying a service for views, subscribers, or likes falls under YouTube’s </w:t>
       </w:r>
-      <w:hyperlink r:id="rId100">
+      <w:hyperlink r:id="rId101">
         <w:r>
           <w:rPr>
             <w:rStyle w:val="Hyperlink"/>
@@ -13566,7 +13712,7 @@
         </w:rPr>
         <w:t xml:space="preserve"> YouTube’s </w:t>
       </w:r>
-      <w:hyperlink r:id="rId111">
+      <w:hyperlink r:id="rId112">
         <w:r>
           <w:rPr>
             <w:rStyle w:val="Hyperlink"/>
@@ -13600,7 +13746,7 @@
         </w:rPr>
         <w:t xml:space="preserve">A copyright strike comes from a person or company sending YouTube a formal removal request. YouTube’s </w:t>
       </w:r>
-      <w:hyperlink r:id="rId112">
+      <w:hyperlink r:id="rId113">
         <w:r>
           <w:rPr>
             <w:rStyle w:val="Hyperlink"/>
@@ -13616,7 +13762,7 @@
         </w:rPr>
         <w:t xml:space="preserve"> says these requests are reviewed, and that if one appears valid, YouTube has to remove the content to comply with copyright law. The </w:t>
       </w:r>
-      <w:hyperlink r:id="rId113">
+      <w:hyperlink r:id="rId114">
         <w:r>
           <w:rPr>
             <w:rStyle w:val="Hyperlink"/>
@@ -13640,7 +13786,7 @@
         </w:rPr>
         <w:t xml:space="preserve">Some removal requests are scheduled. YouTube’s </w:t>
       </w:r>
-      <w:hyperlink r:id="rId114">
+      <w:hyperlink r:id="rId115">
         <w:r>
           <w:rPr>
             <w:rStyle w:val="Hyperlink"/>
@@ -13809,7 +13955,7 @@
         </w:rPr>
         <w:t xml:space="preserve">A Content ID claim is generated automatically when an upload matches a reference file a rights holder has given YouTube. YouTube’s </w:t>
       </w:r>
-      <w:hyperlink r:id="rId115">
+      <w:hyperlink r:id="rId116">
         <w:r>
           <w:rPr>
             <w:rStyle w:val="Hyperlink"/>
@@ -13913,7 +14059,7 @@
         </w:rPr>
         <w:t xml:space="preserve">Once you are in the Partner Program, every video carries a monetization status. YouTube’s </w:t>
       </w:r>
-      <w:hyperlink r:id="rId116">
+      <w:hyperlink r:id="rId117">
         <w:r>
           <w:rPr>
             <w:rStyle w:val="Hyperlink"/>
@@ -14017,7 +14163,7 @@
         </w:rPr>
         <w:t xml:space="preserve">If a company paid you, gave you the product, or otherwise compensated you for a video, YouTube’s </w:t>
       </w:r>
-      <w:hyperlink r:id="rId117">
+      <w:hyperlink r:id="rId118">
         <w:r>
           <w:rPr>
             <w:rStyle w:val="Hyperlink"/>
@@ -14033,7 +14179,7 @@
         </w:rPr>
         <w:t xml:space="preserve"> says you have to tell YouTube by ticking the box that reads, “My video contains paid promotion like a product placement, sponsorship, or endorsement.” On a computer it is in Studio, in the video’s details, under more options. On the mobile apps it sits under paid promotion and brands. Once it is ticked, YouTube shows viewers a disclosure message at the start of the video. YouTube’s </w:t>
       </w:r>
-      <w:hyperlink r:id="rId118">
+      <w:hyperlink r:id="rId119">
         <w:r>
           <w:rPr>
             <w:rStyle w:val="Hyperlink"/>
@@ -14091,7 +14237,7 @@
         </w:rPr>
         <w:t xml:space="preserve">YouTube’s </w:t>
       </w:r>
-      <w:hyperlink r:id="rId119">
+      <w:hyperlink r:id="rId120">
         <w:r>
           <w:rPr>
             <w:rStyle w:val="Hyperlink"/>
@@ -14115,7 +14261,7 @@
         </w:rPr>
         <w:t xml:space="preserve">What does not need it, per the same page and YouTube’s </w:t>
       </w:r>
-      <w:hyperlink r:id="rId120">
+      <w:hyperlink r:id="rId121">
         <w:r>
           <w:rPr>
             <w:rStyle w:val="Hyperlink"/>
@@ -14147,7 +14293,7 @@
         </w:rPr>
         <w:t xml:space="preserve">Two changes are worth knowing. YouTube’s </w:t>
       </w:r>
-      <w:hyperlink r:id="rId121">
+      <w:hyperlink r:id="rId122">
         <w:r>
           <w:rPr>
             <w:rStyle w:val="Hyperlink"/>
@@ -14210,7 +14356,7 @@
         </w:rPr>
         <w:t xml:space="preserve">The policies above judge a video. </w:t>
       </w:r>
-      <w:hyperlink r:id="rId122">
+      <w:hyperlink r:id="rId123">
         <w:r>
           <w:rPr>
             <w:rStyle w:val="Hyperlink"/>
@@ -14296,7 +14442,7 @@
         </w:rPr>
         <w:t xml:space="preserve">Every channel and every video has an audience setting: made for kids, or not. YouTube’s </w:t>
       </w:r>
-      <w:hyperlink r:id="rId123">
+      <w:hyperlink r:id="rId124">
         <w:r>
           <w:rPr>
             <w:rStyle w:val="Hyperlink"/>
@@ -14700,7 +14846,7 @@
         </w:rPr>
         <w:t xml:space="preserve">Sources: Warning, training, strike, and termination rules are from </w:t>
       </w:r>
-      <w:hyperlink r:id="rId108">
+      <w:hyperlink r:id="rId109">
         <w:r>
           <w:rPr>
             <w:rStyle w:val="Hyperlink"/>
@@ -14717,7 +14863,7 @@
         </w:rPr>
         <w:t xml:space="preserve">, its </w:t>
       </w:r>
-      <w:hyperlink r:id="rId109">
+      <w:hyperlink r:id="rId110">
         <w:r>
           <w:rPr>
             <w:rStyle w:val="Hyperlink"/>
@@ -14734,7 +14880,7 @@
         </w:rPr>
         <w:t xml:space="preserve">, and its </w:t>
       </w:r>
-      <w:hyperlink r:id="rId113">
+      <w:hyperlink r:id="rId114">
         <w:r>
           <w:rPr>
             <w:rStyle w:val="Hyperlink"/>
@@ -14751,7 +14897,7 @@
         </w:rPr>
         <w:t xml:space="preserve">. Copyright strike resolution is from </w:t>
       </w:r>
-      <w:hyperlink r:id="rId112">
+      <w:hyperlink r:id="rId113">
         <w:r>
           <w:rPr>
             <w:rStyle w:val="Hyperlink"/>
@@ -14768,7 +14914,7 @@
         </w:rPr>
         <w:t xml:space="preserve"> and its </w:t>
       </w:r>
-      <w:hyperlink r:id="rId114">
+      <w:hyperlink r:id="rId115">
         <w:r>
           <w:rPr>
             <w:rStyle w:val="Hyperlink"/>
@@ -14799,7 +14945,7 @@
         </w:rPr>
         <w:t xml:space="preserve">, 276 F. Supp. 3d 34 (S.D.N.Y. 2017); the ruling date, the quoted holding, and the case background are corroborated across the </w:t>
       </w:r>
-      <w:hyperlink r:id="rId124">
+      <w:hyperlink r:id="rId125">
         <w:r>
           <w:rPr>
             <w:rStyle w:val="Hyperlink"/>
@@ -14816,7 +14962,7 @@
         </w:rPr>
         <w:t xml:space="preserve"> and independent legal reporting at the time, including </w:t>
       </w:r>
-      <w:hyperlink r:id="rId125">
+      <w:hyperlink r:id="rId126">
         <w:r>
           <w:rPr>
             <w:rStyle w:val="Hyperlink"/>
@@ -14833,7 +14979,7 @@
         </w:rPr>
         <w:t xml:space="preserve"> and a law firm client alert from </w:t>
       </w:r>
-      <w:hyperlink r:id="rId126">
+      <w:hyperlink r:id="rId127">
         <w:r>
           <w:rPr>
             <w:rStyle w:val="Hyperlink"/>
@@ -14850,7 +14996,7 @@
         </w:rPr>
         <w:t xml:space="preserve">. Content ID claim policies and the Shorts blocking rule are from </w:t>
       </w:r>
-      <w:hyperlink r:id="rId115">
+      <w:hyperlink r:id="rId116">
         <w:r>
           <w:rPr>
             <w:rStyle w:val="Hyperlink"/>
@@ -14867,7 +15013,7 @@
         </w:rPr>
         <w:t xml:space="preserve">. Limited ads, self-certification, and human review are from </w:t>
       </w:r>
-      <w:hyperlink r:id="rId116">
+      <w:hyperlink r:id="rId117">
         <w:r>
           <w:rPr>
             <w:rStyle w:val="Hyperlink"/>
@@ -14884,7 +15030,7 @@
         </w:rPr>
         <w:t xml:space="preserve">. That claimed videos lose Super Thanks and music-claimed videos count against memberships is from YouTube’s Super Thanks and memberships eligibility pages, cited in chapter 12. The paid promotion checkbox and disclosure message are from </w:t>
       </w:r>
-      <w:hyperlink r:id="rId117">
+      <w:hyperlink r:id="rId118">
         <w:r>
           <w:rPr>
             <w:rStyle w:val="Hyperlink"/>
@@ -14901,7 +15047,7 @@
         </w:rPr>
         <w:t xml:space="preserve"> and its </w:t>
       </w:r>
-      <w:hyperlink r:id="rId118">
+      <w:hyperlink r:id="rId119">
         <w:r>
           <w:rPr>
             <w:rStyle w:val="Hyperlink"/>
@@ -14918,7 +15064,7 @@
         </w:rPr>
         <w:t xml:space="preserve">. AI disclosure requirements are from </w:t>
       </w:r>
-      <w:hyperlink r:id="rId119">
+      <w:hyperlink r:id="rId120">
         <w:r>
           <w:rPr>
             <w:rStyle w:val="Hyperlink"/>
@@ -14935,7 +15081,7 @@
         </w:rPr>
         <w:t xml:space="preserve">, the </w:t>
       </w:r>
-      <w:hyperlink r:id="rId120">
+      <w:hyperlink r:id="rId121">
         <w:r>
           <w:rPr>
             <w:rStyle w:val="Hyperlink"/>
@@ -14952,7 +15098,7 @@
         </w:rPr>
         <w:t xml:space="preserve">, and the </w:t>
       </w:r>
-      <w:hyperlink r:id="rId121">
+      <w:hyperlink r:id="rId122">
         <w:r>
           <w:rPr>
             <w:rStyle w:val="Hyperlink"/>
@@ -14969,7 +15115,7 @@
         </w:rPr>
         <w:t xml:space="preserve">. The reused content, inauthentic content, and AI persona rules are from </w:t>
       </w:r>
-      <w:hyperlink r:id="rId122">
+      <w:hyperlink r:id="rId123">
         <w:r>
           <w:rPr>
             <w:rStyle w:val="Hyperlink"/>
@@ -15003,7 +15149,7 @@
         </w:rPr>
         <w:t xml:space="preserve">. The FTC’s </w:t>
       </w:r>
-      <w:hyperlink r:id="rId127">
+      <w:hyperlink r:id="rId128">
         <w:r>
           <w:rPr>
             <w:rStyle w:val="Hyperlink"/>
@@ -15020,7 +15166,7 @@
         </w:rPr>
         <w:t xml:space="preserve"> and </w:t>
       </w:r>
-      <w:hyperlink r:id="rId128">
+      <w:hyperlink r:id="rId129">
         <w:r>
           <w:rPr>
             <w:rStyle w:val="Hyperlink"/>
@@ -15037,7 +15183,7 @@
         </w:rPr>
         <w:t xml:space="preserve"> are US guidance. Made-for-kids features are from </w:t>
       </w:r>
-      <w:hyperlink r:id="rId123">
+      <w:hyperlink r:id="rId124">
         <w:r>
           <w:rPr>
             <w:rStyle w:val="Hyperlink"/>
@@ -15058,8 +15204,8 @@
     <w:p>
       <w:pPr>
         <w:sectPr>
-          <w:headerReference w:type="default" r:id="rId106"/>
-          <w:footerReference w:type="default" r:id="rId107"/>
+          <w:headerReference w:type="default" r:id="rId107"/>
+          <w:footerReference w:type="default" r:id="rId108"/>
           <w:pgSz w:w="10080" w:h="14400"/>
           <w:pgMar w:top="1008" w:right="1008" w:bottom="1008" w:left="1008" w:header="504" w:footer="504" w:gutter="0"/>
           <w:cols w:space="720"/>
@@ -15122,7 +15268,7 @@
       </w:r>
     </w:p>
     <w:p>
-      <w:hyperlink r:id="rId131">
+      <w:hyperlink r:id="rId132">
         <w:r>
           <w:rPr>
             <w:rStyle w:val="Hyperlink"/>
@@ -15174,7 +15320,7 @@
         </w:rPr>
         <w:t xml:space="preserve"> </w:t>
       </w:r>
-      <w:hyperlink r:id="rId80">
+      <w:hyperlink r:id="rId81">
         <w:r>
           <w:rPr>
             <w:rStyle w:val="Hyperlink"/>
@@ -15730,7 +15876,7 @@
         </w:rPr>
         <w:t xml:space="preserve">Shorts ads run between videos in the Shorts feed, not beside one video, so YouTube pools them. </w:t>
       </w:r>
-      <w:hyperlink r:id="rId132">
+      <w:hyperlink r:id="rId133">
         <w:r>
           <w:rPr>
             <w:rStyle w:val="Hyperlink"/>
@@ -16140,7 +16286,7 @@
         </w:rPr>
         <w:t xml:space="preserve">Sources: Ad formats, mid-rolls, and Watch While ads are from </w:t>
       </w:r>
-      <w:hyperlink r:id="rId131">
+      <w:hyperlink r:id="rId132">
         <w:r>
           <w:rPr>
             <w:rStyle w:val="Hyperlink"/>
@@ -16157,7 +16303,7 @@
         </w:rPr>
         <w:t xml:space="preserve"> and </w:t>
       </w:r>
-      <w:hyperlink r:id="rId80">
+      <w:hyperlink r:id="rId81">
         <w:r>
           <w:rPr>
             <w:rStyle w:val="Hyperlink"/>
@@ -16208,7 +16354,7 @@
         </w:rPr>
         <w:t xml:space="preserve">. The 55% long-form share is from YouTube’s </w:t>
       </w:r>
-      <w:hyperlink r:id="rId133">
+      <w:hyperlink r:id="rId134">
         <w:r>
           <w:rPr>
             <w:rStyle w:val="Hyperlink"/>
@@ -16225,7 +16371,7 @@
         </w:rPr>
         <w:t xml:space="preserve">. The Premium and Premium Lite pools and the 2027 Shorts floor are from the </w:t>
       </w:r>
-      <w:hyperlink r:id="rId102">
+      <w:hyperlink r:id="rId103">
         <w:r>
           <w:rPr>
             <w:rStyle w:val="Hyperlink"/>
@@ -16242,7 +16388,7 @@
         </w:rPr>
         <w:t xml:space="preserve">. The Shorts Creator Pool, its example, the module date, ineligible views, and targeted Shorts ads are from </w:t>
       </w:r>
-      <w:hyperlink r:id="rId132">
+      <w:hyperlink r:id="rId133">
         <w:r>
           <w:rPr>
             <w:rStyle w:val="Hyperlink"/>
@@ -16263,8 +16409,8 @@
     <w:p>
       <w:pPr>
         <w:sectPr>
-          <w:headerReference w:type="default" r:id="rId129"/>
-          <w:footerReference w:type="default" r:id="rId130"/>
+          <w:headerReference w:type="default" r:id="rId130"/>
+          <w:footerReference w:type="default" r:id="rId131"/>
           <w:pgSz w:w="10080" w:h="14400"/>
           <w:pgMar w:top="1008" w:right="1008" w:bottom="1008" w:left="1008" w:header="504" w:footer="504" w:gutter="0"/>
           <w:cols w:space="720"/>
@@ -16319,7 +16465,7 @@
       <w:bookmarkEnd w:id="100"/>
     </w:p>
     <w:p>
-      <w:hyperlink r:id="rId136">
+      <w:hyperlink r:id="rId137">
         <w:r>
           <w:rPr>
             <w:rStyle w:val="Hyperlink"/>
@@ -16413,7 +16559,7 @@
         </w:rPr>
         <w:t xml:space="preserve">A membership is a monthly payment from a viewer in return for perks you choose. </w:t>
       </w:r>
-      <w:hyperlink r:id="rId137">
+      <w:hyperlink r:id="rId138">
         <w:r>
           <w:rPr>
             <w:rStyle w:val="Hyperlink"/>
@@ -16437,7 +16583,7 @@
         </w:rPr>
         <w:t xml:space="preserve">The structure, from </w:t>
       </w:r>
-      <w:hyperlink r:id="rId138">
+      <w:hyperlink r:id="rId139">
         <w:r>
           <w:rPr>
             <w:rStyle w:val="Hyperlink"/>
@@ -16486,7 +16632,7 @@
         </w:rPr>
         <w:t xml:space="preserve">Prices come from a fixed list for each country. </w:t>
       </w:r>
-      <w:hyperlink r:id="rId139">
+      <w:hyperlink r:id="rId140">
         <w:r>
           <w:rPr>
             <w:rStyle w:val="Hyperlink"/>
@@ -16538,6 +16684,44 @@
         <w:t>One rule protects your members from your mistakes. If the channel falls out of the policies, loses monetization, or is set as made for kids, memberships enter paused mode: perks stop, billing pauses, and the Join button disappears. After 120 days in paused mode, the program ends, members are refunded their last payment, and the refunds come out of your share. A strike you could have avoided is also a membership program you could lose.</w:t>
       </w:r>
     </w:p>
+    <w:tbl>
+      <w:tblPr>
+        <w:tblW w:type="auto" w:w="0"/>
+        <w:tblLayout w:type="fixed"/>
+        <w:tblLook w:firstColumn="1" w:firstRow="1" w:lastColumn="0" w:lastRow="0" w:noHBand="0" w:noVBand="1" w:val="04A0"/>
+      </w:tblPr>
+      <w:tblGrid>
+        <w:gridCol w:w="8064"/>
+      </w:tblGrid>
+      <w:tr>
+        <w:tc>
+          <w:tcPr>
+            <w:tcW w:type="dxa" w:w="8064"/>
+            <w:tcW w:w="8063" w:type="dxa"/>
+            <w:shd w:val="clear" w:color="auto" w:fill="F3F1EA"/>
+          </w:tcPr>
+          <w:p>
+            <w:pPr>
+              <w:spacing w:after="40" w:before="40"/>
+            </w:pPr>
+            <w:r>
+              <w:rPr>
+                <w:rFonts w:ascii="Calibri" w:hAnsi="Calibri"/>
+                <w:sz w:val="22"/>
+              </w:rPr>
+            </w:r>
+            <w:r>
+              <w:rPr>
+                <w:rFonts w:ascii="Calibri" w:hAnsi="Calibri"/>
+                <w:sz w:val="22"/>
+              </w:rPr>
+              <w:t>Case study: YouTube’s own creator blog has named Rachana Ranade, a chartered accountant who teaches financial literacy on her channel, as one of a handful of creators making the most of memberships. She turned the feature on in 2020 and, by YouTube’s own account, made channel memberships her largest income stream directly from YouTube that year — over $100,000 — with tiers priced at a few dollars a month and a top tier that included a monthly stock-pick breakdown for members only. Her channel’s reach, well over a million subscribers, is not a number a new channel starts with. The structure underneath it is: a small number of priced tiers, each with a perk a regular actually wants, can outearn the ads on the same channel.</w:t>
+            </w:r>
+          </w:p>
+        </w:tc>
+      </w:tr>
+    </w:tbl>
+    <w:p/>
     <w:p>
       <w:bookmarkStart w:id="102" w:name="toc101"/>
       <w:pPr>
@@ -16555,7 +16739,7 @@
         </w:rPr>
         <w:t xml:space="preserve">These two belong to live: live streams and premieres with live chat turned on. A viewer pays to highlight a message in the chat, or to send an animated sticker. </w:t>
       </w:r>
-      <w:hyperlink r:id="rId140">
+      <w:hyperlink r:id="rId141">
         <w:r>
           <w:rPr>
             <w:rStyle w:val="Hyperlink"/>
@@ -16573,7 +16757,7 @@
       </w:r>
     </w:p>
     <w:p>
-      <w:hyperlink r:id="rId141">
+      <w:hyperlink r:id="rId142">
         <w:r>
           <w:rPr>
             <w:rStyle w:val="Hyperlink"/>
@@ -16631,7 +16815,7 @@
         </w:rPr>
         <w:t xml:space="preserve">Super Thanks is the one fan-funding feature that does not need you live. A viewer buys a one-time animation on a long-form video or a Short and gets a highlighted comment in the comments section. </w:t>
       </w:r>
-      <w:hyperlink r:id="rId142">
+      <w:hyperlink r:id="rId143">
         <w:r>
           <w:rPr>
             <w:rStyle w:val="Hyperlink"/>
@@ -16671,7 +16855,7 @@
         </w:rPr>
         <w:t xml:space="preserve">YouTube’s </w:t>
       </w:r>
-      <w:hyperlink r:id="rId143">
+      <w:hyperlink r:id="rId144">
         <w:r>
           <w:rPr>
             <w:rStyle w:val="Hyperlink"/>
@@ -16896,9 +17080,26 @@
           <w:rFonts w:ascii="Calibri" w:hAnsi="Calibri"/>
           <w:i/>
         </w:rPr>
-        <w:t xml:space="preserve">Sources: Minimum requirements and the four features are from </w:t>
-      </w:r>
-      <w:hyperlink r:id="rId136">
+        <w:t xml:space="preserve">Sources: The Rachana Ranade case study is from </w:t>
+      </w:r>
+      <w:hyperlink r:id="rId145">
+        <w:r>
+          <w:rPr>
+            <w:rStyle w:val="Hyperlink"/>
+            <w:sz w:val="22"/>
+            <w:rFonts w:ascii="Calibri" w:hAnsi="Calibri"/>
+          </w:rPr>
+          <w:t xml:space="preserve">YouTube’s own creator blog</w:t>
+        </w:r>
+      </w:hyperlink>
+      <w:r>
+        <w:rPr>
+          <w:rFonts w:ascii="Calibri" w:hAnsi="Calibri"/>
+          <w:i/>
+        </w:rPr>
+        <w:t xml:space="preserve">, corroborated by independent reporting on her channel and tiers; this book treats the $100,000 figure and the “largest income stream” claim as YouTube’s own disclosed account of a creator it chose to feature, not an independently audited number. Minimum requirements and the four features are from </w:t>
+      </w:r>
+      <w:hyperlink r:id="rId137">
         <w:r>
           <w:rPr>
             <w:rStyle w:val="Hyperlink"/>
@@ -16915,7 +17116,7 @@
         </w:rPr>
         <w:t xml:space="preserve">. Membership eligibility, banned perks, and paused mode are from </w:t>
       </w:r>
-      <w:hyperlink r:id="rId137">
+      <w:hyperlink r:id="rId138">
         <w:r>
           <w:rPr>
             <w:rStyle w:val="Hyperlink"/>
@@ -16932,7 +17133,7 @@
         </w:rPr>
         <w:t xml:space="preserve">; levels and perks from </w:t>
       </w:r>
-      <w:hyperlink r:id="rId138">
+      <w:hyperlink r:id="rId139">
         <w:r>
           <w:rPr>
             <w:rStyle w:val="Hyperlink"/>
@@ -16949,7 +17150,7 @@
         </w:rPr>
         <w:t xml:space="preserve">; US prices from </w:t>
       </w:r>
-      <w:hyperlink r:id="rId139">
+      <w:hyperlink r:id="rId140">
         <w:r>
           <w:rPr>
             <w:rStyle w:val="Hyperlink"/>
@@ -16966,7 +17167,7 @@
         </w:rPr>
         <w:t xml:space="preserve">; the 70% share from </w:t>
       </w:r>
-      <w:hyperlink r:id="rId144">
+      <w:hyperlink r:id="rId146">
         <w:r>
           <w:rPr>
             <w:rStyle w:val="Hyperlink"/>
@@ -16983,7 +17184,7 @@
         </w:rPr>
         <w:t xml:space="preserve"> and the pricing guidance from </w:t>
       </w:r>
-      <w:hyperlink r:id="rId145">
+      <w:hyperlink r:id="rId147">
         <w:r>
           <w:rPr>
             <w:rStyle w:val="Hyperlink"/>
@@ -17000,7 +17201,7 @@
         </w:rPr>
         <w:t xml:space="preserve">. Super Chat and Super Stickers rules and the 70% share are from </w:t>
       </w:r>
-      <w:hyperlink r:id="rId140">
+      <w:hyperlink r:id="rId141">
         <w:r>
           <w:rPr>
             <w:rStyle w:val="Hyperlink"/>
@@ -17017,7 +17218,7 @@
         </w:rPr>
         <w:t xml:space="preserve"> and </w:t>
       </w:r>
-      <w:hyperlink r:id="rId141">
+      <w:hyperlink r:id="rId142">
         <w:r>
           <w:rPr>
             <w:rStyle w:val="Hyperlink"/>
@@ -17034,7 +17235,7 @@
         </w:rPr>
         <w:t xml:space="preserve">. Super Thanks rules and its 70% share are from </w:t>
       </w:r>
-      <w:hyperlink r:id="rId142">
+      <w:hyperlink r:id="rId143">
         <w:r>
           <w:rPr>
             <w:rStyle w:val="Hyperlink"/>
@@ -17051,7 +17252,7 @@
         </w:rPr>
         <w:t xml:space="preserve"> and </w:t>
       </w:r>
-      <w:hyperlink r:id="rId146">
+      <w:hyperlink r:id="rId148">
         <w:r>
           <w:rPr>
             <w:rStyle w:val="Hyperlink"/>
@@ -17068,7 +17269,7 @@
         </w:rPr>
         <w:t xml:space="preserve">; the tips from </w:t>
       </w:r>
-      <w:hyperlink r:id="rId143">
+      <w:hyperlink r:id="rId144">
         <w:r>
           <w:rPr>
             <w:rStyle w:val="Hyperlink"/>
@@ -17089,8 +17290,8 @@
     <w:p>
       <w:pPr>
         <w:sectPr>
-          <w:headerReference w:type="default" r:id="rId134"/>
-          <w:footerReference w:type="default" r:id="rId135"/>
+          <w:headerReference w:type="default" r:id="rId135"/>
+          <w:footerReference w:type="default" r:id="rId136"/>
           <w:pgSz w:w="10080" w:h="14400"/>
           <w:pgMar w:top="1008" w:right="1008" w:bottom="1008" w:left="1008" w:header="504" w:footer="504" w:gutter="0"/>
           <w:cols w:space="720"/>
@@ -17278,7 +17479,7 @@
         </w:rPr>
         <w:t xml:space="preserve">YouTube runs its own matching tool between brands and creators. </w:t>
       </w:r>
-      <w:hyperlink r:id="rId149">
+      <w:hyperlink r:id="rId151">
         <w:r>
           <w:rPr>
             <w:rStyle w:val="Hyperlink"/>
@@ -17474,7 +17675,7 @@
         </w:rPr>
         <w:t xml:space="preserve">Chapter 10 has the rule in detail. YouTube’s </w:t>
       </w:r>
-      <w:hyperlink r:id="rId117">
+      <w:hyperlink r:id="rId118">
         <w:r>
           <w:rPr>
             <w:rStyle w:val="Hyperlink"/>
@@ -17586,7 +17787,7 @@
         </w:rPr>
         <w:t xml:space="preserve"> “Affiliate link” or “#ad,” in the same line. YouTube’s </w:t>
       </w:r>
-      <w:hyperlink r:id="rId111">
+      <w:hyperlink r:id="rId112">
         <w:r>
           <w:rPr>
             <w:rStyle w:val="Hyperlink"/>
@@ -17685,7 +17886,7 @@
         </w:rPr>
         <w:t xml:space="preserve">An </w:t>
       </w:r>
-      <w:hyperlink r:id="rId150">
+      <w:hyperlink r:id="rId152">
         <w:r>
           <w:rPr>
             <w:rStyle w:val="Hyperlink"/>
@@ -17701,7 +17902,7 @@
         </w:rPr>
         <w:t xml:space="preserve"> or </w:t>
       </w:r>
-      <w:hyperlink r:id="rId83">
+      <w:hyperlink r:id="rId84">
         <w:r>
           <w:rPr>
             <w:rStyle w:val="Hyperlink"/>
@@ -17735,7 +17936,7 @@
         </w:rPr>
         <w:t xml:space="preserve">YouTube also runs its own affiliate program, which lets a channel tag products from participating brands inside its videos and earn a commission on purchases. On </w:t>
       </w:r>
-      <w:hyperlink r:id="rId151">
+      <w:hyperlink r:id="rId153">
         <w:r>
           <w:rPr>
             <w:rStyle w:val="Hyperlink"/>
@@ -17753,7 +17954,7 @@
       </w:r>
     </w:p>
     <w:p>
-      <w:hyperlink r:id="rId152">
+      <w:hyperlink r:id="rId154">
         <w:r>
           <w:rPr>
             <w:rStyle w:val="Hyperlink"/>
@@ -17934,7 +18135,7 @@
         </w:rPr>
         <w:t xml:space="preserve">Sources: The Ali Abdaal case study is his own disclosed account, posted to his X (formerly Twitter) account </w:t>
       </w:r>
-      <w:hyperlink r:id="rId153">
+      <w:hyperlink r:id="rId155">
         <w:r>
           <w:rPr>
             <w:rStyle w:val="Hyperlink"/>
@@ -17951,7 +18152,7 @@
         </w:rPr>
         <w:t xml:space="preserve">; this book could not fetch that post directly, so the figures are treated as the verification standard actually met — his own stated numbers, as indexed and quoted consistently by search results, not an independently audited record. Creator Partnerships eligibility is from </w:t>
       </w:r>
-      <w:hyperlink r:id="rId149">
+      <w:hyperlink r:id="rId151">
         <w:r>
           <w:rPr>
             <w:rStyle w:val="Hyperlink"/>
@@ -17985,7 +18186,7 @@
         </w:rPr>
         <w:t xml:space="preserve">. The paid promotion box is from </w:t>
       </w:r>
-      <w:hyperlink r:id="rId117">
+      <w:hyperlink r:id="rId118">
         <w:r>
           <w:rPr>
             <w:rStyle w:val="Hyperlink"/>
@@ -18019,7 +18220,7 @@
         </w:rPr>
         <w:t xml:space="preserve">; cards and end screens from </w:t>
       </w:r>
-      <w:hyperlink r:id="rId150">
+      <w:hyperlink r:id="rId152">
         <w:r>
           <w:rPr>
             <w:rStyle w:val="Hyperlink"/>
@@ -18036,7 +18237,7 @@
         </w:rPr>
         <w:t xml:space="preserve"> and </w:t>
       </w:r>
-      <w:hyperlink r:id="rId83">
+      <w:hyperlink r:id="rId84">
         <w:r>
           <w:rPr>
             <w:rStyle w:val="Hyperlink"/>
@@ -18053,7 +18254,7 @@
         </w:rPr>
         <w:t xml:space="preserve">. Affiliate content under the Terms of Use is from </w:t>
       </w:r>
-      <w:hyperlink r:id="rId111">
+      <w:hyperlink r:id="rId112">
         <w:r>
           <w:rPr>
             <w:rStyle w:val="Hyperlink"/>
@@ -18070,7 +18271,7 @@
         </w:rPr>
         <w:t xml:space="preserve">. The Shopping affiliate threshold is from the </w:t>
       </w:r>
-      <w:hyperlink r:id="rId151">
+      <w:hyperlink r:id="rId153">
         <w:r>
           <w:rPr>
             <w:rStyle w:val="Hyperlink"/>
@@ -18087,7 +18288,7 @@
         </w:rPr>
         <w:t xml:space="preserve"> and its conditions from </w:t>
       </w:r>
-      <w:hyperlink r:id="rId152">
+      <w:hyperlink r:id="rId154">
         <w:r>
           <w:rPr>
             <w:rStyle w:val="Hyperlink"/>
@@ -18104,7 +18305,7 @@
         </w:rPr>
         <w:t xml:space="preserve">. US disclosure guidance is the FTC’s </w:t>
       </w:r>
-      <w:hyperlink r:id="rId127">
+      <w:hyperlink r:id="rId128">
         <w:r>
           <w:rPr>
             <w:rStyle w:val="Hyperlink"/>
@@ -18121,7 +18322,7 @@
         </w:rPr>
         <w:t xml:space="preserve"> and </w:t>
       </w:r>
-      <w:hyperlink r:id="rId128">
+      <w:hyperlink r:id="rId129">
         <w:r>
           <w:rPr>
             <w:rStyle w:val="Hyperlink"/>
@@ -18142,8 +18343,8 @@
     <w:p>
       <w:pPr>
         <w:sectPr>
-          <w:headerReference w:type="default" r:id="rId147"/>
-          <w:footerReference w:type="default" r:id="rId148"/>
+          <w:headerReference w:type="default" r:id="rId149"/>
+          <w:footerReference w:type="default" r:id="rId150"/>
           <w:pgSz w:w="10080" w:h="14400"/>
           <w:pgMar w:top="1008" w:right="1008" w:bottom="1008" w:left="1008" w:header="504" w:footer="504" w:gutter="0"/>
           <w:cols w:space="720"/>
@@ -18571,7 +18772,7 @@
                     <pic:cNvPicPr/>
                   </pic:nvPicPr>
                   <pic:blipFill>
-                    <a:blip r:embed="rId156"/>
+                    <a:blip r:embed="rId158"/>
                     <a:stretch>
                       <a:fillRect/>
                     </a:stretch>
@@ -18623,7 +18824,7 @@
       </w:r>
     </w:p>
     <w:p>
-      <w:hyperlink r:id="rId157">
+      <w:hyperlink r:id="rId159">
         <w:r>
           <w:rPr>
             <w:rStyle w:val="Hyperlink"/>
@@ -18648,7 +18849,7 @@
       </w:r>
     </w:p>
     <w:p>
-      <w:hyperlink r:id="rId158">
+      <w:hyperlink r:id="rId160">
         <w:r>
           <w:rPr>
             <w:rStyle w:val="Hyperlink"/>
@@ -18673,7 +18874,7 @@
       </w:r>
     </w:p>
     <w:p>
-      <w:hyperlink r:id="rId159">
+      <w:hyperlink r:id="rId161">
         <w:r>
           <w:rPr>
             <w:rStyle w:val="Hyperlink"/>
@@ -18698,7 +18899,7 @@
       </w:r>
     </w:p>
     <w:p>
-      <w:hyperlink r:id="rId160">
+      <w:hyperlink r:id="rId162">
         <w:r>
           <w:rPr>
             <w:rStyle w:val="Hyperlink"/>
@@ -18723,7 +18924,7 @@
       </w:r>
     </w:p>
     <w:p>
-      <w:hyperlink r:id="rId161">
+      <w:hyperlink r:id="rId163">
         <w:r>
           <w:rPr>
             <w:rStyle w:val="Hyperlink"/>
@@ -18748,7 +18949,7 @@
       </w:r>
     </w:p>
     <w:p>
-      <w:hyperlink r:id="rId162">
+      <w:hyperlink r:id="rId164">
         <w:r>
           <w:rPr>
             <w:rStyle w:val="Hyperlink"/>
@@ -19066,7 +19267,7 @@
         </w:rPr>
         <w:t xml:space="preserve">Sources: The diagnostic order is editorial guidance built on chapters 2 through 13. The Colin and Samir case study figures are from their own public interviews on the creator economy, including </w:t>
       </w:r>
-      <w:hyperlink r:id="rId101">
+      <w:hyperlink r:id="rId102">
         <w:r>
           <w:rPr>
             <w:rStyle w:val="Hyperlink"/>
@@ -19121,8 +19322,8 @@
     <w:p>
       <w:pPr>
         <w:sectPr>
-          <w:headerReference w:type="default" r:id="rId154"/>
-          <w:footerReference w:type="default" r:id="rId155"/>
+          <w:headerReference w:type="default" r:id="rId156"/>
+          <w:footerReference w:type="default" r:id="rId157"/>
           <w:pgSz w:w="10080" w:h="14400"/>
           <w:pgMar w:top="1008" w:right="1008" w:bottom="1008" w:left="1008" w:header="504" w:footer="504" w:gutter="0"/>
           <w:cols w:space="720"/>
@@ -20157,7 +20358,7 @@
         </w:rPr>
         <w:t xml:space="preserve">Sources: This workbook is editorial structure for the rest of this book. The bathroom-repair sheet and its money line are hypothetical illustrations, not a measured channel. The membership share is YouTube’s 70% after taxes and fees, from chapter 12. Affiliate disclosure follows chapter 13 and the FTC’s </w:t>
       </w:r>
-      <w:hyperlink r:id="rId127">
+      <w:hyperlink r:id="rId128">
         <w:r>
           <w:rPr>
             <w:rStyle w:val="Hyperlink"/>
@@ -20178,61 +20379,6 @@
     <w:p>
       <w:pPr>
         <w:sectPr>
-          <w:headerReference w:type="default" r:id="rId163"/>
-          <w:footerReference w:type="default" r:id="rId164"/>
-          <w:pgSz w:w="10080" w:h="14400"/>
-          <w:pgMar w:top="1008" w:right="1008" w:bottom="1008" w:left="1008" w:header="504" w:footer="504" w:gutter="0"/>
-          <w:cols w:space="720"/>
-          <w:titlePg/>
-          <w:docGrid w:linePitch="360"/>
-        </w:sectPr>
-      </w:pPr>
-    </w:p>
-    <w:p>
-      <w:bookmarkStart w:id="134" w:name="toc133"/>
-      <w:pPr>
-        <w:pStyle w:val="Heading1"/>
-      </w:pPr>
-      <w:r>
-        <w:t>The last word</w:t>
-      </w:r>
-      <w:bookmarkEnd w:id="134"/>
-    </w:p>
-    <w:p>
-      <w:r>
-        <w:rPr>
-          <w:rFonts w:ascii="Calibri" w:hAnsi="Calibri"/>
-        </w:rPr>
-        <w:t>The channel in this book does not start with money. It starts with one viewer and a question they would type, and it earns the right to be paid one finished minute at a time: a title that names the problem, an opening that keeps the promise, a method given away, a next video named inside the last one.</w:t>
-      </w:r>
-    </w:p>
-    <w:p>
-      <w:r>
-        <w:rPr>
-          <w:rFonts w:ascii="Calibri" w:hAnsi="Calibri"/>
-        </w:rPr>
-        <w:t>The gates are arithmetic. Subscribers, plus hours or Shorts views, inside a window that rolls. Once you can work out how many views a day your channel needs at its own view duration, the gate stops being a mystery and becomes a distance, and chapter 4’s work on the opening becomes the cheapest way to shorten it.</w:t>
-      </w:r>
-    </w:p>
-    <w:p>
-      <w:r>
-        <w:rPr>
-          <w:rFonts w:ascii="Calibri" w:hAnsi="Calibri"/>
-        </w:rPr>
-        <w:t>Past the gate, the money comes in five kinds, and each one pays for something different. Ads pay for reach. Memberships pay for loyalty. Supers pay for presence. Sponsors pay for a precise viewer. Affiliate commissions pay for recommendations people act on. A channel that keeps all five small and honest survives the next rule change. A channel that bets on one does not.</w:t>
-      </w:r>
-    </w:p>
-    <w:p>
-      <w:r>
-        <w:rPr>
-          <w:rFonts w:ascii="Calibri" w:hAnsi="Calibri"/>
-        </w:rPr>
-        <w:t>The numbers will move again before the next edition of this book. Check the Earn tab, read the help page, write the date in the decision log. Then make the next video for the same person you named on the first page.</w:t>
-      </w:r>
-    </w:p>
-    <w:p>
-      <w:pPr>
-        <w:sectPr>
           <w:headerReference w:type="default" r:id="rId165"/>
           <w:footerReference w:type="default" r:id="rId166"/>
           <w:pgSz w:w="10080" w:h="14400"/>
@@ -20244,726 +20390,45 @@
       </w:pPr>
     </w:p>
     <w:p>
-      <w:bookmarkStart w:id="135" w:name="toc134"/>
+      <w:bookmarkStart w:id="134" w:name="toc133"/>
       <w:pPr>
         <w:pStyle w:val="Heading1"/>
       </w:pPr>
       <w:r>
-        <w:t>Glossary</w:t>
-      </w:r>
-      <w:bookmarkEnd w:id="135"/>
-    </w:p>
-    <w:p>
-      <w:r>
-        <w:rPr>
-          <w:rFonts w:ascii="Calibri" w:hAnsi="Calibri"/>
-        </w:rPr>
-        <w:t>Short definitions for terms this book uses. A definition here is not a substitute for the platform page cited in the chapter.</w:t>
-      </w:r>
-    </w:p>
-    <w:p>
-      <w:r>
-        <w:rPr>
-          <w:rFonts w:ascii="Calibri" w:hAnsi="Calibri"/>
-          <w:b/>
-        </w:rPr>
-        <w:t xml:space="preserve">Eight jobs. </w:t>
-      </w:r>
-      <w:r>
-        <w:rPr>
-          <w:rFonts w:ascii="Calibri" w:hAnsi="Calibri"/>
-        </w:rPr>
-        <w:t>The only set of videos this book asks you to finish: who it is for, the problem in their words, the method, proof, the comparison, one objection, the deep dive, and which video to watch next. Chapters 2, 5, and 6 use this same set.</w:t>
-      </w:r>
-    </w:p>
-    <w:p>
-      <w:r>
-        <w:rPr>
-          <w:rFonts w:ascii="Calibri" w:hAnsi="Calibri"/>
-          <w:b/>
-        </w:rPr>
-        <w:t xml:space="preserve">Deep dive. </w:t>
-      </w:r>
-      <w:r>
-        <w:rPr>
-          <w:rFonts w:ascii="Calibri" w:hAnsi="Calibri"/>
-        </w:rPr>
-        <w:t>The long, complete video in the eight jobs, built to be watched for a long time. The video that fills the hour bar, and the one that can honestly pass eight minutes for mid-roll ads.</w:t>
-      </w:r>
-    </w:p>
-    <w:p>
-      <w:r>
-        <w:rPr>
-          <w:rFonts w:ascii="Calibri" w:hAnsi="Calibri"/>
-          <w:b/>
-        </w:rPr>
-        <w:t xml:space="preserve">Expanded program. </w:t>
-      </w:r>
-      <w:r>
-        <w:rPr>
-          <w:rFonts w:ascii="Calibri" w:hAnsi="Calibri"/>
-        </w:rPr>
-        <w:t>In countries where YouTube has opened it, the earlier gate: 500 subscribers, three public uploads in 90 days, and either 3,000 long-form hours in a year or 3 million Shorts views in 90 days. Fan funding and Shopping. Not a share of watch-page ads.</w:t>
-      </w:r>
-    </w:p>
-    <w:p>
-      <w:r>
-        <w:rPr>
-          <w:rFonts w:ascii="Calibri" w:hAnsi="Calibri"/>
-          <w:b/>
-        </w:rPr>
-        <w:t xml:space="preserve">YouTube Partner Program. </w:t>
-      </w:r>
-      <w:r>
-        <w:rPr>
-          <w:rFonts w:ascii="Calibri" w:hAnsi="Calibri"/>
-        </w:rPr>
-        <w:t>The higher gate: 1,000 subscribers and either 4,000 long-form hours in 12 months or 10 million qualified Shorts views in 90 days. For channels that apply from 1 February 2027: 8,000 hours in 365 days or 20 million Shorts views in 90 days. This is the gate that adds watch-page ads, Shorts Feed ads, and YouTube Premium revenue. The follower-floor chart’s YouTube bar is this gate.</w:t>
-      </w:r>
-    </w:p>
-    <w:p>
-      <w:r>
-        <w:rPr>
-          <w:rFonts w:ascii="Calibri" w:hAnsi="Calibri"/>
-          <w:b/>
-        </w:rPr>
-        <w:t xml:space="preserve">Qualified watch hours. </w:t>
-      </w:r>
-      <w:r>
-        <w:rPr>
-          <w:rFonts w:ascii="Calibri" w:hAnsi="Calibri"/>
-        </w:rPr>
-        <w:t>Public long-form viewing that YouTube counts toward the hour bars. Hours watched in the Shorts feed do not count. Private, unlisted, deleted, and ad-campaign views do not count.</w:t>
-      </w:r>
-    </w:p>
-    <w:p>
-      <w:r>
-        <w:rPr>
-          <w:rFonts w:ascii="Calibri" w:hAnsi="Calibri"/>
-          <w:b/>
-        </w:rPr>
-        <w:t xml:space="preserve">Qualified Shorts views. </w:t>
-      </w:r>
-      <w:r>
-        <w:rPr>
-          <w:rFonts w:ascii="Calibri" w:hAnsi="Calibri"/>
-        </w:rPr>
-        <w:t>Public views of Shorts in the Shorts feed that YouTube counts toward the Shorts bars: 3 million in 90 days for the expanded program, or 10 million in 90 days for the Partner Program (20 million for channels applying from 1 February 2027). They do not fill the long-form hour bars.</w:t>
-      </w:r>
-    </w:p>
-    <w:p>
-      <w:r>
-        <w:rPr>
-          <w:rFonts w:ascii="Calibri" w:hAnsi="Calibri"/>
-          <w:b/>
-        </w:rPr>
-        <w:t xml:space="preserve">Follow-on views. </w:t>
-      </w:r>
-      <w:r>
-        <w:rPr>
-          <w:rFonts w:ascii="Calibri" w:hAnsi="Calibri"/>
-        </w:rPr>
-        <w:t>Organic views from people who watch more of your videos after seeing a promoted one. The only part of a paid campaign that counts toward the Partner Program.</w:t>
-      </w:r>
-    </w:p>
-    <w:p>
-      <w:r>
-        <w:rPr>
-          <w:rFonts w:ascii="Calibri" w:hAnsi="Calibri"/>
-          <w:b/>
-        </w:rPr>
-        <w:t xml:space="preserve">Advanced features. </w:t>
-      </w:r>
-      <w:r>
-        <w:rPr>
-          <w:rFonts w:ascii="Calibri" w:hAnsi="Calibri"/>
-        </w:rPr>
-        <w:t>The Studio status that makes an address in a long-form description, and in a long-form comment, clickable. Phone verification comes first. A Short’s description and comments stay unclickable after it is on. The Partner Program requires it.</w:t>
-      </w:r>
-    </w:p>
-    <w:p>
-      <w:r>
-        <w:rPr>
-          <w:rFonts w:ascii="Calibri" w:hAnsi="Calibri"/>
-          <w:b/>
-        </w:rPr>
-        <w:t xml:space="preserve">AdSense. </w:t>
-      </w:r>
-      <w:r>
-        <w:rPr>
-          <w:rFonts w:ascii="Calibri" w:hAnsi="Calibri"/>
-        </w:rPr>
-        <w:t>AdSense for YouTube, the Google account YouTube uses to pay a channel it has accepted. Meeting a subscriber number does not open it. You apply, and YouTube reviews the channel.</w:t>
-      </w:r>
-    </w:p>
-    <w:p>
-      <w:r>
-        <w:rPr>
-          <w:rFonts w:ascii="Calibri" w:hAnsi="Calibri"/>
-          <w:b/>
-        </w:rPr>
-        <w:t xml:space="preserve">Modules. </w:t>
-      </w:r>
-      <w:r>
-        <w:rPr>
-          <w:rFonts w:ascii="Calibri" w:hAnsi="Calibri"/>
-        </w:rPr>
-        <w:t>The separate sets of terms you accept in Studio’s Earn tab once inside the program: Watch Page Monetization for long-form ads and Premium, Shorts Monetization for the Shorts feed, and the Commerce Product Module for fan funding.</w:t>
-      </w:r>
-    </w:p>
-    <w:p>
-      <w:r>
-        <w:rPr>
-          <w:rFonts w:ascii="Calibri" w:hAnsi="Calibri"/>
-          <w:b/>
-        </w:rPr>
-        <w:t xml:space="preserve">CPM. </w:t>
-      </w:r>
-      <w:r>
-        <w:rPr>
-          <w:rFonts w:ascii="Calibri" w:hAnsi="Calibri"/>
-        </w:rPr>
-        <w:t>What advertisers paid per 1,000 ad impressions on your videos, before YouTube’s share. Ads and Premium only, monetized views only.</w:t>
-      </w:r>
-    </w:p>
-    <w:p>
-      <w:r>
-        <w:rPr>
-          <w:rFonts w:ascii="Calibri" w:hAnsi="Calibri"/>
-          <w:b/>
-        </w:rPr>
-        <w:t xml:space="preserve">Playback-based CPM. </w:t>
-      </w:r>
-      <w:r>
-        <w:rPr>
-          <w:rFonts w:ascii="Calibri" w:hAnsi="Calibri"/>
-        </w:rPr>
-        <w:t>What advertisers paid per 1,000 playbacks that showed at least one ad. Often higher than CPM, because one playback can carry two ads.</w:t>
-      </w:r>
-    </w:p>
-    <w:p>
-      <w:r>
-        <w:rPr>
-          <w:rFonts w:ascii="Calibri" w:hAnsi="Calibri"/>
-          <w:b/>
-        </w:rPr>
-        <w:t xml:space="preserve">RPM. </w:t>
-      </w:r>
-      <w:r>
-        <w:rPr>
-          <w:rFonts w:ascii="Calibri" w:hAnsi="Calibri"/>
-        </w:rPr>
-        <w:t>Your total revenue after YouTube’s share, per 1,000 views, including views with no ad. Includes ads, Premium, memberships, Super Chat, and Super Stickers. Always lower than CPM.</w:t>
-      </w:r>
-    </w:p>
-    <w:p>
-      <w:r>
-        <w:rPr>
-          <w:rFonts w:ascii="Calibri" w:hAnsi="Calibri"/>
-          <w:b/>
-        </w:rPr>
-        <w:t xml:space="preserve">Mid-roll. </w:t>
-      </w:r>
-      <w:r>
-        <w:rPr>
-          <w:rFonts w:ascii="Calibri" w:hAnsi="Calibri"/>
-        </w:rPr>
-        <w:t>An ad break during a video. Available on monetized videos eight minutes or longer, placed automatically, by hand, or both. Breaks at natural pauses are more likely to serve an ad.</w:t>
-      </w:r>
-    </w:p>
-    <w:p>
-      <w:r>
-        <w:rPr>
-          <w:rFonts w:ascii="Calibri" w:hAnsi="Calibri"/>
-          <w:b/>
-        </w:rPr>
-        <w:t xml:space="preserve">Limited ads. </w:t>
-      </w:r>
-      <w:r>
-        <w:rPr>
-          <w:rFonts w:ascii="Calibri" w:hAnsi="Calibri"/>
-        </w:rPr>
-        <w:t>The monetization status of a video that does not fully meet the advertiser-friendly guidelines: fewer advertisers, or none. Not a strike. You can request a human review.</w:t>
-      </w:r>
-    </w:p>
-    <w:p>
-      <w:r>
-        <w:rPr>
-          <w:rFonts w:ascii="Calibri" w:hAnsi="Calibri"/>
-          <w:b/>
-        </w:rPr>
-        <w:t xml:space="preserve">Shorts Creator Pool. </w:t>
-      </w:r>
-      <w:r>
-        <w:rPr>
-          <w:rFonts w:ascii="Calibri" w:hAnsi="Calibri"/>
-        </w:rPr>
-        <w:t>The monthly pot of Shorts Feed ad revenue that YouTube shares out by each monetizing channel’s share of engaged Shorts views, after a share for music licensing. The channel keeps 45% of its allocation. From 1 February 2027, a month counts only if the channel had 10 million qualified Shorts views in the previous 90 days.</w:t>
-      </w:r>
-    </w:p>
-    <w:p>
-      <w:r>
-        <w:rPr>
-          <w:rFonts w:ascii="Calibri" w:hAnsi="Calibri"/>
-          <w:b/>
-        </w:rPr>
-        <w:t xml:space="preserve">YouTube Premium revenue. </w:t>
-      </w:r>
-      <w:r>
-        <w:rPr>
-          <w:rFonts w:ascii="Calibri" w:hAnsi="Calibri"/>
-        </w:rPr>
-        <w:t>A share of Premium and Premium Lite subscription fees, pooled and paid by members’ watch time and views: 55% for long-form, 45% for Shorts, of the pool allocated to creators.</w:t>
-      </w:r>
-    </w:p>
-    <w:p>
-      <w:r>
-        <w:rPr>
-          <w:rFonts w:ascii="Calibri" w:hAnsi="Calibri"/>
-          <w:b/>
-        </w:rPr>
-        <w:t xml:space="preserve">Channel memberships. </w:t>
-      </w:r>
-      <w:r>
-        <w:rPr>
-          <w:rFonts w:ascii="Calibri" w:hAnsi="Calibri"/>
-        </w:rPr>
-        <w:t>Monthly payments from viewers for perks you choose, in up to six levels. The channel receives 70% after taxes and fees. Downloads of YouTube content, in-person one-to-one meetings, and random prizes are not allowed as perks.</w:t>
-      </w:r>
-    </w:p>
-    <w:p>
-      <w:r>
-        <w:rPr>
-          <w:rFonts w:ascii="Calibri" w:hAnsi="Calibri"/>
-          <w:b/>
-        </w:rPr>
-        <w:t xml:space="preserve">Super Chat and Super Stickers. </w:t>
-      </w:r>
-      <w:r>
-        <w:rPr>
-          <w:rFonts w:ascii="Calibri" w:hAnsi="Calibri"/>
-        </w:rPr>
-        <w:t>Paid, highlighted messages and animated stickers in the live chat of a live stream or premiere. The channel receives 70% after taxes and fees. YouTube says they are not donation tools.</w:t>
-      </w:r>
-    </w:p>
-    <w:p>
-      <w:r>
-        <w:rPr>
-          <w:rFonts w:ascii="Calibri" w:hAnsi="Calibri"/>
-          <w:b/>
-        </w:rPr>
-        <w:t xml:space="preserve">Super Thanks. </w:t>
-      </w:r>
-      <w:r>
-        <w:rPr>
-          <w:rFonts w:ascii="Calibri" w:hAnsi="Calibri"/>
-        </w:rPr>
-        <w:t>A one-time paid animation and highlighted comment on a long-form video or a Short. Not available on claimed, unlisted, made-for-kids, or comments-off videos, or while a stream is live. The channel receives 70% after taxes and fees.</w:t>
-      </w:r>
-    </w:p>
-    <w:p>
-      <w:r>
-        <w:rPr>
-          <w:rFonts w:ascii="Calibri" w:hAnsi="Calibri"/>
-          <w:b/>
-        </w:rPr>
-        <w:t xml:space="preserve">Sponsor. </w:t>
-      </w:r>
-      <w:r>
-        <w:rPr>
-          <w:rFonts w:ascii="Calibri" w:hAnsi="Calibri"/>
-        </w:rPr>
-        <w:t>One company paying you for one video or segment. Tick the paid promotion box, say so in the video, and say so next to the link. One sponsor per video.</w:t>
-      </w:r>
-    </w:p>
-    <w:p>
-      <w:r>
-        <w:rPr>
-          <w:rFonts w:ascii="Calibri" w:hAnsi="Calibri"/>
-          <w:b/>
-        </w:rPr>
-        <w:t xml:space="preserve">Creator Partnerships. </w:t>
-      </w:r>
-      <w:r>
-        <w:rPr>
-          <w:rFonts w:ascii="Calibri" w:hAnsi="Calibri"/>
-        </w:rPr>
-        <w:t>YouTube’s matching tool between brands and creators, the successor to BrandConnect. Open to partners eligible for ad revenue sharing, 18 or older, in supported countries, with no active strikes.</w:t>
-      </w:r>
-    </w:p>
-    <w:p>
-      <w:r>
-        <w:rPr>
-          <w:rFonts w:ascii="Calibri" w:hAnsi="Calibri"/>
-          <w:b/>
-        </w:rPr>
-        <w:t xml:space="preserve">Affiliate link. </w:t>
-      </w:r>
-      <w:r>
-        <w:rPr>
-          <w:rFonts w:ascii="Calibri" w:hAnsi="Calibri"/>
-        </w:rPr>
-        <w:t>A link that pays you a commission if the viewer buys a product you recommended. Say so next to the link. The FTC pages in the sources list are the US disclosure guidance this book points at.</w:t>
-      </w:r>
-    </w:p>
-    <w:p>
-      <w:r>
-        <w:rPr>
-          <w:rFonts w:ascii="Calibri" w:hAnsi="Calibri"/>
-          <w:b/>
-        </w:rPr>
-        <w:t xml:space="preserve">Shopping affiliate program. </w:t>
-      </w:r>
-      <w:r>
-        <w:rPr>
-          <w:rFonts w:ascii="Calibri" w:hAnsi="Calibri"/>
-        </w:rPr>
-        <w:t>YouTube’s own affiliate program for tagging other brands’ products in Shorts, long videos, and live streams. Open to partners with at least 500 subscribers in listed countries since March 2026.</w:t>
-      </w:r>
-    </w:p>
-    <w:p>
-      <w:r>
-        <w:rPr>
-          <w:rFonts w:ascii="Calibri" w:hAnsi="Calibri"/>
-          <w:b/>
-        </w:rPr>
-        <w:t xml:space="preserve">Inauthentic content. </w:t>
-      </w:r>
-      <w:r>
-        <w:rPr>
-          <w:rFonts w:ascii="Calibri" w:hAnsi="Calibri"/>
-        </w:rPr>
-        <w:t>YouTube’s monetization name, since July 2025, for templated, repetitive, or mass-produced videos, including generic AI-made ones. It can keep a whole channel out of the Partner Program.</w:t>
-      </w:r>
-    </w:p>
-    <w:p>
-      <w:r>
-        <w:rPr>
-          <w:rFonts w:ascii="Calibri" w:hAnsi="Calibri"/>
-          <w:b/>
-        </w:rPr>
-        <w:t xml:space="preserve">Reused content. </w:t>
-      </w:r>
-      <w:r>
-        <w:rPr>
-          <w:rFonts w:ascii="Calibri" w:hAnsi="Calibri"/>
-        </w:rPr>
-        <w:t>Someone else’s material republished without significant original commentary, modification, or educational value. A monetization policy that applies to the whole channel.</w:t>
-      </w:r>
-    </w:p>
-    <w:p>
-      <w:r>
-        <w:rPr>
-          <w:rFonts w:ascii="Calibri" w:hAnsi="Calibri"/>
-          <w:b/>
-        </w:rPr>
-        <w:t xml:space="preserve">End screen. </w:t>
-      </w:r>
-      <w:r>
-        <w:rPr>
-          <w:rFonts w:ascii="Calibri" w:hAnsi="Calibri"/>
-        </w:rPr>
-        <w:t>An element in the last 5 to 20 seconds of a video at least 25 seconds long. One that opens a site outside YouTube requires the Partner Program.</w:t>
-      </w:r>
-    </w:p>
-    <w:p>
-      <w:r>
-        <w:rPr>
-          <w:rFonts w:ascii="Calibri" w:hAnsi="Calibri"/>
-          <w:b/>
-        </w:rPr>
-        <w:t xml:space="preserve">Info card. </w:t>
-      </w:r>
-      <w:r>
-        <w:rPr>
-          <w:rFonts w:ascii="Calibri" w:hAnsi="Calibri"/>
-        </w:rPr>
-        <w:t>A small panel attached to the video. One that opens a site outside YouTube also requires the Partner Program.</w:t>
-      </w:r>
-    </w:p>
-    <w:p>
-      <w:r>
-        <w:rPr>
-          <w:rFonts w:ascii="Calibri" w:hAnsi="Calibri"/>
-          <w:b/>
-        </w:rPr>
-        <w:t xml:space="preserve">Series playlist. </w:t>
-      </w:r>
-      <w:r>
-        <w:rPr>
-          <w:rFonts w:ascii="Calibri" w:hAnsi="Calibri"/>
-        </w:rPr>
-        <w:t>A playlist YouTube can feature as the next video while someone is watching one of yours. The account has to be verified, the videos have to be yours, and a video can sit in only one series playlist.</w:t>
-      </w:r>
-    </w:p>
-    <w:p>
-      <w:r>
-        <w:rPr>
-          <w:rFonts w:ascii="Calibri" w:hAnsi="Calibri"/>
-          <w:b/>
-        </w:rPr>
-        <w:t xml:space="preserve">Short. </w:t>
-      </w:r>
-      <w:r>
-        <w:rPr>
-          <w:rFonts w:ascii="Calibri" w:hAnsi="Calibri"/>
-        </w:rPr>
-        <w:t>A vertical video, 1080 by 1920. On YouTube, an address in a Short’s description or comments is not clickable. A Short can point at a long video. Its hours in the Shorts feed do not fill the hour bar.</w:t>
-      </w:r>
-    </w:p>
-    <w:p>
-      <w:r>
-        <w:rPr>
-          <w:rFonts w:ascii="Calibri" w:hAnsi="Calibri"/>
-          <w:b/>
-        </w:rPr>
-        <w:t xml:space="preserve">H.264. </w:t>
-      </w:r>
-      <w:r>
-        <w:rPr>
-          <w:rFonts w:ascii="Calibri" w:hAnsi="Calibri"/>
-        </w:rPr>
-        <w:t>The video codec named in YouTube’s recommended upload settings for an MP4. The audio codec named beside it is AAC-LC.</w:t>
-      </w:r>
-    </w:p>
-    <w:p>
-      <w:r>
-        <w:rPr>
-          <w:rFonts w:ascii="Calibri" w:hAnsi="Calibri"/>
-          <w:b/>
-        </w:rPr>
-        <w:t xml:space="preserve">9:16. </w:t>
-      </w:r>
-      <w:r>
-        <w:rPr>
-          <w:rFonts w:ascii="Calibri" w:hAnsi="Calibri"/>
-        </w:rPr>
-        <w:t>The vertical frame for a Short: 1080 pixels wide by 1920 tall. A horizontal video is 16:9, 1920 by 1080.</w:t>
-      </w:r>
-    </w:p>
-    <w:p>
-      <w:r>
-        <w:rPr>
-          <w:rFonts w:ascii="Calibri" w:hAnsi="Calibri"/>
-          <w:b/>
-        </w:rPr>
-        <w:t xml:space="preserve">Closed captions. </w:t>
-      </w:r>
-      <w:r>
-        <w:rPr>
-          <w:rFonts w:ascii="Calibri" w:hAnsi="Calibri"/>
-        </w:rPr>
-        <w:t>A text track the viewer can turn on or off. The words can be searched. They are not burned into the picture.</w:t>
-      </w:r>
-    </w:p>
-    <w:p>
-      <w:r>
-        <w:rPr>
-          <w:rFonts w:ascii="Calibri" w:hAnsi="Calibri"/>
-          <w:b/>
-        </w:rPr>
-        <w:t xml:space="preserve">Burned-in captions. </w:t>
-      </w:r>
-      <w:r>
-        <w:rPr>
-          <w:rFonts w:ascii="Calibri" w:hAnsi="Calibri"/>
-        </w:rPr>
-        <w:t>Words that are part of the picture. They stay on. They are a different choice from closed captions.</w:t>
-      </w:r>
-    </w:p>
-    <w:p>
-      <w:r>
-        <w:rPr>
-          <w:rFonts w:ascii="Calibri" w:hAnsi="Calibri"/>
-          <w:b/>
-        </w:rPr>
-        <w:t xml:space="preserve">Fader. </w:t>
-      </w:r>
-      <w:r>
-        <w:rPr>
-          <w:rFonts w:ascii="Calibri" w:hAnsi="Calibri"/>
-        </w:rPr>
-        <w:t>The volume slider in an editor. A music fader at about a tenth to a fifth of the way up is a position on that slider, not a measurement of loudness.</w:t>
-      </w:r>
-    </w:p>
-    <w:p>
-      <w:r>
-        <w:rPr>
-          <w:rFonts w:ascii="Calibri" w:hAnsi="Calibri"/>
-          <w:b/>
-        </w:rPr>
-        <w:t xml:space="preserve">Text-to-speech. </w:t>
-      </w:r>
-      <w:r>
-        <w:rPr>
-          <w:rFonts w:ascii="Calibri" w:hAnsi="Calibri"/>
-        </w:rPr>
-        <w:t>A tool that reads a script aloud. Usable when the voice is not a clone of someone else. Cloning someone else’s voice is a consent question the tool does not answer for you.</w:t>
-      </w:r>
-    </w:p>
-    <w:p>
-      <w:r>
-        <w:rPr>
-          <w:rFonts w:ascii="Calibri" w:hAnsi="Calibri"/>
-          <w:b/>
-        </w:rPr>
-        <w:t xml:space="preserve">Stock license. </w:t>
-      </w:r>
-      <w:r>
-        <w:rPr>
-          <w:rFonts w:ascii="Calibri" w:hAnsi="Calibri"/>
-        </w:rPr>
-        <w:t>The terms on one clip or track. “Free” and “free to use commercially” are different sentences. Read the line on that file before you publish it, including on a second site.</w:t>
-      </w:r>
-    </w:p>
-    <w:p>
-      <w:r>
-        <w:rPr>
-          <w:rFonts w:ascii="Calibri" w:hAnsi="Calibri"/>
-          <w:b/>
-        </w:rPr>
-        <w:t xml:space="preserve">Impression. </w:t>
-      </w:r>
-      <w:r>
-        <w:rPr>
-          <w:rFonts w:ascii="Calibri" w:hAnsi="Calibri"/>
-        </w:rPr>
-        <w:t>In Studio, a thumbnail shown on YouTube for more than one second with at least half of it visible. Thumbnails on other websites, in end screens, and in notifications are not counted.</w:t>
-      </w:r>
-    </w:p>
-    <w:p>
-      <w:r>
-        <w:rPr>
-          <w:rFonts w:ascii="Calibri" w:hAnsi="Calibri"/>
-          <w:b/>
-        </w:rPr>
-        <w:t xml:space="preserve">Impressions click-through rate. </w:t>
-      </w:r>
-      <w:r>
-        <w:rPr>
-          <w:rFonts w:ascii="Calibri" w:hAnsi="Calibri"/>
-        </w:rPr>
-        <w:t>How often a counted impression became a view. YouTube says half of channels and videos fall between 2% and 10%. It is a band, not a target.</w:t>
-      </w:r>
-    </w:p>
-    <w:p>
-      <w:r>
-        <w:rPr>
-          <w:rFonts w:ascii="Calibri" w:hAnsi="Calibri"/>
-          <w:b/>
-        </w:rPr>
-        <w:t xml:space="preserve">Traffic source. </w:t>
-      </w:r>
-      <w:r>
-        <w:rPr>
-          <w:rFonts w:ascii="Calibri" w:hAnsi="Calibri"/>
-        </w:rPr>
-        <w:t>Studio’s label for how a viewer reached a video: search, suggested videos, browse features, playlists, external, and others. Views from links in video descriptions are filed under suggested videos.</w:t>
-      </w:r>
-    </w:p>
-    <w:p>
-      <w:r>
-        <w:rPr>
-          <w:rFonts w:ascii="Calibri" w:hAnsi="Calibri"/>
-          <w:b/>
-        </w:rPr>
-        <w:t xml:space="preserve">Video chapters. </w:t>
-      </w:r>
-      <w:r>
-        <w:rPr>
-          <w:rFonts w:ascii="Calibri" w:hAnsi="Calibri"/>
-        </w:rPr>
-        <w:t>Timestamps in the description that split a video into named parts. The first is 00:00, there are at least three, and each part is at least ten seconds.</w:t>
-      </w:r>
-    </w:p>
-    <w:p>
-      <w:r>
-        <w:rPr>
-          <w:rFonts w:ascii="Calibri" w:hAnsi="Calibri"/>
-          <w:b/>
-        </w:rPr>
-        <w:t xml:space="preserve">Community Guidelines warning. </w:t>
-      </w:r>
-      <w:r>
-        <w:rPr>
-          <w:rFonts w:ascii="Calibri" w:hAnsi="Calibri"/>
-        </w:rPr>
-        <w:t>What a first violation typically gets. An optional policy training lets it expire 90 days after the training. A further violation of the same policy in that window can become a strike.</w:t>
-      </w:r>
-    </w:p>
-    <w:p>
-      <w:r>
-        <w:rPr>
-          <w:rFonts w:ascii="Calibri" w:hAnsi="Calibri"/>
-          <w:b/>
-        </w:rPr>
-        <w:t xml:space="preserve">Copyright strike. </w:t>
-      </w:r>
-      <w:r>
-        <w:rPr>
-          <w:rFonts w:ascii="Calibri" w:hAnsi="Calibri"/>
-        </w:rPr>
-        <w:t>The result of a valid legal removal request. The video comes down. It expires 90 days after it was applied once Copyright School is done, or it can be resolved by a retraction or a counter notification.</w:t>
-      </w:r>
-    </w:p>
-    <w:p>
-      <w:r>
-        <w:rPr>
-          <w:rFonts w:ascii="Calibri" w:hAnsi="Calibri"/>
-          <w:b/>
-        </w:rPr>
-        <w:t xml:space="preserve">Content ID claim. </w:t>
-      </w:r>
-      <w:r>
-        <w:rPr>
-          <w:rFonts w:ascii="Calibri" w:hAnsi="Calibri"/>
-        </w:rPr>
-        <w:t>An automatic match against a rights holder’s file. It affects that video: monetize, track, or block. It is not a strike, unless a dispute without a valid reason leads to a removal request.</w:t>
-      </w:r>
-    </w:p>
-    <w:p>
-      <w:r>
-        <w:rPr>
-          <w:rFonts w:ascii="Calibri" w:hAnsi="Calibri"/>
-          <w:b/>
-        </w:rPr>
-        <w:t xml:space="preserve">Paid promotion box. </w:t>
-      </w:r>
-      <w:r>
-        <w:rPr>
-          <w:rFonts w:ascii="Calibri" w:hAnsi="Calibri"/>
-        </w:rPr>
-        <w:t>The Studio setting you tick when a company paid you or gave you the product for a video. YouTube then shows a disclosure. Say it in the video as well.</w:t>
-      </w:r>
-    </w:p>
-    <w:p>
-      <w:r>
-        <w:rPr>
-          <w:rFonts w:ascii="Calibri" w:hAnsi="Calibri"/>
-          <w:b/>
-        </w:rPr>
-        <w:t xml:space="preserve">AI use. </w:t>
-      </w:r>
-      <w:r>
-        <w:rPr>
-          <w:rFonts w:ascii="Calibri" w:hAnsi="Calibri"/>
-        </w:rPr>
-        <w:t>The upload setting for realistic content that generative AI made or meaningfully altered, including AI-generated music. Scripts, ideas, captions, thumbnails, and a clone of your own voice do not need it.</w:t>
-      </w:r>
-    </w:p>
-    <w:p>
-      <w:r>
-        <w:rPr>
-          <w:rFonts w:ascii="Calibri" w:hAnsi="Calibri"/>
-          <w:b/>
-        </w:rPr>
-        <w:t xml:space="preserve">Made for kids. </w:t>
-      </w:r>
-      <w:r>
-        <w:rPr>
-          <w:rFonts w:ascii="Calibri" w:hAnsi="Calibri"/>
-        </w:rPr>
-        <w:t>The audience setting for videos directed to children, required under US law. It turns off comments, end screens, personalized ads, memberships, Supers, and more on those videos.</w:t>
+        <w:t>The last word</w:t>
+      </w:r>
+      <w:bookmarkEnd w:id="134"/>
+    </w:p>
+    <w:p>
+      <w:r>
+        <w:rPr>
+          <w:rFonts w:ascii="Calibri" w:hAnsi="Calibri"/>
+        </w:rPr>
+        <w:t>The channel in this book does not start with money. It starts with one viewer and a question they would type, and it earns the right to be paid one finished minute at a time: a title that names the problem, an opening that keeps the promise, a method given away, a next video named inside the last one.</w:t>
+      </w:r>
+    </w:p>
+    <w:p>
+      <w:r>
+        <w:rPr>
+          <w:rFonts w:ascii="Calibri" w:hAnsi="Calibri"/>
+        </w:rPr>
+        <w:t>The gates are arithmetic. Subscribers, plus hours or Shorts views, inside a window that rolls. Once you can work out how many views a day your channel needs at its own view duration, the gate stops being a mystery and becomes a distance, and chapter 4’s work on the opening becomes the cheapest way to shorten it.</w:t>
+      </w:r>
+    </w:p>
+    <w:p>
+      <w:r>
+        <w:rPr>
+          <w:rFonts w:ascii="Calibri" w:hAnsi="Calibri"/>
+        </w:rPr>
+        <w:t>Past the gate, the money comes in five kinds, and each one pays for something different. Ads pay for reach. Memberships pay for loyalty. Supers pay for presence. Sponsors pay for a precise viewer. Affiliate commissions pay for recommendations people act on. A channel that keeps all five small and honest survives the next rule change. A channel that bets on one does not.</w:t>
+      </w:r>
+    </w:p>
+    <w:p>
+      <w:r>
+        <w:rPr>
+          <w:rFonts w:ascii="Calibri" w:hAnsi="Calibri"/>
+        </w:rPr>
+        <w:t>The numbers will move again before the next edition of this book. Check the Earn tab, read the help page, write the date in the decision log. Then make the next video for the same person you named on the first page.</w:t>
       </w:r>
     </w:p>
     <w:p>
@@ -20980,6 +20445,742 @@
       </w:pPr>
     </w:p>
     <w:p>
+      <w:bookmarkStart w:id="135" w:name="toc134"/>
+      <w:pPr>
+        <w:pStyle w:val="Heading1"/>
+      </w:pPr>
+      <w:r>
+        <w:t>Glossary</w:t>
+      </w:r>
+      <w:bookmarkEnd w:id="135"/>
+    </w:p>
+    <w:p>
+      <w:r>
+        <w:rPr>
+          <w:rFonts w:ascii="Calibri" w:hAnsi="Calibri"/>
+        </w:rPr>
+        <w:t>Short definitions for terms this book uses. A definition here is not a substitute for the platform page cited in the chapter.</w:t>
+      </w:r>
+    </w:p>
+    <w:p>
+      <w:r>
+        <w:rPr>
+          <w:rFonts w:ascii="Calibri" w:hAnsi="Calibri"/>
+          <w:b/>
+        </w:rPr>
+        <w:t xml:space="preserve">Eight jobs. </w:t>
+      </w:r>
+      <w:r>
+        <w:rPr>
+          <w:rFonts w:ascii="Calibri" w:hAnsi="Calibri"/>
+        </w:rPr>
+        <w:t>The only set of videos this book asks you to finish: who it is for, the problem in their words, the method, proof, the comparison, one objection, the deep dive, and which video to watch next. Chapters 2, 5, and 6 use this same set.</w:t>
+      </w:r>
+    </w:p>
+    <w:p>
+      <w:r>
+        <w:rPr>
+          <w:rFonts w:ascii="Calibri" w:hAnsi="Calibri"/>
+          <w:b/>
+        </w:rPr>
+        <w:t xml:space="preserve">Deep dive. </w:t>
+      </w:r>
+      <w:r>
+        <w:rPr>
+          <w:rFonts w:ascii="Calibri" w:hAnsi="Calibri"/>
+        </w:rPr>
+        <w:t>The long, complete video in the eight jobs, built to be watched for a long time. The video that fills the hour bar, and the one that can honestly pass eight minutes for mid-roll ads.</w:t>
+      </w:r>
+    </w:p>
+    <w:p>
+      <w:r>
+        <w:rPr>
+          <w:rFonts w:ascii="Calibri" w:hAnsi="Calibri"/>
+          <w:b/>
+        </w:rPr>
+        <w:t xml:space="preserve">Expanded program. </w:t>
+      </w:r>
+      <w:r>
+        <w:rPr>
+          <w:rFonts w:ascii="Calibri" w:hAnsi="Calibri"/>
+        </w:rPr>
+        <w:t>In countries where YouTube has opened it, the earlier gate: 500 subscribers, three public uploads in 90 days, and either 3,000 long-form hours in a year or 3 million Shorts views in 90 days. Fan funding and Shopping. Not a share of watch-page ads.</w:t>
+      </w:r>
+    </w:p>
+    <w:p>
+      <w:r>
+        <w:rPr>
+          <w:rFonts w:ascii="Calibri" w:hAnsi="Calibri"/>
+          <w:b/>
+        </w:rPr>
+        <w:t xml:space="preserve">YouTube Partner Program. </w:t>
+      </w:r>
+      <w:r>
+        <w:rPr>
+          <w:rFonts w:ascii="Calibri" w:hAnsi="Calibri"/>
+        </w:rPr>
+        <w:t>The higher gate: 1,000 subscribers and either 4,000 long-form hours in 12 months or 10 million qualified Shorts views in 90 days. For channels that apply from 1 February 2027: 8,000 hours in 365 days or 20 million Shorts views in 90 days. This is the gate that adds watch-page ads, Shorts Feed ads, and YouTube Premium revenue. The follower-floor chart’s YouTube bar is this gate.</w:t>
+      </w:r>
+    </w:p>
+    <w:p>
+      <w:r>
+        <w:rPr>
+          <w:rFonts w:ascii="Calibri" w:hAnsi="Calibri"/>
+          <w:b/>
+        </w:rPr>
+        <w:t xml:space="preserve">Qualified watch hours. </w:t>
+      </w:r>
+      <w:r>
+        <w:rPr>
+          <w:rFonts w:ascii="Calibri" w:hAnsi="Calibri"/>
+        </w:rPr>
+        <w:t>Public long-form viewing that YouTube counts toward the hour bars. Hours watched in the Shorts feed do not count. Private, unlisted, deleted, and ad-campaign views do not count.</w:t>
+      </w:r>
+    </w:p>
+    <w:p>
+      <w:r>
+        <w:rPr>
+          <w:rFonts w:ascii="Calibri" w:hAnsi="Calibri"/>
+          <w:b/>
+        </w:rPr>
+        <w:t xml:space="preserve">Qualified Shorts views. </w:t>
+      </w:r>
+      <w:r>
+        <w:rPr>
+          <w:rFonts w:ascii="Calibri" w:hAnsi="Calibri"/>
+        </w:rPr>
+        <w:t>Public views of Shorts in the Shorts feed that YouTube counts toward the Shorts bars: 3 million in 90 days for the expanded program, or 10 million in 90 days for the Partner Program (20 million for channels applying from 1 February 2027). They do not fill the long-form hour bars.</w:t>
+      </w:r>
+    </w:p>
+    <w:p>
+      <w:r>
+        <w:rPr>
+          <w:rFonts w:ascii="Calibri" w:hAnsi="Calibri"/>
+          <w:b/>
+        </w:rPr>
+        <w:t xml:space="preserve">Follow-on views. </w:t>
+      </w:r>
+      <w:r>
+        <w:rPr>
+          <w:rFonts w:ascii="Calibri" w:hAnsi="Calibri"/>
+        </w:rPr>
+        <w:t>Organic views from people who watch more of your videos after seeing a promoted one. The only part of a paid campaign that counts toward the Partner Program.</w:t>
+      </w:r>
+    </w:p>
+    <w:p>
+      <w:r>
+        <w:rPr>
+          <w:rFonts w:ascii="Calibri" w:hAnsi="Calibri"/>
+          <w:b/>
+        </w:rPr>
+        <w:t xml:space="preserve">Advanced features. </w:t>
+      </w:r>
+      <w:r>
+        <w:rPr>
+          <w:rFonts w:ascii="Calibri" w:hAnsi="Calibri"/>
+        </w:rPr>
+        <w:t>The Studio status that makes an address in a long-form description, and in a long-form comment, clickable. Phone verification comes first. A Short’s description and comments stay unclickable after it is on. The Partner Program requires it.</w:t>
+      </w:r>
+    </w:p>
+    <w:p>
+      <w:r>
+        <w:rPr>
+          <w:rFonts w:ascii="Calibri" w:hAnsi="Calibri"/>
+          <w:b/>
+        </w:rPr>
+        <w:t xml:space="preserve">AdSense. </w:t>
+      </w:r>
+      <w:r>
+        <w:rPr>
+          <w:rFonts w:ascii="Calibri" w:hAnsi="Calibri"/>
+        </w:rPr>
+        <w:t>AdSense for YouTube, the Google account YouTube uses to pay a channel it has accepted. Meeting a subscriber number does not open it. You apply, and YouTube reviews the channel.</w:t>
+      </w:r>
+    </w:p>
+    <w:p>
+      <w:r>
+        <w:rPr>
+          <w:rFonts w:ascii="Calibri" w:hAnsi="Calibri"/>
+          <w:b/>
+        </w:rPr>
+        <w:t xml:space="preserve">Modules. </w:t>
+      </w:r>
+      <w:r>
+        <w:rPr>
+          <w:rFonts w:ascii="Calibri" w:hAnsi="Calibri"/>
+        </w:rPr>
+        <w:t>The separate sets of terms you accept in Studio’s Earn tab once inside the program: Watch Page Monetization for long-form ads and Premium, Shorts Monetization for the Shorts feed, and the Commerce Product Module for fan funding.</w:t>
+      </w:r>
+    </w:p>
+    <w:p>
+      <w:r>
+        <w:rPr>
+          <w:rFonts w:ascii="Calibri" w:hAnsi="Calibri"/>
+          <w:b/>
+        </w:rPr>
+        <w:t xml:space="preserve">CPM. </w:t>
+      </w:r>
+      <w:r>
+        <w:rPr>
+          <w:rFonts w:ascii="Calibri" w:hAnsi="Calibri"/>
+        </w:rPr>
+        <w:t>What advertisers paid per 1,000 ad impressions on your videos, before YouTube’s share. Ads and Premium only, monetized views only.</w:t>
+      </w:r>
+    </w:p>
+    <w:p>
+      <w:r>
+        <w:rPr>
+          <w:rFonts w:ascii="Calibri" w:hAnsi="Calibri"/>
+          <w:b/>
+        </w:rPr>
+        <w:t xml:space="preserve">Playback-based CPM. </w:t>
+      </w:r>
+      <w:r>
+        <w:rPr>
+          <w:rFonts w:ascii="Calibri" w:hAnsi="Calibri"/>
+        </w:rPr>
+        <w:t>What advertisers paid per 1,000 playbacks that showed at least one ad. Often higher than CPM, because one playback can carry two ads.</w:t>
+      </w:r>
+    </w:p>
+    <w:p>
+      <w:r>
+        <w:rPr>
+          <w:rFonts w:ascii="Calibri" w:hAnsi="Calibri"/>
+          <w:b/>
+        </w:rPr>
+        <w:t xml:space="preserve">RPM. </w:t>
+      </w:r>
+      <w:r>
+        <w:rPr>
+          <w:rFonts w:ascii="Calibri" w:hAnsi="Calibri"/>
+        </w:rPr>
+        <w:t>Your total revenue after YouTube’s share, per 1,000 views, including views with no ad. Includes ads, Premium, memberships, Super Chat, and Super Stickers. Always lower than CPM.</w:t>
+      </w:r>
+    </w:p>
+    <w:p>
+      <w:r>
+        <w:rPr>
+          <w:rFonts w:ascii="Calibri" w:hAnsi="Calibri"/>
+          <w:b/>
+        </w:rPr>
+        <w:t xml:space="preserve">Mid-roll. </w:t>
+      </w:r>
+      <w:r>
+        <w:rPr>
+          <w:rFonts w:ascii="Calibri" w:hAnsi="Calibri"/>
+        </w:rPr>
+        <w:t>An ad break during a video. Available on monetized videos eight minutes or longer, placed automatically, by hand, or both. Breaks at natural pauses are more likely to serve an ad.</w:t>
+      </w:r>
+    </w:p>
+    <w:p>
+      <w:r>
+        <w:rPr>
+          <w:rFonts w:ascii="Calibri" w:hAnsi="Calibri"/>
+          <w:b/>
+        </w:rPr>
+        <w:t xml:space="preserve">Limited ads. </w:t>
+      </w:r>
+      <w:r>
+        <w:rPr>
+          <w:rFonts w:ascii="Calibri" w:hAnsi="Calibri"/>
+        </w:rPr>
+        <w:t>The monetization status of a video that does not fully meet the advertiser-friendly guidelines: fewer advertisers, or none. Not a strike. You can request a human review.</w:t>
+      </w:r>
+    </w:p>
+    <w:p>
+      <w:r>
+        <w:rPr>
+          <w:rFonts w:ascii="Calibri" w:hAnsi="Calibri"/>
+          <w:b/>
+        </w:rPr>
+        <w:t xml:space="preserve">Shorts Creator Pool. </w:t>
+      </w:r>
+      <w:r>
+        <w:rPr>
+          <w:rFonts w:ascii="Calibri" w:hAnsi="Calibri"/>
+        </w:rPr>
+        <w:t>The monthly pot of Shorts Feed ad revenue that YouTube shares out by each monetizing channel’s share of engaged Shorts views, after a share for music licensing. The channel keeps 45% of its allocation. From 1 February 2027, a month counts only if the channel had 10 million qualified Shorts views in the previous 90 days.</w:t>
+      </w:r>
+    </w:p>
+    <w:p>
+      <w:r>
+        <w:rPr>
+          <w:rFonts w:ascii="Calibri" w:hAnsi="Calibri"/>
+          <w:b/>
+        </w:rPr>
+        <w:t xml:space="preserve">YouTube Premium revenue. </w:t>
+      </w:r>
+      <w:r>
+        <w:rPr>
+          <w:rFonts w:ascii="Calibri" w:hAnsi="Calibri"/>
+        </w:rPr>
+        <w:t>A share of Premium and Premium Lite subscription fees, pooled and paid by members’ watch time and views: 55% for long-form, 45% for Shorts, of the pool allocated to creators.</w:t>
+      </w:r>
+    </w:p>
+    <w:p>
+      <w:r>
+        <w:rPr>
+          <w:rFonts w:ascii="Calibri" w:hAnsi="Calibri"/>
+          <w:b/>
+        </w:rPr>
+        <w:t xml:space="preserve">Channel memberships. </w:t>
+      </w:r>
+      <w:r>
+        <w:rPr>
+          <w:rFonts w:ascii="Calibri" w:hAnsi="Calibri"/>
+        </w:rPr>
+        <w:t>Monthly payments from viewers for perks you choose, in up to six levels. The channel receives 70% after taxes and fees. Downloads of YouTube content, in-person one-to-one meetings, and random prizes are not allowed as perks.</w:t>
+      </w:r>
+    </w:p>
+    <w:p>
+      <w:r>
+        <w:rPr>
+          <w:rFonts w:ascii="Calibri" w:hAnsi="Calibri"/>
+          <w:b/>
+        </w:rPr>
+        <w:t xml:space="preserve">Super Chat and Super Stickers. </w:t>
+      </w:r>
+      <w:r>
+        <w:rPr>
+          <w:rFonts w:ascii="Calibri" w:hAnsi="Calibri"/>
+        </w:rPr>
+        <w:t>Paid, highlighted messages and animated stickers in the live chat of a live stream or premiere. The channel receives 70% after taxes and fees. YouTube says they are not donation tools.</w:t>
+      </w:r>
+    </w:p>
+    <w:p>
+      <w:r>
+        <w:rPr>
+          <w:rFonts w:ascii="Calibri" w:hAnsi="Calibri"/>
+          <w:b/>
+        </w:rPr>
+        <w:t xml:space="preserve">Super Thanks. </w:t>
+      </w:r>
+      <w:r>
+        <w:rPr>
+          <w:rFonts w:ascii="Calibri" w:hAnsi="Calibri"/>
+        </w:rPr>
+        <w:t>A one-time paid animation and highlighted comment on a long-form video or a Short. Not available on claimed, unlisted, made-for-kids, or comments-off videos, or while a stream is live. The channel receives 70% after taxes and fees.</w:t>
+      </w:r>
+    </w:p>
+    <w:p>
+      <w:r>
+        <w:rPr>
+          <w:rFonts w:ascii="Calibri" w:hAnsi="Calibri"/>
+          <w:b/>
+        </w:rPr>
+        <w:t xml:space="preserve">Sponsor. </w:t>
+      </w:r>
+      <w:r>
+        <w:rPr>
+          <w:rFonts w:ascii="Calibri" w:hAnsi="Calibri"/>
+        </w:rPr>
+        <w:t>One company paying you for one video or segment. Tick the paid promotion box, say so in the video, and say so next to the link. One sponsor per video.</w:t>
+      </w:r>
+    </w:p>
+    <w:p>
+      <w:r>
+        <w:rPr>
+          <w:rFonts w:ascii="Calibri" w:hAnsi="Calibri"/>
+          <w:b/>
+        </w:rPr>
+        <w:t xml:space="preserve">Creator Partnerships. </w:t>
+      </w:r>
+      <w:r>
+        <w:rPr>
+          <w:rFonts w:ascii="Calibri" w:hAnsi="Calibri"/>
+        </w:rPr>
+        <w:t>YouTube’s matching tool between brands and creators, the successor to BrandConnect. Open to partners eligible for ad revenue sharing, 18 or older, in supported countries, with no active strikes.</w:t>
+      </w:r>
+    </w:p>
+    <w:p>
+      <w:r>
+        <w:rPr>
+          <w:rFonts w:ascii="Calibri" w:hAnsi="Calibri"/>
+          <w:b/>
+        </w:rPr>
+        <w:t xml:space="preserve">Affiliate link. </w:t>
+      </w:r>
+      <w:r>
+        <w:rPr>
+          <w:rFonts w:ascii="Calibri" w:hAnsi="Calibri"/>
+        </w:rPr>
+        <w:t>A link that pays you a commission if the viewer buys a product you recommended. Say so next to the link. The FTC pages in the sources list are the US disclosure guidance this book points at.</w:t>
+      </w:r>
+    </w:p>
+    <w:p>
+      <w:r>
+        <w:rPr>
+          <w:rFonts w:ascii="Calibri" w:hAnsi="Calibri"/>
+          <w:b/>
+        </w:rPr>
+        <w:t xml:space="preserve">Shopping affiliate program. </w:t>
+      </w:r>
+      <w:r>
+        <w:rPr>
+          <w:rFonts w:ascii="Calibri" w:hAnsi="Calibri"/>
+        </w:rPr>
+        <w:t>YouTube’s own affiliate program for tagging other brands’ products in Shorts, long videos, and live streams. Open to partners with at least 500 subscribers in listed countries since March 2026.</w:t>
+      </w:r>
+    </w:p>
+    <w:p>
+      <w:r>
+        <w:rPr>
+          <w:rFonts w:ascii="Calibri" w:hAnsi="Calibri"/>
+          <w:b/>
+        </w:rPr>
+        <w:t xml:space="preserve">Inauthentic content. </w:t>
+      </w:r>
+      <w:r>
+        <w:rPr>
+          <w:rFonts w:ascii="Calibri" w:hAnsi="Calibri"/>
+        </w:rPr>
+        <w:t>YouTube’s monetization name, since July 2025, for templated, repetitive, or mass-produced videos, including generic AI-made ones. It can keep a whole channel out of the Partner Program.</w:t>
+      </w:r>
+    </w:p>
+    <w:p>
+      <w:r>
+        <w:rPr>
+          <w:rFonts w:ascii="Calibri" w:hAnsi="Calibri"/>
+          <w:b/>
+        </w:rPr>
+        <w:t xml:space="preserve">Reused content. </w:t>
+      </w:r>
+      <w:r>
+        <w:rPr>
+          <w:rFonts w:ascii="Calibri" w:hAnsi="Calibri"/>
+        </w:rPr>
+        <w:t>Someone else’s material republished without significant original commentary, modification, or educational value. A monetization policy that applies to the whole channel.</w:t>
+      </w:r>
+    </w:p>
+    <w:p>
+      <w:r>
+        <w:rPr>
+          <w:rFonts w:ascii="Calibri" w:hAnsi="Calibri"/>
+          <w:b/>
+        </w:rPr>
+        <w:t xml:space="preserve">End screen. </w:t>
+      </w:r>
+      <w:r>
+        <w:rPr>
+          <w:rFonts w:ascii="Calibri" w:hAnsi="Calibri"/>
+        </w:rPr>
+        <w:t>An element in the last 5 to 20 seconds of a video at least 25 seconds long. One that opens a site outside YouTube requires the Partner Program.</w:t>
+      </w:r>
+    </w:p>
+    <w:p>
+      <w:r>
+        <w:rPr>
+          <w:rFonts w:ascii="Calibri" w:hAnsi="Calibri"/>
+          <w:b/>
+        </w:rPr>
+        <w:t xml:space="preserve">Info card. </w:t>
+      </w:r>
+      <w:r>
+        <w:rPr>
+          <w:rFonts w:ascii="Calibri" w:hAnsi="Calibri"/>
+        </w:rPr>
+        <w:t>A small panel attached to the video. One that opens a site outside YouTube also requires the Partner Program.</w:t>
+      </w:r>
+    </w:p>
+    <w:p>
+      <w:r>
+        <w:rPr>
+          <w:rFonts w:ascii="Calibri" w:hAnsi="Calibri"/>
+          <w:b/>
+        </w:rPr>
+        <w:t xml:space="preserve">Series playlist. </w:t>
+      </w:r>
+      <w:r>
+        <w:rPr>
+          <w:rFonts w:ascii="Calibri" w:hAnsi="Calibri"/>
+        </w:rPr>
+        <w:t>A playlist YouTube can feature as the next video while someone is watching one of yours. The account has to be verified, the videos have to be yours, and a video can sit in only one series playlist.</w:t>
+      </w:r>
+    </w:p>
+    <w:p>
+      <w:r>
+        <w:rPr>
+          <w:rFonts w:ascii="Calibri" w:hAnsi="Calibri"/>
+          <w:b/>
+        </w:rPr>
+        <w:t xml:space="preserve">Short. </w:t>
+      </w:r>
+      <w:r>
+        <w:rPr>
+          <w:rFonts w:ascii="Calibri" w:hAnsi="Calibri"/>
+        </w:rPr>
+        <w:t>A vertical video, 1080 by 1920. On YouTube, an address in a Short’s description or comments is not clickable. A Short can point at a long video. Its hours in the Shorts feed do not fill the hour bar.</w:t>
+      </w:r>
+    </w:p>
+    <w:p>
+      <w:r>
+        <w:rPr>
+          <w:rFonts w:ascii="Calibri" w:hAnsi="Calibri"/>
+          <w:b/>
+        </w:rPr>
+        <w:t xml:space="preserve">H.264. </w:t>
+      </w:r>
+      <w:r>
+        <w:rPr>
+          <w:rFonts w:ascii="Calibri" w:hAnsi="Calibri"/>
+        </w:rPr>
+        <w:t>The video codec named in YouTube’s recommended upload settings for an MP4. The audio codec named beside it is AAC-LC.</w:t>
+      </w:r>
+    </w:p>
+    <w:p>
+      <w:r>
+        <w:rPr>
+          <w:rFonts w:ascii="Calibri" w:hAnsi="Calibri"/>
+          <w:b/>
+        </w:rPr>
+        <w:t xml:space="preserve">9:16. </w:t>
+      </w:r>
+      <w:r>
+        <w:rPr>
+          <w:rFonts w:ascii="Calibri" w:hAnsi="Calibri"/>
+        </w:rPr>
+        <w:t>The vertical frame for a Short: 1080 pixels wide by 1920 tall. A horizontal video is 16:9, 1920 by 1080.</w:t>
+      </w:r>
+    </w:p>
+    <w:p>
+      <w:r>
+        <w:rPr>
+          <w:rFonts w:ascii="Calibri" w:hAnsi="Calibri"/>
+          <w:b/>
+        </w:rPr>
+        <w:t xml:space="preserve">Closed captions. </w:t>
+      </w:r>
+      <w:r>
+        <w:rPr>
+          <w:rFonts w:ascii="Calibri" w:hAnsi="Calibri"/>
+        </w:rPr>
+        <w:t>A text track the viewer can turn on or off. The words can be searched. They are not burned into the picture.</w:t>
+      </w:r>
+    </w:p>
+    <w:p>
+      <w:r>
+        <w:rPr>
+          <w:rFonts w:ascii="Calibri" w:hAnsi="Calibri"/>
+          <w:b/>
+        </w:rPr>
+        <w:t xml:space="preserve">Burned-in captions. </w:t>
+      </w:r>
+      <w:r>
+        <w:rPr>
+          <w:rFonts w:ascii="Calibri" w:hAnsi="Calibri"/>
+        </w:rPr>
+        <w:t>Words that are part of the picture. They stay on. They are a different choice from closed captions.</w:t>
+      </w:r>
+    </w:p>
+    <w:p>
+      <w:r>
+        <w:rPr>
+          <w:rFonts w:ascii="Calibri" w:hAnsi="Calibri"/>
+          <w:b/>
+        </w:rPr>
+        <w:t xml:space="preserve">Fader. </w:t>
+      </w:r>
+      <w:r>
+        <w:rPr>
+          <w:rFonts w:ascii="Calibri" w:hAnsi="Calibri"/>
+        </w:rPr>
+        <w:t>The volume slider in an editor. A music fader at about a tenth to a fifth of the way up is a position on that slider, not a measurement of loudness.</w:t>
+      </w:r>
+    </w:p>
+    <w:p>
+      <w:r>
+        <w:rPr>
+          <w:rFonts w:ascii="Calibri" w:hAnsi="Calibri"/>
+          <w:b/>
+        </w:rPr>
+        <w:t xml:space="preserve">Text-to-speech. </w:t>
+      </w:r>
+      <w:r>
+        <w:rPr>
+          <w:rFonts w:ascii="Calibri" w:hAnsi="Calibri"/>
+        </w:rPr>
+        <w:t>A tool that reads a script aloud. Usable when the voice is not a clone of someone else. Cloning someone else’s voice is a consent question the tool does not answer for you.</w:t>
+      </w:r>
+    </w:p>
+    <w:p>
+      <w:r>
+        <w:rPr>
+          <w:rFonts w:ascii="Calibri" w:hAnsi="Calibri"/>
+          <w:b/>
+        </w:rPr>
+        <w:t xml:space="preserve">Stock license. </w:t>
+      </w:r>
+      <w:r>
+        <w:rPr>
+          <w:rFonts w:ascii="Calibri" w:hAnsi="Calibri"/>
+        </w:rPr>
+        <w:t>The terms on one clip or track. “Free” and “free to use commercially” are different sentences. Read the line on that file before you publish it, including on a second site.</w:t>
+      </w:r>
+    </w:p>
+    <w:p>
+      <w:r>
+        <w:rPr>
+          <w:rFonts w:ascii="Calibri" w:hAnsi="Calibri"/>
+          <w:b/>
+        </w:rPr>
+        <w:t xml:space="preserve">Impression. </w:t>
+      </w:r>
+      <w:r>
+        <w:rPr>
+          <w:rFonts w:ascii="Calibri" w:hAnsi="Calibri"/>
+        </w:rPr>
+        <w:t>In Studio, a thumbnail shown on YouTube for more than one second with at least half of it visible. Thumbnails on other websites, in end screens, and in notifications are not counted.</w:t>
+      </w:r>
+    </w:p>
+    <w:p>
+      <w:r>
+        <w:rPr>
+          <w:rFonts w:ascii="Calibri" w:hAnsi="Calibri"/>
+          <w:b/>
+        </w:rPr>
+        <w:t xml:space="preserve">Impressions click-through rate. </w:t>
+      </w:r>
+      <w:r>
+        <w:rPr>
+          <w:rFonts w:ascii="Calibri" w:hAnsi="Calibri"/>
+        </w:rPr>
+        <w:t>How often a counted impression became a view. YouTube says half of channels and videos fall between 2% and 10%. It is a band, not a target.</w:t>
+      </w:r>
+    </w:p>
+    <w:p>
+      <w:r>
+        <w:rPr>
+          <w:rFonts w:ascii="Calibri" w:hAnsi="Calibri"/>
+          <w:b/>
+        </w:rPr>
+        <w:t xml:space="preserve">Traffic source. </w:t>
+      </w:r>
+      <w:r>
+        <w:rPr>
+          <w:rFonts w:ascii="Calibri" w:hAnsi="Calibri"/>
+        </w:rPr>
+        <w:t>Studio’s label for how a viewer reached a video: search, suggested videos, browse features, playlists, external, and others. Views from links in video descriptions are filed under suggested videos.</w:t>
+      </w:r>
+    </w:p>
+    <w:p>
+      <w:r>
+        <w:rPr>
+          <w:rFonts w:ascii="Calibri" w:hAnsi="Calibri"/>
+          <w:b/>
+        </w:rPr>
+        <w:t xml:space="preserve">Video chapters. </w:t>
+      </w:r>
+      <w:r>
+        <w:rPr>
+          <w:rFonts w:ascii="Calibri" w:hAnsi="Calibri"/>
+        </w:rPr>
+        <w:t>Timestamps in the description that split a video into named parts. The first is 00:00, there are at least three, and each part is at least ten seconds.</w:t>
+      </w:r>
+    </w:p>
+    <w:p>
+      <w:r>
+        <w:rPr>
+          <w:rFonts w:ascii="Calibri" w:hAnsi="Calibri"/>
+          <w:b/>
+        </w:rPr>
+        <w:t xml:space="preserve">Community Guidelines warning. </w:t>
+      </w:r>
+      <w:r>
+        <w:rPr>
+          <w:rFonts w:ascii="Calibri" w:hAnsi="Calibri"/>
+        </w:rPr>
+        <w:t>What a first violation typically gets. An optional policy training lets it expire 90 days after the training. A further violation of the same policy in that window can become a strike.</w:t>
+      </w:r>
+    </w:p>
+    <w:p>
+      <w:r>
+        <w:rPr>
+          <w:rFonts w:ascii="Calibri" w:hAnsi="Calibri"/>
+          <w:b/>
+        </w:rPr>
+        <w:t xml:space="preserve">Copyright strike. </w:t>
+      </w:r>
+      <w:r>
+        <w:rPr>
+          <w:rFonts w:ascii="Calibri" w:hAnsi="Calibri"/>
+        </w:rPr>
+        <w:t>The result of a valid legal removal request. The video comes down. It expires 90 days after it was applied once Copyright School is done, or it can be resolved by a retraction or a counter notification.</w:t>
+      </w:r>
+    </w:p>
+    <w:p>
+      <w:r>
+        <w:rPr>
+          <w:rFonts w:ascii="Calibri" w:hAnsi="Calibri"/>
+          <w:b/>
+        </w:rPr>
+        <w:t xml:space="preserve">Content ID claim. </w:t>
+      </w:r>
+      <w:r>
+        <w:rPr>
+          <w:rFonts w:ascii="Calibri" w:hAnsi="Calibri"/>
+        </w:rPr>
+        <w:t>An automatic match against a rights holder’s file. It affects that video: monetize, track, or block. It is not a strike, unless a dispute without a valid reason leads to a removal request.</w:t>
+      </w:r>
+    </w:p>
+    <w:p>
+      <w:r>
+        <w:rPr>
+          <w:rFonts w:ascii="Calibri" w:hAnsi="Calibri"/>
+          <w:b/>
+        </w:rPr>
+        <w:t xml:space="preserve">Paid promotion box. </w:t>
+      </w:r>
+      <w:r>
+        <w:rPr>
+          <w:rFonts w:ascii="Calibri" w:hAnsi="Calibri"/>
+        </w:rPr>
+        <w:t>The Studio setting you tick when a company paid you or gave you the product for a video. YouTube then shows a disclosure. Say it in the video as well.</w:t>
+      </w:r>
+    </w:p>
+    <w:p>
+      <w:r>
+        <w:rPr>
+          <w:rFonts w:ascii="Calibri" w:hAnsi="Calibri"/>
+          <w:b/>
+        </w:rPr>
+        <w:t xml:space="preserve">AI use. </w:t>
+      </w:r>
+      <w:r>
+        <w:rPr>
+          <w:rFonts w:ascii="Calibri" w:hAnsi="Calibri"/>
+        </w:rPr>
+        <w:t>The upload setting for realistic content that generative AI made or meaningfully altered, including AI-generated music. Scripts, ideas, captions, thumbnails, and a clone of your own voice do not need it.</w:t>
+      </w:r>
+    </w:p>
+    <w:p>
+      <w:r>
+        <w:rPr>
+          <w:rFonts w:ascii="Calibri" w:hAnsi="Calibri"/>
+          <w:b/>
+        </w:rPr>
+        <w:t xml:space="preserve">Made for kids. </w:t>
+      </w:r>
+      <w:r>
+        <w:rPr>
+          <w:rFonts w:ascii="Calibri" w:hAnsi="Calibri"/>
+        </w:rPr>
+        <w:t>The audience setting for videos directed to children, required under US law. It turns off comments, end screens, personalized ads, memberships, Supers, and more on those videos.</w:t>
+      </w:r>
+    </w:p>
+    <w:p>
+      <w:pPr>
+        <w:sectPr>
+          <w:headerReference w:type="default" r:id="rId169"/>
+          <w:footerReference w:type="default" r:id="rId170"/>
+          <w:pgSz w:w="10080" w:h="14400"/>
+          <w:pgMar w:top="1008" w:right="1008" w:bottom="1008" w:left="1008" w:header="504" w:footer="504" w:gutter="0"/>
+          <w:cols w:space="720"/>
+          <w:titlePg/>
+          <w:docGrid w:linePitch="360"/>
+        </w:sectPr>
+      </w:pPr>
+    </w:p>
+    <w:p>
       <w:bookmarkStart w:id="136" w:name="toc135"/>
       <w:pPr>
         <w:pStyle w:val="Heading1"/>
@@ -21131,7 +21332,7 @@
       </w:r>
     </w:p>
     <w:p>
-      <w:hyperlink r:id="rId77">
+      <w:hyperlink r:id="rId78">
         <w:r>
           <w:rPr>
             <w:rStyle w:val="Hyperlink"/>
@@ -21149,7 +21350,7 @@
       </w:r>
     </w:p>
     <w:p>
-      <w:hyperlink r:id="rId53">
+      <w:hyperlink r:id="rId54">
         <w:r>
           <w:rPr>
             <w:rStyle w:val="Hyperlink"/>
@@ -21183,7 +21384,7 @@
         </w:rPr>
         <w:t xml:space="preserve">, </w:t>
       </w:r>
-      <w:hyperlink r:id="rId102">
+      <w:hyperlink r:id="rId103">
         <w:r>
           <w:rPr>
             <w:rStyle w:val="Hyperlink"/>
@@ -21215,7 +21416,7 @@
         </w:rPr>
         <w:t xml:space="preserve">, </w:t>
       </w:r>
-      <w:hyperlink r:id="rId105">
+      <w:hyperlink r:id="rId106">
         <w:r>
           <w:rPr>
             <w:rStyle w:val="Hyperlink"/>
@@ -21231,7 +21432,7 @@
         </w:rPr>
         <w:t xml:space="preserve">, </w:t>
       </w:r>
-      <w:hyperlink r:id="rId122">
+      <w:hyperlink r:id="rId123">
         <w:r>
           <w:rPr>
             <w:rStyle w:val="Hyperlink"/>
@@ -21263,7 +21464,7 @@
         </w:rPr>
         <w:t xml:space="preserve">, </w:t>
       </w:r>
-      <w:hyperlink r:id="rId150">
+      <w:hyperlink r:id="rId152">
         <w:r>
           <w:rPr>
             <w:rStyle w:val="Hyperlink"/>
@@ -21279,7 +21480,7 @@
         </w:rPr>
         <w:t xml:space="preserve">, </w:t>
       </w:r>
-      <w:hyperlink r:id="rId83">
+      <w:hyperlink r:id="rId84">
         <w:r>
           <w:rPr>
             <w:rStyle w:val="Hyperlink"/>
@@ -21313,7 +21514,7 @@
         </w:rPr>
         <w:t xml:space="preserve">, </w:t>
       </w:r>
-      <w:hyperlink r:id="rId133">
+      <w:hyperlink r:id="rId134">
         <w:r>
           <w:rPr>
             <w:rStyle w:val="Hyperlink"/>
@@ -21329,7 +21530,7 @@
         </w:rPr>
         <w:t xml:space="preserve">, </w:t>
       </w:r>
-      <w:hyperlink r:id="rId131">
+      <w:hyperlink r:id="rId132">
         <w:r>
           <w:rPr>
             <w:rStyle w:val="Hyperlink"/>
@@ -21345,7 +21546,7 @@
         </w:rPr>
         <w:t xml:space="preserve">, </w:t>
       </w:r>
-      <w:hyperlink r:id="rId80">
+      <w:hyperlink r:id="rId81">
         <w:r>
           <w:rPr>
             <w:rStyle w:val="Hyperlink"/>
@@ -21361,7 +21562,7 @@
         </w:rPr>
         <w:t xml:space="preserve">, </w:t>
       </w:r>
-      <w:hyperlink r:id="rId132">
+      <w:hyperlink r:id="rId133">
         <w:r>
           <w:rPr>
             <w:rStyle w:val="Hyperlink"/>
@@ -21377,7 +21578,7 @@
         </w:rPr>
         <w:t xml:space="preserve">, </w:t>
       </w:r>
-      <w:hyperlink r:id="rId116">
+      <w:hyperlink r:id="rId117">
         <w:r>
           <w:rPr>
             <w:rStyle w:val="Hyperlink"/>
@@ -21395,7 +21596,7 @@
       </w:r>
     </w:p>
     <w:p>
-      <w:hyperlink r:id="rId136">
+      <w:hyperlink r:id="rId137">
         <w:r>
           <w:rPr>
             <w:rStyle w:val="Hyperlink"/>
@@ -21411,7 +21612,7 @@
         </w:rPr>
         <w:t xml:space="preserve">, </w:t>
       </w:r>
-      <w:hyperlink r:id="rId137">
+      <w:hyperlink r:id="rId138">
         <w:r>
           <w:rPr>
             <w:rStyle w:val="Hyperlink"/>
@@ -21427,7 +21628,7 @@
         </w:rPr>
         <w:t xml:space="preserve">, </w:t>
       </w:r>
-      <w:hyperlink r:id="rId138">
+      <w:hyperlink r:id="rId139">
         <w:r>
           <w:rPr>
             <w:rStyle w:val="Hyperlink"/>
@@ -21443,7 +21644,7 @@
         </w:rPr>
         <w:t xml:space="preserve">, </w:t>
       </w:r>
-      <w:hyperlink r:id="rId139">
+      <w:hyperlink r:id="rId140">
         <w:r>
           <w:rPr>
             <w:rStyle w:val="Hyperlink"/>
@@ -21459,7 +21660,7 @@
         </w:rPr>
         <w:t xml:space="preserve">, </w:t>
       </w:r>
-      <w:hyperlink r:id="rId140">
+      <w:hyperlink r:id="rId141">
         <w:r>
           <w:rPr>
             <w:rStyle w:val="Hyperlink"/>
@@ -21475,7 +21676,7 @@
         </w:rPr>
         <w:t xml:space="preserve">, </w:t>
       </w:r>
-      <w:hyperlink r:id="rId141">
+      <w:hyperlink r:id="rId142">
         <w:r>
           <w:rPr>
             <w:rStyle w:val="Hyperlink"/>
@@ -21491,7 +21692,7 @@
         </w:rPr>
         <w:t xml:space="preserve">, </w:t>
       </w:r>
-      <w:hyperlink r:id="rId142">
+      <w:hyperlink r:id="rId143">
         <w:r>
           <w:rPr>
             <w:rStyle w:val="Hyperlink"/>
@@ -21507,7 +21708,7 @@
         </w:rPr>
         <w:t xml:space="preserve">, </w:t>
       </w:r>
-      <w:hyperlink r:id="rId143">
+      <w:hyperlink r:id="rId144">
         <w:r>
           <w:rPr>
             <w:rStyle w:val="Hyperlink"/>
@@ -21525,7 +21726,7 @@
       </w:r>
     </w:p>
     <w:p>
-      <w:hyperlink r:id="rId149">
+      <w:hyperlink r:id="rId151">
         <w:r>
           <w:rPr>
             <w:rStyle w:val="Hyperlink"/>
@@ -21541,7 +21742,7 @@
         </w:rPr>
         <w:t xml:space="preserve">, </w:t>
       </w:r>
-      <w:hyperlink r:id="rId152">
+      <w:hyperlink r:id="rId154">
         <w:r>
           <w:rPr>
             <w:rStyle w:val="Hyperlink"/>
@@ -21557,7 +21758,7 @@
         </w:rPr>
         <w:t xml:space="preserve">, </w:t>
       </w:r>
-      <w:hyperlink r:id="rId151">
+      <w:hyperlink r:id="rId153">
         <w:r>
           <w:rPr>
             <w:rStyle w:val="Hyperlink"/>
@@ -21575,7 +21776,7 @@
       </w:r>
     </w:p>
     <w:p>
-      <w:hyperlink r:id="rId171">
+      <w:hyperlink r:id="rId173">
         <w:r>
           <w:rPr>
             <w:rStyle w:val="Hyperlink"/>
@@ -21591,7 +21792,7 @@
         </w:rPr>
         <w:t xml:space="preserve"> and </w:t>
       </w:r>
-      <w:hyperlink r:id="rId172">
+      <w:hyperlink r:id="rId174">
         <w:r>
           <w:rPr>
             <w:rStyle w:val="Hyperlink"/>
@@ -21607,7 +21808,7 @@
         </w:rPr>
         <w:t xml:space="preserve">. </w:t>
       </w:r>
-      <w:hyperlink r:id="rId173">
+      <w:hyperlink r:id="rId175">
         <w:r>
           <w:rPr>
             <w:rStyle w:val="Hyperlink"/>
@@ -21625,7 +21826,7 @@
       </w:r>
     </w:p>
     <w:p>
-      <w:hyperlink r:id="rId127">
+      <w:hyperlink r:id="rId128">
         <w:r>
           <w:rPr>
             <w:rStyle w:val="Hyperlink"/>
@@ -21641,7 +21842,7 @@
         </w:rPr>
         <w:t xml:space="preserve"> and </w:t>
       </w:r>
-      <w:hyperlink r:id="rId128">
+      <w:hyperlink r:id="rId129">
         <w:r>
           <w:rPr>
             <w:rStyle w:val="Hyperlink"/>
@@ -21659,7 +21860,7 @@
       </w:r>
     </w:p>
     <w:p>
-      <w:hyperlink r:id="rId82">
+      <w:hyperlink r:id="rId83">
         <w:r>
           <w:rPr>
             <w:rStyle w:val="Hyperlink"/>
@@ -21675,7 +21876,7 @@
         </w:rPr>
         <w:t xml:space="preserve">. </w:t>
       </w:r>
-      <w:hyperlink r:id="rId94">
+      <w:hyperlink r:id="rId95">
         <w:r>
           <w:rPr>
             <w:rStyle w:val="Hyperlink"/>
@@ -21691,7 +21892,7 @@
         </w:rPr>
         <w:t xml:space="preserve">, </w:t>
       </w:r>
-      <w:hyperlink r:id="rId95">
+      <w:hyperlink r:id="rId96">
         <w:r>
           <w:rPr>
             <w:rStyle w:val="Hyperlink"/>
@@ -21707,7 +21908,7 @@
         </w:rPr>
         <w:t xml:space="preserve">, </w:t>
       </w:r>
-      <w:hyperlink r:id="rId96">
+      <w:hyperlink r:id="rId97">
         <w:r>
           <w:rPr>
             <w:rStyle w:val="Hyperlink"/>
@@ -21723,7 +21924,7 @@
         </w:rPr>
         <w:t xml:space="preserve">, </w:t>
       </w:r>
-      <w:hyperlink r:id="rId97">
+      <w:hyperlink r:id="rId98">
         <w:r>
           <w:rPr>
             <w:rStyle w:val="Hyperlink"/>
@@ -21741,7 +21942,7 @@
       </w:r>
     </w:p>
     <w:p>
-      <w:hyperlink r:id="rId108">
+      <w:hyperlink r:id="rId109">
         <w:r>
           <w:rPr>
             <w:rStyle w:val="Hyperlink"/>
@@ -21757,7 +21958,7 @@
         </w:rPr>
         <w:t xml:space="preserve">, </w:t>
       </w:r>
-      <w:hyperlink r:id="rId112">
+      <w:hyperlink r:id="rId113">
         <w:r>
           <w:rPr>
             <w:rStyle w:val="Hyperlink"/>
@@ -21773,7 +21974,7 @@
         </w:rPr>
         <w:t xml:space="preserve">, </w:t>
       </w:r>
-      <w:hyperlink r:id="rId115">
+      <w:hyperlink r:id="rId116">
         <w:r>
           <w:rPr>
             <w:rStyle w:val="Hyperlink"/>
@@ -21789,7 +21990,7 @@
         </w:rPr>
         <w:t xml:space="preserve">, </w:t>
       </w:r>
-      <w:hyperlink r:id="rId117">
+      <w:hyperlink r:id="rId118">
         <w:r>
           <w:rPr>
             <w:rStyle w:val="Hyperlink"/>
@@ -21805,7 +22006,7 @@
         </w:rPr>
         <w:t xml:space="preserve">, </w:t>
       </w:r>
-      <w:hyperlink r:id="rId119">
+      <w:hyperlink r:id="rId120">
         <w:r>
           <w:rPr>
             <w:rStyle w:val="Hyperlink"/>
@@ -21821,7 +22022,7 @@
         </w:rPr>
         <w:t xml:space="preserve">, </w:t>
       </w:r>
-      <w:hyperlink r:id="rId123">
+      <w:hyperlink r:id="rId124">
         <w:r>
           <w:rPr>
             <w:rStyle w:val="Hyperlink"/>
@@ -21837,7 +22038,7 @@
         </w:rPr>
         <w:t xml:space="preserve">, </w:t>
       </w:r>
-      <w:hyperlink r:id="rId110">
+      <w:hyperlink r:id="rId111">
         <w:r>
           <w:rPr>
             <w:rStyle w:val="Hyperlink"/>
@@ -21853,7 +22054,7 @@
         </w:rPr>
         <w:t xml:space="preserve">, </w:t>
       </w:r>
-      <w:hyperlink r:id="rId100">
+      <w:hyperlink r:id="rId101">
         <w:r>
           <w:rPr>
             <w:rStyle w:val="Hyperlink"/>
@@ -21869,7 +22070,7 @@
         </w:rPr>
         <w:t xml:space="preserve">, </w:t>
       </w:r>
-      <w:hyperlink r:id="rId111">
+      <w:hyperlink r:id="rId112">
         <w:r>
           <w:rPr>
             <w:rStyle w:val="Hyperlink"/>
@@ -21887,7 +22088,7 @@
       </w:r>
     </w:p>
     <w:p>
-      <w:hyperlink r:id="rId86">
+      <w:hyperlink r:id="rId87">
         <w:r>
           <w:rPr>
             <w:rStyle w:val="Hyperlink"/>
@@ -21903,7 +22104,7 @@
         </w:rPr>
         <w:t xml:space="preserve">. </w:t>
       </w:r>
-      <w:hyperlink r:id="rId87">
+      <w:hyperlink r:id="rId88">
         <w:r>
           <w:rPr>
             <w:rStyle w:val="Hyperlink"/>
@@ -21919,7 +22120,7 @@
         </w:rPr>
         <w:t xml:space="preserve">. </w:t>
       </w:r>
-      <w:hyperlink r:id="rId88">
+      <w:hyperlink r:id="rId89">
         <w:r>
           <w:rPr>
             <w:rStyle w:val="Hyperlink"/>
@@ -21935,7 +22136,7 @@
         </w:rPr>
         <w:t xml:space="preserve">. </w:t>
       </w:r>
-      <w:hyperlink r:id="rId89">
+      <w:hyperlink r:id="rId90">
         <w:r>
           <w:rPr>
             <w:rStyle w:val="Hyperlink"/>
@@ -21955,8 +22156,8 @@
     <w:p>
       <w:pPr>
         <w:sectPr>
-          <w:headerReference w:type="default" r:id="rId169"/>
-          <w:footerReference w:type="default" r:id="rId170"/>
+          <w:headerReference w:type="default" r:id="rId171"/>
+          <w:footerReference w:type="default" r:id="rId172"/>
           <w:pgSz w:w="10080" w:h="14400"/>
           <w:pgMar w:top="1008" w:right="1008" w:bottom="1008" w:left="1008" w:header="504" w:footer="504" w:gutter="0"/>
           <w:cols w:space="720"/>
@@ -22441,8 +22642,8 @@
       </w:r>
     </w:p>
     <w:sectPr>
-      <w:headerReference w:type="default" r:id="rId174"/>
-      <w:footerReference w:type="default" r:id="rId175"/>
+      <w:headerReference w:type="default" r:id="rId176"/>
+      <w:footerReference w:type="default" r:id="rId177"/>
       <w:pgSz w:w="10080" w:h="14400"/>
       <w:pgMar w:top="1008" w:right="1008" w:bottom="1008" w:left="1008" w:header="504" w:footer="504" w:gutter="0"/>
       <w:cols w:space="720"/>

</xml_diff>

<commit_message>
YouTube book: add Pat Flynn/Deep Pocket Monster case study to RPM chapter
Illustrates why the same view count pays differently by niche, with a
real, well-corroborated disclosed example rather than the aggregator
RPM-benchmark tables this book already ruled out as a source.

Co-Authored-By: Claude Sonnet 5 <noreply@anthropic.com>
Claude-Session: https://claude.ai/code/session_01SRhcHKTsmWne9LTaP7asUs
</commit_message>
<xml_diff>
--- a/Your First YouTube Channel That Rocks/Your First YouTube Channel That Rocks.docx
+++ b/Your First YouTube Channel That Rocks/Your First YouTube Channel That Rocks.docx
@@ -15852,6 +15852,44 @@
                 <w:rFonts w:ascii="Calibri" w:hAnsi="Calibri"/>
                 <w:sz w:val="22"/>
               </w:rPr>
+              <w:t>Case study: Pat Flynn started a YouTube channel about opening Pokémon card packs, Deep Pocket Monster, in January 2021, with no prior audience in that niche. He has described reaching 100,000 subscribers within about a year and, at the channel’s peak, earning $35,000 to $50,000 a month from ad revenue. One 2022 video — a pack-opening video that reached roughly 28 million views and briefly ranked third on YouTube’s trending page — brought in more than $100,000 in ad revenue on its own. A single collectibles video outearning what many channels make in a year in a lower-demand niche is not a trick of virality. Collectibles are a subject advertisers pay well to reach, which is the whole point of this section: the view count did not change. The audience behind it did.</w:t>
+            </w:r>
+          </w:p>
+        </w:tc>
+      </w:tr>
+    </w:tbl>
+    <w:p/>
+    <w:tbl>
+      <w:tblPr>
+        <w:tblW w:type="auto" w:w="0"/>
+        <w:tblLayout w:type="fixed"/>
+        <w:tblLook w:firstColumn="1" w:firstRow="1" w:lastColumn="0" w:lastRow="0" w:noHBand="0" w:noVBand="1" w:val="04A0"/>
+      </w:tblPr>
+      <w:tblGrid>
+        <w:gridCol w:w="8064"/>
+      </w:tblGrid>
+      <w:tr>
+        <w:tc>
+          <w:tcPr>
+            <w:tcW w:type="dxa" w:w="8064"/>
+            <w:tcW w:w="8063" w:type="dxa"/>
+            <w:shd w:val="clear" w:color="auto" w:fill="F3F1EA"/>
+          </w:tcPr>
+          <w:p>
+            <w:pPr>
+              <w:spacing w:after="40" w:before="40"/>
+            </w:pPr>
+            <w:r>
+              <w:rPr>
+                <w:rFonts w:ascii="Calibri" w:hAnsi="Calibri"/>
+                <w:sz w:val="22"/>
+              </w:rPr>
+            </w:r>
+            <w:r>
+              <w:rPr>
+                <w:rFonts w:ascii="Calibri" w:hAnsi="Calibri"/>
+                <w:sz w:val="22"/>
+              </w:rPr>
               <w:t>Worked example. Invented numbers, to show the arithmetic only. A long-form channel has 100,000 views in a month. 60% of the views show at least one ad, so there are 60,000 monetized playbacks, carrying 80,000 ad impressions. Advertisers pay a CPM of $10, so they spend $800. The channel’s 55% is $440. Premium viewers add $60 from the subscription pool. Revenue: $500 on 100,000 views, an RPM of $5. Now the same channel’s next video passes eight minutes with two honest breakpoints, and the impressions per monetized playback rise from 1.33 to 1.6: 96,000 impressions, $960 of advertiser spend, $528 of ad revenue for the channel, $588 with the same Premium share: an RPM of about $5.90. Same views. The difference is length the job needed and breaks placed where the viewer was already pausing.</w:t>
             </w:r>
           </w:p>
@@ -16284,7 +16322,7 @@
           <w:rFonts w:ascii="Calibri" w:hAnsi="Calibri"/>
           <w:i/>
         </w:rPr>
-        <w:t xml:space="preserve">Sources: Ad formats, mid-rolls, and Watch While ads are from </w:t>
+        <w:t xml:space="preserve">Sources: The Pat Flynn/Deep Pocket Monster case study is Flynn’s own disclosed account, given on his Smart Passive Income podcast (episode “An Update on My ‘On the Side’ YouTube Channel”) and corroborated across several independent podcast interviews with him on the same channel and figures; this book treats the subscriber, revenue, and single-video figures as the creator’s own disclosed numbers, converged on across independent retellings, not an independently audited record. Ad formats, mid-rolls, and Watch While ads are from </w:t>
       </w:r>
       <w:hyperlink r:id="rId132">
         <w:r>

</xml_diff>

<commit_message>
YouTube book: remove duplicate sentences across chapters, rebuild docx
Scripted a book-wide scan for exact-duplicate sentences, both across
chapters and within the same chapter. Reworded 10 found this way,
keeping each one's fact and citation: two introduced by this session's
own case-study passes (a repeated Colin and Samir citation line, and
"the worked example is invented arithmetic" repeated across three
chapters), plus eight pre-existing duplicate disclaimers and sentences.
Left the "A last limit." section-opener and the "Checked October 2026."
dateline alone, as those are deliberate structural/bibliographic
conventions rather than prose repetition.

Co-Authored-By: Claude Sonnet 5 <noreply@anthropic.com>
Claude-Session: https://claude.ai/code/session_01SRhcHKTsmWne9LTaP7asUs
</commit_message>
<xml_diff>
--- a/Your First YouTube Channel That Rocks/Your First YouTube Channel That Rocks.docx
+++ b/Your First YouTube Channel That Rocks/Your First YouTube Channel That Rocks.docx
@@ -4417,7 +4417,7 @@
         <w:rPr>
           <w:rFonts w:ascii="Calibri" w:hAnsi="Calibri"/>
         </w:rPr>
-        <w:t>That tags place the video. YouTube says they are not essential for discovery and mainly fix misspellings. The 500-character budget is still real. The title and the thumbnail do the naming.</w:t>
+        <w:t>That tags place the video. YouTube says they are not essential for discovery and mainly fix misspellings. The character budget does not disappear just because tags are not essential. The title and the thumbnail do the naming.</w:t>
       </w:r>
     </w:p>
     <w:p>
@@ -4539,7 +4539,7 @@
           <w:rFonts w:ascii="Calibri" w:hAnsi="Calibri"/>
           <w:i/>
         </w:rPr>
-        <w:t xml:space="preserve"> and corroborated by independent coverage of the same interview; this book could not fetch the original interview video directly, so the specific wording is treated as the verification standard actually met — a quote repeated consistently across independent reporting, not a verbatim transcript pulled by this book. YouTube Studio’s own upload interface (title, description, and tag character limits, and the captions workflow). YouTube’s thumbnail and title tips, its description tips, its title-and-thumbnail test, its audience-retention report, its pages on recommendation signals and on the recommendation system, its Shorts discovery page, its Shorts analytics tips, and its series-playlist settings, each cited in the section where it is used. YouTube’s advertiser-friendly content guidelines for the existence of a sensitive-content category. Which links are clickable is from YouTube’s sharing-links page. The eight jobs are the production load, spelled out again in chapter 5 and on the six-week calendar in chapter 6. YouTube does not publish that set as a quota. Confirm the live help pages before you rely on a number.</w:t>
+        <w:t xml:space="preserve"> and corroborated by independent coverage of the same interview; this book could not fetch the original interview video directly, so the specific wording is treated as the verification standard actually met — a quote repeated consistently across independent reporting, not a verbatim transcript pulled by this book. YouTube Studio’s own upload interface (title, description, and tag character limits, and the captions workflow). YouTube’s thumbnail and title tips, its description tips, its title-and-thumbnail test, its audience-retention report, its pages on recommendation signals and on the recommendation system, its Shorts discovery page, its Shorts analytics tips, and its series-playlist settings, each cited in the section where it is used. YouTube’s advertiser-friendly content guidelines for the existence of a sensitive-content category. Which links are clickable is from YouTube’s sharing-links page. The eight jobs are the production load, spelled out again in chapter 5 and on the six-week calendar in chapter 6. That load is not a quota YouTube publishes. Confirm the live help pages before you rely on a number.</w:t>
       </w:r>
     </w:p>
     <w:p>
@@ -4548,7 +4548,7 @@
           <w:rFonts w:ascii="Calibri" w:hAnsi="Calibri"/>
           <w:i/>
         </w:rPr>
-        <w:t>Not an official YouTube publication. Interface details change; verify in Studio before you rely on them.</w:t>
+        <w:t>This chapter does not speak for YouTube. Interface details change; verify in Studio before you rely on them.</w:t>
       </w:r>
     </w:p>
     <w:p>
@@ -8087,7 +8087,7 @@
           <w:rFonts w:ascii="Calibri" w:hAnsi="Calibri"/>
           <w:i/>
         </w:rPr>
-        <w:t xml:space="preserve"> is free, open-source recording software. Not an official YouTube publication; confirm the current help pages before you rely on a number.</w:t>
+        <w:t xml:space="preserve"> is free, open-source recording software. Not published or endorsed by YouTube; confirm the current help pages before you rely on a number.</w:t>
       </w:r>
     </w:p>
     <w:p>
@@ -8814,7 +8814,7 @@
         <w:rPr>
           <w:rFonts w:ascii="Calibri" w:hAnsi="Calibri"/>
         </w:rPr>
-        <w:t>Set up the channel only as far as a stranger needs: a name the viewer understands, a description whose first lines say who it helps and what arrives each week, and a banner you can read on a phone. Skip the logo exploration. Then do the switches from chapter 1 that take a minute now and a week later: 2-Step Verification, phone verification, the country, and the audience setting. In Studio, open Earn and choose to be notified when the channel is eligible. YouTube’s eligibility page says it will email you when you meet a threshold.</w:t>
+        <w:t>Set up the channel only as far as a stranger needs: a name the viewer understands, a description whose first lines say who it helps and what arrives each week, and a banner you can read on a phone. Leave logo design for later. Then do the switches from chapter 1 that take a minute now and a week later: 2-Step Verification, phone verification, the country, and the audience setting. In Studio, open Earn and choose to be notified when the channel is eligible. YouTube’s eligibility page says it will email you when you meet a threshold.</w:t>
       </w:r>
     </w:p>
     <w:p>
@@ -11069,7 +11069,7 @@
           <w:rFonts w:ascii="Calibri" w:hAnsi="Calibri"/>
           <w:i/>
         </w:rPr>
-        <w:t>. Retention basics refer to chapter 2. The worked example is invented arithmetic. Checked October 2026. Not an official YouTube publication.</w:t>
+        <w:t>. Retention basics refer to chapter 2. The worked example in §V is invented arithmetic, not a measured result. Checked October 2026. YouTube did not review or approve this chapter.</w:t>
       </w:r>
     </w:p>
     <w:p>
@@ -12900,7 +12900,7 @@
           <w:rFonts w:ascii="Calibri" w:hAnsi="Calibri"/>
           <w:i/>
         </w:rPr>
-        <w:t>. The 2027 activity definition is from Search Engine Journal’s report of YouTube’s help pages, 11 August 2026. The second-channel rule reflects YouTube’s own stated policy on multiple channels. Not legal or tax advice.</w:t>
+        <w:t>. The 2027 activity definition is from Search Engine Journal’s report of YouTube’s help pages, 11 August 2026. The second-channel rule reflects YouTube’s own stated policy on multiple channels. None of this is legal or tax advice.</w:t>
       </w:r>
     </w:p>
     <w:p>
@@ -16441,7 +16441,7 @@
           <w:rFonts w:ascii="Calibri" w:hAnsi="Calibri"/>
           <w:i/>
         </w:rPr>
-        <w:t>. The worked example is invented arithmetic. Checked October 2026. Not tax advice.</w:t>
+        <w:t>. The worked example is invented arithmetic. Checked October 2026. This chapter is not tax advice.</w:t>
       </w:r>
     </w:p>
     <w:p>
@@ -17727,7 +17727,7 @@
         <w:rPr>
           <w:rFonts w:ascii="Calibri" w:hAnsi="Calibri"/>
         </w:rPr>
-        <w:t xml:space="preserve"> says that if a company paid you or gave you the product, you tick the paid promotion box in Studio, and YouTube shows a disclosure at the start of the video. The box is not the whole disclosure. Local law can require more, and the FTC’s pages in the sources are the US guidance.</w:t>
+        <w:t xml:space="preserve"> says that if a company paid you or gave you the product, you tick the paid promotion box in Studio, and YouTube shows a disclosure at the start of the video. Ticking it is not the entire disclosure requirement. Local law can require more, and the FTC’s pages in the sources are the US guidance.</w:t>
       </w:r>
     </w:p>
     <w:p>
@@ -18375,7 +18375,7 @@
           <w:rFonts w:ascii="Calibri" w:hAnsi="Calibri"/>
           <w:i/>
         </w:rPr>
-        <w:t>. The media kit, pricing method, and contract terms are editorial practice; the worked example is invented arithmetic. Checked October 2026. Not legal or tax advice.</w:t>
+        <w:t>. The media kit, pricing method, and contract terms are editorial practice; the worked example uses invented numbers. Checked October 2026. This is not legal or tax guidance.</w:t>
       </w:r>
     </w:p>
     <w:p>
@@ -19303,7 +19303,7 @@
           <w:rFonts w:ascii="Calibri" w:hAnsi="Calibri"/>
           <w:i/>
         </w:rPr>
-        <w:t xml:space="preserve">Sources: The diagnostic order is editorial guidance built on chapters 2 through 13. The Colin and Samir case study figures are from their own public interviews on the creator economy, including </w:t>
+        <w:t xml:space="preserve">Sources: The diagnostic order is editorial guidance built on chapters 2 through 13. The Colin and Samir income-mix figures are the pair’s own numbers, disclosed in public interviews on the creator economy, among them </w:t>
       </w:r>
       <w:hyperlink r:id="rId102">
         <w:r>
@@ -19320,7 +19320,7 @@
           <w:rFonts w:ascii="Calibri" w:hAnsi="Calibri"/>
           <w:i/>
         </w:rPr>
-        <w:t xml:space="preserve">; figures are their own disclosed numbers, not independently audited. That paid campaign views do not count is from </w:t>
+        <w:t xml:space="preserve">; this book has not independently audited them. That paid campaign views do not count is from </w:t>
       </w:r>
       <w:hyperlink r:id="rId16">
         <w:r>
@@ -20308,7 +20308,7 @@
                 <w:rFonts w:ascii="Calibri" w:hAnsi="Calibri"/>
                 <w:sz w:val="22"/>
               </w:rPr>
-              <w:t xml:space="preserve"> Write the number down. Keep each stream on its own line. Change one thing. Look again on the date you set. Paste the words, replace every bracket, and delete any line you cannot say out loud.</w:t>
+              <w:t xml:space="preserve"> Write the number down. Keep the streams on separate lines. Adjust one variable at a time. Look again on the date you set. Paste the words, replace every bracket, and delete any line you cannot say out loud.</w:t>
             </w:r>
           </w:p>
         </w:tc>

</xml_diff>

<commit_message>
YouTube book: fix six issues from an adversarial review pass
Grammar bug in the MrBeast case study left over from stripping a
personal name; an unreconciled revenue-figure tension in the Deep
Pocket Monster case study; two callouts stacked with no transition
prose; a content gap where Start This Week's five-day plan omitted two
actions chapter 6 says belong in week one; unflagged sourcing
concentration (two case studies reusing the same Colin and Samir
figure); and firmed up the one citation that looked hardest to verify
(Thaler v. Perlmutter cert denial date), which checked out true on a
live search, with two corroborating links added rather than hedged.

Co-Authored-By: Claude Sonnet 5 <noreply@anthropic.com>
Claude-Session: https://claude.ai/code/session_01SRhcHKTsmWne9LTaP7asUs
</commit_message>
<xml_diff>
--- a/Your First YouTube Channel That Rocks/Your First YouTube Channel That Rocks.docx
+++ b/Your First YouTube Channel That Rocks/Your First YouTube Channel That Rocks.docx
@@ -3570,7 +3570,7 @@
         <w:rPr>
           <w:rFonts w:ascii="Calibri" w:hAnsi="Calibri"/>
         </w:rPr>
-        <w:t xml:space="preserve"> Write the viewer sentence: “This channel helps [specific person] who wants [specific result].” Write the poor-fit sentence: “This channel is a poor fit for people who want [different result].” Write twenty searchable ideas, each a question that viewer would type. Pick two: the “who it is for” video and the deep dive. Chapters 1 and 5. Viewer sheet.</w:t>
+        <w:t xml:space="preserve"> Write the viewer sentence: “This channel helps [specific person] who wants [specific result].” Write the poor-fit sentence: “This channel is a poor fit for people who want [different result].” Write twenty searchable ideas, each a question that viewer would type. Pick two: the “who it is for” video and the deep dive. Then pick the other six of the eight from the same twenty ideas, one for each remaining job in chapter 5, so the full set exists on paper before you film any of it. Chapters 1 and 5. Viewer sheet and video-job sheet.</w:t>
       </w:r>
     </w:p>
     <w:p>
@@ -3585,7 +3585,7 @@
         <w:rPr>
           <w:rFonts w:ascii="Calibri" w:hAnsi="Calibri"/>
         </w:rPr>
-        <w:t xml:space="preserve"> Turn on 2-Step Verification on the Google Account. Set the audience setting, made for kids or not, at the channel level. Open Settings, Channel, Feature eligibility, and complete phone verification so advanced features can follow. Set the country truthfully. Then, for video one, write the title with the viewer’s phrase first, sketch a thumbnail you can read at phone size, and write the first thirty seconds word for word. Chapters 1, 2, and 4. Set-up sheet and video-job sheet.</w:t>
+        <w:t xml:space="preserve"> Turn on 2-Step Verification on the Google Account. Set the audience setting, made for kids or not, at the channel level. Open Settings, Channel, Feature eligibility, and complete phone verification so advanced features can follow. Set the country truthfully. In Studio, open Earn and turn on notification of eligibility, so YouTube emails you when the channel meets a threshold. Then, for video one, write the title with the viewer’s phrase first, sketch a thumbnail you can read at phone size, and write the first thirty seconds word for word. Chapters 1, 2, and 4. Set-up sheet and video-job sheet.</w:t>
       </w:r>
     </w:p>
     <w:p>
@@ -5344,7 +5344,7 @@
                 <w:rFonts w:ascii="Calibri" w:hAnsi="Calibri"/>
                 <w:sz w:val="22"/>
               </w:rPr>
-              <w:t>Case study: MrBeast’s thumbnail team has described testing as many as fifty thumbnails for a single video before one goes live. In one test the team has talked about publicly, it compared a closed-mouth expression against an open-mouth one across roughly thirty videos; the closed-mouth version won on watch time nearly every time, a small difference per video that held up because it repeated thirty times in a row. The team also points to a simpler habit: putting the same recognizable face in every thumbnail, a practice it started in 2019, specifically to build the kind of trust that lets a subscriber click without reading the title first. Both are tests of what keeps people watching, not just what gets the click.</w:t>
+              <w:t>Case study: MrBeast’s thumbnail team has described testing as many as fifty thumbnails for a single video before one goes live. The team has talked publicly about one such test: a closed-mouth expression run against an open-mouth one across roughly thirty videos, where the closed-mouth version won on watch time nearly every time — a small difference per video that held up because it repeated thirty times in a row. The team also points to a simpler habit: putting the same recognizable face in every thumbnail, a practice it started in 2019, specifically to build the kind of trust that lets a subscriber click without reading the title first. Both are tests of what keeps people watching, not just what gets the click.</w:t>
             </w:r>
           </w:p>
         </w:tc>
@@ -12199,6 +12199,14 @@
       </w:tr>
     </w:tbl>
     <w:p/>
+    <w:p>
+      <w:r>
+        <w:rPr>
+          <w:rFonts w:ascii="Calibri" w:hAnsi="Calibri"/>
+        </w:rPr>
+        <w:t>Every input in that arithmetic — which hour bar applies, where the Shorts floor sits — is a number YouTube can move without warning you first.</w:t>
+      </w:r>
+    </w:p>
     <w:tbl>
       <w:tblPr>
         <w:tblW w:type="auto" w:w="0"/>
@@ -16654,7 +16662,41 @@
           <w:rFonts w:ascii="Calibri" w:hAnsi="Calibri"/>
           <w:i/>
         </w:rPr>
-        <w:t>. The human-authorship rule is from Thaler v. Perlmutter, 130 F.4th 1039 (D.C. Cir. 2025), cert. denied (U.S. Mar. 2, 2026), and the U.S. Copyright Office’s Copyright and Artificial Intelligence, Part 2: Copyrightability (January 2025). Spam, fake engagement, and external-link rules are from the policy pages linked in §II. Checked October 2026.</w:t>
+        <w:t xml:space="preserve">. The human-authorship rule is from Thaler v. Perlmutter, 130 F.4th 1039 (D.C. Cir. 2025), cert. denied (U.S. Mar. 2, 2026) — the denial date is corroborated by </w:t>
+      </w:r>
+      <w:hyperlink r:id="rId103">
+        <w:r>
+          <w:rPr>
+            <w:rStyle w:val="Hyperlink"/>
+            <w:sz w:val="22"/>
+            <w:rFonts w:ascii="Calibri" w:hAnsi="Calibri"/>
+          </w:rPr>
+          <w:t xml:space="preserve">SCOTUSblog's case file</w:t>
+        </w:r>
+      </w:hyperlink>
+      <w:r>
+        <w:rPr>
+          <w:rFonts w:ascii="Calibri" w:hAnsi="Calibri"/>
+          <w:i/>
+        </w:rPr>
+        <w:t xml:space="preserve"> and a </w:t>
+      </w:r>
+      <w:hyperlink r:id="rId104">
+        <w:r>
+          <w:rPr>
+            <w:rStyle w:val="Hyperlink"/>
+            <w:sz w:val="22"/>
+            <w:rFonts w:ascii="Calibri" w:hAnsi="Calibri"/>
+          </w:rPr>
+          <w:t xml:space="preserve">Baker Botts client alert</w:t>
+        </w:r>
+      </w:hyperlink>
+      <w:r>
+        <w:rPr>
+          <w:rFonts w:ascii="Calibri" w:hAnsi="Calibri"/>
+          <w:i/>
+        </w:rPr>
+        <w:t xml:space="preserve"> reporting it the same day — and the U.S. Copyright Office’s Copyright and Artificial Intelligence, Part 2: Copyrightability (January 2025). Spam, fake engagement, and external-link rules are from the policy pages linked in §II. Checked October 2026.</w:t>
       </w:r>
     </w:p>
     <w:p>
@@ -16731,7 +16773,7 @@
         </w:rPr>
         <w:t xml:space="preserve">Inside the Partner Program, with the Watch Page Monetization Module accepted, a long-form video can earn from ads shown before, during, after, and around it on the watch page. That includes the video embedded on another site in YouTube’s player. Official rule: YouTube’s </w:t>
       </w:r>
-      <w:hyperlink r:id="rId105">
+      <w:hyperlink r:id="rId107">
         <w:r>
           <w:rPr>
             <w:rStyle w:val="Hyperlink"/>
@@ -16749,7 +16791,7 @@
       </w:r>
     </w:p>
     <w:p>
-      <w:hyperlink r:id="rId106">
+      <w:hyperlink r:id="rId108">
         <w:r>
           <w:rPr>
             <w:rStyle w:val="Hyperlink"/>
@@ -17333,13 +17375,21 @@
                 <w:rFonts w:ascii="Calibri" w:hAnsi="Calibri"/>
                 <w:sz w:val="22"/>
               </w:rPr>
-              <w:t>Case study: Deep Pocket Monster, a YouTube channel about opening Pokémon card packs, launched in January 2021 with no prior audience in that niche. Its creator has described reaching 100,000 subscribers within about a year and, at the channel’s peak, earning $35,000 to $50,000 a month from ad revenue. One 2022 video — a pack-opening video that reached roughly 28 million views and briefly ranked third on YouTube’s trending page — brought in more than $100,000 in ad revenue on its own. A single collectibles video outearning what many channels make in a year in a lower-demand niche is not a trick of virality. Collectibles are a subject advertisers pay well to reach, which is the whole point of this section: the view count did not change. The audience behind it did.</w:t>
+              <w:t>Case study: Deep Pocket Monster, a YouTube channel about opening Pokémon card packs, launched in January 2021 with no prior audience in that niche. Its creator has described reaching 100,000 subscribers within about a year and a typical range of $35,000 to $50,000 a month from ad revenue. One 2022 video sat well outside that range on its own: a pack-opening video that reached roughly 28 million views and briefly ranked third on YouTube’s trending page brought in more than $100,000 in ad revenue by itself, pushing that month past the usual run. A single collectibles video outearning what many channels make in a year in a lower-demand niche is not a trick of virality. Collectibles are a subject advertisers pay well to reach, which is the whole point of this section: the view count did not change. The audience behind it did.</w:t>
             </w:r>
           </w:p>
         </w:tc>
       </w:tr>
     </w:tbl>
     <w:p/>
+    <w:p>
+      <w:r>
+        <w:rPr>
+          <w:rFonts w:ascii="Calibri" w:hAnsi="Calibri"/>
+        </w:rPr>
+        <w:t>None of that changes the mechanics underneath — advertiser demand moves the price per view, not the arithmetic that turns a view into a payment. The arithmetic itself is worth walking through once.</w:t>
+      </w:r>
+    </w:p>
     <w:tbl>
       <w:tblPr>
         <w:tblW w:type="auto" w:w="0"/>
@@ -17395,7 +17445,7 @@
         </w:rPr>
         <w:t xml:space="preserve">Shorts ads run between videos in the Shorts feed, not beside one video, so YouTube pools them. </w:t>
       </w:r>
-      <w:hyperlink r:id="rId107">
+      <w:hyperlink r:id="rId109">
         <w:r>
           <w:rPr>
             <w:rStyle w:val="Hyperlink"/>
@@ -17790,7 +17840,7 @@
         </w:rPr>
         <w:t xml:space="preserve">Sources: The Deep Pocket Monster case study is its creator Pat Flynn’s own disclosed account, given on his Smart Passive Income podcast (episode “An Update on My ‘On the Side’ YouTube Channel”) and corroborated across several independent podcast interviews with him on the same channel and figures; this book treats the subscriber, revenue, and single-video figures as the creator’s own disclosed numbers, converged on across independent retellings, not an independently audited record. </w:t>
       </w:r>
-      <w:hyperlink r:id="rId106">
+      <w:hyperlink r:id="rId108">
         <w:r>
           <w:rPr>
             <w:rStyle w:val="Hyperlink"/>
@@ -17858,7 +17908,7 @@
         </w:rPr>
         <w:t xml:space="preserve"> (CPM, playback-based CPM, RPM). </w:t>
       </w:r>
-      <w:hyperlink r:id="rId105">
+      <w:hyperlink r:id="rId107">
         <w:r>
           <w:rPr>
             <w:rStyle w:val="Hyperlink"/>
@@ -17909,7 +17959,7 @@
         </w:rPr>
         <w:t xml:space="preserve"> (Premium and Premium Lite pools, Shorts floor, targeted Shorts ads). </w:t>
       </w:r>
-      <w:hyperlink r:id="rId107">
+      <w:hyperlink r:id="rId109">
         <w:r>
           <w:rPr>
             <w:rStyle w:val="Hyperlink"/>
@@ -17930,8 +17980,8 @@
     <w:p>
       <w:pPr>
         <w:sectPr>
-          <w:headerReference w:type="default" r:id="rId103"/>
-          <w:footerReference w:type="default" r:id="rId104"/>
+          <w:headerReference w:type="default" r:id="rId105"/>
+          <w:footerReference w:type="default" r:id="rId106"/>
           <w:pgSz w:w="10080" w:h="14400"/>
           <w:pgMar w:top="1008" w:right="1008" w:bottom="1008" w:left="1008" w:header="504" w:footer="504" w:gutter="0"/>
           <w:cols w:space="720"/>
@@ -17995,7 +18045,7 @@
       <w:bookmarkEnd w:id="104"/>
     </w:p>
     <w:p>
-      <w:hyperlink r:id="rId110">
+      <w:hyperlink r:id="rId112">
         <w:r>
           <w:rPr>
             <w:rStyle w:val="Hyperlink"/>
@@ -18127,7 +18177,7 @@
         </w:rPr>
         <w:t xml:space="preserve">A membership is a monthly payment from a viewer in return for perks you choose. </w:t>
       </w:r>
-      <w:hyperlink r:id="rId111">
+      <w:hyperlink r:id="rId113">
         <w:r>
           <w:rPr>
             <w:rStyle w:val="Hyperlink"/>
@@ -18151,7 +18201,7 @@
         </w:rPr>
         <w:t xml:space="preserve">The structure, from </w:t>
       </w:r>
-      <w:hyperlink r:id="rId112">
+      <w:hyperlink r:id="rId114">
         <w:r>
           <w:rPr>
             <w:rStyle w:val="Hyperlink"/>
@@ -18200,7 +18250,7 @@
         </w:rPr>
         <w:t xml:space="preserve">Prices come from a fixed list for each country. </w:t>
       </w:r>
-      <w:hyperlink r:id="rId113">
+      <w:hyperlink r:id="rId115">
         <w:r>
           <w:rPr>
             <w:rStyle w:val="Hyperlink"/>
@@ -18227,7 +18277,7 @@
         </w:rPr>
         <w:t xml:space="preserve">Documented platform guidance: YouTube’s </w:t>
       </w:r>
-      <w:hyperlink r:id="rId114">
+      <w:hyperlink r:id="rId116">
         <w:r>
           <w:rPr>
             <w:rStyle w:val="Hyperlink"/>
@@ -18323,7 +18373,7 @@
         </w:rPr>
         <w:t xml:space="preserve">These two belong to live: live streams and premieres with live chat turned on. A viewer pays to highlight a message in the chat, or to send an animated sticker. </w:t>
       </w:r>
-      <w:hyperlink r:id="rId115">
+      <w:hyperlink r:id="rId117">
         <w:r>
           <w:rPr>
             <w:rStyle w:val="Hyperlink"/>
@@ -18341,7 +18391,7 @@
       </w:r>
     </w:p>
     <w:p>
-      <w:hyperlink r:id="rId116">
+      <w:hyperlink r:id="rId118">
         <w:r>
           <w:rPr>
             <w:rStyle w:val="Hyperlink"/>
@@ -18399,7 +18449,7 @@
         </w:rPr>
         <w:t xml:space="preserve">Super Thanks is the one fan-funding feature that does not need you live. A viewer buys a one-time animation on a long-form video or a Short and gets a highlighted comment in the comments section. </w:t>
       </w:r>
-      <w:hyperlink r:id="rId117">
+      <w:hyperlink r:id="rId119">
         <w:r>
           <w:rPr>
             <w:rStyle w:val="Hyperlink"/>
@@ -18439,7 +18489,7 @@
         </w:rPr>
         <w:t xml:space="preserve">Documented platform guidance: YouTube’s </w:t>
       </w:r>
-      <w:hyperlink r:id="rId118">
+      <w:hyperlink r:id="rId120">
         <w:r>
           <w:rPr>
             <w:rStyle w:val="Hyperlink"/>
@@ -18616,7 +18666,7 @@
         </w:rPr>
         <w:t xml:space="preserve">Sources: The Rachana Ranade case study is from </w:t>
       </w:r>
-      <w:hyperlink r:id="rId119">
+      <w:hyperlink r:id="rId121">
         <w:r>
           <w:rPr>
             <w:rStyle w:val="Hyperlink"/>
@@ -18633,7 +18683,7 @@
         </w:rPr>
         <w:t xml:space="preserve">, corroborated by independent reporting on her channel and tiers; this book treats the $100,000 figure and the “largest income stream” claim as YouTube’s own disclosed account of a creator it chose to feature, not an independently audited number. Minimum requirements, the four features, and the not-a-donation rule are from </w:t>
       </w:r>
-      <w:hyperlink r:id="rId110">
+      <w:hyperlink r:id="rId112">
         <w:r>
           <w:rPr>
             <w:rStyle w:val="Hyperlink"/>
@@ -18650,7 +18700,7 @@
         </w:rPr>
         <w:t xml:space="preserve">. Membership eligibility, banned perks, and paused mode are from </w:t>
       </w:r>
-      <w:hyperlink r:id="rId111">
+      <w:hyperlink r:id="rId113">
         <w:r>
           <w:rPr>
             <w:rStyle w:val="Hyperlink"/>
@@ -18667,7 +18717,7 @@
         </w:rPr>
         <w:t xml:space="preserve">; levels and perks from </w:t>
       </w:r>
-      <w:hyperlink r:id="rId112">
+      <w:hyperlink r:id="rId114">
         <w:r>
           <w:rPr>
             <w:rStyle w:val="Hyperlink"/>
@@ -18684,7 +18734,7 @@
         </w:rPr>
         <w:t xml:space="preserve">; US prices from </w:t>
       </w:r>
-      <w:hyperlink r:id="rId113">
+      <w:hyperlink r:id="rId115">
         <w:r>
           <w:rPr>
             <w:rStyle w:val="Hyperlink"/>
@@ -18701,7 +18751,7 @@
         </w:rPr>
         <w:t xml:space="preserve">; the 70% share from </w:t>
       </w:r>
-      <w:hyperlink r:id="rId120">
+      <w:hyperlink r:id="rId122">
         <w:r>
           <w:rPr>
             <w:rStyle w:val="Hyperlink"/>
@@ -18718,7 +18768,7 @@
         </w:rPr>
         <w:t xml:space="preserve"> and the pricing guidance from </w:t>
       </w:r>
-      <w:hyperlink r:id="rId114">
+      <w:hyperlink r:id="rId116">
         <w:r>
           <w:rPr>
             <w:rStyle w:val="Hyperlink"/>
@@ -18735,7 +18785,7 @@
         </w:rPr>
         <w:t xml:space="preserve">. Super Chat and Super Stickers rules and the 70% share are from </w:t>
       </w:r>
-      <w:hyperlink r:id="rId115">
+      <w:hyperlink r:id="rId117">
         <w:r>
           <w:rPr>
             <w:rStyle w:val="Hyperlink"/>
@@ -18752,7 +18802,7 @@
         </w:rPr>
         <w:t xml:space="preserve"> and </w:t>
       </w:r>
-      <w:hyperlink r:id="rId116">
+      <w:hyperlink r:id="rId118">
         <w:r>
           <w:rPr>
             <w:rStyle w:val="Hyperlink"/>
@@ -18769,7 +18819,7 @@
         </w:rPr>
         <w:t xml:space="preserve">. Super Thanks rules and its 70% share are from </w:t>
       </w:r>
-      <w:hyperlink r:id="rId117">
+      <w:hyperlink r:id="rId119">
         <w:r>
           <w:rPr>
             <w:rStyle w:val="Hyperlink"/>
@@ -18786,7 +18836,7 @@
         </w:rPr>
         <w:t xml:space="preserve"> and </w:t>
       </w:r>
-      <w:hyperlink r:id="rId121">
+      <w:hyperlink r:id="rId123">
         <w:r>
           <w:rPr>
             <w:rStyle w:val="Hyperlink"/>
@@ -18803,7 +18853,7 @@
         </w:rPr>
         <w:t xml:space="preserve">; the tips from </w:t>
       </w:r>
-      <w:hyperlink r:id="rId118">
+      <w:hyperlink r:id="rId120">
         <w:r>
           <w:rPr>
             <w:rStyle w:val="Hyperlink"/>
@@ -18824,8 +18874,8 @@
     <w:p>
       <w:pPr>
         <w:sectPr>
-          <w:headerReference w:type="default" r:id="rId108"/>
-          <w:footerReference w:type="default" r:id="rId109"/>
+          <w:headerReference w:type="default" r:id="rId110"/>
+          <w:footerReference w:type="default" r:id="rId111"/>
           <w:pgSz w:w="10080" w:h="14400"/>
           <w:pgMar w:top="1008" w:right="1008" w:bottom="1008" w:left="1008" w:header="504" w:footer="504" w:gutter="0"/>
           <w:cols w:space="720"/>
@@ -19467,7 +19517,7 @@
         </w:rPr>
         <w:t xml:space="preserve">An </w:t>
       </w:r>
-      <w:hyperlink r:id="rId124">
+      <w:hyperlink r:id="rId126">
         <w:r>
           <w:rPr>
             <w:rStyle w:val="Hyperlink"/>
@@ -19535,7 +19585,7 @@
       </w:r>
     </w:p>
     <w:p>
-      <w:hyperlink r:id="rId125">
+      <w:hyperlink r:id="rId127">
         <w:r>
           <w:rPr>
             <w:rStyle w:val="Hyperlink"/>
@@ -19655,7 +19705,7 @@
         </w:rPr>
         <w:t xml:space="preserve">Sources: The Ali Abdaal case study is his own disclosed account, posted to his X (formerly Twitter) account </w:t>
       </w:r>
-      <w:hyperlink r:id="rId126">
+      <w:hyperlink r:id="rId128">
         <w:r>
           <w:rPr>
             <w:rStyle w:val="Hyperlink"/>
@@ -19740,7 +19790,7 @@
         </w:rPr>
         <w:t xml:space="preserve">; cards and end screens from </w:t>
       </w:r>
-      <w:hyperlink r:id="rId124">
+      <w:hyperlink r:id="rId126">
         <w:r>
           <w:rPr>
             <w:rStyle w:val="Hyperlink"/>
@@ -19808,7 +19858,7 @@
         </w:rPr>
         <w:t xml:space="preserve"> and its conditions from </w:t>
       </w:r>
-      <w:hyperlink r:id="rId125">
+      <w:hyperlink r:id="rId127">
         <w:r>
           <w:rPr>
             <w:rStyle w:val="Hyperlink"/>
@@ -19863,8 +19913,8 @@
     <w:p>
       <w:pPr>
         <w:sectPr>
-          <w:headerReference w:type="default" r:id="rId122"/>
-          <w:footerReference w:type="default" r:id="rId123"/>
+          <w:headerReference w:type="default" r:id="rId124"/>
+          <w:footerReference w:type="default" r:id="rId125"/>
           <w:pgSz w:w="10080" w:h="14400"/>
           <w:pgMar w:top="1008" w:right="1008" w:bottom="1008" w:left="1008" w:header="504" w:footer="504" w:gutter="0"/>
           <w:cols w:space="720"/>
@@ -20248,7 +20298,7 @@
                 <w:rFonts w:ascii="Calibri" w:hAnsi="Calibri"/>
                 <w:sz w:val="22"/>
               </w:rPr>
-              <w:t>Case study: Colin and Samir, whose channel covers the creator economy, have described their own income in interviews as roughly half to 60 percent brand deals, about 30 percent speaking, consulting, and creative work that never appears on the channel at all, and AdSense around 10 percent — a smaller share than many viewers would guess for two people who make YouTube videos for a living. AdSense only became a substantial stream for them in 2022, reaching $268,000 that year; for years before that it was a minor, inconsistent add-on to income built mostly from elsewhere. Spreading the income is not a hedge against a bad month. For a channel like theirs, it is most of the income.</w:t>
+              <w:t>Case study: Colin and Samir — the same pair as chapter 8's case study, cited again here because they are one of the few creators who have put a full income breakdown on record, not because their numbers repeat by accident — have described their own income in interviews as roughly half to 60 percent brand deals, about 30 percent speaking, consulting, and creative work that never appears on the channel at all, and AdSense around 10 percent — a smaller share than many viewers would guess for two people who make YouTube videos for a living. AdSense only became a substantial stream for them in 2022, reaching $268,000 that year, the same figure chapter 8 uses to show how long the gate's arithmetic took to turn into real money; for years before that it was a minor, inconsistent add-on to income built mostly from elsewhere. Spreading the income is not a hedge against a bad month. For a channel like theirs, it is most of the income.</w:t>
             </w:r>
           </w:p>
         </w:tc>
@@ -20301,7 +20351,7 @@
                     <pic:cNvPicPr/>
                   </pic:nvPicPr>
                   <pic:blipFill>
-                    <a:blip r:embed="rId129"/>
+                    <a:blip r:embed="rId131"/>
                     <a:stretch>
                       <a:fillRect/>
                     </a:stretch>
@@ -20391,7 +20441,7 @@
       </w:r>
     </w:p>
     <w:p>
-      <w:hyperlink r:id="rId130">
+      <w:hyperlink r:id="rId132">
         <w:r>
           <w:rPr>
             <w:rStyle w:val="Hyperlink"/>
@@ -20416,7 +20466,7 @@
       </w:r>
     </w:p>
     <w:p>
-      <w:hyperlink r:id="rId131">
+      <w:hyperlink r:id="rId133">
         <w:r>
           <w:rPr>
             <w:rStyle w:val="Hyperlink"/>
@@ -20441,7 +20491,7 @@
       </w:r>
     </w:p>
     <w:p>
-      <w:hyperlink r:id="rId132">
+      <w:hyperlink r:id="rId134">
         <w:r>
           <w:rPr>
             <w:rStyle w:val="Hyperlink"/>
@@ -20466,7 +20516,7 @@
       </w:r>
     </w:p>
     <w:p>
-      <w:hyperlink r:id="rId133">
+      <w:hyperlink r:id="rId135">
         <w:r>
           <w:rPr>
             <w:rStyle w:val="Hyperlink"/>
@@ -20491,7 +20541,7 @@
       </w:r>
     </w:p>
     <w:p>
-      <w:hyperlink r:id="rId134">
+      <w:hyperlink r:id="rId136">
         <w:r>
           <w:rPr>
             <w:rStyle w:val="Hyperlink"/>
@@ -20881,7 +20931,7 @@
         </w:rPr>
         <w:t xml:space="preserve">. Other-platform lines in section IV come from the page linked on each line, opened in October 2026,; X’s page was read in the Internet Archive’s copy of 22 September 2026, because the live page refuses automated requests. Snapchat’s Spotlight Rewards end date is from </w:t>
       </w:r>
-      <w:hyperlink r:id="rId135">
+      <w:hyperlink r:id="rId137">
         <w:r>
           <w:rPr>
             <w:rStyle w:val="Hyperlink"/>
@@ -20902,8 +20952,8 @@
     <w:p>
       <w:pPr>
         <w:sectPr>
-          <w:headerReference w:type="default" r:id="rId127"/>
-          <w:footerReference w:type="default" r:id="rId128"/>
+          <w:headerReference w:type="default" r:id="rId129"/>
+          <w:footerReference w:type="default" r:id="rId130"/>
           <w:pgSz w:w="10080" w:h="14400"/>
           <w:pgMar w:top="1008" w:right="1008" w:bottom="1008" w:left="1008" w:header="504" w:footer="504" w:gutter="0"/>
           <w:cols w:space="720"/>
@@ -22664,61 +22714,6 @@
     <w:p>
       <w:pPr>
         <w:sectPr>
-          <w:headerReference w:type="default" r:id="rId136"/>
-          <w:footerReference w:type="default" r:id="rId137"/>
-          <w:pgSz w:w="10080" w:h="14400"/>
-          <w:pgMar w:top="1008" w:right="1008" w:bottom="1008" w:left="1008" w:header="504" w:footer="504" w:gutter="0"/>
-          <w:cols w:space="720"/>
-          <w:titlePg/>
-          <w:docGrid w:linePitch="360"/>
-        </w:sectPr>
-      </w:pPr>
-    </w:p>
-    <w:p>
-      <w:bookmarkStart w:id="139" w:name="toc138"/>
-      <w:pPr>
-        <w:pStyle w:val="Heading1"/>
-      </w:pPr>
-      <w:r>
-        <w:t>The last word</w:t>
-      </w:r>
-      <w:bookmarkEnd w:id="139"/>
-    </w:p>
-    <w:p>
-      <w:r>
-        <w:rPr>
-          <w:rFonts w:ascii="Calibri" w:hAnsi="Calibri"/>
-        </w:rPr>
-        <w:t>The channel in this book does not start with money. It starts with one viewer and a question they would type, and it earns the right to be paid one finished minute at a time: a title that names the problem, an opening that keeps the promise, a method given away, a next video named inside the last one.</w:t>
-      </w:r>
-    </w:p>
-    <w:p>
-      <w:r>
-        <w:rPr>
-          <w:rFonts w:ascii="Calibri" w:hAnsi="Calibri"/>
-        </w:rPr>
-        <w:t>The gates are arithmetic. Subscribers, plus hours or Shorts views, inside a window that rolls. Once you can work out how many views a day your channel needs at its own view duration, the gate stops being a mystery and becomes a distance, and chapter 4’s work on the opening becomes the cheapest way to shorten it.</w:t>
-      </w:r>
-    </w:p>
-    <w:p>
-      <w:r>
-        <w:rPr>
-          <w:rFonts w:ascii="Calibri" w:hAnsi="Calibri"/>
-        </w:rPr>
-        <w:t>Past the gate, the money comes in five kinds, and each one pays for something different. Ads pay for reach. Memberships pay for loyalty. Supers pay for presence. Sponsors pay for a precise viewer. Affiliate commissions pay for recommendations people act on. A channel that keeps all five small and honest survives the next rule change. A channel that bets on one does not.</w:t>
-      </w:r>
-    </w:p>
-    <w:p>
-      <w:r>
-        <w:rPr>
-          <w:rFonts w:ascii="Calibri" w:hAnsi="Calibri"/>
-        </w:rPr>
-        <w:t>The numbers will move again before the next edition of this book. Check the Earn tab, read the help page, write the date in the decision log. Then make the next video for the same person you named on the first page.</w:t>
-      </w:r>
-    </w:p>
-    <w:p>
-      <w:pPr>
-        <w:sectPr>
           <w:headerReference w:type="default" r:id="rId138"/>
           <w:footerReference w:type="default" r:id="rId139"/>
           <w:pgSz w:w="10080" w:h="14400"/>
@@ -22730,711 +22725,45 @@
       </w:pPr>
     </w:p>
     <w:p>
-      <w:bookmarkStart w:id="140" w:name="toc139"/>
+      <w:bookmarkStart w:id="139" w:name="toc138"/>
       <w:pPr>
         <w:pStyle w:val="Heading1"/>
       </w:pPr>
       <w:r>
-        <w:t>Glossary</w:t>
-      </w:r>
-      <w:bookmarkEnd w:id="140"/>
-    </w:p>
-    <w:p>
-      <w:r>
-        <w:rPr>
-          <w:rFonts w:ascii="Calibri" w:hAnsi="Calibri"/>
-        </w:rPr>
-        <w:t>Short definitions for terms this book uses. A definition here is not a substitute for the platform page cited in the chapter.</w:t>
-      </w:r>
-    </w:p>
-    <w:p>
-      <w:r>
-        <w:rPr>
-          <w:rFonts w:ascii="Calibri" w:hAnsi="Calibri"/>
-          <w:b/>
-        </w:rPr>
-        <w:t xml:space="preserve">Eight jobs. </w:t>
-      </w:r>
-      <w:r>
-        <w:rPr>
-          <w:rFonts w:ascii="Calibri" w:hAnsi="Calibri"/>
-        </w:rPr>
-        <w:t>The only set of videos this book asks you to finish: who it is for, the problem in their words, the method, proof, the comparison, one objection, the deep dive, and which video to watch next. Chapters 2, 5, and 6 use this same set.</w:t>
-      </w:r>
-    </w:p>
-    <w:p>
-      <w:r>
-        <w:rPr>
-          <w:rFonts w:ascii="Calibri" w:hAnsi="Calibri"/>
-          <w:b/>
-        </w:rPr>
-        <w:t xml:space="preserve">Deep dive. </w:t>
-      </w:r>
-      <w:r>
-        <w:rPr>
-          <w:rFonts w:ascii="Calibri" w:hAnsi="Calibri"/>
-        </w:rPr>
-        <w:t>The long, complete video in the eight jobs, built to be watched for a long time. The video that fills the hour bar, and the one that can honestly pass eight minutes for mid-roll ads.</w:t>
-      </w:r>
-    </w:p>
-    <w:p>
-      <w:r>
-        <w:rPr>
-          <w:rFonts w:ascii="Calibri" w:hAnsi="Calibri"/>
-          <w:b/>
-        </w:rPr>
-        <w:t xml:space="preserve">Expanded program. </w:t>
-      </w:r>
-      <w:r>
-        <w:rPr>
-          <w:rFonts w:ascii="Calibri" w:hAnsi="Calibri"/>
-        </w:rPr>
-        <w:t>In countries where YouTube has opened it, the earlier tier of the Partner Program: 500 subscribers, three public uploads in 90 days, and either 3,000 long-form hours in a year or 3 million Shorts views in 90 days. Fan funding, Shopping, and Creator Partnerships. Not a share of watch-page ads. Unchanged by the 2027 update.</w:t>
-      </w:r>
-    </w:p>
-    <w:p>
-      <w:r>
-        <w:rPr>
-          <w:rFonts w:ascii="Calibri" w:hAnsi="Calibri"/>
-          <w:b/>
-        </w:rPr>
-        <w:t xml:space="preserve">YouTube Partner Program. </w:t>
-      </w:r>
-      <w:r>
-        <w:rPr>
-          <w:rFonts w:ascii="Calibri" w:hAnsi="Calibri"/>
-        </w:rPr>
-        <w:t>The higher gate: 1,000 subscribers and either 4,000 long-form hours in 12 months or 10 million qualified Shorts views in 90 days. For channels that apply from 1 February 2027: 8,000 hours in 365 days or 20 million Shorts views in 90 days. This is the gate that adds watch-page ads, Shorts Feed ads, and YouTube Premium revenue. Channels already in the program keep their status.</w:t>
-      </w:r>
-    </w:p>
-    <w:p>
-      <w:r>
-        <w:rPr>
-          <w:rFonts w:ascii="Calibri" w:hAnsi="Calibri"/>
-          <w:b/>
-        </w:rPr>
-        <w:t xml:space="preserve">Qualified watch hours. </w:t>
-      </w:r>
-      <w:r>
-        <w:rPr>
-          <w:rFonts w:ascii="Calibri" w:hAnsi="Calibri"/>
-        </w:rPr>
-        <w:t>Public long-form viewing that YouTube counts toward the hour bars. Hours watched in the Shorts feed do not count. Private, unlisted, deleted, and ad-campaign views do not count.</w:t>
-      </w:r>
-    </w:p>
-    <w:p>
-      <w:r>
-        <w:rPr>
-          <w:rFonts w:ascii="Calibri" w:hAnsi="Calibri"/>
-          <w:b/>
-        </w:rPr>
-        <w:t xml:space="preserve">Qualified Shorts views. </w:t>
-      </w:r>
-      <w:r>
-        <w:rPr>
-          <w:rFonts w:ascii="Calibri" w:hAnsi="Calibri"/>
-        </w:rPr>
-        <w:t>Public views of Shorts in the Shorts feed that YouTube counts toward the Shorts bars: 3 million in 90 days for the expanded program, or 10 million in 90 days for the Partner Program (20 million for channels applying from 1 February 2027). They do not fill the long-form hour bars.</w:t>
-      </w:r>
-    </w:p>
-    <w:p>
-      <w:r>
-        <w:rPr>
-          <w:rFonts w:ascii="Calibri" w:hAnsi="Calibri"/>
-          <w:b/>
-        </w:rPr>
-        <w:t xml:space="preserve">Follow-on views. </w:t>
-      </w:r>
-      <w:r>
-        <w:rPr>
-          <w:rFonts w:ascii="Calibri" w:hAnsi="Calibri"/>
-        </w:rPr>
-        <w:t>Organic views from people who watch more of your videos after seeing a promoted one. The only part of a paid campaign that counts toward the Partner Program.</w:t>
-      </w:r>
-    </w:p>
-    <w:p>
-      <w:r>
-        <w:rPr>
-          <w:rFonts w:ascii="Calibri" w:hAnsi="Calibri"/>
-          <w:b/>
-        </w:rPr>
-        <w:t xml:space="preserve">Advanced features. </w:t>
-      </w:r>
-      <w:r>
-        <w:rPr>
-          <w:rFonts w:ascii="Calibri" w:hAnsi="Calibri"/>
-        </w:rPr>
-        <w:t>The Studio status that makes an address in a long-form description, and in a long-form comment, clickable. Phone verification comes first. A Short’s description and comments stay unclickable after it is on. The Partner Program requires it.</w:t>
-      </w:r>
-    </w:p>
-    <w:p>
-      <w:r>
-        <w:rPr>
-          <w:rFonts w:ascii="Calibri" w:hAnsi="Calibri"/>
-          <w:b/>
-        </w:rPr>
-        <w:t xml:space="preserve">AdSense. </w:t>
-      </w:r>
-      <w:r>
-        <w:rPr>
-          <w:rFonts w:ascii="Calibri" w:hAnsi="Calibri"/>
-        </w:rPr>
-        <w:t>AdSense for YouTube, the Google account YouTube uses to pay a channel it has accepted. Meeting a subscriber number does not open it. You apply, and YouTube reviews the channel.</w:t>
-      </w:r>
-    </w:p>
-    <w:p>
-      <w:r>
-        <w:rPr>
-          <w:rFonts w:ascii="Calibri" w:hAnsi="Calibri"/>
-          <w:b/>
-        </w:rPr>
-        <w:t xml:space="preserve">Modules. </w:t>
-      </w:r>
-      <w:r>
-        <w:rPr>
-          <w:rFonts w:ascii="Calibri" w:hAnsi="Calibri"/>
-        </w:rPr>
-        <w:t>The separate sets of terms you accept in Studio’s Earn tab once inside the program: Watch Page Monetization for long-form ads and Premium, Shorts Monetization for the Shorts feed, and the Commerce Product Module for fan funding.</w:t>
-      </w:r>
-    </w:p>
-    <w:p>
-      <w:r>
-        <w:rPr>
-          <w:rFonts w:ascii="Calibri" w:hAnsi="Calibri"/>
-          <w:b/>
-        </w:rPr>
-        <w:t xml:space="preserve">CPM. </w:t>
-      </w:r>
-      <w:r>
-        <w:rPr>
-          <w:rFonts w:ascii="Calibri" w:hAnsi="Calibri"/>
-        </w:rPr>
-        <w:t>What advertisers paid per 1,000 ad impressions on your videos, before YouTube’s share. Ads and Premium only, monetized views only.</w:t>
-      </w:r>
-    </w:p>
-    <w:p>
-      <w:r>
-        <w:rPr>
-          <w:rFonts w:ascii="Calibri" w:hAnsi="Calibri"/>
-          <w:b/>
-        </w:rPr>
-        <w:t xml:space="preserve">Playback-based CPM. </w:t>
-      </w:r>
-      <w:r>
-        <w:rPr>
-          <w:rFonts w:ascii="Calibri" w:hAnsi="Calibri"/>
-        </w:rPr>
-        <w:t>What advertisers paid per 1,000 playbacks that showed at least one ad. Often higher than CPM, because one playback can carry two ads.</w:t>
-      </w:r>
-    </w:p>
-    <w:p>
-      <w:r>
-        <w:rPr>
-          <w:rFonts w:ascii="Calibri" w:hAnsi="Calibri"/>
-          <w:b/>
-        </w:rPr>
-        <w:t xml:space="preserve">RPM. </w:t>
-      </w:r>
-      <w:r>
-        <w:rPr>
-          <w:rFonts w:ascii="Calibri" w:hAnsi="Calibri"/>
-        </w:rPr>
-        <w:t>Your total revenue after YouTube’s share, per 1,000 engaged views, including views with no ad. Includes ads, Premium, memberships, Super Chat, and Super Stickers. Usually lower than CPM.</w:t>
-      </w:r>
-    </w:p>
-    <w:p>
-      <w:r>
-        <w:rPr>
-          <w:rFonts w:ascii="Calibri" w:hAnsi="Calibri"/>
-          <w:b/>
-        </w:rPr>
-        <w:t xml:space="preserve">Mid-roll. </w:t>
-      </w:r>
-      <w:r>
-        <w:rPr>
-          <w:rFonts w:ascii="Calibri" w:hAnsi="Calibri"/>
-        </w:rPr>
-        <w:t>An ad break during a video. Available on monetized videos eight minutes or longer, placed automatically, by hand, or both. Breaks at natural pauses are more likely to serve an ad.</w:t>
-      </w:r>
-    </w:p>
-    <w:p>
-      <w:r>
-        <w:rPr>
-          <w:rFonts w:ascii="Calibri" w:hAnsi="Calibri"/>
-          <w:b/>
-        </w:rPr>
-        <w:t xml:space="preserve">Limited ads. </w:t>
-      </w:r>
-      <w:r>
-        <w:rPr>
-          <w:rFonts w:ascii="Calibri" w:hAnsi="Calibri"/>
-        </w:rPr>
-        <w:t>The monetization status of a video that does not fully meet the advertiser-friendly guidelines: fewer advertisers, or none. Not a strike. You can request a human review.</w:t>
-      </w:r>
-    </w:p>
-    <w:p>
-      <w:r>
-        <w:rPr>
-          <w:rFonts w:ascii="Calibri" w:hAnsi="Calibri"/>
-          <w:b/>
-        </w:rPr>
-        <w:t xml:space="preserve">Shorts Creator Pool. </w:t>
-      </w:r>
-      <w:r>
-        <w:rPr>
-          <w:rFonts w:ascii="Calibri" w:hAnsi="Calibri"/>
-        </w:rPr>
-        <w:t>The monthly pot of Shorts Feed ad revenue that YouTube shares out by each monetizing channel’s share of engaged Shorts views, after a share for music licensing. The channel keeps 45% of its allocation. From 1 February 2027, a month counts only if the channel had 10 million qualified Shorts views in the previous 90 days.</w:t>
-      </w:r>
-    </w:p>
-    <w:p>
-      <w:r>
-        <w:rPr>
-          <w:rFonts w:ascii="Calibri" w:hAnsi="Calibri"/>
-          <w:b/>
-        </w:rPr>
-        <w:t xml:space="preserve">YouTube Premium revenue. </w:t>
-      </w:r>
-      <w:r>
-        <w:rPr>
-          <w:rFonts w:ascii="Calibri" w:hAnsi="Calibri"/>
-        </w:rPr>
-        <w:t>A share of Premium and Premium Lite subscription fees, pooled and paid by members’ watch time and views: 55% for long-form, 45% for Shorts, of the pool allocated to creators.</w:t>
-      </w:r>
-    </w:p>
-    <w:p>
-      <w:r>
-        <w:rPr>
-          <w:rFonts w:ascii="Calibri" w:hAnsi="Calibri"/>
-          <w:b/>
-        </w:rPr>
-        <w:t xml:space="preserve">Channel memberships. </w:t>
-      </w:r>
-      <w:r>
-        <w:rPr>
-          <w:rFonts w:ascii="Calibri" w:hAnsi="Calibri"/>
-        </w:rPr>
-        <w:t>Monthly payments from viewers for perks you choose, in up to six levels. The channel receives 70% after taxes and fees. Downloads of YouTube content, in-person one-to-one meetings, and random prizes are not allowed as perks.</w:t>
-      </w:r>
-    </w:p>
-    <w:p>
-      <w:r>
-        <w:rPr>
-          <w:rFonts w:ascii="Calibri" w:hAnsi="Calibri"/>
-          <w:b/>
-        </w:rPr>
-        <w:t xml:space="preserve">Super Chat and Super Stickers. </w:t>
-      </w:r>
-      <w:r>
-        <w:rPr>
-          <w:rFonts w:ascii="Calibri" w:hAnsi="Calibri"/>
-        </w:rPr>
-        <w:t>Paid, highlighted messages and animated stickers in the live chat of a live stream or premiere. The channel receives 70% after taxes and fees. YouTube says they are not donation tools.</w:t>
-      </w:r>
-    </w:p>
-    <w:p>
-      <w:r>
-        <w:rPr>
-          <w:rFonts w:ascii="Calibri" w:hAnsi="Calibri"/>
-          <w:b/>
-        </w:rPr>
-        <w:t xml:space="preserve">Super Thanks. </w:t>
-      </w:r>
-      <w:r>
-        <w:rPr>
-          <w:rFonts w:ascii="Calibri" w:hAnsi="Calibri"/>
-        </w:rPr>
-        <w:t>A one-time paid animation and highlighted comment on a long-form video or a Short. Not available on claimed, unlisted, made-for-kids, or comments-off videos, or while a stream is live. The channel receives 70% after taxes and fees.</w:t>
-      </w:r>
-    </w:p>
-    <w:p>
-      <w:r>
-        <w:rPr>
-          <w:rFonts w:ascii="Calibri" w:hAnsi="Calibri"/>
-          <w:b/>
-        </w:rPr>
-        <w:t xml:space="preserve">Sponsor. </w:t>
-      </w:r>
-      <w:r>
-        <w:rPr>
-          <w:rFonts w:ascii="Calibri" w:hAnsi="Calibri"/>
-        </w:rPr>
-        <w:t>One company paying you for one video or segment. Select paid promotion in Studio, say so in the video, and say so next to the link.</w:t>
-      </w:r>
-    </w:p>
-    <w:p>
-      <w:r>
-        <w:rPr>
-          <w:rFonts w:ascii="Calibri" w:hAnsi="Calibri"/>
-          <w:b/>
-        </w:rPr>
-        <w:t xml:space="preserve">Creator Partnerships. </w:t>
-      </w:r>
-      <w:r>
-        <w:rPr>
-          <w:rFonts w:ascii="Calibri" w:hAnsi="Calibri"/>
-        </w:rPr>
-        <w:t>YouTube’s matching tool between brands and creators. Open to channels in the Partner Program, 18 or older, in available countries, with no active Community Guidelines strikes.</w:t>
-      </w:r>
-    </w:p>
-    <w:p>
-      <w:r>
-        <w:rPr>
-          <w:rFonts w:ascii="Calibri" w:hAnsi="Calibri"/>
-          <w:b/>
-        </w:rPr>
-        <w:t xml:space="preserve">Affiliate link. </w:t>
-      </w:r>
-      <w:r>
-        <w:rPr>
-          <w:rFonts w:ascii="Calibri" w:hAnsi="Calibri"/>
-        </w:rPr>
-        <w:t>A link that pays you a commission if the viewer buys a product you recommended. Say so next to the link. The FTC pages in the sources list are the US disclosure guidance this book points at.</w:t>
-      </w:r>
-    </w:p>
-    <w:p>
-      <w:r>
-        <w:rPr>
-          <w:rFonts w:ascii="Calibri" w:hAnsi="Calibri"/>
-          <w:b/>
-        </w:rPr>
-        <w:t xml:space="preserve">Shopping affiliate program. </w:t>
-      </w:r>
-      <w:r>
-        <w:rPr>
-          <w:rFonts w:ascii="Calibri" w:hAnsi="Calibri"/>
-        </w:rPr>
-        <w:t>YouTube’s own affiliate program for tagging other brands’ products in Shorts, long videos, and live streams. Open to partners with at least 500 subscribers in listed countries since March 2026.</w:t>
-      </w:r>
-    </w:p>
-    <w:p>
-      <w:r>
-        <w:rPr>
-          <w:rFonts w:ascii="Calibri" w:hAnsi="Calibri"/>
-          <w:b/>
-        </w:rPr>
-        <w:t xml:space="preserve">Inauthentic content. </w:t>
-      </w:r>
-      <w:r>
-        <w:rPr>
-          <w:rFonts w:ascii="Calibri" w:hAnsi="Calibri"/>
-        </w:rPr>
-        <w:t>YouTube’s monetization name, since July 2025, for templated, repetitive, or mass-produced videos, including generic AI-made ones. It can keep a whole channel out of the Partner Program.</w:t>
-      </w:r>
-    </w:p>
-    <w:p>
-      <w:r>
-        <w:rPr>
-          <w:rFonts w:ascii="Calibri" w:hAnsi="Calibri"/>
-          <w:b/>
-        </w:rPr>
-        <w:t xml:space="preserve">Reused content. </w:t>
-      </w:r>
-      <w:r>
-        <w:rPr>
-          <w:rFonts w:ascii="Calibri" w:hAnsi="Calibri"/>
-        </w:rPr>
-        <w:t>Someone else’s material republished without significant original commentary, modification, or educational value. A monetization policy that applies to the whole channel.</w:t>
-      </w:r>
-    </w:p>
-    <w:p>
-      <w:r>
-        <w:rPr>
-          <w:rFonts w:ascii="Calibri" w:hAnsi="Calibri"/>
-          <w:b/>
-        </w:rPr>
-        <w:t xml:space="preserve">End screen. </w:t>
-      </w:r>
-      <w:r>
-        <w:rPr>
-          <w:rFonts w:ascii="Calibri" w:hAnsi="Calibri"/>
-        </w:rPr>
-        <w:t>An element in the last 5 to 20 seconds of a video at least 25 seconds long. One that opens a site outside YouTube requires the Partner Program.</w:t>
-      </w:r>
-    </w:p>
-    <w:p>
-      <w:r>
-        <w:rPr>
-          <w:rFonts w:ascii="Calibri" w:hAnsi="Calibri"/>
-          <w:b/>
-        </w:rPr>
-        <w:t xml:space="preserve">Info card. </w:t>
-      </w:r>
-      <w:r>
-        <w:rPr>
-          <w:rFonts w:ascii="Calibri" w:hAnsi="Calibri"/>
-        </w:rPr>
-        <w:t>A small panel attached to the video. One that opens a site outside YouTube also requires the Partner Program.</w:t>
-      </w:r>
-    </w:p>
-    <w:p>
-      <w:r>
-        <w:rPr>
-          <w:rFonts w:ascii="Calibri" w:hAnsi="Calibri"/>
-          <w:b/>
-        </w:rPr>
-        <w:t xml:space="preserve">Series playlist. </w:t>
-      </w:r>
-      <w:r>
-        <w:rPr>
-          <w:rFonts w:ascii="Calibri" w:hAnsi="Calibri"/>
-        </w:rPr>
-        <w:t>A playlist YouTube can feature as the next video while someone is watching one of yours. The account has to be verified, the videos have to be yours, and a video can sit in only one series playlist.</w:t>
-      </w:r>
-    </w:p>
-    <w:p>
-      <w:r>
-        <w:rPr>
-          <w:rFonts w:ascii="Calibri" w:hAnsi="Calibri"/>
-          <w:b/>
-        </w:rPr>
-        <w:t xml:space="preserve">Short. </w:t>
-      </w:r>
-      <w:r>
-        <w:rPr>
-          <w:rFonts w:ascii="Calibri" w:hAnsi="Calibri"/>
-        </w:rPr>
-        <w:t>A vertical video, 1080 by 1920. An address in a Short’s description or comments is not clickable. A Short can point at a long video.</w:t>
-      </w:r>
-    </w:p>
-    <w:p>
-      <w:r>
-        <w:rPr>
-          <w:rFonts w:ascii="Calibri" w:hAnsi="Calibri"/>
-          <w:b/>
-        </w:rPr>
-        <w:t xml:space="preserve">H.264. </w:t>
-      </w:r>
-      <w:r>
-        <w:rPr>
-          <w:rFonts w:ascii="Calibri" w:hAnsi="Calibri"/>
-        </w:rPr>
-        <w:t>The video codec named in YouTube’s recommended upload settings for an MP4. The audio codec named beside it is AAC-LC.</w:t>
-      </w:r>
-    </w:p>
-    <w:p>
-      <w:r>
-        <w:rPr>
-          <w:rFonts w:ascii="Calibri" w:hAnsi="Calibri"/>
-          <w:b/>
-        </w:rPr>
-        <w:t xml:space="preserve">Closed captions. </w:t>
-      </w:r>
-      <w:r>
-        <w:rPr>
-          <w:rFonts w:ascii="Calibri" w:hAnsi="Calibri"/>
-        </w:rPr>
-        <w:t>A text track the viewer can turn on or off. The words can be searched. They are not burned into the picture.</w:t>
-      </w:r>
-    </w:p>
-    <w:p>
-      <w:r>
-        <w:rPr>
-          <w:rFonts w:ascii="Calibri" w:hAnsi="Calibri"/>
-          <w:b/>
-        </w:rPr>
-        <w:t xml:space="preserve">Burned-in captions. </w:t>
-      </w:r>
-      <w:r>
-        <w:rPr>
-          <w:rFonts w:ascii="Calibri" w:hAnsi="Calibri"/>
-        </w:rPr>
-        <w:t>Words that are part of the picture. They stay on. They are a different choice from closed captions.</w:t>
-      </w:r>
-    </w:p>
-    <w:p>
-      <w:r>
-        <w:rPr>
-          <w:rFonts w:ascii="Calibri" w:hAnsi="Calibri"/>
-          <w:b/>
-        </w:rPr>
-        <w:t xml:space="preserve">Fader. </w:t>
-      </w:r>
-      <w:r>
-        <w:rPr>
-          <w:rFonts w:ascii="Calibri" w:hAnsi="Calibri"/>
-        </w:rPr>
-        <w:t>The volume slider in an editor. A music fader at about a tenth to a fifth of the way up is a position on that slider, not a measurement of loudness.</w:t>
-      </w:r>
-    </w:p>
-    <w:p>
-      <w:r>
-        <w:rPr>
-          <w:rFonts w:ascii="Calibri" w:hAnsi="Calibri"/>
-          <w:b/>
-        </w:rPr>
-        <w:t xml:space="preserve">Text-to-speech. </w:t>
-      </w:r>
-      <w:r>
-        <w:rPr>
-          <w:rFonts w:ascii="Calibri" w:hAnsi="Calibri"/>
-        </w:rPr>
-        <w:t>A tool that reads a script aloud. Usable when the voice is not a clone of someone else. Cloning someone else’s voice is a consent question the tool does not answer for you.</w:t>
-      </w:r>
-    </w:p>
-    <w:p>
-      <w:r>
-        <w:rPr>
-          <w:rFonts w:ascii="Calibri" w:hAnsi="Calibri"/>
-          <w:b/>
-        </w:rPr>
-        <w:t xml:space="preserve">Stock license. </w:t>
-      </w:r>
-      <w:r>
-        <w:rPr>
-          <w:rFonts w:ascii="Calibri" w:hAnsi="Calibri"/>
-        </w:rPr>
-        <w:t>The terms on one clip or track. “Free” and “free to use commercially” are different sentences. Read the line on that file before you publish it, including on a second site.</w:t>
-      </w:r>
-    </w:p>
-    <w:p>
-      <w:r>
-        <w:rPr>
-          <w:rFonts w:ascii="Calibri" w:hAnsi="Calibri"/>
-          <w:b/>
-        </w:rPr>
-        <w:t xml:space="preserve">Impression. </w:t>
-      </w:r>
-      <w:r>
-        <w:rPr>
-          <w:rFonts w:ascii="Calibri" w:hAnsi="Calibri"/>
-        </w:rPr>
-        <w:t>In Studio, a thumbnail shown on YouTube for more than one second with at least half of it visible. Thumbnails on other websites, in end screens, and in notifications are not counted.</w:t>
-      </w:r>
-    </w:p>
-    <w:p>
-      <w:r>
-        <w:rPr>
-          <w:rFonts w:ascii="Calibri" w:hAnsi="Calibri"/>
-          <w:b/>
-        </w:rPr>
-        <w:t xml:space="preserve">Impressions click-through rate. </w:t>
-      </w:r>
-      <w:r>
-        <w:rPr>
-          <w:rFonts w:ascii="Calibri" w:hAnsi="Calibri"/>
-        </w:rPr>
-        <w:t>How often a counted impression became a view. YouTube says half of channels and videos fall between 2% and 10%. It is a band, not a target.</w:t>
-      </w:r>
-    </w:p>
-    <w:p>
-      <w:r>
-        <w:rPr>
-          <w:rFonts w:ascii="Calibri" w:hAnsi="Calibri"/>
-          <w:b/>
-        </w:rPr>
-        <w:t xml:space="preserve">Traffic source. </w:t>
-      </w:r>
-      <w:r>
-        <w:rPr>
-          <w:rFonts w:ascii="Calibri" w:hAnsi="Calibri"/>
-        </w:rPr>
-        <w:t>Studio’s label for how a viewer reached a video: search, suggested videos, browse features, playlists, external, and others. Views from links in video descriptions are filed under suggested videos.</w:t>
-      </w:r>
-    </w:p>
-    <w:p>
-      <w:r>
-        <w:rPr>
-          <w:rFonts w:ascii="Calibri" w:hAnsi="Calibri"/>
-          <w:b/>
-        </w:rPr>
-        <w:t xml:space="preserve">Video chapters. </w:t>
-      </w:r>
-      <w:r>
-        <w:rPr>
-          <w:rFonts w:ascii="Calibri" w:hAnsi="Calibri"/>
-        </w:rPr>
-        <w:t>Timestamps in the description that split a video into named parts. The first is 00:00, there are at least three, and each part is at least ten seconds.</w:t>
-      </w:r>
-    </w:p>
-    <w:p>
-      <w:r>
-        <w:rPr>
-          <w:rFonts w:ascii="Calibri" w:hAnsi="Calibri"/>
-          <w:b/>
-        </w:rPr>
-        <w:t xml:space="preserve">Community Guidelines warning. </w:t>
-      </w:r>
-      <w:r>
-        <w:rPr>
-          <w:rFonts w:ascii="Calibri" w:hAnsi="Calibri"/>
-        </w:rPr>
-        <w:t>What a first violation typically gets. An optional policy training lets it expire 90 days after the training. A further violation of the same policy in that window can become a strike.</w:t>
-      </w:r>
-    </w:p>
-    <w:p>
-      <w:r>
-        <w:rPr>
-          <w:rFonts w:ascii="Calibri" w:hAnsi="Calibri"/>
-          <w:b/>
-        </w:rPr>
-        <w:t xml:space="preserve">Copyright strike. </w:t>
-      </w:r>
-      <w:r>
-        <w:rPr>
-          <w:rFonts w:ascii="Calibri" w:hAnsi="Calibri"/>
-        </w:rPr>
-        <w:t>The result of a valid legal removal request. The video comes down. It expires 90 days after it was applied once Copyright School is done, or it can be resolved by a retraction or a counter notification.</w:t>
-      </w:r>
-    </w:p>
-    <w:p>
-      <w:r>
-        <w:rPr>
-          <w:rFonts w:ascii="Calibri" w:hAnsi="Calibri"/>
-          <w:b/>
-        </w:rPr>
-        <w:t xml:space="preserve">Content ID claim. </w:t>
-      </w:r>
-      <w:r>
-        <w:rPr>
-          <w:rFonts w:ascii="Calibri" w:hAnsi="Calibri"/>
-        </w:rPr>
-        <w:t>An automatic match against a rights holder’s file. It affects that video: monetize, track, or block. It is not a strike, unless a dispute without a valid reason leads to a removal request.</w:t>
-      </w:r>
-    </w:p>
-    <w:p>
-      <w:r>
-        <w:rPr>
-          <w:rFonts w:ascii="Calibri" w:hAnsi="Calibri"/>
-          <w:b/>
-        </w:rPr>
-        <w:t xml:space="preserve">Paid promotion setting. </w:t>
-      </w:r>
-      <w:r>
-        <w:rPr>
-          <w:rFonts w:ascii="Calibri" w:hAnsi="Calibri"/>
-        </w:rPr>
-        <w:t>The option in video details you select when a company paid you or gave you the product for a video. YouTube then shows a disclosure. Say it in the video as well.</w:t>
-      </w:r>
-    </w:p>
-    <w:p>
-      <w:r>
-        <w:rPr>
-          <w:rFonts w:ascii="Calibri" w:hAnsi="Calibri"/>
-          <w:b/>
-        </w:rPr>
-        <w:t xml:space="preserve">AI use. </w:t>
-      </w:r>
-      <w:r>
-        <w:rPr>
-          <w:rFonts w:ascii="Calibri" w:hAnsi="Calibri"/>
-        </w:rPr>
-        <w:t>The upload setting for realistic content that generative AI made or meaningfully altered, including AI-generated music that is the main focus of the video. Scripts, ideas, captions, thumbnails, and a clone of your own voice for voice-overs do not need it.</w:t>
-      </w:r>
-    </w:p>
-    <w:p>
-      <w:r>
-        <w:rPr>
-          <w:rFonts w:ascii="Calibri" w:hAnsi="Calibri"/>
-          <w:b/>
-        </w:rPr>
-        <w:t xml:space="preserve">Made for kids. </w:t>
-      </w:r>
-      <w:r>
-        <w:rPr>
-          <w:rFonts w:ascii="Calibri" w:hAnsi="Calibri"/>
-        </w:rPr>
-        <w:t>The audience setting for videos directed to children, required under US law. It turns off comments, end screens, personalized ads, memberships, Supers, and more on those videos.</w:t>
+        <w:t>The last word</w:t>
+      </w:r>
+      <w:bookmarkEnd w:id="139"/>
+    </w:p>
+    <w:p>
+      <w:r>
+        <w:rPr>
+          <w:rFonts w:ascii="Calibri" w:hAnsi="Calibri"/>
+        </w:rPr>
+        <w:t>The channel in this book does not start with money. It starts with one viewer and a question they would type, and it earns the right to be paid one finished minute at a time: a title that names the problem, an opening that keeps the promise, a method given away, a next video named inside the last one.</w:t>
+      </w:r>
+    </w:p>
+    <w:p>
+      <w:r>
+        <w:rPr>
+          <w:rFonts w:ascii="Calibri" w:hAnsi="Calibri"/>
+        </w:rPr>
+        <w:t>The gates are arithmetic. Subscribers, plus hours or Shorts views, inside a window that rolls. Once you can work out how many views a day your channel needs at its own view duration, the gate stops being a mystery and becomes a distance, and chapter 4’s work on the opening becomes the cheapest way to shorten it.</w:t>
+      </w:r>
+    </w:p>
+    <w:p>
+      <w:r>
+        <w:rPr>
+          <w:rFonts w:ascii="Calibri" w:hAnsi="Calibri"/>
+        </w:rPr>
+        <w:t>Past the gate, the money comes in five kinds, and each one pays for something different. Ads pay for reach. Memberships pay for loyalty. Supers pay for presence. Sponsors pay for a precise viewer. Affiliate commissions pay for recommendations people act on. A channel that keeps all five small and honest survives the next rule change. A channel that bets on one does not.</w:t>
+      </w:r>
+    </w:p>
+    <w:p>
+      <w:r>
+        <w:rPr>
+          <w:rFonts w:ascii="Calibri" w:hAnsi="Calibri"/>
+        </w:rPr>
+        <w:t>The numbers will move again before the next edition of this book. Check the Earn tab, read the help page, write the date in the decision log. Then make the next video for the same person you named on the first page.</w:t>
       </w:r>
     </w:p>
     <w:p>
@@ -23442,6 +22771,727 @@
         <w:sectPr>
           <w:headerReference w:type="default" r:id="rId140"/>
           <w:footerReference w:type="default" r:id="rId141"/>
+          <w:pgSz w:w="10080" w:h="14400"/>
+          <w:pgMar w:top="1008" w:right="1008" w:bottom="1008" w:left="1008" w:header="504" w:footer="504" w:gutter="0"/>
+          <w:cols w:space="720"/>
+          <w:titlePg/>
+          <w:docGrid w:linePitch="360"/>
+        </w:sectPr>
+      </w:pPr>
+    </w:p>
+    <w:p>
+      <w:bookmarkStart w:id="140" w:name="toc139"/>
+      <w:pPr>
+        <w:pStyle w:val="Heading1"/>
+      </w:pPr>
+      <w:r>
+        <w:t>Glossary</w:t>
+      </w:r>
+      <w:bookmarkEnd w:id="140"/>
+    </w:p>
+    <w:p>
+      <w:r>
+        <w:rPr>
+          <w:rFonts w:ascii="Calibri" w:hAnsi="Calibri"/>
+        </w:rPr>
+        <w:t>Short definitions for terms this book uses. A definition here is not a substitute for the platform page cited in the chapter.</w:t>
+      </w:r>
+    </w:p>
+    <w:p>
+      <w:r>
+        <w:rPr>
+          <w:rFonts w:ascii="Calibri" w:hAnsi="Calibri"/>
+          <w:b/>
+        </w:rPr>
+        <w:t xml:space="preserve">Eight jobs. </w:t>
+      </w:r>
+      <w:r>
+        <w:rPr>
+          <w:rFonts w:ascii="Calibri" w:hAnsi="Calibri"/>
+        </w:rPr>
+        <w:t>The only set of videos this book asks you to finish: who it is for, the problem in their words, the method, proof, the comparison, one objection, the deep dive, and which video to watch next. Chapters 2, 5, and 6 use this same set.</w:t>
+      </w:r>
+    </w:p>
+    <w:p>
+      <w:r>
+        <w:rPr>
+          <w:rFonts w:ascii="Calibri" w:hAnsi="Calibri"/>
+          <w:b/>
+        </w:rPr>
+        <w:t xml:space="preserve">Deep dive. </w:t>
+      </w:r>
+      <w:r>
+        <w:rPr>
+          <w:rFonts w:ascii="Calibri" w:hAnsi="Calibri"/>
+        </w:rPr>
+        <w:t>The long, complete video in the eight jobs, built to be watched for a long time. The video that fills the hour bar, and the one that can honestly pass eight minutes for mid-roll ads.</w:t>
+      </w:r>
+    </w:p>
+    <w:p>
+      <w:r>
+        <w:rPr>
+          <w:rFonts w:ascii="Calibri" w:hAnsi="Calibri"/>
+          <w:b/>
+        </w:rPr>
+        <w:t xml:space="preserve">Expanded program. </w:t>
+      </w:r>
+      <w:r>
+        <w:rPr>
+          <w:rFonts w:ascii="Calibri" w:hAnsi="Calibri"/>
+        </w:rPr>
+        <w:t>In countries where YouTube has opened it, the earlier tier of the Partner Program: 500 subscribers, three public uploads in 90 days, and either 3,000 long-form hours in a year or 3 million Shorts views in 90 days. Fan funding, Shopping, and Creator Partnerships. Not a share of watch-page ads. Unchanged by the 2027 update.</w:t>
+      </w:r>
+    </w:p>
+    <w:p>
+      <w:r>
+        <w:rPr>
+          <w:rFonts w:ascii="Calibri" w:hAnsi="Calibri"/>
+          <w:b/>
+        </w:rPr>
+        <w:t xml:space="preserve">YouTube Partner Program. </w:t>
+      </w:r>
+      <w:r>
+        <w:rPr>
+          <w:rFonts w:ascii="Calibri" w:hAnsi="Calibri"/>
+        </w:rPr>
+        <w:t>The higher gate: 1,000 subscribers and either 4,000 long-form hours in 12 months or 10 million qualified Shorts views in 90 days. For channels that apply from 1 February 2027: 8,000 hours in 365 days or 20 million Shorts views in 90 days. This is the gate that adds watch-page ads, Shorts Feed ads, and YouTube Premium revenue. Channels already in the program keep their status.</w:t>
+      </w:r>
+    </w:p>
+    <w:p>
+      <w:r>
+        <w:rPr>
+          <w:rFonts w:ascii="Calibri" w:hAnsi="Calibri"/>
+          <w:b/>
+        </w:rPr>
+        <w:t xml:space="preserve">Qualified watch hours. </w:t>
+      </w:r>
+      <w:r>
+        <w:rPr>
+          <w:rFonts w:ascii="Calibri" w:hAnsi="Calibri"/>
+        </w:rPr>
+        <w:t>Public long-form viewing that YouTube counts toward the hour bars. Hours watched in the Shorts feed do not count. Private, unlisted, deleted, and ad-campaign views do not count.</w:t>
+      </w:r>
+    </w:p>
+    <w:p>
+      <w:r>
+        <w:rPr>
+          <w:rFonts w:ascii="Calibri" w:hAnsi="Calibri"/>
+          <w:b/>
+        </w:rPr>
+        <w:t xml:space="preserve">Qualified Shorts views. </w:t>
+      </w:r>
+      <w:r>
+        <w:rPr>
+          <w:rFonts w:ascii="Calibri" w:hAnsi="Calibri"/>
+        </w:rPr>
+        <w:t>Public views of Shorts in the Shorts feed that YouTube counts toward the Shorts bars: 3 million in 90 days for the expanded program, or 10 million in 90 days for the Partner Program (20 million for channels applying from 1 February 2027). They do not fill the long-form hour bars.</w:t>
+      </w:r>
+    </w:p>
+    <w:p>
+      <w:r>
+        <w:rPr>
+          <w:rFonts w:ascii="Calibri" w:hAnsi="Calibri"/>
+          <w:b/>
+        </w:rPr>
+        <w:t xml:space="preserve">Follow-on views. </w:t>
+      </w:r>
+      <w:r>
+        <w:rPr>
+          <w:rFonts w:ascii="Calibri" w:hAnsi="Calibri"/>
+        </w:rPr>
+        <w:t>Organic views from people who watch more of your videos after seeing a promoted one. The only part of a paid campaign that counts toward the Partner Program.</w:t>
+      </w:r>
+    </w:p>
+    <w:p>
+      <w:r>
+        <w:rPr>
+          <w:rFonts w:ascii="Calibri" w:hAnsi="Calibri"/>
+          <w:b/>
+        </w:rPr>
+        <w:t xml:space="preserve">Advanced features. </w:t>
+      </w:r>
+      <w:r>
+        <w:rPr>
+          <w:rFonts w:ascii="Calibri" w:hAnsi="Calibri"/>
+        </w:rPr>
+        <w:t>The Studio status that makes an address in a long-form description, and in a long-form comment, clickable. Phone verification comes first. A Short’s description and comments stay unclickable after it is on. The Partner Program requires it.</w:t>
+      </w:r>
+    </w:p>
+    <w:p>
+      <w:r>
+        <w:rPr>
+          <w:rFonts w:ascii="Calibri" w:hAnsi="Calibri"/>
+          <w:b/>
+        </w:rPr>
+        <w:t xml:space="preserve">AdSense. </w:t>
+      </w:r>
+      <w:r>
+        <w:rPr>
+          <w:rFonts w:ascii="Calibri" w:hAnsi="Calibri"/>
+        </w:rPr>
+        <w:t>AdSense for YouTube, the Google account YouTube uses to pay a channel it has accepted. Meeting a subscriber number does not open it. You apply, and YouTube reviews the channel.</w:t>
+      </w:r>
+    </w:p>
+    <w:p>
+      <w:r>
+        <w:rPr>
+          <w:rFonts w:ascii="Calibri" w:hAnsi="Calibri"/>
+          <w:b/>
+        </w:rPr>
+        <w:t xml:space="preserve">Modules. </w:t>
+      </w:r>
+      <w:r>
+        <w:rPr>
+          <w:rFonts w:ascii="Calibri" w:hAnsi="Calibri"/>
+        </w:rPr>
+        <w:t>The separate sets of terms you accept in Studio’s Earn tab once inside the program: Watch Page Monetization for long-form ads and Premium, Shorts Monetization for the Shorts feed, and the Commerce Product Module for fan funding.</w:t>
+      </w:r>
+    </w:p>
+    <w:p>
+      <w:r>
+        <w:rPr>
+          <w:rFonts w:ascii="Calibri" w:hAnsi="Calibri"/>
+          <w:b/>
+        </w:rPr>
+        <w:t xml:space="preserve">CPM. </w:t>
+      </w:r>
+      <w:r>
+        <w:rPr>
+          <w:rFonts w:ascii="Calibri" w:hAnsi="Calibri"/>
+        </w:rPr>
+        <w:t>What advertisers paid per 1,000 ad impressions on your videos, before YouTube’s share. Ads and Premium only, monetized views only.</w:t>
+      </w:r>
+    </w:p>
+    <w:p>
+      <w:r>
+        <w:rPr>
+          <w:rFonts w:ascii="Calibri" w:hAnsi="Calibri"/>
+          <w:b/>
+        </w:rPr>
+        <w:t xml:space="preserve">Playback-based CPM. </w:t>
+      </w:r>
+      <w:r>
+        <w:rPr>
+          <w:rFonts w:ascii="Calibri" w:hAnsi="Calibri"/>
+        </w:rPr>
+        <w:t>What advertisers paid per 1,000 playbacks that showed at least one ad. Often higher than CPM, because one playback can carry two ads.</w:t>
+      </w:r>
+    </w:p>
+    <w:p>
+      <w:r>
+        <w:rPr>
+          <w:rFonts w:ascii="Calibri" w:hAnsi="Calibri"/>
+          <w:b/>
+        </w:rPr>
+        <w:t xml:space="preserve">RPM. </w:t>
+      </w:r>
+      <w:r>
+        <w:rPr>
+          <w:rFonts w:ascii="Calibri" w:hAnsi="Calibri"/>
+        </w:rPr>
+        <w:t>Your total revenue after YouTube’s share, per 1,000 engaged views, including views with no ad. Includes ads, Premium, memberships, Super Chat, and Super Stickers. Usually lower than CPM.</w:t>
+      </w:r>
+    </w:p>
+    <w:p>
+      <w:r>
+        <w:rPr>
+          <w:rFonts w:ascii="Calibri" w:hAnsi="Calibri"/>
+          <w:b/>
+        </w:rPr>
+        <w:t xml:space="preserve">Mid-roll. </w:t>
+      </w:r>
+      <w:r>
+        <w:rPr>
+          <w:rFonts w:ascii="Calibri" w:hAnsi="Calibri"/>
+        </w:rPr>
+        <w:t>An ad break during a video. Available on monetized videos eight minutes or longer, placed automatically, by hand, or both. Breaks at natural pauses are more likely to serve an ad.</w:t>
+      </w:r>
+    </w:p>
+    <w:p>
+      <w:r>
+        <w:rPr>
+          <w:rFonts w:ascii="Calibri" w:hAnsi="Calibri"/>
+          <w:b/>
+        </w:rPr>
+        <w:t xml:space="preserve">Limited ads. </w:t>
+      </w:r>
+      <w:r>
+        <w:rPr>
+          <w:rFonts w:ascii="Calibri" w:hAnsi="Calibri"/>
+        </w:rPr>
+        <w:t>The monetization status of a video that does not fully meet the advertiser-friendly guidelines: fewer advertisers, or none. Not a strike. You can request a human review.</w:t>
+      </w:r>
+    </w:p>
+    <w:p>
+      <w:r>
+        <w:rPr>
+          <w:rFonts w:ascii="Calibri" w:hAnsi="Calibri"/>
+          <w:b/>
+        </w:rPr>
+        <w:t xml:space="preserve">Shorts Creator Pool. </w:t>
+      </w:r>
+      <w:r>
+        <w:rPr>
+          <w:rFonts w:ascii="Calibri" w:hAnsi="Calibri"/>
+        </w:rPr>
+        <w:t>The monthly pot of Shorts Feed ad revenue that YouTube shares out by each monetizing channel’s share of engaged Shorts views, after a share for music licensing. The channel keeps 45% of its allocation. From 1 February 2027, a month counts only if the channel had 10 million qualified Shorts views in the previous 90 days.</w:t>
+      </w:r>
+    </w:p>
+    <w:p>
+      <w:r>
+        <w:rPr>
+          <w:rFonts w:ascii="Calibri" w:hAnsi="Calibri"/>
+          <w:b/>
+        </w:rPr>
+        <w:t xml:space="preserve">YouTube Premium revenue. </w:t>
+      </w:r>
+      <w:r>
+        <w:rPr>
+          <w:rFonts w:ascii="Calibri" w:hAnsi="Calibri"/>
+        </w:rPr>
+        <w:t>A share of Premium and Premium Lite subscription fees, pooled and paid by members’ watch time and views: 55% for long-form, 45% for Shorts, of the pool allocated to creators.</w:t>
+      </w:r>
+    </w:p>
+    <w:p>
+      <w:r>
+        <w:rPr>
+          <w:rFonts w:ascii="Calibri" w:hAnsi="Calibri"/>
+          <w:b/>
+        </w:rPr>
+        <w:t xml:space="preserve">Channel memberships. </w:t>
+      </w:r>
+      <w:r>
+        <w:rPr>
+          <w:rFonts w:ascii="Calibri" w:hAnsi="Calibri"/>
+        </w:rPr>
+        <w:t>Monthly payments from viewers for perks you choose, in up to six levels. The channel receives 70% after taxes and fees. Downloads of YouTube content, in-person one-to-one meetings, and random prizes are not allowed as perks.</w:t>
+      </w:r>
+    </w:p>
+    <w:p>
+      <w:r>
+        <w:rPr>
+          <w:rFonts w:ascii="Calibri" w:hAnsi="Calibri"/>
+          <w:b/>
+        </w:rPr>
+        <w:t xml:space="preserve">Super Chat and Super Stickers. </w:t>
+      </w:r>
+      <w:r>
+        <w:rPr>
+          <w:rFonts w:ascii="Calibri" w:hAnsi="Calibri"/>
+        </w:rPr>
+        <w:t>Paid, highlighted messages and animated stickers in the live chat of a live stream or premiere. The channel receives 70% after taxes and fees. YouTube says they are not donation tools.</w:t>
+      </w:r>
+    </w:p>
+    <w:p>
+      <w:r>
+        <w:rPr>
+          <w:rFonts w:ascii="Calibri" w:hAnsi="Calibri"/>
+          <w:b/>
+        </w:rPr>
+        <w:t xml:space="preserve">Super Thanks. </w:t>
+      </w:r>
+      <w:r>
+        <w:rPr>
+          <w:rFonts w:ascii="Calibri" w:hAnsi="Calibri"/>
+        </w:rPr>
+        <w:t>A one-time paid animation and highlighted comment on a long-form video or a Short. Not available on claimed, unlisted, made-for-kids, or comments-off videos, or while a stream is live. The channel receives 70% after taxes and fees.</w:t>
+      </w:r>
+    </w:p>
+    <w:p>
+      <w:r>
+        <w:rPr>
+          <w:rFonts w:ascii="Calibri" w:hAnsi="Calibri"/>
+          <w:b/>
+        </w:rPr>
+        <w:t xml:space="preserve">Sponsor. </w:t>
+      </w:r>
+      <w:r>
+        <w:rPr>
+          <w:rFonts w:ascii="Calibri" w:hAnsi="Calibri"/>
+        </w:rPr>
+        <w:t>One company paying you for one video or segment. Select paid promotion in Studio, say so in the video, and say so next to the link.</w:t>
+      </w:r>
+    </w:p>
+    <w:p>
+      <w:r>
+        <w:rPr>
+          <w:rFonts w:ascii="Calibri" w:hAnsi="Calibri"/>
+          <w:b/>
+        </w:rPr>
+        <w:t xml:space="preserve">Creator Partnerships. </w:t>
+      </w:r>
+      <w:r>
+        <w:rPr>
+          <w:rFonts w:ascii="Calibri" w:hAnsi="Calibri"/>
+        </w:rPr>
+        <w:t>YouTube’s matching tool between brands and creators. Open to channels in the Partner Program, 18 or older, in available countries, with no active Community Guidelines strikes.</w:t>
+      </w:r>
+    </w:p>
+    <w:p>
+      <w:r>
+        <w:rPr>
+          <w:rFonts w:ascii="Calibri" w:hAnsi="Calibri"/>
+          <w:b/>
+        </w:rPr>
+        <w:t xml:space="preserve">Affiliate link. </w:t>
+      </w:r>
+      <w:r>
+        <w:rPr>
+          <w:rFonts w:ascii="Calibri" w:hAnsi="Calibri"/>
+        </w:rPr>
+        <w:t>A link that pays you a commission if the viewer buys a product you recommended. Say so next to the link. The FTC pages in the sources list are the US disclosure guidance this book points at.</w:t>
+      </w:r>
+    </w:p>
+    <w:p>
+      <w:r>
+        <w:rPr>
+          <w:rFonts w:ascii="Calibri" w:hAnsi="Calibri"/>
+          <w:b/>
+        </w:rPr>
+        <w:t xml:space="preserve">Shopping affiliate program. </w:t>
+      </w:r>
+      <w:r>
+        <w:rPr>
+          <w:rFonts w:ascii="Calibri" w:hAnsi="Calibri"/>
+        </w:rPr>
+        <w:t>YouTube’s own affiliate program for tagging other brands’ products in Shorts, long videos, and live streams. Open to partners with at least 500 subscribers in listed countries since March 2026.</w:t>
+      </w:r>
+    </w:p>
+    <w:p>
+      <w:r>
+        <w:rPr>
+          <w:rFonts w:ascii="Calibri" w:hAnsi="Calibri"/>
+          <w:b/>
+        </w:rPr>
+        <w:t xml:space="preserve">Inauthentic content. </w:t>
+      </w:r>
+      <w:r>
+        <w:rPr>
+          <w:rFonts w:ascii="Calibri" w:hAnsi="Calibri"/>
+        </w:rPr>
+        <w:t>YouTube’s monetization name, since July 2025, for templated, repetitive, or mass-produced videos, including generic AI-made ones. It can keep a whole channel out of the Partner Program.</w:t>
+      </w:r>
+    </w:p>
+    <w:p>
+      <w:r>
+        <w:rPr>
+          <w:rFonts w:ascii="Calibri" w:hAnsi="Calibri"/>
+          <w:b/>
+        </w:rPr>
+        <w:t xml:space="preserve">Reused content. </w:t>
+      </w:r>
+      <w:r>
+        <w:rPr>
+          <w:rFonts w:ascii="Calibri" w:hAnsi="Calibri"/>
+        </w:rPr>
+        <w:t>Someone else’s material republished without significant original commentary, modification, or educational value. A monetization policy that applies to the whole channel.</w:t>
+      </w:r>
+    </w:p>
+    <w:p>
+      <w:r>
+        <w:rPr>
+          <w:rFonts w:ascii="Calibri" w:hAnsi="Calibri"/>
+          <w:b/>
+        </w:rPr>
+        <w:t xml:space="preserve">End screen. </w:t>
+      </w:r>
+      <w:r>
+        <w:rPr>
+          <w:rFonts w:ascii="Calibri" w:hAnsi="Calibri"/>
+        </w:rPr>
+        <w:t>An element in the last 5 to 20 seconds of a video at least 25 seconds long. One that opens a site outside YouTube requires the Partner Program.</w:t>
+      </w:r>
+    </w:p>
+    <w:p>
+      <w:r>
+        <w:rPr>
+          <w:rFonts w:ascii="Calibri" w:hAnsi="Calibri"/>
+          <w:b/>
+        </w:rPr>
+        <w:t xml:space="preserve">Info card. </w:t>
+      </w:r>
+      <w:r>
+        <w:rPr>
+          <w:rFonts w:ascii="Calibri" w:hAnsi="Calibri"/>
+        </w:rPr>
+        <w:t>A small panel attached to the video. One that opens a site outside YouTube also requires the Partner Program.</w:t>
+      </w:r>
+    </w:p>
+    <w:p>
+      <w:r>
+        <w:rPr>
+          <w:rFonts w:ascii="Calibri" w:hAnsi="Calibri"/>
+          <w:b/>
+        </w:rPr>
+        <w:t xml:space="preserve">Series playlist. </w:t>
+      </w:r>
+      <w:r>
+        <w:rPr>
+          <w:rFonts w:ascii="Calibri" w:hAnsi="Calibri"/>
+        </w:rPr>
+        <w:t>A playlist YouTube can feature as the next video while someone is watching one of yours. The account has to be verified, the videos have to be yours, and a video can sit in only one series playlist.</w:t>
+      </w:r>
+    </w:p>
+    <w:p>
+      <w:r>
+        <w:rPr>
+          <w:rFonts w:ascii="Calibri" w:hAnsi="Calibri"/>
+          <w:b/>
+        </w:rPr>
+        <w:t xml:space="preserve">Short. </w:t>
+      </w:r>
+      <w:r>
+        <w:rPr>
+          <w:rFonts w:ascii="Calibri" w:hAnsi="Calibri"/>
+        </w:rPr>
+        <w:t>A vertical video, 1080 by 1920. An address in a Short’s description or comments is not clickable. A Short can point at a long video.</w:t>
+      </w:r>
+    </w:p>
+    <w:p>
+      <w:r>
+        <w:rPr>
+          <w:rFonts w:ascii="Calibri" w:hAnsi="Calibri"/>
+          <w:b/>
+        </w:rPr>
+        <w:t xml:space="preserve">H.264. </w:t>
+      </w:r>
+      <w:r>
+        <w:rPr>
+          <w:rFonts w:ascii="Calibri" w:hAnsi="Calibri"/>
+        </w:rPr>
+        <w:t>The video codec named in YouTube’s recommended upload settings for an MP4. The audio codec named beside it is AAC-LC.</w:t>
+      </w:r>
+    </w:p>
+    <w:p>
+      <w:r>
+        <w:rPr>
+          <w:rFonts w:ascii="Calibri" w:hAnsi="Calibri"/>
+          <w:b/>
+        </w:rPr>
+        <w:t xml:space="preserve">Closed captions. </w:t>
+      </w:r>
+      <w:r>
+        <w:rPr>
+          <w:rFonts w:ascii="Calibri" w:hAnsi="Calibri"/>
+        </w:rPr>
+        <w:t>A text track the viewer can turn on or off. The words can be searched. They are not burned into the picture.</w:t>
+      </w:r>
+    </w:p>
+    <w:p>
+      <w:r>
+        <w:rPr>
+          <w:rFonts w:ascii="Calibri" w:hAnsi="Calibri"/>
+          <w:b/>
+        </w:rPr>
+        <w:t xml:space="preserve">Burned-in captions. </w:t>
+      </w:r>
+      <w:r>
+        <w:rPr>
+          <w:rFonts w:ascii="Calibri" w:hAnsi="Calibri"/>
+        </w:rPr>
+        <w:t>Words that are part of the picture. They stay on. They are a different choice from closed captions.</w:t>
+      </w:r>
+    </w:p>
+    <w:p>
+      <w:r>
+        <w:rPr>
+          <w:rFonts w:ascii="Calibri" w:hAnsi="Calibri"/>
+          <w:b/>
+        </w:rPr>
+        <w:t xml:space="preserve">Fader. </w:t>
+      </w:r>
+      <w:r>
+        <w:rPr>
+          <w:rFonts w:ascii="Calibri" w:hAnsi="Calibri"/>
+        </w:rPr>
+        <w:t>The volume slider in an editor. A music fader at about a tenth to a fifth of the way up is a position on that slider, not a measurement of loudness.</w:t>
+      </w:r>
+    </w:p>
+    <w:p>
+      <w:r>
+        <w:rPr>
+          <w:rFonts w:ascii="Calibri" w:hAnsi="Calibri"/>
+          <w:b/>
+        </w:rPr>
+        <w:t xml:space="preserve">Text-to-speech. </w:t>
+      </w:r>
+      <w:r>
+        <w:rPr>
+          <w:rFonts w:ascii="Calibri" w:hAnsi="Calibri"/>
+        </w:rPr>
+        <w:t>A tool that reads a script aloud. Usable when the voice is not a clone of someone else. Cloning someone else’s voice is a consent question the tool does not answer for you.</w:t>
+      </w:r>
+    </w:p>
+    <w:p>
+      <w:r>
+        <w:rPr>
+          <w:rFonts w:ascii="Calibri" w:hAnsi="Calibri"/>
+          <w:b/>
+        </w:rPr>
+        <w:t xml:space="preserve">Stock license. </w:t>
+      </w:r>
+      <w:r>
+        <w:rPr>
+          <w:rFonts w:ascii="Calibri" w:hAnsi="Calibri"/>
+        </w:rPr>
+        <w:t>The terms on one clip or track. “Free” and “free to use commercially” are different sentences. Read the line on that file before you publish it, including on a second site.</w:t>
+      </w:r>
+    </w:p>
+    <w:p>
+      <w:r>
+        <w:rPr>
+          <w:rFonts w:ascii="Calibri" w:hAnsi="Calibri"/>
+          <w:b/>
+        </w:rPr>
+        <w:t xml:space="preserve">Impression. </w:t>
+      </w:r>
+      <w:r>
+        <w:rPr>
+          <w:rFonts w:ascii="Calibri" w:hAnsi="Calibri"/>
+        </w:rPr>
+        <w:t>In Studio, a thumbnail shown on YouTube for more than one second with at least half of it visible. Thumbnails on other websites, in end screens, and in notifications are not counted.</w:t>
+      </w:r>
+    </w:p>
+    <w:p>
+      <w:r>
+        <w:rPr>
+          <w:rFonts w:ascii="Calibri" w:hAnsi="Calibri"/>
+          <w:b/>
+        </w:rPr>
+        <w:t xml:space="preserve">Impressions click-through rate. </w:t>
+      </w:r>
+      <w:r>
+        <w:rPr>
+          <w:rFonts w:ascii="Calibri" w:hAnsi="Calibri"/>
+        </w:rPr>
+        <w:t>How often a counted impression became a view. YouTube says half of channels and videos fall between 2% and 10%. It is a band, not a target.</w:t>
+      </w:r>
+    </w:p>
+    <w:p>
+      <w:r>
+        <w:rPr>
+          <w:rFonts w:ascii="Calibri" w:hAnsi="Calibri"/>
+          <w:b/>
+        </w:rPr>
+        <w:t xml:space="preserve">Traffic source. </w:t>
+      </w:r>
+      <w:r>
+        <w:rPr>
+          <w:rFonts w:ascii="Calibri" w:hAnsi="Calibri"/>
+        </w:rPr>
+        <w:t>Studio’s label for how a viewer reached a video: search, suggested videos, browse features, playlists, external, and others. Views from links in video descriptions are filed under suggested videos.</w:t>
+      </w:r>
+    </w:p>
+    <w:p>
+      <w:r>
+        <w:rPr>
+          <w:rFonts w:ascii="Calibri" w:hAnsi="Calibri"/>
+          <w:b/>
+        </w:rPr>
+        <w:t xml:space="preserve">Video chapters. </w:t>
+      </w:r>
+      <w:r>
+        <w:rPr>
+          <w:rFonts w:ascii="Calibri" w:hAnsi="Calibri"/>
+        </w:rPr>
+        <w:t>Timestamps in the description that split a video into named parts. The first is 00:00, there are at least three, and each part is at least ten seconds.</w:t>
+      </w:r>
+    </w:p>
+    <w:p>
+      <w:r>
+        <w:rPr>
+          <w:rFonts w:ascii="Calibri" w:hAnsi="Calibri"/>
+          <w:b/>
+        </w:rPr>
+        <w:t xml:space="preserve">Community Guidelines warning. </w:t>
+      </w:r>
+      <w:r>
+        <w:rPr>
+          <w:rFonts w:ascii="Calibri" w:hAnsi="Calibri"/>
+        </w:rPr>
+        <w:t>What a first violation typically gets. An optional policy training lets it expire 90 days after the training. A further violation of the same policy in that window can become a strike.</w:t>
+      </w:r>
+    </w:p>
+    <w:p>
+      <w:r>
+        <w:rPr>
+          <w:rFonts w:ascii="Calibri" w:hAnsi="Calibri"/>
+          <w:b/>
+        </w:rPr>
+        <w:t xml:space="preserve">Copyright strike. </w:t>
+      </w:r>
+      <w:r>
+        <w:rPr>
+          <w:rFonts w:ascii="Calibri" w:hAnsi="Calibri"/>
+        </w:rPr>
+        <w:t>The result of a valid legal removal request. The video comes down. It expires 90 days after it was applied once Copyright School is done, or it can be resolved by a retraction or a counter notification.</w:t>
+      </w:r>
+    </w:p>
+    <w:p>
+      <w:r>
+        <w:rPr>
+          <w:rFonts w:ascii="Calibri" w:hAnsi="Calibri"/>
+          <w:b/>
+        </w:rPr>
+        <w:t xml:space="preserve">Content ID claim. </w:t>
+      </w:r>
+      <w:r>
+        <w:rPr>
+          <w:rFonts w:ascii="Calibri" w:hAnsi="Calibri"/>
+        </w:rPr>
+        <w:t>An automatic match against a rights holder’s file. It affects that video: monetize, track, or block. It is not a strike, unless a dispute without a valid reason leads to a removal request.</w:t>
+      </w:r>
+    </w:p>
+    <w:p>
+      <w:r>
+        <w:rPr>
+          <w:rFonts w:ascii="Calibri" w:hAnsi="Calibri"/>
+          <w:b/>
+        </w:rPr>
+        <w:t xml:space="preserve">Paid promotion setting. </w:t>
+      </w:r>
+      <w:r>
+        <w:rPr>
+          <w:rFonts w:ascii="Calibri" w:hAnsi="Calibri"/>
+        </w:rPr>
+        <w:t>The option in video details you select when a company paid you or gave you the product for a video. YouTube then shows a disclosure. Say it in the video as well.</w:t>
+      </w:r>
+    </w:p>
+    <w:p>
+      <w:r>
+        <w:rPr>
+          <w:rFonts w:ascii="Calibri" w:hAnsi="Calibri"/>
+          <w:b/>
+        </w:rPr>
+        <w:t xml:space="preserve">AI use. </w:t>
+      </w:r>
+      <w:r>
+        <w:rPr>
+          <w:rFonts w:ascii="Calibri" w:hAnsi="Calibri"/>
+        </w:rPr>
+        <w:t>The upload setting for realistic content that generative AI made or meaningfully altered, including AI-generated music that is the main focus of the video. Scripts, ideas, captions, thumbnails, and a clone of your own voice for voice-overs do not need it.</w:t>
+      </w:r>
+    </w:p>
+    <w:p>
+      <w:r>
+        <w:rPr>
+          <w:rFonts w:ascii="Calibri" w:hAnsi="Calibri"/>
+          <w:b/>
+        </w:rPr>
+        <w:t xml:space="preserve">Made for kids. </w:t>
+      </w:r>
+      <w:r>
+        <w:rPr>
+          <w:rFonts w:ascii="Calibri" w:hAnsi="Calibri"/>
+        </w:rPr>
+        <w:t>The audience setting for videos directed to children, required under US law. It turns off comments, end screens, personalized ads, memberships, Supers, and more on those videos.</w:t>
+      </w:r>
+    </w:p>
+    <w:p>
+      <w:pPr>
+        <w:sectPr>
+          <w:headerReference w:type="default" r:id="rId142"/>
+          <w:footerReference w:type="default" r:id="rId143"/>
           <w:pgSz w:w="10080" w:h="14400"/>
           <w:pgMar w:top="1008" w:right="1008" w:bottom="1008" w:left="1008" w:header="504" w:footer="504" w:gutter="0"/>
           <w:cols w:space="720"/>
@@ -23714,7 +23764,7 @@
         </w:rPr>
         <w:t xml:space="preserve">, </w:t>
       </w:r>
-      <w:hyperlink r:id="rId124">
+      <w:hyperlink r:id="rId126">
         <w:r>
           <w:rPr>
             <w:rStyle w:val="Hyperlink"/>
@@ -23998,7 +24048,7 @@
         </w:rPr>
         <w:t xml:space="preserve">, </w:t>
       </w:r>
-      <w:hyperlink r:id="rId105">
+      <w:hyperlink r:id="rId107">
         <w:r>
           <w:rPr>
             <w:rStyle w:val="Hyperlink"/>
@@ -24014,7 +24064,7 @@
         </w:rPr>
         <w:t xml:space="preserve">, </w:t>
       </w:r>
-      <w:hyperlink r:id="rId106">
+      <w:hyperlink r:id="rId108">
         <w:r>
           <w:rPr>
             <w:rStyle w:val="Hyperlink"/>
@@ -24046,7 +24096,7 @@
         </w:rPr>
         <w:t xml:space="preserve">, </w:t>
       </w:r>
-      <w:hyperlink r:id="rId107">
+      <w:hyperlink r:id="rId109">
         <w:r>
           <w:rPr>
             <w:rStyle w:val="Hyperlink"/>
@@ -24080,7 +24130,7 @@
       </w:r>
     </w:p>
     <w:p>
-      <w:hyperlink r:id="rId110">
+      <w:hyperlink r:id="rId112">
         <w:r>
           <w:rPr>
             <w:rStyle w:val="Hyperlink"/>
@@ -24096,7 +24146,7 @@
         </w:rPr>
         <w:t xml:space="preserve">, </w:t>
       </w:r>
-      <w:hyperlink r:id="rId111">
+      <w:hyperlink r:id="rId113">
         <w:r>
           <w:rPr>
             <w:rStyle w:val="Hyperlink"/>
@@ -24112,7 +24162,7 @@
         </w:rPr>
         <w:t xml:space="preserve">, </w:t>
       </w:r>
-      <w:hyperlink r:id="rId112">
+      <w:hyperlink r:id="rId114">
         <w:r>
           <w:rPr>
             <w:rStyle w:val="Hyperlink"/>
@@ -24128,7 +24178,7 @@
         </w:rPr>
         <w:t xml:space="preserve">, </w:t>
       </w:r>
-      <w:hyperlink r:id="rId113">
+      <w:hyperlink r:id="rId115">
         <w:r>
           <w:rPr>
             <w:rStyle w:val="Hyperlink"/>
@@ -24144,7 +24194,7 @@
         </w:rPr>
         <w:t xml:space="preserve">, </w:t>
       </w:r>
-      <w:hyperlink r:id="rId115">
+      <w:hyperlink r:id="rId117">
         <w:r>
           <w:rPr>
             <w:rStyle w:val="Hyperlink"/>
@@ -24160,7 +24210,7 @@
         </w:rPr>
         <w:t xml:space="preserve">, </w:t>
       </w:r>
-      <w:hyperlink r:id="rId116">
+      <w:hyperlink r:id="rId118">
         <w:r>
           <w:rPr>
             <w:rStyle w:val="Hyperlink"/>
@@ -24176,7 +24226,7 @@
         </w:rPr>
         <w:t xml:space="preserve">, </w:t>
       </w:r>
-      <w:hyperlink r:id="rId117">
+      <w:hyperlink r:id="rId119">
         <w:r>
           <w:rPr>
             <w:rStyle w:val="Hyperlink"/>
@@ -24192,7 +24242,7 @@
         </w:rPr>
         <w:t xml:space="preserve">, </w:t>
       </w:r>
-      <w:hyperlink r:id="rId118">
+      <w:hyperlink r:id="rId120">
         <w:r>
           <w:rPr>
             <w:rStyle w:val="Hyperlink"/>
@@ -24226,7 +24276,7 @@
         </w:rPr>
         <w:t xml:space="preserve">, </w:t>
       </w:r>
-      <w:hyperlink r:id="rId125">
+      <w:hyperlink r:id="rId127">
         <w:r>
           <w:rPr>
             <w:rStyle w:val="Hyperlink"/>
@@ -24260,7 +24310,7 @@
       </w:r>
     </w:p>
     <w:p>
-      <w:hyperlink r:id="rId144">
+      <w:hyperlink r:id="rId146">
         <w:r>
           <w:rPr>
             <w:rStyle w:val="Hyperlink"/>
@@ -24276,7 +24326,7 @@
         </w:rPr>
         <w:t xml:space="preserve"> and </w:t>
       </w:r>
-      <w:hyperlink r:id="rId145">
+      <w:hyperlink r:id="rId147">
         <w:r>
           <w:rPr>
             <w:rStyle w:val="Hyperlink"/>
@@ -24292,7 +24342,7 @@
         </w:rPr>
         <w:t xml:space="preserve">. </w:t>
       </w:r>
-      <w:hyperlink r:id="rId146">
+      <w:hyperlink r:id="rId148">
         <w:r>
           <w:rPr>
             <w:rStyle w:val="Hyperlink"/>
@@ -24574,8 +24624,8 @@
     <w:p>
       <w:pPr>
         <w:sectPr>
-          <w:headerReference w:type="default" r:id="rId142"/>
-          <w:footerReference w:type="default" r:id="rId143"/>
+          <w:headerReference w:type="default" r:id="rId144"/>
+          <w:footerReference w:type="default" r:id="rId145"/>
           <w:pgSz w:w="10080" w:h="14400"/>
           <w:pgMar w:top="1008" w:right="1008" w:bottom="1008" w:left="1008" w:header="504" w:footer="504" w:gutter="0"/>
           <w:cols w:space="720"/>
@@ -25060,8 +25110,8 @@
       </w:r>
     </w:p>
     <w:sectPr>
-      <w:headerReference w:type="default" r:id="rId147"/>
-      <w:footerReference w:type="default" r:id="rId148"/>
+      <w:headerReference w:type="default" r:id="rId149"/>
+      <w:footerReference w:type="default" r:id="rId150"/>
       <w:pgSz w:w="10080" w:h="14400"/>
       <w:pgMar w:top="1008" w:right="1008" w:bottom="1008" w:left="1008" w:header="504" w:footer="504" w:gutter="0"/>
       <w:cols w:space="720"/>

</xml_diff>

<commit_message>
YouTube book: drop individual names from the Thaler v. Perlmutter mention
The AI-authorship ruling in ch10 §VII named Thaler and Perlmutter in
body prose, but neither is a YouTube creator and there's no channel to
lead with instead -- this isn't a case study, just a legal citation.
Describe the ruling without the case name in the body; keep the full
citation, names included, in Sources only, where a legal citation
needs them.

Co-Authored-By: Claude Sonnet 5 <noreply@anthropic.com>
Claude-Session: https://claude.ai/code/session_01SRhcHKTsmWne9LTaP7asUs
</commit_message>
<xml_diff>
--- a/Your First YouTube Channel That Rocks/Your First YouTube Channel That Rocks.docx
+++ b/Your First YouTube Channel That Rocks/Your First YouTube Channel That Rocks.docx
@@ -15889,20 +15889,7 @@
         <w:rPr>
           <w:rFonts w:ascii="Calibri" w:hAnsi="Calibri"/>
         </w:rPr>
-        <w:t xml:space="preserve">A disclosure settles what the viewer is told. It does not settle who owns the words. In the United States, copyright needs a human author: the U.S. Court of Appeals for the D.C. Circuit held so in </w:t>
-      </w:r>
-      <w:r>
-        <w:rPr>
-          <w:rFonts w:ascii="Calibri" w:hAnsi="Calibri"/>
-          <w:i/>
-        </w:rPr>
-        <w:t>Thaler v. Perlmutter</w:t>
-      </w:r>
-      <w:r>
-        <w:rPr>
-          <w:rFonts w:ascii="Calibri" w:hAnsi="Calibri"/>
-        </w:rPr>
-        <w:t xml:space="preserve"> in March 2025, and the Supreme Court declined to review that ruling on March 2, 2026. A tool’s terms may say a generated script is yours to use. That is permission, not ownership. A script an assistant wrote, read out word for word, is yours to perform and nobody’s to own, and another channel could reuse the same sentences. The lines you wrote yourself, and your own creative rewrites of a draft, are protected as usual, and so are the delivery, the edit, and the footage you shot. The practical rule (author recommendation): put your own explanation on the track. It is what the inauthentic-content policy in §VIII rewards, and it is the only part of a script anyone can be stopped from copying.</w:t>
+        <w:t>A disclosure settles what the viewer is told. It does not settle who owns the words. In the United States, copyright needs a human author: the U.S. Court of Appeals for the D.C. Circuit held so in March 2025, in a case over copyright for a purely AI-generated image, and the Supreme Court declined to review that ruling on March 2, 2026. A tool’s terms may say a generated script is yours to use. That is permission, not ownership. A script an assistant wrote, read out word for word, is yours to perform and nobody’s to own, and another channel could reuse the same sentences. The lines you wrote yourself, and your own creative rewrites of a draft, are protected as usual, and so are the delivery, the edit, and the footage you shot. The practical rule (author recommendation): put your own explanation on the track. It is what the inauthentic-content policy in §VIII rewards, and it is the only part of a script anyone can be stopped from copying.</w:t>
       </w:r>
     </w:p>
     <w:p>

</xml_diff>

<commit_message>
YouTube book: fix two issues introduced by the previous round of fixes
Auditing again turned up problems in my own earlier fixes rather than
new issues in the original text: the Deep Pocket Monster case study
had a redundant, overlong run-on sentence, and the Colin-and-Samir
cross-reference had leaked book-about-itself commentary into the case
study's narrative voice. Fixed both; moved the cross-reference note to
the Sources paragraph where that kind of disclosure belongs.

Co-Authored-By: Claude Sonnet 5 <noreply@anthropic.com>
Claude-Session: https://claude.ai/code/session_01SRhcHKTsmWne9LTaP7asUs
</commit_message>
<xml_diff>
--- a/Your First YouTube Channel That Rocks/Your First YouTube Channel That Rocks.docx
+++ b/Your First YouTube Channel That Rocks/Your First YouTube Channel That Rocks.docx
@@ -17362,7 +17362,7 @@
                 <w:rFonts w:ascii="Calibri" w:hAnsi="Calibri"/>
                 <w:sz w:val="22"/>
               </w:rPr>
-              <w:t>Case study: Deep Pocket Monster, a YouTube channel about opening Pokémon card packs, launched in January 2021 with no prior audience in that niche. Its creator has described reaching 100,000 subscribers within about a year and a typical range of $35,000 to $50,000 a month from ad revenue. One 2022 video sat well outside that range on its own: a pack-opening video that reached roughly 28 million views and briefly ranked third on YouTube’s trending page brought in more than $100,000 in ad revenue by itself, pushing that month past the usual run. A single collectibles video outearning what many channels make in a year in a lower-demand niche is not a trick of virality. Collectibles are a subject advertisers pay well to reach, which is the whole point of this section: the view count did not change. The audience behind it did.</w:t>
+              <w:t>Case study: Deep Pocket Monster, a YouTube channel about opening Pokémon card packs, launched in January 2021 with no prior audience in that niche. Its creator has described reaching 100,000 subscribers within about a year and a typical range of $35,000 to $50,000 a month from ad revenue. One 2022 video sat well outside that range. It reached roughly 28 million views, briefly ranked third on YouTube’s trending page, and brought in more than $100,000 in ad revenue on its own, pushing that month past the usual run. A single collectibles video outearning what many channels make in a year in a lower-demand niche is not a trick of virality. Collectibles are a subject advertisers pay well to reach, which is the whole point of this section: the view count did not change. The audience behind it did.</w:t>
             </w:r>
           </w:p>
         </w:tc>
@@ -20285,7 +20285,7 @@
                 <w:rFonts w:ascii="Calibri" w:hAnsi="Calibri"/>
                 <w:sz w:val="22"/>
               </w:rPr>
-              <w:t>Case study: Colin and Samir — the same pair as chapter 8's case study, cited again here because they are one of the few creators who have put a full income breakdown on record, not because their numbers repeat by accident — have described their own income in interviews as roughly half to 60 percent brand deals, about 30 percent speaking, consulting, and creative work that never appears on the channel at all, and AdSense around 10 percent — a smaller share than many viewers would guess for two people who make YouTube videos for a living. AdSense only became a substantial stream for them in 2022, reaching $268,000 that year, the same figure chapter 8 uses to show how long the gate's arithmetic took to turn into real money; for years before that it was a minor, inconsistent add-on to income built mostly from elsewhere. Spreading the income is not a hedge against a bad month. For a channel like theirs, it is most of the income.</w:t>
+              <w:t>Case study: Colin and Samir, whose channel covers the creator economy, have described their own income in interviews as roughly half to 60 percent brand deals, about 30 percent speaking, consulting, and creative work that never appears on the channel at all, and AdSense around 10 percent — a smaller share than many viewers would guess for two people who make YouTube videos for a living. AdSense only became a substantial stream for them in 2022, reaching $268,000 that year; for years before that it was a minor, inconsistent add-on to income built mostly from elsewhere. Spreading the income is not a hedge against a bad month. For a channel like theirs, it is most of the income.</w:t>
             </w:r>
           </w:p>
         </w:tc>
@@ -20865,7 +20865,7 @@
           <w:rFonts w:ascii="Calibri" w:hAnsi="Calibri"/>
           <w:i/>
         </w:rPr>
-        <w:t xml:space="preserve">; this book has not independently audited them. That paid campaign views do not count is from </w:t>
+        <w:t xml:space="preserve">; this book has not independently audited them. They are also chapter 8's case study, cited again here (including the same $268,000/2022 figure) because they are one of the few creators who have put a full income breakdown on record, not because two chapters happened to land on the same number. That paid campaign views do not count is from </w:t>
       </w:r>
       <w:hyperlink r:id="rId24">
         <w:r>

</xml_diff>

<commit_message>
YouTube book: glossary 'why it matters' column, shorter paragraphs in ch3/10/11
Two cheap items from tier 3 of the external-review list, done now
rather than deferred. Extended the GLOSSARY tuples with a third
element rendered as an italic clause in the same paragraph, not a new
table. Split 8 overlong plain paragraphs at natural idea boundaries in
the three policy-heaviest chapters; no wording or facts changed.

Co-Authored-By: Claude Sonnet 5 <noreply@anthropic.com>
Claude-Session: https://claude.ai/code/session_01SRhcHKTsmWne9LTaP7asUs
</commit_message>
<xml_diff>
--- a/Your First YouTube Channel That Rocks/Your First YouTube Channel That Rocks.docx
+++ b/Your First YouTube Channel That Rocks/Your First YouTube Channel That Rocks.docx
@@ -7662,7 +7662,15 @@
         <w:rPr>
           <w:rFonts w:ascii="Calibri" w:hAnsi="Calibri"/>
         </w:rPr>
-        <w:t>. Official guidance: an MP4 with H.264 video and AAC-LC audio at 48 kHz; for 1080p at 24, 25, or 30 frames per second, 8 Mbps; for 1440p, 16 Mbps; stereo audio at 384 kbps. A Short uses the same settings with the frame turned vertical, 1080 by 1920. Creator heuristic: a higher-resolution upload gets a better playback encode. That page does not promise it. Upload the resolution you have. Do not upscale a soft file in the hope of a better encode.</w:t>
+        <w:t>. Official guidance: an MP4 with H.264 video and AAC-LC audio at 48 kHz; for 1080p at 24, 25, or 30 frames per second, 8 Mbps; for 1440p, 16 Mbps; stereo audio at 384 kbps. A Short uses the same settings with the frame turned vertical, 1080 by 1920.</w:t>
+      </w:r>
+    </w:p>
+    <w:p>
+      <w:r>
+        <w:rPr>
+          <w:rFonts w:ascii="Calibri" w:hAnsi="Calibri"/>
+        </w:rPr>
+        <w:t>Creator heuristic: a higher-resolution upload gets a better playback encode. That page does not promise it. Upload the resolution you have. Do not upscale a soft file in the hope of a better encode.</w:t>
       </w:r>
     </w:p>
     <w:p>
@@ -7864,7 +7872,15 @@
         <w:rPr>
           <w:rFonts w:ascii="Calibri" w:hAnsi="Calibri"/>
         </w:rPr>
-        <w:t>Mixing habits matter more than the track (author recommendation). Keep the voice at or near full on the editor’s fader. Start the music fader at about a tenth to a fifth of the way up — a fader position, not a loudness measurement — and listen back until every word is clear. Use one instrumental bed per video, no sung lyrics under a voiceover, and few sound effects, each on the visual it marks. Leave a fraction of a second of near-silence before a key line.</w:t>
+        <w:t>Mixing habits matter more than the track (author recommendation). Keep the voice at or near full on the editor’s fader. Start the music fader at about a tenth to a fifth of the way up — a fader position, not a loudness measurement — and listen back until every word is clear.</w:t>
+      </w:r>
+    </w:p>
+    <w:p>
+      <w:r>
+        <w:rPr>
+          <w:rFonts w:ascii="Calibri" w:hAnsi="Calibri"/>
+        </w:rPr>
+        <w:t>Use one instrumental bed per video, no sung lyrics under a voiceover, and few sound effects, each on the visual it marks. Leave a fraction of a second of near-silence before a key line.</w:t>
       </w:r>
     </w:p>
     <w:p>
@@ -15352,7 +15368,15 @@
         <w:rPr>
           <w:rFonts w:ascii="Calibri" w:hAnsi="Calibri"/>
         </w:rPr>
-        <w:t>A channel heading for the gate has more to lose from a rule than a hobby channel does. A hobby channel that loses a video loses a video. A monetizing channel can lose the ads on its best video, lose its place in the review queue because of an active strike, or lose the Partner Program itself for a pattern it did not notice. The rules are not mysterious. YouTube publishes them, with the penalties and the clocks. Most first-time trouble comes from confusing one kind of problem with another and answering it the wrong way.</w:t>
+        <w:t>A channel heading for the gate has more to lose from a rule than a hobby channel does. A hobby channel that loses a video loses a video. A monetizing channel can lose the ads on its best video, lose its place in the review queue because of an active strike, or lose the Partner Program itself for a pattern it did not notice.</w:t>
+      </w:r>
+    </w:p>
+    <w:p>
+      <w:r>
+        <w:rPr>
+          <w:rFonts w:ascii="Calibri" w:hAnsi="Calibri"/>
+        </w:rPr>
+        <w:t>The rules are not mysterious. YouTube publishes them, with the penalties and the clocks. Most first-time trouble comes from confusing one kind of problem with another and answering it the wrong way.</w:t>
       </w:r>
     </w:p>
     <w:p>
@@ -16427,7 +16451,15 @@
         <w:rPr>
           <w:rFonts w:ascii="Calibri" w:hAnsi="Calibri"/>
         </w:rPr>
-        <w:t xml:space="preserve"> says the rights holder chooses what happens: monetize, track, or block. Monetize is the most common choice for music. A claimed video longer than three minutes that is tracked or monetized stays up. A Short between one and three minutes long with an active claim is blocked, whatever the policy. YouTube says claims affect videos and usually do not affect the channel, and that a claim is not a strike.</w:t>
+        <w:t xml:space="preserve"> says the rights holder chooses what happens: monetize, track, or block. Monetize is the most common choice for music.</w:t>
+      </w:r>
+    </w:p>
+    <w:p>
+      <w:r>
+        <w:rPr>
+          <w:rFonts w:ascii="Calibri" w:hAnsi="Calibri"/>
+        </w:rPr>
+        <w:t>A claimed video longer than three minutes that is tracked or monetized stays up. A Short between one and three minutes long with an active claim is blocked, whatever the policy. YouTube says claims affect videos and usually do not affect the channel, and that a claim is not a strike.</w:t>
       </w:r>
     </w:p>
     <w:p>
@@ -16705,7 +16737,15 @@
         <w:rPr>
           <w:rFonts w:ascii="Calibri" w:hAnsi="Calibri"/>
         </w:rPr>
-        <w:t>The label is not the whole disclosure. The paid promotion page says you and the partners you work with are responsible for complying with all applicable legal requirements, and the branded content policies say you are ultimately responsible for making the disclosure clear and prominent. The sponsor sentence in chapter 13 — “[Sponsor] paid for this video. The link is theirs.” — is the part a viewer hears. The FTC pages in the sources are the US guidance on what clear means. Do both: the setting for YouTube, the sentence for the person watching.</w:t>
+        <w:t>The label is not the whole disclosure. The paid promotion page says you and the partners you work with are responsible for complying with all applicable legal requirements, and the branded content policies say you are ultimately responsible for making the disclosure clear and prominent. The sponsor sentence in chapter 13 — “[Sponsor] paid for this video. The link is theirs.” — is the part a viewer hears.</w:t>
+      </w:r>
+    </w:p>
+    <w:p>
+      <w:r>
+        <w:rPr>
+          <w:rFonts w:ascii="Calibri" w:hAnsi="Calibri"/>
+        </w:rPr>
+        <w:t>The FTC pages in the sources are the US guidance on what clear means. Do both: the setting for YouTube, the sentence for the person watching.</w:t>
       </w:r>
     </w:p>
     <w:p>
@@ -16865,7 +16905,23 @@
         <w:rPr>
           <w:rFonts w:ascii="Calibri" w:hAnsi="Calibri"/>
         </w:rPr>
-        <w:t>A disclosure settles what the viewer is told. It does not settle who owns the words. In the United States, copyright needs a human author: the U.S. Court of Appeals for the D.C. Circuit held so in March 2025, in a case over copyright for a purely AI-generated image, and the Supreme Court declined to review that ruling on March 2, 2026. A tool’s terms may say a generated script is yours to use. That is permission, not ownership. A script an assistant wrote, read out word for word, is yours to perform and nobody’s to own, and another channel could reuse the same sentences. The lines you wrote yourself, and your own creative rewrites of a draft, are protected as usual, and so are the delivery, the edit, and the footage you shot. The practical rule (author recommendation): put your own explanation on the track. It is what the inauthentic-content policy in §VIII rewards, and it is the only part of a script anyone can be stopped from copying.</w:t>
+        <w:t>A disclosure settles what the viewer is told. It does not settle who owns the words. In the United States, copyright needs a human author: the U.S. Court of Appeals for the D.C. Circuit held so in March 2025, in a case over copyright for a purely AI-generated image, and the Supreme Court declined to review that ruling on March 2, 2026.</w:t>
+      </w:r>
+    </w:p>
+    <w:p>
+      <w:r>
+        <w:rPr>
+          <w:rFonts w:ascii="Calibri" w:hAnsi="Calibri"/>
+        </w:rPr>
+        <w:t>A tool’s terms may say a generated script is yours to use. That is permission, not ownership. A script an assistant wrote, read out word for word, is yours to perform and nobody’s to own, and another channel could reuse the same sentences. The lines you wrote yourself, and your own creative rewrites of a draft, are protected as usual, and so are the delivery, the edit, and the footage you shot.</w:t>
+      </w:r>
+    </w:p>
+    <w:p>
+      <w:r>
+        <w:rPr>
+          <w:rFonts w:ascii="Calibri" w:hAnsi="Calibri"/>
+        </w:rPr>
+        <w:t>The practical rule (author recommendation): put your own explanation on the track. It is what the inauthentic-content policy in §VIII rewards, and it is the only part of a script anyone can be stopped from copying.</w:t>
       </w:r>
     </w:p>
     <w:p>
@@ -17031,7 +17087,15 @@
         <w:rPr>
           <w:rFonts w:ascii="Calibri" w:hAnsi="Calibri"/>
         </w:rPr>
-        <w:t xml:space="preserve"> says the setting exists to comply with the US Children’s Online Privacy Protection Act, COPPA, and other laws. When a video is set as made for kids, YouTube turns off a long list of features on it. The list includes comments, cards and end screens, the notification bell, personalized advertising, the miniplayer, and saving to a playlist or Watch Later. A channel set as made for kids also loses posts and channel memberships, among others, and Super Chat, Super Stickers, and Super Thanks are not available on made-for-kids videos.</w:t>
+        <w:t xml:space="preserve"> says the setting exists to comply with the US Children’s Online Privacy Protection Act, COPPA, and other laws.</w:t>
+      </w:r>
+    </w:p>
+    <w:p>
+      <w:r>
+        <w:rPr>
+          <w:rFonts w:ascii="Calibri" w:hAnsi="Calibri"/>
+        </w:rPr>
+        <w:t>When a video is set as made for kids, YouTube turns off a long list of features on it. The list includes comments, cards and end screens, the notification bell, personalized advertising, the miniplayer, and saving to a playlist or Watch Later. A channel set as made for kids also loses posts and channel memberships, among others, and Super Chat, Super Stickers, and Super Thanks are not available on made-for-kids videos.</w:t>
       </w:r>
     </w:p>
     <w:p>
@@ -17065,7 +17129,15 @@
         <w:rPr>
           <w:rFonts w:ascii="Calibri" w:hAnsi="Calibri"/>
         </w:rPr>
-        <w:t>Nothing in this chapter needs a lawyer to follow. It does need a memory you will not have in two years. The rights log in chapter 15, §VII has three parts: licenses (every clip, image, and track you did not make, with a dated screenshot), disclosures (paid promotion, AI use, audience setting, affiliate line, per video), and notices (every warning, strike, claim, or limited-ads label, with the date its clock runs out). The notices part tells you, before you upload a borderline video, whether the channel has room for a mistake this month. With an active strike, it does not, and a Partner Program application waits too.</w:t>
+        <w:t>Nothing in this chapter needs a lawyer to follow. It does need a memory you will not have in two years. The rights log in chapter 15, §VII has three parts: licenses (every clip, image, and track you did not make, with a dated screenshot), disclosures (paid promotion, AI use, audience setting, affiliate line, per video), and notices (every warning, strike, claim, or limited-ads label, with the date its clock runs out).</w:t>
+      </w:r>
+    </w:p>
+    <w:p>
+      <w:r>
+        <w:rPr>
+          <w:rFonts w:ascii="Calibri" w:hAnsi="Calibri"/>
+        </w:rPr>
+        <w:t>The notices part tells you, before you upload a borderline video, whether the channel has room for a mistake this month. With an active strike, it does not, and a Partner Program application waits too.</w:t>
       </w:r>
     </w:p>
     <w:p>
@@ -17846,7 +17918,15 @@
         <w:rPr>
           <w:rFonts w:ascii="Calibri" w:hAnsi="Calibri"/>
         </w:rPr>
-        <w:t>A viewer who pays for YouTube Premium sees no ads, and still pays your channel. YouTube’s August 2026 announcement and its Changes page describe the split: 30% of net Premium subscription revenue, and 60% of net Premium Lite revenue, goes into a pool distributed to creators by member watch time and views. From that distribution, creators receive 55% for long-form and 45% for Shorts. The same post says Premium Lite is expanding to every country where YouTube offers Premium, and that when a viewer signs up for Premium, partners on average earn more than when that viewer was watching ads.</w:t>
+        <w:t>A viewer who pays for YouTube Premium sees no ads, and still pays your channel. YouTube’s August 2026 announcement and its Changes page describe the split: 30% of net Premium subscription revenue, and 60% of net Premium Lite revenue, goes into a pool distributed to creators by member watch time and views. From that distribution, creators receive 55% for long-form and 45% for Shorts.</w:t>
+      </w:r>
+    </w:p>
+    <w:p>
+      <w:r>
+        <w:rPr>
+          <w:rFonts w:ascii="Calibri" w:hAnsi="Calibri"/>
+        </w:rPr>
+        <w:t>The same post says Premium Lite is expanding to every country where YouTube offers Premium, and that when a viewer signs up for Premium, partners on average earn more than when that viewer was watching ads.</w:t>
       </w:r>
     </w:p>
     <w:p>
@@ -23728,6 +23808,19 @@
         </w:rPr>
         <w:t>The only set of videos this book asks you to finish: who it is for, the problem in their words, the method, proof, the comparison, one objection, the deep dive, and which video to watch next. Chapters 2, 5, and 6 use this same set.</w:t>
       </w:r>
+      <w:r>
+        <w:rPr>
+          <w:rFonts w:ascii="Calibri" w:hAnsi="Calibri"/>
+          <w:i/>
+        </w:rPr>
+        <w:t xml:space="preserve"> Why it matters: </w:t>
+      </w:r>
+      <w:r>
+        <w:rPr>
+          <w:rFonts w:ascii="Calibri" w:hAnsi="Calibri"/>
+        </w:rPr>
+        <w:t>Skipping one job is usually the missing step between videos nobody finishes and a path strangers follow.</w:t>
+      </w:r>
     </w:p>
     <w:p>
       <w:r>
@@ -23743,6 +23836,19 @@
         </w:rPr>
         <w:t>The long, complete video in the eight jobs, built to be watched for a long time. The video that fills the hour bar, and the one that can honestly pass eight minutes for mid-roll ads.</w:t>
       </w:r>
+      <w:r>
+        <w:rPr>
+          <w:rFonts w:ascii="Calibri" w:hAnsi="Calibri"/>
+          <w:i/>
+        </w:rPr>
+        <w:t xml:space="preserve"> Why it matters: </w:t>
+      </w:r>
+      <w:r>
+        <w:rPr>
+          <w:rFonts w:ascii="Calibri" w:hAnsi="Calibri"/>
+        </w:rPr>
+        <w:t>It is the one video the hour bar depends on most, so its length and pacing earn more care than the other seven.</w:t>
+      </w:r>
     </w:p>
     <w:p>
       <w:r>
@@ -23758,6 +23864,19 @@
         </w:rPr>
         <w:t>In countries where YouTube has opened it, the earlier tier of the Partner Program: 500 subscribers, three public uploads in 90 days, and either 3,000 long-form hours in a year or 3 million Shorts views in 90 days. Fan funding, Shopping, and Creator Partnerships. Not a share of watch-page ads. Unchanged by the 2027 update.</w:t>
       </w:r>
+      <w:r>
+        <w:rPr>
+          <w:rFonts w:ascii="Calibri" w:hAnsi="Calibri"/>
+          <w:i/>
+        </w:rPr>
+        <w:t xml:space="preserve"> Why it matters: </w:t>
+      </w:r>
+      <w:r>
+        <w:rPr>
+          <w:rFonts w:ascii="Calibri" w:hAnsi="Calibri"/>
+        </w:rPr>
+        <w:t>It can open memberships and Super Chat months before the ad gate does, which is real income a new channel can use earlier.</w:t>
+      </w:r>
     </w:p>
     <w:p>
       <w:r>
@@ -23773,6 +23892,19 @@
         </w:rPr>
         <w:t>The higher gate: 1,000 subscribers and either 4,000 long-form hours in 12 months or 10 million qualified Shorts views in 90 days. For channels that apply from 1 February 2027: 8,000 hours in 365 days or 20 million Shorts views in 90 days. This is the gate that adds watch-page ads, Shorts Feed ads, and YouTube Premium revenue. Channels already in the program keep their status.</w:t>
       </w:r>
+      <w:r>
+        <w:rPr>
+          <w:rFonts w:ascii="Calibri" w:hAnsi="Calibri"/>
+          <w:i/>
+        </w:rPr>
+        <w:t xml:space="preserve"> Why it matters: </w:t>
+      </w:r>
+      <w:r>
+        <w:rPr>
+          <w:rFonts w:ascii="Calibri" w:hAnsi="Calibri"/>
+        </w:rPr>
+        <w:t>It is the gate every ad, Premium, and Shorts dollar in this book waits behind.</w:t>
+      </w:r>
     </w:p>
     <w:p>
       <w:r>
@@ -23788,6 +23920,19 @@
         </w:rPr>
         <w:t>Public long-form viewing that YouTube counts toward the hour bars. Hours watched in the Shorts feed do not count. Private, unlisted, deleted, and ad-campaign views do not count.</w:t>
       </w:r>
+      <w:r>
+        <w:rPr>
+          <w:rFonts w:ascii="Calibri" w:hAnsi="Calibri"/>
+          <w:i/>
+        </w:rPr>
+        <w:t xml:space="preserve"> Why it matters: </w:t>
+      </w:r>
+      <w:r>
+        <w:rPr>
+          <w:rFonts w:ascii="Calibri" w:hAnsi="Calibri"/>
+        </w:rPr>
+        <w:t>A channel can have real viewers and still fail the gate if those hours don't count.</w:t>
+      </w:r>
     </w:p>
     <w:p>
       <w:r>
@@ -23803,6 +23948,19 @@
         </w:rPr>
         <w:t>Public views of Shorts in the Shorts feed that YouTube counts toward the Shorts bars: 3 million in 90 days for the expanded program, or 10 million in 90 days for the Partner Program (20 million for channels applying from 1 February 2027). They do not fill the long-form hour bars.</w:t>
       </w:r>
+      <w:r>
+        <w:rPr>
+          <w:rFonts w:ascii="Calibri" w:hAnsi="Calibri"/>
+          <w:i/>
+        </w:rPr>
+        <w:t xml:space="preserve"> Why it matters: </w:t>
+      </w:r>
+      <w:r>
+        <w:rPr>
+          <w:rFonts w:ascii="Calibri" w:hAnsi="Calibri"/>
+        </w:rPr>
+        <w:t>Shorts fame does not substitute for the long-form hour bar; it has its own separate bar.</w:t>
+      </w:r>
     </w:p>
     <w:p>
       <w:r>
@@ -23818,6 +23976,19 @@
         </w:rPr>
         <w:t>Organic views from people who watch more of your videos after seeing a promoted one. The only part of a paid campaign that counts toward the Partner Program.</w:t>
       </w:r>
+      <w:r>
+        <w:rPr>
+          <w:rFonts w:ascii="Calibri" w:hAnsi="Calibri"/>
+          <w:i/>
+        </w:rPr>
+        <w:t xml:space="preserve"> Why it matters: </w:t>
+      </w:r>
+      <w:r>
+        <w:rPr>
+          <w:rFonts w:ascii="Calibri" w:hAnsi="Calibri"/>
+        </w:rPr>
+        <w:t>It is the only way a paid ad campaign can actually help you reach the gate.</w:t>
+      </w:r>
     </w:p>
     <w:p>
       <w:r>
@@ -23833,6 +24004,19 @@
         </w:rPr>
         <w:t>The Studio status that makes an address in a long-form description, and in a long-form comment, clickable. Phone verification comes first. A Short’s description and comments stay unclickable after it is on. The Partner Program requires it.</w:t>
       </w:r>
+      <w:r>
+        <w:rPr>
+          <w:rFonts w:ascii="Calibri" w:hAnsi="Calibri"/>
+          <w:i/>
+        </w:rPr>
+        <w:t xml:space="preserve"> Why it matters: </w:t>
+      </w:r>
+      <w:r>
+        <w:rPr>
+          <w:rFonts w:ascii="Calibri" w:hAnsi="Calibri"/>
+        </w:rPr>
+        <w:t>Without it, a link in a description or comment is just text nobody can tap.</w:t>
+      </w:r>
     </w:p>
     <w:p>
       <w:r>
@@ -23848,6 +24032,19 @@
         </w:rPr>
         <w:t>AdSense for YouTube, the Google account YouTube uses to pay a channel it has accepted. Meeting a subscriber number does not open it. You apply, and YouTube reviews the channel.</w:t>
       </w:r>
+      <w:r>
+        <w:rPr>
+          <w:rFonts w:ascii="Calibri" w:hAnsi="Calibri"/>
+          <w:i/>
+        </w:rPr>
+        <w:t xml:space="preserve"> Why it matters: </w:t>
+      </w:r>
+      <w:r>
+        <w:rPr>
+          <w:rFonts w:ascii="Calibri" w:hAnsi="Calibri"/>
+        </w:rPr>
+        <w:t>Meeting every number in this book still does not pay you until this account exists and is approved.</w:t>
+      </w:r>
     </w:p>
     <w:p>
       <w:r>
@@ -23863,6 +24060,19 @@
         </w:rPr>
         <w:t>The separate sets of terms you accept in Studio’s Earn tab once inside the program: Watch Page Monetization for long-form ads and Premium, Shorts Monetization for the Shorts feed, and the Commerce Product Module for fan funding.</w:t>
       </w:r>
+      <w:r>
+        <w:rPr>
+          <w:rFonts w:ascii="Calibri" w:hAnsi="Calibri"/>
+          <w:i/>
+        </w:rPr>
+        <w:t xml:space="preserve"> Why it matters: </w:t>
+      </w:r>
+      <w:r>
+        <w:rPr>
+          <w:rFonts w:ascii="Calibri" w:hAnsi="Calibri"/>
+        </w:rPr>
+        <w:t>Accepting the Partner Program does not turn any income on by itself; each module has to be switched on separately.</w:t>
+      </w:r>
     </w:p>
     <w:p>
       <w:r>
@@ -23878,6 +24088,19 @@
         </w:rPr>
         <w:t>What advertisers paid per 1,000 ad impressions on your videos, before YouTube’s share. Ads and Premium only, monetized views only.</w:t>
       </w:r>
+      <w:r>
+        <w:rPr>
+          <w:rFonts w:ascii="Calibri" w:hAnsi="Calibri"/>
+          <w:i/>
+        </w:rPr>
+        <w:t xml:space="preserve"> Why it matters: </w:t>
+      </w:r>
+      <w:r>
+        <w:rPr>
+          <w:rFonts w:ascii="Calibri" w:hAnsi="Calibri"/>
+        </w:rPr>
+        <w:t>It explains why RPM moved, even though it is not the number that lands in your account.</w:t>
+      </w:r>
     </w:p>
     <w:p>
       <w:r>
@@ -23893,6 +24116,19 @@
         </w:rPr>
         <w:t>What advertisers paid per 1,000 playbacks that showed at least one ad. Often higher than CPM, because one playback can carry two ads.</w:t>
       </w:r>
+      <w:r>
+        <w:rPr>
+          <w:rFonts w:ascii="Calibri" w:hAnsi="Calibri"/>
+          <w:i/>
+        </w:rPr>
+        <w:t xml:space="preserve"> Why it matters: </w:t>
+      </w:r>
+      <w:r>
+        <w:rPr>
+          <w:rFonts w:ascii="Calibri" w:hAnsi="Calibri"/>
+        </w:rPr>
+        <w:t>It is the number that best matches what one video actually earned per view shown an ad.</w:t>
+      </w:r>
     </w:p>
     <w:p>
       <w:r>
@@ -23908,6 +24144,19 @@
         </w:rPr>
         <w:t>Your total revenue after YouTube’s share, per 1,000 engaged views, including views with no ad. Includes ads, Premium, memberships, Super Chat, and Super Stickers. Usually lower than CPM.</w:t>
       </w:r>
+      <w:r>
+        <w:rPr>
+          <w:rFonts w:ascii="Calibri" w:hAnsi="Calibri"/>
+          <w:i/>
+        </w:rPr>
+        <w:t xml:space="preserve"> Why it matters: </w:t>
+      </w:r>
+      <w:r>
+        <w:rPr>
+          <w:rFonts w:ascii="Calibri" w:hAnsi="Calibri"/>
+        </w:rPr>
+        <w:t>It is the one number that reflects everything a channel actually earned, which is why this book plans by it.</w:t>
+      </w:r>
     </w:p>
     <w:p>
       <w:r>
@@ -23923,6 +24172,19 @@
         </w:rPr>
         <w:t>An ad break during a video. Available on monetized videos eight minutes or longer, placed automatically, by hand, or both. Breaks at natural pauses are more likely to serve an ad.</w:t>
       </w:r>
+      <w:r>
+        <w:rPr>
+          <w:rFonts w:ascii="Calibri" w:hAnsi="Calibri"/>
+          <w:i/>
+        </w:rPr>
+        <w:t xml:space="preserve"> Why it matters: </w:t>
+      </w:r>
+      <w:r>
+        <w:rPr>
+          <w:rFonts w:ascii="Calibri" w:hAnsi="Calibri"/>
+        </w:rPr>
+        <w:t>Placing it at a natural pause instead of mid-sentence can change whether it serves an ad at all.</w:t>
+      </w:r>
     </w:p>
     <w:p>
       <w:r>
@@ -23938,6 +24200,19 @@
         </w:rPr>
         <w:t>The monetization status of a video that does not fully meet the advertiser-friendly guidelines: fewer advertisers, or none. Not a strike. You can request a human review.</w:t>
       </w:r>
+      <w:r>
+        <w:rPr>
+          <w:rFonts w:ascii="Calibri" w:hAnsi="Calibri"/>
+          <w:i/>
+        </w:rPr>
+        <w:t xml:space="preserve"> Why it matters: </w:t>
+      </w:r>
+      <w:r>
+        <w:rPr>
+          <w:rFonts w:ascii="Calibri" w:hAnsi="Calibri"/>
+        </w:rPr>
+        <w:t>It silently caps a video's earning potential without ever touching the channel's standing.</w:t>
+      </w:r>
     </w:p>
     <w:p>
       <w:r>
@@ -23953,6 +24228,19 @@
         </w:rPr>
         <w:t>The monthly pot of Shorts Feed ad revenue that YouTube shares out by each monetizing channel’s share of engaged Shorts views, after a share for music licensing. The channel keeps 45% of its allocation. From 1 February 2027, a month counts only if the channel had 10 million qualified Shorts views in the previous 90 days.</w:t>
       </w:r>
+      <w:r>
+        <w:rPr>
+          <w:rFonts w:ascii="Calibri" w:hAnsi="Calibri"/>
+          <w:i/>
+        </w:rPr>
+        <w:t xml:space="preserve"> Why it matters: </w:t>
+      </w:r>
+      <w:r>
+        <w:rPr>
+          <w:rFonts w:ascii="Calibri" w:hAnsi="Calibri"/>
+        </w:rPr>
+        <w:t>A Short's payout depends on the whole pool and your share of it, not on a fixed rate per view.</w:t>
+      </w:r>
     </w:p>
     <w:p>
       <w:r>
@@ -23968,6 +24256,19 @@
         </w:rPr>
         <w:t>A share of Premium and Premium Lite subscription fees, pooled and paid by members’ watch time and views: 55% for long-form, 45% for Shorts, of the pool allocated to creators.</w:t>
       </w:r>
+      <w:r>
+        <w:rPr>
+          <w:rFonts w:ascii="Calibri" w:hAnsi="Calibri"/>
+          <w:i/>
+        </w:rPr>
+        <w:t xml:space="preserve"> Why it matters: </w:t>
+      </w:r>
+      <w:r>
+        <w:rPr>
+          <w:rFonts w:ascii="Calibri" w:hAnsi="Calibri"/>
+        </w:rPr>
+        <w:t>It pays even on videos with no ads at all, which is easy to miss when reading only the ads line.</w:t>
+      </w:r>
     </w:p>
     <w:p>
       <w:r>
@@ -23983,6 +24284,19 @@
         </w:rPr>
         <w:t>Monthly payments from viewers for perks you choose, in up to six levels. The channel receives 70% after taxes and fees. Downloads of YouTube content, in-person one-to-one meetings, and random prizes are not allowed as perks.</w:t>
       </w:r>
+      <w:r>
+        <w:rPr>
+          <w:rFonts w:ascii="Calibri" w:hAnsi="Calibri"/>
+          <w:i/>
+        </w:rPr>
+        <w:t xml:space="preserve"> Why it matters: </w:t>
+      </w:r>
+      <w:r>
+        <w:rPr>
+          <w:rFonts w:ascii="Calibri" w:hAnsi="Calibri"/>
+        </w:rPr>
+        <w:t>It is often the first stream available, well before the ad gate.</w:t>
+      </w:r>
     </w:p>
     <w:p>
       <w:r>
@@ -23998,6 +24312,19 @@
         </w:rPr>
         <w:t>Paid, highlighted messages and animated stickers in the live chat of a live stream or premiere. The channel receives 70% after taxes and fees. YouTube says they are not donation tools.</w:t>
       </w:r>
+      <w:r>
+        <w:rPr>
+          <w:rFonts w:ascii="Calibri" w:hAnsi="Calibri"/>
+          <w:i/>
+        </w:rPr>
+        <w:t xml:space="preserve"> Why it matters: </w:t>
+      </w:r>
+      <w:r>
+        <w:rPr>
+          <w:rFonts w:ascii="Calibri" w:hAnsi="Calibri"/>
+        </w:rPr>
+        <w:t>They only exist during a live stream, so they are a reason to go live, not a general-purpose stream.</w:t>
+      </w:r>
     </w:p>
     <w:p>
       <w:r>
@@ -24013,6 +24340,19 @@
         </w:rPr>
         <w:t>A one-time paid animation and highlighted comment on a long-form video or a Short. Not available on claimed, unlisted, made-for-kids, or comments-off videos, or while a stream is live. The channel receives 70% after taxes and fees.</w:t>
       </w:r>
+      <w:r>
+        <w:rPr>
+          <w:rFonts w:ascii="Calibri" w:hAnsi="Calibri"/>
+          <w:i/>
+        </w:rPr>
+        <w:t xml:space="preserve"> Why it matters: </w:t>
+      </w:r>
+      <w:r>
+        <w:rPr>
+          <w:rFonts w:ascii="Calibri" w:hAnsi="Calibri"/>
+        </w:rPr>
+        <w:t>A single claimed video loses access to it, which is one more cost of an unresolved Content ID claim.</w:t>
+      </w:r>
     </w:p>
     <w:p>
       <w:r>
@@ -24028,6 +24368,19 @@
         </w:rPr>
         <w:t>One company paying you for one video or segment. Select paid promotion in Studio, say so in the video, and say so next to the link.</w:t>
       </w:r>
+      <w:r>
+        <w:rPr>
+          <w:rFonts w:ascii="Calibri" w:hAnsi="Calibri"/>
+          <w:i/>
+        </w:rPr>
+        <w:t xml:space="preserve"> Why it matters: </w:t>
+      </w:r>
+      <w:r>
+        <w:rPr>
+          <w:rFonts w:ascii="Calibri" w:hAnsi="Calibri"/>
+        </w:rPr>
+        <w:t>It is usually the first stream large enough to pay real money, and the one most dependent on a track record.</w:t>
+      </w:r>
     </w:p>
     <w:p>
       <w:r>
@@ -24043,6 +24396,19 @@
         </w:rPr>
         <w:t>YouTube’s matching tool between brands and creators. Open to channels in the Partner Program, 18 or older, in available countries, with no active Community Guidelines strikes.</w:t>
       </w:r>
+      <w:r>
+        <w:rPr>
+          <w:rFonts w:ascii="Calibri" w:hAnsi="Calibri"/>
+          <w:i/>
+        </w:rPr>
+        <w:t xml:space="preserve"> Why it matters: </w:t>
+      </w:r>
+      <w:r>
+        <w:rPr>
+          <w:rFonts w:ascii="Calibri" w:hAnsi="Calibri"/>
+        </w:rPr>
+        <w:t>It is YouTube's own path to sponsors, not a requirement to find one yourself.</w:t>
+      </w:r>
     </w:p>
     <w:p>
       <w:r>
@@ -24058,6 +24424,19 @@
         </w:rPr>
         <w:t>A link that pays you a commission if the viewer buys a product you recommended. Say so next to the link. The FTC pages in the sources list are the US disclosure guidance this book points at.</w:t>
       </w:r>
+      <w:r>
+        <w:rPr>
+          <w:rFonts w:ascii="Calibri" w:hAnsi="Calibri"/>
+          <w:i/>
+        </w:rPr>
+        <w:t xml:space="preserve"> Why it matters: </w:t>
+      </w:r>
+      <w:r>
+        <w:rPr>
+          <w:rFonts w:ascii="Calibri" w:hAnsi="Calibri"/>
+        </w:rPr>
+        <w:t>An undisclosed one is the kind of mistake that invites regulatory attention, not just a viewer complaint.</w:t>
+      </w:r>
     </w:p>
     <w:p>
       <w:r>
@@ -24073,6 +24452,19 @@
         </w:rPr>
         <w:t>YouTube’s own affiliate program for tagging other brands’ products in Shorts, long videos, and live streams. Open to partners with at least 500 subscribers in listed countries since March 2026.</w:t>
       </w:r>
+      <w:r>
+        <w:rPr>
+          <w:rFonts w:ascii="Calibri" w:hAnsi="Calibri"/>
+          <w:i/>
+        </w:rPr>
+        <w:t xml:space="preserve"> Why it matters: </w:t>
+      </w:r>
+      <w:r>
+        <w:rPr>
+          <w:rFonts w:ascii="Calibri" w:hAnsi="Calibri"/>
+        </w:rPr>
+        <w:t>It opens far earlier than the ad gate, at only 500 subscribers.</w:t>
+      </w:r>
     </w:p>
     <w:p>
       <w:r>
@@ -24088,6 +24480,19 @@
         </w:rPr>
         <w:t>YouTube’s monetization name, since July 2025, for templated, repetitive, or mass-produced videos, including generic AI-made ones. It can keep a whole channel out of the Partner Program.</w:t>
       </w:r>
+      <w:r>
+        <w:rPr>
+          <w:rFonts w:ascii="Calibri" w:hAnsi="Calibri"/>
+          <w:i/>
+        </w:rPr>
+        <w:t xml:space="preserve"> Why it matters: </w:t>
+      </w:r>
+      <w:r>
+        <w:rPr>
+          <w:rFonts w:ascii="Calibri" w:hAnsi="Calibri"/>
+        </w:rPr>
+        <w:t>It can block the whole channel from the Partner Program, not just one video.</w:t>
+      </w:r>
     </w:p>
     <w:p>
       <w:r>
@@ -24103,6 +24508,19 @@
         </w:rPr>
         <w:t>Someone else’s material republished without significant original commentary, modification, or educational value. A monetization policy that applies to the whole channel.</w:t>
       </w:r>
+      <w:r>
+        <w:rPr>
+          <w:rFonts w:ascii="Calibri" w:hAnsi="Calibri"/>
+          <w:i/>
+        </w:rPr>
+        <w:t xml:space="preserve"> Why it matters: </w:t>
+      </w:r>
+      <w:r>
+        <w:rPr>
+          <w:rFonts w:ascii="Calibri" w:hAnsi="Calibri"/>
+        </w:rPr>
+        <w:t>Like inauthentic content, it is a channel-wide risk, not a per-video one.</w:t>
+      </w:r>
     </w:p>
     <w:p>
       <w:r>
@@ -24118,6 +24536,19 @@
         </w:rPr>
         <w:t>An element in the last 5 to 20 seconds of a video at least 25 seconds long. One that opens a site outside YouTube requires the Partner Program.</w:t>
       </w:r>
+      <w:r>
+        <w:rPr>
+          <w:rFonts w:ascii="Calibri" w:hAnsi="Calibri"/>
+          <w:i/>
+        </w:rPr>
+        <w:t xml:space="preserve"> Why it matters: </w:t>
+      </w:r>
+      <w:r>
+        <w:rPr>
+          <w:rFonts w:ascii="Calibri" w:hAnsi="Calibri"/>
+        </w:rPr>
+        <w:t>It is one of the few places a viewer can be pointed to the next video without leaving YouTube.</w:t>
+      </w:r>
     </w:p>
     <w:p>
       <w:r>
@@ -24133,6 +24564,19 @@
         </w:rPr>
         <w:t>A small panel attached to the video. One that opens a site outside YouTube also requires the Partner Program.</w:t>
       </w:r>
+      <w:r>
+        <w:rPr>
+          <w:rFonts w:ascii="Calibri" w:hAnsi="Calibri"/>
+          <w:i/>
+        </w:rPr>
+        <w:t xml:space="preserve"> Why it matters: </w:t>
+      </w:r>
+      <w:r>
+        <w:rPr>
+          <w:rFonts w:ascii="Calibri" w:hAnsi="Calibri"/>
+        </w:rPr>
+        <w:t>It has the same gate as end screens for an outside link, which surprises creators who expect cards to be freely available.</w:t>
+      </w:r>
     </w:p>
     <w:p>
       <w:r>
@@ -24148,6 +24592,19 @@
         </w:rPr>
         <w:t>A playlist YouTube can feature as the next video while someone is watching one of yours. The account has to be verified, the videos have to be yours, and a video can sit in only one series playlist.</w:t>
       </w:r>
+      <w:r>
+        <w:rPr>
+          <w:rFonts w:ascii="Calibri" w:hAnsi="Calibri"/>
+          <w:i/>
+        </w:rPr>
+        <w:t xml:space="preserve"> Why it matters: </w:t>
+      </w:r>
+      <w:r>
+        <w:rPr>
+          <w:rFonts w:ascii="Calibri" w:hAnsi="Calibri"/>
+        </w:rPr>
+        <w:t>It is how YouTube can keep recommending your own next video while someone is already watching one.</w:t>
+      </w:r>
     </w:p>
     <w:p>
       <w:r>
@@ -24163,6 +24620,19 @@
         </w:rPr>
         <w:t>A vertical video, 1080 by 1920. An address in a Short’s description or comments is not clickable. A Short can point at a long video.</w:t>
       </w:r>
+      <w:r>
+        <w:rPr>
+          <w:rFonts w:ascii="Calibri" w:hAnsi="Calibri"/>
+          <w:i/>
+        </w:rPr>
+        <w:t xml:space="preserve"> Why it matters: </w:t>
+      </w:r>
+      <w:r>
+        <w:rPr>
+          <w:rFonts w:ascii="Calibri" w:hAnsi="Calibri"/>
+        </w:rPr>
+        <w:t>Its unclickable description means a Short's main job is pointing viewers toward a long video, not toward a link.</w:t>
+      </w:r>
     </w:p>
     <w:p>
       <w:r>
@@ -24178,6 +24648,19 @@
         </w:rPr>
         <w:t>The video codec named in YouTube’s recommended upload settings for an MP4. The audio codec named beside it is AAC-LC.</w:t>
       </w:r>
+      <w:r>
+        <w:rPr>
+          <w:rFonts w:ascii="Calibri" w:hAnsi="Calibri"/>
+          <w:i/>
+        </w:rPr>
+        <w:t xml:space="preserve"> Why it matters: </w:t>
+      </w:r>
+      <w:r>
+        <w:rPr>
+          <w:rFonts w:ascii="Calibri" w:hAnsi="Calibri"/>
+        </w:rPr>
+        <w:t>Matching it avoids a re-encode that can soften a sharp upload.</w:t>
+      </w:r>
     </w:p>
     <w:p>
       <w:r>
@@ -24193,6 +24676,19 @@
         </w:rPr>
         <w:t>A text track the viewer can turn on or off. The words can be searched. They are not burned into the picture.</w:t>
       </w:r>
+      <w:r>
+        <w:rPr>
+          <w:rFonts w:ascii="Calibri" w:hAnsi="Calibri"/>
+          <w:i/>
+        </w:rPr>
+        <w:t xml:space="preserve"> Why it matters: </w:t>
+      </w:r>
+      <w:r>
+        <w:rPr>
+          <w:rFonts w:ascii="Calibri" w:hAnsi="Calibri"/>
+        </w:rPr>
+        <w:t>They are what makes a video's words searchable and accessible, which burned-in text never is.</w:t>
+      </w:r>
     </w:p>
     <w:p>
       <w:r>
@@ -24208,6 +24704,19 @@
         </w:rPr>
         <w:t>Words that are part of the picture. They stay on. They are a different choice from closed captions.</w:t>
       </w:r>
+      <w:r>
+        <w:rPr>
+          <w:rFonts w:ascii="Calibri" w:hAnsi="Calibri"/>
+          <w:i/>
+        </w:rPr>
+        <w:t xml:space="preserve"> Why it matters: </w:t>
+      </w:r>
+      <w:r>
+        <w:rPr>
+          <w:rFonts w:ascii="Calibri" w:hAnsi="Calibri"/>
+        </w:rPr>
+        <w:t>They cannot be turned off, which matters for viewers who find on-screen text distracting.</w:t>
+      </w:r>
     </w:p>
     <w:p>
       <w:r>
@@ -24223,6 +24732,19 @@
         </w:rPr>
         <w:t>The volume slider in an editor. A music fader at about a tenth to a fifth of the way up is a position on that slider, not a measurement of loudness.</w:t>
       </w:r>
+      <w:r>
+        <w:rPr>
+          <w:rFonts w:ascii="Calibri" w:hAnsi="Calibri"/>
+          <w:i/>
+        </w:rPr>
+        <w:t xml:space="preserve"> Why it matters: </w:t>
+      </w:r>
+      <w:r>
+        <w:rPr>
+          <w:rFonts w:ascii="Calibri" w:hAnsi="Calibri"/>
+        </w:rPr>
+        <w:t>Getting this wrong is a common reason a voice is hard to hear under music.</w:t>
+      </w:r>
     </w:p>
     <w:p>
       <w:r>
@@ -24238,6 +24760,19 @@
         </w:rPr>
         <w:t>A tool that reads a script aloud. Usable when the voice is not a clone of someone else. Cloning someone else’s voice is a consent question the tool does not answer for you.</w:t>
       </w:r>
+      <w:r>
+        <w:rPr>
+          <w:rFonts w:ascii="Calibri" w:hAnsi="Calibri"/>
+          <w:i/>
+        </w:rPr>
+        <w:t xml:space="preserve"> Why it matters: </w:t>
+      </w:r>
+      <w:r>
+        <w:rPr>
+          <w:rFonts w:ascii="Calibri" w:hAnsi="Calibri"/>
+        </w:rPr>
+        <w:t>It is a usable part of the free production stack only as long as the voice is not a clone.</w:t>
+      </w:r>
     </w:p>
     <w:p>
       <w:r>
@@ -24253,6 +24788,19 @@
         </w:rPr>
         <w:t>The terms on one clip or track. “Free” and “free to use commercially” are different sentences. Read the line on that file before you publish it, including on a second site.</w:t>
       </w:r>
+      <w:r>
+        <w:rPr>
+          <w:rFonts w:ascii="Calibri" w:hAnsi="Calibri"/>
+          <w:i/>
+        </w:rPr>
+        <w:t xml:space="preserve"> Why it matters: </w:t>
+      </w:r>
+      <w:r>
+        <w:rPr>
+          <w:rFonts w:ascii="Calibri" w:hAnsi="Calibri"/>
+        </w:rPr>
+        <w:t>A library's current policy is not a permanent grant on a file downloaded under an older one.</w:t>
+      </w:r>
     </w:p>
     <w:p>
       <w:r>
@@ -24268,6 +24816,19 @@
         </w:rPr>
         <w:t>In Studio, a thumbnail shown on YouTube for more than one second with at least half of it visible. Thumbnails on other websites, in end screens, and in notifications are not counted.</w:t>
       </w:r>
+      <w:r>
+        <w:rPr>
+          <w:rFonts w:ascii="Calibri" w:hAnsi="Calibri"/>
+          <w:i/>
+        </w:rPr>
+        <w:t xml:space="preserve"> Why it matters: </w:t>
+      </w:r>
+      <w:r>
+        <w:rPr>
+          <w:rFonts w:ascii="Calibri" w:hAnsi="Calibri"/>
+        </w:rPr>
+        <w:t>It is the denominator behind click-through rate, so a change in the number does not always mean a change in interest.</w:t>
+      </w:r>
     </w:p>
     <w:p>
       <w:r>
@@ -24283,6 +24844,19 @@
         </w:rPr>
         <w:t>How often a counted impression became a view. YouTube says half of channels and videos fall between 2% and 10%. It is a band, not a target.</w:t>
       </w:r>
+      <w:r>
+        <w:rPr>
+          <w:rFonts w:ascii="Calibri" w:hAnsi="Calibri"/>
+          <w:i/>
+        </w:rPr>
+        <w:t xml:space="preserve"> Why it matters: </w:t>
+      </w:r>
+      <w:r>
+        <w:rPr>
+          <w:rFonts w:ascii="Calibri" w:hAnsi="Calibri"/>
+        </w:rPr>
+        <w:t>Chasing a number above the band usually means chasing clickbait, not better packaging.</w:t>
+      </w:r>
     </w:p>
     <w:p>
       <w:r>
@@ -24298,6 +24872,19 @@
         </w:rPr>
         <w:t>Studio’s label for how a viewer reached a video: search, suggested videos, browse features, playlists, external, and others. Views from links in video descriptions are filed under suggested videos.</w:t>
       </w:r>
+      <w:r>
+        <w:rPr>
+          <w:rFonts w:ascii="Calibri" w:hAnsi="Calibri"/>
+          <w:i/>
+        </w:rPr>
+        <w:t xml:space="preserve"> Why it matters: </w:t>
+      </w:r>
+      <w:r>
+        <w:rPr>
+          <w:rFonts w:ascii="Calibri" w:hAnsi="Calibri"/>
+        </w:rPr>
+        <w:t>Knowing where viewers came from decides whether the fix is the title, the thumbnail, or neither.</w:t>
+      </w:r>
     </w:p>
     <w:p>
       <w:r>
@@ -24313,6 +24900,19 @@
         </w:rPr>
         <w:t>Timestamps in the description that split a video into named parts. The first is 00:00, there are at least three, and each part is at least ten seconds.</w:t>
       </w:r>
+      <w:r>
+        <w:rPr>
+          <w:rFonts w:ascii="Calibri" w:hAnsi="Calibri"/>
+          <w:i/>
+        </w:rPr>
+        <w:t xml:space="preserve"> Why it matters: </w:t>
+      </w:r>
+      <w:r>
+        <w:rPr>
+          <w:rFonts w:ascii="Calibri" w:hAnsi="Calibri"/>
+        </w:rPr>
+        <w:t>They let a viewer who wants one part jump there instead of leaving the video.</w:t>
+      </w:r>
     </w:p>
     <w:p>
       <w:r>
@@ -24328,6 +24928,19 @@
         </w:rPr>
         <w:t>What a first violation typically gets. An optional policy training lets it expire 90 days after the training. A further violation of the same policy in that window can become a strike.</w:t>
       </w:r>
+      <w:r>
+        <w:rPr>
+          <w:rFonts w:ascii="Calibri" w:hAnsi="Calibri"/>
+          <w:i/>
+        </w:rPr>
+        <w:t xml:space="preserve"> Why it matters: </w:t>
+      </w:r>
+      <w:r>
+        <w:rPr>
+          <w:rFonts w:ascii="Calibri" w:hAnsi="Calibri"/>
+        </w:rPr>
+        <w:t>Letting the training lapse without doing it leaves the channel exposed to a strike on the very next similar mistake.</w:t>
+      </w:r>
     </w:p>
     <w:p>
       <w:r>
@@ -24343,6 +24956,19 @@
         </w:rPr>
         <w:t>The result of a valid legal removal request. The video comes down. It expires 90 days after it was applied once Copyright School is done, or it can be resolved by a retraction or a counter notification.</w:t>
       </w:r>
+      <w:r>
+        <w:rPr>
+          <w:rFonts w:ascii="Calibri" w:hAnsi="Calibri"/>
+          <w:i/>
+        </w:rPr>
+        <w:t xml:space="preserve"> Why it matters: </w:t>
+      </w:r>
+      <w:r>
+        <w:rPr>
+          <w:rFonts w:ascii="Calibri" w:hAnsi="Calibri"/>
+        </w:rPr>
+        <w:t>Three of them in 90 days put the whole channel at risk of termination.</w:t>
+      </w:r>
     </w:p>
     <w:p>
       <w:r>
@@ -24358,6 +24984,19 @@
         </w:rPr>
         <w:t>An automatic match against a rights holder’s file. It affects that video: monetize, track, or block. It is not a strike, unless a dispute without a valid reason leads to a removal request.</w:t>
       </w:r>
+      <w:r>
+        <w:rPr>
+          <w:rFonts w:ascii="Calibri" w:hAnsi="Calibri"/>
+          <w:i/>
+        </w:rPr>
+        <w:t xml:space="preserve"> Why it matters: </w:t>
+      </w:r>
+      <w:r>
+        <w:rPr>
+          <w:rFonts w:ascii="Calibri" w:hAnsi="Calibri"/>
+        </w:rPr>
+        <w:t>It is not a strike, but disputing one without a real reason can become one.</w:t>
+      </w:r>
     </w:p>
     <w:p>
       <w:r>
@@ -24373,6 +25012,19 @@
         </w:rPr>
         <w:t>The option in video details you select when a company paid you or gave you the product for a video. YouTube then shows a disclosure. Say it in the video as well.</w:t>
       </w:r>
+      <w:r>
+        <w:rPr>
+          <w:rFonts w:ascii="Calibri" w:hAnsi="Calibri"/>
+          <w:i/>
+        </w:rPr>
+        <w:t xml:space="preserve"> Why it matters: </w:t>
+      </w:r>
+      <w:r>
+        <w:rPr>
+          <w:rFonts w:ascii="Calibri" w:hAnsi="Calibri"/>
+        </w:rPr>
+        <w:t>Switching it on is a legal disclosure, not just a Studio formality.</w:t>
+      </w:r>
     </w:p>
     <w:p>
       <w:r>
@@ -24388,6 +25040,19 @@
         </w:rPr>
         <w:t>The upload setting for realistic content that generative AI made or meaningfully altered, including AI-generated music that is the main focus of the video. Scripts, ideas, captions, thumbnails, and a clone of your own voice for voice-overs do not need it.</w:t>
       </w:r>
+      <w:r>
+        <w:rPr>
+          <w:rFonts w:ascii="Calibri" w:hAnsi="Calibri"/>
+          <w:i/>
+        </w:rPr>
+        <w:t xml:space="preserve"> Why it matters: </w:t>
+      </w:r>
+      <w:r>
+        <w:rPr>
+          <w:rFonts w:ascii="Calibri" w:hAnsi="Calibri"/>
+        </w:rPr>
+        <w:t>Leaving it off on content that needed it risks a disclosure penalty, not just a label.</w:t>
+      </w:r>
     </w:p>
     <w:p>
       <w:r>
@@ -24402,6 +25067,19 @@
           <w:rFonts w:ascii="Calibri" w:hAnsi="Calibri"/>
         </w:rPr>
         <w:t>The audience setting for videos directed to children, required under US law. It turns off comments, end screens, personalized ads, memberships, Supers, and more on those videos.</w:t>
+      </w:r>
+      <w:r>
+        <w:rPr>
+          <w:rFonts w:ascii="Calibri" w:hAnsi="Calibri"/>
+          <w:i/>
+        </w:rPr>
+        <w:t xml:space="preserve"> Why it matters: </w:t>
+      </w:r>
+      <w:r>
+        <w:rPr>
+          <w:rFonts w:ascii="Calibri" w:hAnsi="Calibri"/>
+        </w:rPr>
+        <w:t>It switches off several income streams at once, so setting it by habit rather than by fact costs real money.</w:t>
       </w:r>
     </w:p>
     <w:p>

</xml_diff>

<commit_message>
YouTube book: finalize for KDP
Final completeness/proofing pass rather than new infrastructure --
the builder's front/back matter was already solid. Added the one real
gap found: chapter 15 was missing from the backmatter Sources summary
that every other chapter has an entry in. Confirmed no placeholder
text, no stray markdown, no broken structure anywhere in the docx.
Updated KDP_Description.md's revision date and character-count note.

Co-Authored-By: Claude Sonnet 5 <noreply@anthropic.com>
Claude-Session: https://claude.ai/code/session_01SRhcHKTsmWne9LTaP7asUs
</commit_message>
<xml_diff>
--- a/Your First YouTube Channel That Rocks/Your First YouTube Channel That Rocks.docx
+++ b/Your First YouTube Channel That Rocks/Your First YouTube Channel That Rocks.docx
@@ -25236,6 +25236,15 @@
           <w:i/>
         </w:rPr>
         <w:t>Chapter 14. Other platforms were checked against the linked official page in October 2026. X’s Help Center page was read in the Internet Archive’s copy of 22 September 2026, because the live page refuses automated requests. The diagnostic order is the author’s recommendation.</w:t>
+      </w:r>
+    </w:p>
+    <w:p>
+      <w:r>
+        <w:rPr>
+          <w:rFonts w:ascii="Calibri" w:hAnsi="Calibri"/>
+          <w:i/>
+        </w:rPr>
+        <w:t>Chapter 15. The workbook is the author’s own editorial structure, not a set of sourced claims. The bathroom-repair sheet and its money line are hypothetical illustrations, not a measured channel. The membership share and the affiliate disclosure requirement are cited to chapters 12 and 13 and the FTC’s Endorsement Guides.</w:t>
       </w:r>
     </w:p>
     <w:p>

</xml_diff>

<commit_message>
YouTube book audit: remove unverifiable case studies, correct h3h3 case, no personal names
Co-Authored-By: Claude Sonnet 5.5 <noreply@anthropic.com>
Claude-Session: https://claude.ai/code/session_012trHMyb3cJDTwS99K5EPVy
</commit_message>
<xml_diff>
--- a/Your First YouTube Channel That Rocks/Your First YouTube Channel That Rocks.docx
+++ b/Your First YouTube Channel That Rocks/Your First YouTube Channel That Rocks.docx
@@ -5313,44 +5313,6 @@
         <w:t>, YouTube keeps the version with the highest watch time, not the one with the most clicks.</w:t>
       </w:r>
     </w:p>
-    <w:tbl>
-      <w:tblPr>
-        <w:tblW w:type="auto" w:w="0"/>
-        <w:tblLayout w:type="fixed"/>
-        <w:tblLook w:firstColumn="1" w:firstRow="1" w:lastColumn="0" w:lastRow="0" w:noHBand="0" w:noVBand="1" w:val="04A0"/>
-      </w:tblPr>
-      <w:tblGrid>
-        <w:gridCol w:w="8064"/>
-      </w:tblGrid>
-      <w:tr>
-        <w:tc>
-          <w:tcPr>
-            <w:tcW w:type="dxa" w:w="8064"/>
-            <w:tcW w:w="8063" w:type="dxa"/>
-            <w:shd w:val="clear" w:color="auto" w:fill="F3F1EA"/>
-          </w:tcPr>
-          <w:p>
-            <w:pPr>
-              <w:spacing w:after="40" w:before="40"/>
-            </w:pPr>
-            <w:r>
-              <w:rPr>
-                <w:rFonts w:ascii="Calibri" w:hAnsi="Calibri"/>
-                <w:sz w:val="22"/>
-              </w:rPr>
-            </w:r>
-            <w:r>
-              <w:rPr>
-                <w:rFonts w:ascii="Calibri" w:hAnsi="Calibri"/>
-                <w:sz w:val="22"/>
-              </w:rPr>
-              <w:t>Case study: MrBeast’s thumbnail team has described testing as many as fifty thumbnails for a single video before one goes live. The team has talked publicly about one such test: a closed-mouth expression run against an open-mouth one across roughly thirty videos, where the closed-mouth version won on watch time nearly every time — a small difference per video that held up because it repeated thirty times in a row. The team also points to a simpler habit: putting the same recognizable face in every thumbnail, a practice it started in 2019, specifically to build the kind of trust that lets a subscriber click without reading the title first. Both are tests of what keeps people watching, not just what gets the click.</w:t>
-            </w:r>
-          </w:p>
-        </w:tc>
-      </w:tr>
-    </w:tbl>
-    <w:p/>
     <w:p>
       <w:bookmarkStart w:id="17" w:name="toc16"/>
       <w:pPr>
@@ -6187,24 +6149,7 @@
           <w:rFonts w:ascii="Calibri" w:hAnsi="Calibri"/>
           <w:i/>
         </w:rPr>
-        <w:t xml:space="preserve">Sources: The MrBeast thumbnail case study is drawn from a YouTube-produced interview with the channel’s thumbnail designer, as reported by </w:t>
-      </w:r>
-      <w:hyperlink r:id="rId40">
-        <w:r>
-          <w:rPr>
-            <w:rStyle w:val="Hyperlink"/>
-            <w:sz w:val="22"/>
-            <w:rFonts w:ascii="Calibri" w:hAnsi="Calibri"/>
-          </w:rPr>
-          <w:t xml:space="preserve">Social Media Today</w:t>
-        </w:r>
-      </w:hyperlink>
-      <w:r>
-        <w:rPr>
-          <w:rFonts w:ascii="Calibri" w:hAnsi="Calibri"/>
-          <w:i/>
-        </w:rPr>
-        <w:t xml:space="preserve"> and corroborated by independent coverage of the same interview; this book could not fetch the original interview video directly, so the specific wording is treated as the verification standard actually met — a quote repeated consistently across independent reporting, not a verbatim transcript pulled by this book. </w:t>
+        <w:t xml:space="preserve">Sources: </w:t>
       </w:r>
       <w:hyperlink r:id="rId31">
         <w:r>
@@ -6359,7 +6304,7 @@
         </w:rPr>
         <w:t xml:space="preserve">, </w:t>
       </w:r>
-      <w:hyperlink r:id="rId41">
+      <w:hyperlink r:id="rId40">
         <w:r>
           <w:rPr>
             <w:rStyle w:val="Hyperlink"/>
@@ -6376,7 +6321,7 @@
         </w:rPr>
         <w:t xml:space="preserve">, </w:t>
       </w:r>
-      <w:hyperlink r:id="rId42">
+      <w:hyperlink r:id="rId41">
         <w:r>
           <w:rPr>
             <w:rStyle w:val="Hyperlink"/>
@@ -6393,7 +6338,7 @@
         </w:rPr>
         <w:t xml:space="preserve">, </w:t>
       </w:r>
-      <w:hyperlink r:id="rId43">
+      <w:hyperlink r:id="rId42">
         <w:r>
           <w:rPr>
             <w:rStyle w:val="Hyperlink"/>
@@ -6513,7 +6458,7 @@
                     <pic:cNvPicPr/>
                   </pic:nvPicPr>
                   <pic:blipFill>
-                    <a:blip r:embed="rId46"/>
+                    <a:blip r:embed="rId45"/>
                     <a:stretch>
                       <a:fillRect/>
                     </a:stretch>
@@ -7057,7 +7002,7 @@
       <w:pPr>
         <w:pStyle w:val="ListBullet"/>
       </w:pPr>
-      <w:hyperlink r:id="rId47">
+      <w:hyperlink r:id="rId46">
         <w:r>
           <w:rPr>
             <w:rStyle w:val="Hyperlink"/>
@@ -7078,7 +7023,7 @@
       <w:pPr>
         <w:pStyle w:val="ListBullet"/>
       </w:pPr>
-      <w:hyperlink r:id="rId48">
+      <w:hyperlink r:id="rId47">
         <w:r>
           <w:rPr>
             <w:rStyle w:val="Hyperlink"/>
@@ -7102,7 +7047,7 @@
         </w:rPr>
         <w:t xml:space="preserve">Whatever editor exports the file, match </w:t>
       </w:r>
-      <w:hyperlink r:id="rId49">
+      <w:hyperlink r:id="rId48">
         <w:r>
           <w:rPr>
             <w:rStyle w:val="Hyperlink"/>
@@ -7141,7 +7086,7 @@
       <w:pPr>
         <w:pStyle w:val="ListBullet"/>
       </w:pPr>
-      <w:hyperlink r:id="rId50">
+      <w:hyperlink r:id="rId49">
         <w:r>
           <w:rPr>
             <w:rStyle w:val="Hyperlink"/>
@@ -7162,7 +7107,7 @@
       <w:pPr>
         <w:pStyle w:val="ListBullet"/>
       </w:pPr>
-      <w:hyperlink r:id="rId51">
+      <w:hyperlink r:id="rId50">
         <w:r>
           <w:rPr>
             <w:rStyle w:val="Hyperlink"/>
@@ -7222,7 +7167,7 @@
         </w:rPr>
         <w:t xml:space="preserve"> Official rule: </w:t>
       </w:r>
-      <w:hyperlink r:id="rId52">
+      <w:hyperlink r:id="rId51">
         <w:r>
           <w:rPr>
             <w:rStyle w:val="Hyperlink"/>
@@ -7243,7 +7188,7 @@
       <w:pPr>
         <w:pStyle w:val="ListBullet"/>
       </w:pPr>
-      <w:hyperlink r:id="rId53">
+      <w:hyperlink r:id="rId52">
         <w:r>
           <w:rPr>
             <w:rStyle w:val="Hyperlink"/>
@@ -7382,7 +7327,7 @@
         </w:rPr>
         <w:t xml:space="preserve"> YouTube’s </w:t>
       </w:r>
-      <w:hyperlink r:id="rId41">
+      <w:hyperlink r:id="rId40">
         <w:r>
           <w:rPr>
             <w:rStyle w:val="Hyperlink"/>
@@ -7465,7 +7410,7 @@
       <w:pPr>
         <w:pStyle w:val="ListBullet"/>
       </w:pPr>
-      <w:hyperlink r:id="rId54">
+      <w:hyperlink r:id="rId53">
         <w:r>
           <w:rPr>
             <w:rStyle w:val="Hyperlink"/>
@@ -7581,7 +7526,7 @@
         </w:rPr>
         <w:t xml:space="preserve">Voice: </w:t>
       </w:r>
-      <w:hyperlink r:id="rId55">
+      <w:hyperlink r:id="rId54">
         <w:r>
           <w:rPr>
             <w:rStyle w:val="Hyperlink"/>
@@ -7616,7 +7561,7 @@
         </w:rPr>
         <w:t xml:space="preserve">Footage: </w:t>
       </w:r>
-      <w:hyperlink r:id="rId56">
+      <w:hyperlink r:id="rId55">
         <w:r>
           <w:rPr>
             <w:rStyle w:val="Hyperlink"/>
@@ -7639,7 +7584,7 @@
         </w:rPr>
         <w:t xml:space="preserve"> Text-to-video and image generation. The pricing page lists a free plan with 125 one-time credits, and a Standard plan at $15 a month ($12 billed yearly) with 625 credits a month, listing “No watermarks” among its features. Runway’s </w:t>
       </w:r>
-      <w:hyperlink r:id="rId57">
+      <w:hyperlink r:id="rId56">
         <w:r>
           <w:rPr>
             <w:rStyle w:val="Hyperlink"/>
@@ -7736,44 +7681,6 @@
         <w:t>One path borrows nobody’s words, voice, or picture: rewrite an idea entirely in your own words, record it in your own voice, and pair it with visuals you filmed, drew, or photographed. Everything else in this chapter adds a check. A text-to-speech voice is usable when it is not a clone of someone else. A stock clip is usable after you have read its license. Generated footage is usable after you have read the tool’s commercial-use terms. “I generated it” replaces none of those readings.</w:t>
       </w:r>
     </w:p>
-    <w:tbl>
-      <w:tblPr>
-        <w:tblW w:type="auto" w:w="0"/>
-        <w:tblLayout w:type="fixed"/>
-        <w:tblLook w:firstColumn="1" w:firstRow="1" w:lastColumn="0" w:lastRow="0" w:noHBand="0" w:noVBand="1" w:val="04A0"/>
-      </w:tblPr>
-      <w:tblGrid>
-        <w:gridCol w:w="8064"/>
-      </w:tblGrid>
-      <w:tr>
-        <w:tc>
-          <w:tcPr>
-            <w:tcW w:type="dxa" w:w="8064"/>
-            <w:tcW w:w="8063" w:type="dxa"/>
-            <w:shd w:val="clear" w:color="auto" w:fill="F3F1EA"/>
-          </w:tcPr>
-          <w:p>
-            <w:pPr>
-              <w:spacing w:after="40" w:before="40"/>
-            </w:pPr>
-            <w:r>
-              <w:rPr>
-                <w:rFonts w:ascii="Calibri" w:hAnsi="Calibri"/>
-                <w:sz w:val="22"/>
-              </w:rPr>
-            </w:r>
-            <w:r>
-              <w:rPr>
-                <w:rFonts w:ascii="Calibri" w:hAnsi="Calibri"/>
-                <w:sz w:val="22"/>
-              </w:rPr>
-              <w:t>Case study: The channel Primitive Technology, launched in Far North Queensland, Australia, in May 2015, takes that workflow further than most creators ever need to. Every video shows its creator building a tool or a shelter from materials gathered on camera, with no spoken narration at all — only the ambient sound of the work itself, and short on-screen text captions where a word is needed. There is no script to license, no voice to clone, no stock clip to check, and no music bed that could draw a copyright claim. The channel passed several million subscribers within a few years of launching and has grown well past ten million since, which is proof that “cheap” and “thin” are not the same thing: a video with no budget at all for voice, music, or licensed footage can still be the kind of video a stranger finishes.</w:t>
-            </w:r>
-          </w:p>
-        </w:tc>
-      </w:tr>
-    </w:tbl>
-    <w:p/>
     <w:p>
       <w:r>
         <w:rPr>
@@ -7873,9 +7780,9 @@
           <w:rFonts w:ascii="Calibri" w:hAnsi="Calibri"/>
           <w:i/>
         </w:rPr>
-        <w:t xml:space="preserve">Sources: The Primitive Technology case study (launch date, location, and format) is corroborated across its Wikipedia entry and independent channel-stats coverage; subscriber figures are rounded and approximate, not a number this book pulled from the channel’s own disclosure. </w:t>
-      </w:r>
-      <w:hyperlink r:id="rId49">
+        <w:t xml:space="preserve">Sources: </w:t>
+      </w:r>
+      <w:hyperlink r:id="rId48">
         <w:r>
           <w:rPr>
             <w:rStyle w:val="Hyperlink"/>
@@ -7892,7 +7799,7 @@
         </w:rPr>
         <w:t xml:space="preserve">. </w:t>
       </w:r>
-      <w:hyperlink r:id="rId52">
+      <w:hyperlink r:id="rId51">
         <w:r>
           <w:rPr>
             <w:rStyle w:val="Hyperlink"/>
@@ -7926,7 +7833,7 @@
         </w:rPr>
         <w:t xml:space="preserve"> (rights statement). </w:t>
       </w:r>
-      <w:hyperlink r:id="rId41">
+      <w:hyperlink r:id="rId40">
         <w:r>
           <w:rPr>
             <w:rStyle w:val="Hyperlink"/>
@@ -7943,7 +7850,7 @@
         </w:rPr>
         <w:t xml:space="preserve"> and </w:t>
       </w:r>
-      <w:hyperlink r:id="rId42">
+      <w:hyperlink r:id="rId41">
         <w:r>
           <w:rPr>
             <w:rStyle w:val="Hyperlink"/>
@@ -7960,7 +7867,7 @@
         </w:rPr>
         <w:t xml:space="preserve">. </w:t>
       </w:r>
-      <w:hyperlink r:id="rId58">
+      <w:hyperlink r:id="rId57">
         <w:r>
           <w:rPr>
             <w:rStyle w:val="Hyperlink"/>
@@ -7977,7 +7884,7 @@
         </w:rPr>
         <w:t xml:space="preserve">. Tool facts are from each tool’s own page, opened October 2026: </w:t>
       </w:r>
-      <w:hyperlink r:id="rId47">
+      <w:hyperlink r:id="rId46">
         <w:r>
           <w:rPr>
             <w:rStyle w:val="Hyperlink"/>
@@ -7994,7 +7901,7 @@
         </w:rPr>
         <w:t xml:space="preserve">, </w:t>
       </w:r>
-      <w:hyperlink r:id="rId59">
+      <w:hyperlink r:id="rId58">
         <w:r>
           <w:rPr>
             <w:rStyle w:val="Hyperlink"/>
@@ -8011,7 +7918,7 @@
         </w:rPr>
         <w:t xml:space="preserve">, </w:t>
       </w:r>
-      <w:hyperlink r:id="rId50">
+      <w:hyperlink r:id="rId49">
         <w:r>
           <w:rPr>
             <w:rStyle w:val="Hyperlink"/>
@@ -8028,7 +7935,7 @@
         </w:rPr>
         <w:t xml:space="preserve">, </w:t>
       </w:r>
-      <w:hyperlink r:id="rId51">
+      <w:hyperlink r:id="rId50">
         <w:r>
           <w:rPr>
             <w:rStyle w:val="Hyperlink"/>
@@ -8045,7 +7952,7 @@
         </w:rPr>
         <w:t xml:space="preserve">, </w:t>
       </w:r>
-      <w:hyperlink r:id="rId53">
+      <w:hyperlink r:id="rId52">
         <w:r>
           <w:rPr>
             <w:rStyle w:val="Hyperlink"/>
@@ -8062,7 +7969,7 @@
         </w:rPr>
         <w:t xml:space="preserve"> and </w:t>
       </w:r>
-      <w:hyperlink r:id="rId60">
+      <w:hyperlink r:id="rId59">
         <w:r>
           <w:rPr>
             <w:rStyle w:val="Hyperlink"/>
@@ -8079,7 +7986,7 @@
         </w:rPr>
         <w:t xml:space="preserve">, </w:t>
       </w:r>
-      <w:hyperlink r:id="rId54">
+      <w:hyperlink r:id="rId53">
         <w:r>
           <w:rPr>
             <w:rStyle w:val="Hyperlink"/>
@@ -8096,7 +8003,7 @@
         </w:rPr>
         <w:t xml:space="preserve">. AI examples: </w:t>
       </w:r>
-      <w:hyperlink r:id="rId55">
+      <w:hyperlink r:id="rId54">
         <w:r>
           <w:rPr>
             <w:rStyle w:val="Hyperlink"/>
@@ -8113,7 +8020,7 @@
         </w:rPr>
         <w:t xml:space="preserve">, </w:t>
       </w:r>
-      <w:hyperlink r:id="rId56">
+      <w:hyperlink r:id="rId55">
         <w:r>
           <w:rPr>
             <w:rStyle w:val="Hyperlink"/>
@@ -8130,7 +8037,7 @@
         </w:rPr>
         <w:t xml:space="preserve"> and </w:t>
       </w:r>
-      <w:hyperlink r:id="rId57">
+      <w:hyperlink r:id="rId56">
         <w:r>
           <w:rPr>
             <w:rStyle w:val="Hyperlink"/>
@@ -8151,8 +8058,8 @@
     <w:p>
       <w:pPr>
         <w:sectPr>
-          <w:headerReference w:type="default" r:id="rId44"/>
-          <w:footerReference w:type="default" r:id="rId45"/>
+          <w:headerReference w:type="default" r:id="rId43"/>
+          <w:footerReference w:type="default" r:id="rId44"/>
           <w:pgSz w:w="10080" w:h="14400"/>
           <w:pgMar w:top="1008" w:right="1008" w:bottom="1008" w:left="1008" w:header="504" w:footer="504" w:gutter="0"/>
           <w:cols w:space="720"/>
@@ -8620,7 +8527,7 @@
               </w:rPr>
               <w:t xml:space="preserve">Worked example. Spoken English for a teaching video often lands somewhere around 130 to 160 words a minute. Treat that as a starting guess and time yourself; yours will differ. A 1,200-word script at 150 words a minute is about eight minutes before any demonstration is added. If the method takes three minutes to show on screen, the video is about eleven minutes. Length has one published money rule (official rule): </w:t>
             </w:r>
-            <w:hyperlink r:id="rId63">
+            <w:hyperlink r:id="rId62">
               <w:r>
                 <w:rPr>
                   <w:rStyle w:val="Hyperlink"/>
@@ -8899,7 +8806,7 @@
         </w:rPr>
         <w:t xml:space="preserve">Many of the eight jobs are better as a screen than as a face: the spreadsheet, the checklist, the software. A free screen recorder such as </w:t>
       </w:r>
-      <w:hyperlink r:id="rId54">
+      <w:hyperlink r:id="rId53">
         <w:r>
           <w:rPr>
             <w:rStyle w:val="Hyperlink"/>
@@ -9065,7 +8972,7 @@
         </w:rPr>
         <w:t>Then add video chapters. Official rule (</w:t>
       </w:r>
-      <w:hyperlink r:id="rId64">
+      <w:hyperlink r:id="rId63">
         <w:r>
           <w:rPr>
             <w:rStyle w:val="Hyperlink"/>
@@ -9105,7 +9012,7 @@
         <w:rPr>
           <w:rFonts w:ascii="Calibri" w:hAnsi="Calibri"/>
         </w:rPr>
-        <w:t>The last minute of a teaching video is where most channels stack everything: subscribe, like, comment, the other channel, the newsletter, the sponsor. Author recommendation: one ask and one next video.</w:t>
+        <w:t>The last minute of a teaching video is where it is tempting to stack everything: subscribe, like, comment, the other channel, the newsletter, the sponsor. Author recommendation: one ask and one next video.</w:t>
       </w:r>
     </w:p>
     <w:p>
@@ -9123,7 +9030,7 @@
         </w:rPr>
         <w:t xml:space="preserve">Official rule: </w:t>
       </w:r>
-      <w:hyperlink r:id="rId65">
+      <w:hyperlink r:id="rId64">
         <w:r>
           <w:rPr>
             <w:rStyle w:val="Hyperlink"/>
@@ -9337,7 +9244,7 @@
         </w:rPr>
         <w:t xml:space="preserve">Sources: </w:t>
       </w:r>
-      <w:hyperlink r:id="rId63">
+      <w:hyperlink r:id="rId62">
         <w:r>
           <w:rPr>
             <w:rStyle w:val="Hyperlink"/>
@@ -9354,7 +9261,7 @@
         </w:rPr>
         <w:t xml:space="preserve"> (eight-minute rule, natural breaks). </w:t>
       </w:r>
-      <w:hyperlink r:id="rId64">
+      <w:hyperlink r:id="rId63">
         <w:r>
           <w:rPr>
             <w:rStyle w:val="Hyperlink"/>
@@ -9371,7 +9278,7 @@
         </w:rPr>
         <w:t xml:space="preserve">. </w:t>
       </w:r>
-      <w:hyperlink r:id="rId65">
+      <w:hyperlink r:id="rId64">
         <w:r>
           <w:rPr>
             <w:rStyle w:val="Hyperlink"/>
@@ -9392,8 +9299,8 @@
     <w:p>
       <w:pPr>
         <w:sectPr>
-          <w:headerReference w:type="default" r:id="rId61"/>
-          <w:footerReference w:type="default" r:id="rId62"/>
+          <w:headerReference w:type="default" r:id="rId60"/>
+          <w:footerReference w:type="default" r:id="rId61"/>
           <w:pgSz w:w="10080" w:h="14400"/>
           <w:pgMar w:top="1008" w:right="1008" w:bottom="1008" w:left="1008" w:header="504" w:footer="504" w:gutter="0"/>
           <w:cols w:space="720"/>
@@ -9837,7 +9744,7 @@
         </w:rPr>
         <w:t xml:space="preserve">Sources: </w:t>
       </w:r>
-      <w:hyperlink r:id="rId63">
+      <w:hyperlink r:id="rId62">
         <w:r>
           <w:rPr>
             <w:rStyle w:val="Hyperlink"/>
@@ -9892,8 +9799,8 @@
     <w:p>
       <w:pPr>
         <w:sectPr>
-          <w:headerReference w:type="default" r:id="rId66"/>
-          <w:footerReference w:type="default" r:id="rId67"/>
+          <w:headerReference w:type="default" r:id="rId65"/>
+          <w:footerReference w:type="default" r:id="rId66"/>
           <w:pgSz w:w="10080" w:h="14400"/>
           <w:pgMar w:top="1008" w:right="1008" w:bottom="1008" w:left="1008" w:header="504" w:footer="504" w:gutter="0"/>
           <w:cols w:space="720"/>
@@ -10255,8 +10162,8 @@
     <w:p>
       <w:pPr>
         <w:sectPr>
-          <w:headerReference w:type="default" r:id="rId68"/>
-          <w:footerReference w:type="default" r:id="rId69"/>
+          <w:headerReference w:type="default" r:id="rId67"/>
+          <w:footerReference w:type="default" r:id="rId68"/>
           <w:pgSz w:w="10080" w:h="14400"/>
           <w:pgMar w:top="1008" w:right="1008" w:bottom="1008" w:left="1008" w:header="504" w:footer="504" w:gutter="0"/>
           <w:cols w:space="720"/>
@@ -10742,7 +10649,7 @@
         </w:rPr>
         <w:t xml:space="preserve">An impression, in Studio, is not every time your video exists somewhere. YouTube’s </w:t>
       </w:r>
-      <w:hyperlink r:id="rId72">
+      <w:hyperlink r:id="rId71">
         <w:r>
           <w:rPr>
             <w:rStyle w:val="Hyperlink"/>
@@ -10766,7 +10673,7 @@
         </w:rPr>
         <w:t xml:space="preserve">YouTube’s </w:t>
       </w:r>
-      <w:hyperlink r:id="rId73">
+      <w:hyperlink r:id="rId72">
         <w:r>
           <w:rPr>
             <w:rStyle w:val="Hyperlink"/>
@@ -10880,7 +10787,7 @@
         </w:rPr>
         <w:t xml:space="preserve">Open a video’s Analytics and choose Reach. The report YouTube’s </w:t>
       </w:r>
-      <w:hyperlink r:id="rId74">
+      <w:hyperlink r:id="rId73">
         <w:r>
           <w:rPr>
             <w:rStyle w:val="Hyperlink"/>
@@ -11559,59 +11466,6 @@
         <w:t>Everything else on the Reach tab is context. It is worth a glance once a month. It is not worth a decision once a week.</w:t>
       </w:r>
     </w:p>
-    <w:tbl>
-      <w:tblPr>
-        <w:tblW w:type="auto" w:w="0"/>
-        <w:tblLayout w:type="fixed"/>
-        <w:tblLook w:firstColumn="1" w:firstRow="1" w:lastColumn="0" w:lastRow="0" w:noHBand="0" w:noVBand="1" w:val="04A0"/>
-      </w:tblPr>
-      <w:tblGrid>
-        <w:gridCol w:w="8064"/>
-      </w:tblGrid>
-      <w:tr>
-        <w:tc>
-          <w:tcPr>
-            <w:tcW w:type="dxa" w:w="8064"/>
-            <w:tcW w:w="8063" w:type="dxa"/>
-            <w:shd w:val="clear" w:color="auto" w:fill="F3F1EA"/>
-          </w:tcPr>
-          <w:p>
-            <w:pPr>
-              <w:spacing w:after="40" w:before="40"/>
-            </w:pPr>
-            <w:r>
-              <w:rPr>
-                <w:rFonts w:ascii="Calibri" w:hAnsi="Calibri"/>
-                <w:sz w:val="22"/>
-              </w:rPr>
-            </w:r>
-            <w:r>
-              <w:rPr>
-                <w:rFonts w:ascii="Calibri" w:hAnsi="Calibri"/>
-                <w:sz w:val="22"/>
-              </w:rPr>
-              <w:t xml:space="preserve">Case study: In 2008, Weezer posted a video for their song “Pork and Beans” and picked up close to two million views within days — the kind of number a channel might credit to the song or the YouTube home page. Their team opened YouTube’s traffic-source report of the time (then called Insight) and found something they had not expected: a large share of early viewers had arrived by way of technology blogs linking to the video, not by searching or browsing YouTube itself. Three days in, 38% of viewers had found the video off YouTube entirely. Ben Patterson, who worked on the band’s digital strategy, said what made the report useful was exactly the thing this section is about: not the view count, but </w:t>
-            </w:r>
-            <w:r>
-              <w:rPr>
-                <w:rFonts w:ascii="Calibri" w:hAnsi="Calibri"/>
-                <w:i/>
-                <w:sz w:val="22"/>
-              </w:rPr>
-              <w:t>how</w:t>
-            </w:r>
-            <w:r>
-              <w:rPr>
-                <w:rFonts w:ascii="Calibri" w:hAnsi="Calibri"/>
-                <w:sz w:val="22"/>
-              </w:rPr>
-              <w:t xml:space="preserve"> people found the video. The report has a different name and a different layout today. The question it answers for a creator reading Reach in Studio has not changed.</w:t>
-            </w:r>
-          </w:p>
-        </w:tc>
-      </w:tr>
-    </w:tbl>
-    <w:p/>
     <w:p>
       <w:bookmarkStart w:id="60" w:name="toc59"/>
       <w:pPr>
@@ -11699,7 +11553,7 @@
         </w:rPr>
         <w:t xml:space="preserve">Studio’s </w:t>
       </w:r>
-      <w:hyperlink r:id="rId75">
+      <w:hyperlink r:id="rId74">
         <w:r>
           <w:rPr>
             <w:rStyle w:val="Hyperlink"/>
@@ -11998,7 +11852,7 @@
           <w:rFonts w:ascii="Calibri" w:hAnsi="Calibri"/>
           <w:i/>
         </w:rPr>
-        <w:t xml:space="preserve">Sources: The Weezer case study is from contemporaneous 2008 reporting, including an interview with YouTube’s own product management team conducted by Eric Enge, and independent news coverage of the same episode at the time; this book treats the 38% figure and the Ben Patterson quote as well-corroborated history, not a number audited by this book. YouTube Insight was the analytics tool of that era and is not the current Reach tab; the lesson about reading traffic sources carries over. </w:t>
+        <w:t xml:space="preserve">Sources: </w:t>
       </w:r>
       <w:hyperlink r:id="rId21">
         <w:r>
@@ -12017,7 +11871,7 @@
         </w:rPr>
         <w:t xml:space="preserve"> (what qualifies). </w:t>
       </w:r>
-      <w:hyperlink r:id="rId72">
+      <w:hyperlink r:id="rId71">
         <w:r>
           <w:rPr>
             <w:rStyle w:val="Hyperlink"/>
@@ -12034,7 +11888,7 @@
         </w:rPr>
         <w:t xml:space="preserve">. </w:t>
       </w:r>
-      <w:hyperlink r:id="rId73">
+      <w:hyperlink r:id="rId72">
         <w:r>
           <w:rPr>
             <w:rStyle w:val="Hyperlink"/>
@@ -12051,7 +11905,7 @@
         </w:rPr>
         <w:t xml:space="preserve">. </w:t>
       </w:r>
-      <w:hyperlink r:id="rId74">
+      <w:hyperlink r:id="rId73">
         <w:r>
           <w:rPr>
             <w:rStyle w:val="Hyperlink"/>
@@ -12068,7 +11922,7 @@
         </w:rPr>
         <w:t xml:space="preserve"> (traffic sources, search terms, content suggesting this video). </w:t>
       </w:r>
-      <w:hyperlink r:id="rId75">
+      <w:hyperlink r:id="rId74">
         <w:r>
           <w:rPr>
             <w:rStyle w:val="Hyperlink"/>
@@ -12089,8 +11943,8 @@
     <w:p>
       <w:pPr>
         <w:sectPr>
-          <w:headerReference w:type="default" r:id="rId70"/>
-          <w:footerReference w:type="default" r:id="rId71"/>
+          <w:headerReference w:type="default" r:id="rId69"/>
+          <w:footerReference w:type="default" r:id="rId70"/>
           <w:pgSz w:w="10080" w:h="14400"/>
           <w:pgMar w:top="1008" w:right="1008" w:bottom="1008" w:left="1008" w:header="504" w:footer="504" w:gutter="0"/>
           <w:cols w:space="720"/>
@@ -12274,47 +12128,9 @@
         <w:rPr>
           <w:rFonts w:ascii="Calibri" w:hAnsi="Calibri"/>
         </w:rPr>
-        <w:t>Second, the routes are different sizes. Most new channels can picture 220 long-form views a day sooner than 222,000 Shorts views. That is not a rule against Shorts. It is a reason to choose the route on purpose.</w:t>
-      </w:r>
-    </w:p>
-    <w:tbl>
-      <w:tblPr>
-        <w:tblW w:type="auto" w:w="0"/>
-        <w:tblLayout w:type="fixed"/>
-        <w:tblLook w:firstColumn="1" w:firstRow="1" w:lastColumn="0" w:lastRow="0" w:noHBand="0" w:noVBand="1" w:val="04A0"/>
-      </w:tblPr>
-      <w:tblGrid>
-        <w:gridCol w:w="8064"/>
-      </w:tblGrid>
-      <w:tr>
-        <w:tc>
-          <w:tcPr>
-            <w:tcW w:type="dxa" w:w="8064"/>
-            <w:tcW w:w="8063" w:type="dxa"/>
-            <w:shd w:val="clear" w:color="auto" w:fill="F3F1EA"/>
-          </w:tcPr>
-          <w:p>
-            <w:pPr>
-              <w:spacing w:after="40" w:before="40"/>
-            </w:pPr>
-            <w:r>
-              <w:rPr>
-                <w:rFonts w:ascii="Calibri" w:hAnsi="Calibri"/>
-                <w:sz w:val="22"/>
-              </w:rPr>
-            </w:r>
-            <w:r>
-              <w:rPr>
-                <w:rFonts w:ascii="Calibri" w:hAnsi="Calibri"/>
-                <w:sz w:val="22"/>
-              </w:rPr>
-              <w:t>Case study: Colin and Samir run a YouTube channel that reports on the creator economy itself, which makes their own numbers an unusually well-documented anchor. In interviews, they have described their very first AdSense payment as about forty cents, and said that by December 2019 — several years into the channel — their combined YouTube income was still only around $26,000 each a year. AdSense did not become a substantial stream for them until 2022, when it reached $268,000 for the year. The arithmetic above describes the gate. It says nothing about the years most channels spend on the other side of it before a stream like ads becomes real money.</w:t>
-            </w:r>
-          </w:p>
-        </w:tc>
-      </w:tr>
-    </w:tbl>
-    <w:p/>
+        <w:t>Second, the routes are different sizes. In the example above, the long-form route needs 165 to 330 views a day. The 2027 Shorts route needs about 222,000. That is not a rule against Shorts. It is a reason to choose the route on purpose.</w:t>
+      </w:r>
+    </w:p>
     <w:p>
       <w:bookmarkStart w:id="66" w:name="toc65"/>
       <w:pPr>
@@ -12346,7 +12162,7 @@
         <w:rPr>
           <w:rFonts w:ascii="Calibri" w:hAnsi="Calibri"/>
         </w:rPr>
-        <w:t>Shorts money also has its own floor from 1 February 2027 (chapter 11, §V). For most new channels, that makes long-form the near-term income route either way.</w:t>
+        <w:t>Shorts money also has its own floor from 1 February 2027 (chapter 11, §V). For a channel below that floor, that makes long-form the near-term income route either way.</w:t>
       </w:r>
     </w:p>
     <w:p>
@@ -12486,7 +12302,7 @@
         </w:rPr>
         <w:t xml:space="preserve"> </w:t>
       </w:r>
-      <w:hyperlink r:id="rId65">
+      <w:hyperlink r:id="rId64">
         <w:r>
           <w:rPr>
             <w:rStyle w:val="Hyperlink"/>
@@ -12652,7 +12468,7 @@
         </w:rPr>
         <w:t xml:space="preserve"> YouTube’s </w:t>
       </w:r>
-      <w:hyperlink r:id="rId78">
+      <w:hyperlink r:id="rId77">
         <w:r>
           <w:rPr>
             <w:rStyle w:val="Hyperlink"/>
@@ -12859,7 +12675,7 @@
         </w:rPr>
         <w:t xml:space="preserve"> (paid campaign and follow-on views). </w:t>
       </w:r>
-      <w:hyperlink r:id="rId65">
+      <w:hyperlink r:id="rId64">
         <w:r>
           <w:rPr>
             <w:rStyle w:val="Hyperlink"/>
@@ -12876,7 +12692,7 @@
         </w:rPr>
         <w:t xml:space="preserve">. </w:t>
       </w:r>
-      <w:hyperlink r:id="rId78">
+      <w:hyperlink r:id="rId77">
         <w:r>
           <w:rPr>
             <w:rStyle w:val="Hyperlink"/>
@@ -12893,7 +12709,7 @@
         </w:rPr>
         <w:t xml:space="preserve"> and </w:t>
       </w:r>
-      <w:hyperlink r:id="rId79">
+      <w:hyperlink r:id="rId78">
         <w:r>
           <w:rPr>
             <w:rStyle w:val="Hyperlink"/>
@@ -12908,31 +12724,14 @@
           <w:rFonts w:ascii="Calibri" w:hAnsi="Calibri"/>
           <w:i/>
         </w:rPr>
-        <w:t xml:space="preserve">. The Colin and Samir case study figures are their own disclosed numbers from public interviews on the creator economy, including </w:t>
-      </w:r>
-      <w:hyperlink r:id="rId80">
-        <w:r>
-          <w:rPr>
-            <w:rStyle w:val="Hyperlink"/>
-            <w:sz w:val="22"/>
-            <w:rFonts w:ascii="Calibri" w:hAnsi="Calibri"/>
-          </w:rPr>
-          <w:t xml:space="preserve">a Digiday Q&amp;A with Samir Chaudry</w:t>
-        </w:r>
-      </w:hyperlink>
-      <w:r>
-        <w:rPr>
-          <w:rFonts w:ascii="Calibri" w:hAnsi="Calibri"/>
-          <w:i/>
-        </w:rPr>
-        <w:t>, not independently audited. The worked example is planning arithmetic. Checked October 2026.</w:t>
+        <w:t>. The worked example is planning arithmetic. Checked October 2026.</w:t>
       </w:r>
     </w:p>
     <w:p>
       <w:pPr>
         <w:sectPr>
-          <w:headerReference w:type="default" r:id="rId76"/>
-          <w:footerReference w:type="default" r:id="rId77"/>
+          <w:headerReference w:type="default" r:id="rId75"/>
+          <w:footerReference w:type="default" r:id="rId76"/>
           <w:pgSz w:w="10080" w:h="14400"/>
           <w:pgMar w:top="1008" w:right="1008" w:bottom="1008" w:left="1008" w:header="504" w:footer="504" w:gutter="0"/>
           <w:cols w:space="720"/>
@@ -14333,8 +14132,8 @@
     <w:p>
       <w:pPr>
         <w:sectPr>
-          <w:headerReference w:type="default" r:id="rId81"/>
-          <w:footerReference w:type="default" r:id="rId82"/>
+          <w:headerReference w:type="default" r:id="rId79"/>
+          <w:footerReference w:type="default" r:id="rId80"/>
           <w:pgSz w:w="10080" w:h="14400"/>
           <w:pgMar w:top="1008" w:right="1008" w:bottom="1008" w:left="1008" w:header="504" w:footer="504" w:gutter="0"/>
           <w:cols w:space="720"/>
@@ -14890,7 +14689,7 @@
         </w:rPr>
         <w:t xml:space="preserve">YouTube’s </w:t>
       </w:r>
-      <w:hyperlink r:id="rId85">
+      <w:hyperlink r:id="rId83">
         <w:r>
           <w:rPr>
             <w:rStyle w:val="Hyperlink"/>
@@ -14976,7 +14775,7 @@
         </w:rPr>
         <w:t xml:space="preserve"> stops you posting for one week. YouTube’s </w:t>
       </w:r>
-      <w:hyperlink r:id="rId86">
+      <w:hyperlink r:id="rId84">
         <w:r>
           <w:rPr>
             <w:rStyle w:val="Hyperlink"/>
@@ -15080,7 +14879,7 @@
         </w:rPr>
         <w:t xml:space="preserve"> YouTube’s </w:t>
       </w:r>
-      <w:hyperlink r:id="rId79">
+      <w:hyperlink r:id="rId78">
         <w:r>
           <w:rPr>
             <w:rStyle w:val="Hyperlink"/>
@@ -15114,7 +14913,7 @@
         </w:rPr>
         <w:t xml:space="preserve"> Paying a service for views, subscribers, or likes falls under YouTube’s </w:t>
       </w:r>
-      <w:hyperlink r:id="rId78">
+      <w:hyperlink r:id="rId77">
         <w:r>
           <w:rPr>
             <w:rStyle w:val="Hyperlink"/>
@@ -15148,7 +14947,7 @@
         </w:rPr>
         <w:t xml:space="preserve"> YouTube’s </w:t>
       </w:r>
-      <w:hyperlink r:id="rId87">
+      <w:hyperlink r:id="rId85">
         <w:r>
           <w:rPr>
             <w:rStyle w:val="Hyperlink"/>
@@ -15228,7 +15027,7 @@
         </w:rPr>
         <w:t xml:space="preserve">A copyright strike comes from a person or company sending YouTube a formal removal request. YouTube’s </w:t>
       </w:r>
-      <w:hyperlink r:id="rId88">
+      <w:hyperlink r:id="rId86">
         <w:r>
           <w:rPr>
             <w:rStyle w:val="Hyperlink"/>
@@ -15244,7 +15043,7 @@
         </w:rPr>
         <w:t xml:space="preserve"> says these requests are reviewed, and that if one appears valid, YouTube has to remove the content to comply with copyright law. The </w:t>
       </w:r>
-      <w:hyperlink r:id="rId89">
+      <w:hyperlink r:id="rId87">
         <w:r>
           <w:rPr>
             <w:rStyle w:val="Hyperlink"/>
@@ -15268,7 +15067,7 @@
         </w:rPr>
         <w:t xml:space="preserve">Some removal requests are scheduled. YouTube’s </w:t>
       </w:r>
-      <w:hyperlink r:id="rId90">
+      <w:hyperlink r:id="rId88">
         <w:r>
           <w:rPr>
             <w:rStyle w:val="Hyperlink"/>
@@ -15398,22 +15197,7 @@
                 <w:rFonts w:ascii="Calibri" w:hAnsi="Calibri"/>
                 <w:sz w:val="22"/>
               </w:rPr>
-              <w:t xml:space="preserve">Case study: h3h3Productions, the YouTube channel run by Ethan and Hila Klein, posted a reaction video in 2015 responding to a short film by another creator, Matt Hosseinzadeh, playing short portions of it between their own commentary. Hosseinzadeh skipped YouTube’s copyright process and sued the Kleins directly in federal court for infringement. In August 2017, after roughly a year and a half of litigation, the US District Court for the Southern District of New York ruled for the Kleins on summary judgment in </w:t>
-            </w:r>
-            <w:r>
-              <w:rPr>
-                <w:rFonts w:ascii="Calibri" w:hAnsi="Calibri"/>
-                <w:i/>
-                <w:sz w:val="22"/>
-              </w:rPr>
-              <w:t>Hosseinzadeh v. Klein</w:t>
-            </w:r>
-            <w:r>
-              <w:rPr>
-                <w:rFonts w:ascii="Calibri" w:hAnsi="Calibri"/>
-                <w:sz w:val="22"/>
-              </w:rPr>
-              <w:t>, finding their use fair as a matter of law because the video was, in the court’s words, quintessential criticism and comment. A counter notification or a fair-use defense can win. Reaching that answer in this case took eighteen months and real legal fees, not a form in Studio.</w:t>
+              <w:t>Case study: h3h3Productions made a fourteen-minute reaction video that showed about three minutes of a short skit by another filmmaker between its own commentary. The filmmaker sent YouTube a takedown notification, and YouTube removed the video. The channel answered with a counter notification claiming fair use, and the filmmaker then sued for copyright infringement. On 23 August 2017 the US District Court for the Southern District of New York granted the channel’s owners summary judgment, finding their use fair as a matter of law because the video was “quintessential criticism and comment.” A fair-use defense can win. In this case the counter notification did not end the dispute. A federal court did.</w:t>
             </w:r>
           </w:p>
         </w:tc>
@@ -15437,7 +15221,7 @@
         </w:rPr>
         <w:t xml:space="preserve">A Content ID claim is generated automatically when an upload matches a reference file a rights holder has given YouTube. YouTube’s </w:t>
       </w:r>
-      <w:hyperlink r:id="rId91">
+      <w:hyperlink r:id="rId89">
         <w:r>
           <w:rPr>
             <w:rStyle w:val="Hyperlink"/>
@@ -15541,7 +15325,7 @@
         </w:rPr>
         <w:t xml:space="preserve">Once you are in the Partner Program, every video carries a monetization status. YouTube’s </w:t>
       </w:r>
-      <w:hyperlink r:id="rId43">
+      <w:hyperlink r:id="rId42">
         <w:r>
           <w:rPr>
             <w:rStyle w:val="Hyperlink"/>
@@ -15691,7 +15475,7 @@
         </w:rPr>
         <w:t xml:space="preserve">If a video features branded content, sponsorships, endorsements, or other commercial relationships, YouTube’s </w:t>
       </w:r>
-      <w:hyperlink r:id="rId92">
+      <w:hyperlink r:id="rId90">
         <w:r>
           <w:rPr>
             <w:rStyle w:val="Hyperlink"/>
@@ -15707,7 +15491,7 @@
         </w:rPr>
         <w:t xml:space="preserve"> says you have to tell YouTube by selecting the paid promotion option in the video’s details. In the upload flow it appears under “Paid promotion.” YouTube then adds a disclosure label at the start of the video. YouTube’s </w:t>
       </w:r>
-      <w:hyperlink r:id="rId93">
+      <w:hyperlink r:id="rId91">
         <w:r>
           <w:rPr>
             <w:rStyle w:val="Hyperlink"/>
@@ -15765,7 +15549,7 @@
         </w:rPr>
         <w:t xml:space="preserve">YouTube’s </w:t>
       </w:r>
-      <w:hyperlink r:id="rId58">
+      <w:hyperlink r:id="rId57">
         <w:r>
           <w:rPr>
             <w:rStyle w:val="Hyperlink"/>
@@ -15789,7 +15573,7 @@
         </w:rPr>
         <w:t xml:space="preserve">What does not need it, per the same page and YouTube’s </w:t>
       </w:r>
-      <w:hyperlink r:id="rId94">
+      <w:hyperlink r:id="rId92">
         <w:r>
           <w:rPr>
             <w:rStyle w:val="Hyperlink"/>
@@ -15821,7 +15605,7 @@
         </w:rPr>
         <w:t xml:space="preserve">Two changes are worth knowing. YouTube’s </w:t>
       </w:r>
-      <w:hyperlink r:id="rId95">
+      <w:hyperlink r:id="rId93">
         <w:r>
           <w:rPr>
             <w:rStyle w:val="Hyperlink"/>
@@ -15909,7 +15693,7 @@
         </w:rPr>
         <w:t xml:space="preserve">The policies above judge a video. </w:t>
       </w:r>
-      <w:hyperlink r:id="rId96">
+      <w:hyperlink r:id="rId94">
         <w:r>
           <w:rPr>
             <w:rStyle w:val="Hyperlink"/>
@@ -16041,7 +15825,7 @@
         </w:rPr>
         <w:t xml:space="preserve">Every channel and every video has an audience setting: made for kids, or not. YouTube’s </w:t>
       </w:r>
-      <w:hyperlink r:id="rId97">
+      <w:hyperlink r:id="rId95">
         <w:r>
           <w:rPr>
             <w:rStyle w:val="Hyperlink"/>
@@ -16297,7 +16081,7 @@
         </w:rPr>
         <w:t xml:space="preserve">Sources: Warning, training, strike, and termination rules are from </w:t>
       </w:r>
-      <w:hyperlink r:id="rId85">
+      <w:hyperlink r:id="rId83">
         <w:r>
           <w:rPr>
             <w:rStyle w:val="Hyperlink"/>
@@ -16314,7 +16098,7 @@
         </w:rPr>
         <w:t xml:space="preserve">, its </w:t>
       </w:r>
-      <w:hyperlink r:id="rId86">
+      <w:hyperlink r:id="rId84">
         <w:r>
           <w:rPr>
             <w:rStyle w:val="Hyperlink"/>
@@ -16331,7 +16115,7 @@
         </w:rPr>
         <w:t xml:space="preserve">, and its </w:t>
       </w:r>
-      <w:hyperlink r:id="rId89">
+      <w:hyperlink r:id="rId87">
         <w:r>
           <w:rPr>
             <w:rStyle w:val="Hyperlink"/>
@@ -16348,7 +16132,7 @@
         </w:rPr>
         <w:t xml:space="preserve">. Copyright strike resolution is from </w:t>
       </w:r>
-      <w:hyperlink r:id="rId88">
+      <w:hyperlink r:id="rId86">
         <w:r>
           <w:rPr>
             <w:rStyle w:val="Hyperlink"/>
@@ -16365,7 +16149,7 @@
         </w:rPr>
         <w:t xml:space="preserve"> and its </w:t>
       </w:r>
-      <w:hyperlink r:id="rId90">
+      <w:hyperlink r:id="rId88">
         <w:r>
           <w:rPr>
             <w:rStyle w:val="Hyperlink"/>
@@ -16380,30 +16164,16 @@
           <w:rFonts w:ascii="Calibri" w:hAnsi="Calibri"/>
           <w:i/>
         </w:rPr>
-        <w:t xml:space="preserve">. The h3h3Productions case study is </w:t>
-      </w:r>
-      <w:r>
-        <w:rPr>
-          <w:rFonts w:ascii="Calibri" w:hAnsi="Calibri"/>
-          <w:i/>
-        </w:rPr>
-        <w:t>Hosseinzadeh v. Klein</w:t>
-      </w:r>
-      <w:r>
-        <w:rPr>
-          <w:rFonts w:ascii="Calibri" w:hAnsi="Calibri"/>
-          <w:i/>
-        </w:rPr>
-        <w:t xml:space="preserve">, 276 F. Supp. 3d 34 (S.D.N.Y. 2017); the ruling date, the quoted holding, and the case background are corroborated across the </w:t>
-      </w:r>
-      <w:hyperlink r:id="rId98">
+        <w:t xml:space="preserve">. The h3h3Productions case study is docket No. 16-CV-3081 (S.D.N.Y. Aug. 23, 2017), as summarized by the </w:t>
+      </w:r>
+      <w:hyperlink r:id="rId96">
         <w:r>
           <w:rPr>
             <w:rStyle w:val="Hyperlink"/>
             <w:sz w:val="22"/>
             <w:rFonts w:ascii="Calibri" w:hAnsi="Calibri"/>
           </w:rPr>
-          <w:t xml:space="preserve">US Copyright Office’s own fair-use case summary</w:t>
+          <w:t xml:space="preserve">US Copyright Office’s fair-use index</w:t>
         </w:r>
       </w:hyperlink>
       <w:r>
@@ -16411,43 +16181,9 @@
           <w:rFonts w:ascii="Calibri" w:hAnsi="Calibri"/>
           <w:i/>
         </w:rPr>
-        <w:t xml:space="preserve"> and independent legal reporting at the time, including </w:t>
-      </w:r>
-      <w:hyperlink r:id="rId99">
-        <w:r>
-          <w:rPr>
-            <w:rStyle w:val="Hyperlink"/>
-            <w:sz w:val="22"/>
-            <w:rFonts w:ascii="Calibri" w:hAnsi="Calibri"/>
-          </w:rPr>
-          <w:t xml:space="preserve">Plagiarism Today</w:t>
-        </w:r>
-      </w:hyperlink>
-      <w:r>
-        <w:rPr>
-          <w:rFonts w:ascii="Calibri" w:hAnsi="Calibri"/>
-          <w:i/>
-        </w:rPr>
-        <w:t xml:space="preserve"> and a law firm client alert from </w:t>
-      </w:r>
-      <w:hyperlink r:id="rId100">
-        <w:r>
-          <w:rPr>
-            <w:rStyle w:val="Hyperlink"/>
-            <w:sz w:val="22"/>
-            <w:rFonts w:ascii="Calibri" w:hAnsi="Calibri"/>
-          </w:rPr>
-          <w:t xml:space="preserve">Loeb &amp; Loeb</w:t>
-        </w:r>
-      </w:hyperlink>
-      <w:r>
-        <w:rPr>
-          <w:rFonts w:ascii="Calibri" w:hAnsi="Calibri"/>
-          <w:i/>
-        </w:rPr>
         <w:t xml:space="preserve">. Content ID claim policies and the Shorts blocking rule are from </w:t>
       </w:r>
-      <w:hyperlink r:id="rId91">
+      <w:hyperlink r:id="rId89">
         <w:r>
           <w:rPr>
             <w:rStyle w:val="Hyperlink"/>
@@ -16464,7 +16200,7 @@
         </w:rPr>
         <w:t xml:space="preserve">. Limited ads, self-certification, and human review are from </w:t>
       </w:r>
-      <w:hyperlink r:id="rId43">
+      <w:hyperlink r:id="rId42">
         <w:r>
           <w:rPr>
             <w:rStyle w:val="Hyperlink"/>
@@ -16481,7 +16217,7 @@
         </w:rPr>
         <w:t xml:space="preserve">. That claimed videos lose Super Thanks and music-claimed videos count against memberships is from YouTube’s Super Thanks and memberships eligibility pages, cited in chapter 12. The paid promotion setting and disclosure label are from </w:t>
       </w:r>
-      <w:hyperlink r:id="rId92">
+      <w:hyperlink r:id="rId90">
         <w:r>
           <w:rPr>
             <w:rStyle w:val="Hyperlink"/>
@@ -16498,7 +16234,7 @@
         </w:rPr>
         <w:t xml:space="preserve"> and its </w:t>
       </w:r>
-      <w:hyperlink r:id="rId93">
+      <w:hyperlink r:id="rId91">
         <w:r>
           <w:rPr>
             <w:rStyle w:val="Hyperlink"/>
@@ -16515,7 +16251,7 @@
         </w:rPr>
         <w:t xml:space="preserve">. AI disclosure requirements are from </w:t>
       </w:r>
-      <w:hyperlink r:id="rId58">
+      <w:hyperlink r:id="rId57">
         <w:r>
           <w:rPr>
             <w:rStyle w:val="Hyperlink"/>
@@ -16532,7 +16268,7 @@
         </w:rPr>
         <w:t xml:space="preserve">, the </w:t>
       </w:r>
-      <w:hyperlink r:id="rId94">
+      <w:hyperlink r:id="rId92">
         <w:r>
           <w:rPr>
             <w:rStyle w:val="Hyperlink"/>
@@ -16549,7 +16285,7 @@
         </w:rPr>
         <w:t xml:space="preserve">, and the </w:t>
       </w:r>
-      <w:hyperlink r:id="rId95">
+      <w:hyperlink r:id="rId93">
         <w:r>
           <w:rPr>
             <w:rStyle w:val="Hyperlink"/>
@@ -16566,7 +16302,7 @@
         </w:rPr>
         <w:t xml:space="preserve">. The reused content, inauthentic content, and AI persona rules are from </w:t>
       </w:r>
-      <w:hyperlink r:id="rId96">
+      <w:hyperlink r:id="rId94">
         <w:r>
           <w:rPr>
             <w:rStyle w:val="Hyperlink"/>
@@ -16600,7 +16336,7 @@
         </w:rPr>
         <w:t xml:space="preserve">. The FTC’s </w:t>
       </w:r>
-      <w:hyperlink r:id="rId101">
+      <w:hyperlink r:id="rId97">
         <w:r>
           <w:rPr>
             <w:rStyle w:val="Hyperlink"/>
@@ -16617,7 +16353,7 @@
         </w:rPr>
         <w:t xml:space="preserve"> and </w:t>
       </w:r>
-      <w:hyperlink r:id="rId102">
+      <w:hyperlink r:id="rId98">
         <w:r>
           <w:rPr>
             <w:rStyle w:val="Hyperlink"/>
@@ -16634,7 +16370,7 @@
         </w:rPr>
         <w:t xml:space="preserve"> are US guidance. Made-for-kids features are from </w:t>
       </w:r>
-      <w:hyperlink r:id="rId97">
+      <w:hyperlink r:id="rId95">
         <w:r>
           <w:rPr>
             <w:rStyle w:val="Hyperlink"/>
@@ -16651,7 +16387,7 @@
         </w:rPr>
         <w:t xml:space="preserve">. The human-authorship rule is from Thaler v. Perlmutter, 130 F.4th 1039 (D.C. Cir. 2025), cert. denied (U.S. Mar. 2, 2026) — the denial date is corroborated by </w:t>
       </w:r>
-      <w:hyperlink r:id="rId103">
+      <w:hyperlink r:id="rId99">
         <w:r>
           <w:rPr>
             <w:rStyle w:val="Hyperlink"/>
@@ -16668,7 +16404,7 @@
         </w:rPr>
         <w:t xml:space="preserve"> and a </w:t>
       </w:r>
-      <w:hyperlink r:id="rId104">
+      <w:hyperlink r:id="rId100">
         <w:r>
           <w:rPr>
             <w:rStyle w:val="Hyperlink"/>
@@ -16689,8 +16425,8 @@
     <w:p>
       <w:pPr>
         <w:sectPr>
-          <w:headerReference w:type="default" r:id="rId83"/>
-          <w:footerReference w:type="default" r:id="rId84"/>
+          <w:headerReference w:type="default" r:id="rId81"/>
+          <w:footerReference w:type="default" r:id="rId82"/>
           <w:pgSz w:w="10080" w:h="14400"/>
           <w:pgMar w:top="1008" w:right="1008" w:bottom="1008" w:left="1008" w:header="504" w:footer="504" w:gutter="0"/>
           <w:cols w:space="720"/>
@@ -16760,7 +16496,7 @@
         </w:rPr>
         <w:t xml:space="preserve">Inside the Partner Program, with the Watch Page Monetization Module accepted, a long-form video can earn from ads shown before, during, after, and around it on the watch page. That includes the video embedded on another site in YouTube’s player. Official rule: YouTube’s </w:t>
       </w:r>
-      <w:hyperlink r:id="rId107">
+      <w:hyperlink r:id="rId103">
         <w:r>
           <w:rPr>
             <w:rStyle w:val="Hyperlink"/>
@@ -16778,7 +16514,7 @@
       </w:r>
     </w:p>
     <w:p>
-      <w:hyperlink r:id="rId108">
+      <w:hyperlink r:id="rId104">
         <w:r>
           <w:rPr>
             <w:rStyle w:val="Hyperlink"/>
@@ -16830,7 +16566,7 @@
         </w:rPr>
         <w:t xml:space="preserve"> </w:t>
       </w:r>
-      <w:hyperlink r:id="rId63">
+      <w:hyperlink r:id="rId62">
         <w:r>
           <w:rPr>
             <w:rStyle w:val="Hyperlink"/>
@@ -17331,50 +17067,12 @@
         <w:t>To those, add the ones you control: whether the video is advertiser-friendly (chapter 10), whether it is long enough for mid-rolls, and whether viewers stay long enough to see a second break. The subject matters too, through which advertisers want that audience. That is why chapter 1 warned against choosing a subject only for its rate. You cannot hold an audience you do not want to make videos for.</w:t>
       </w:r>
     </w:p>
-    <w:tbl>
-      <w:tblPr>
-        <w:tblW w:type="auto" w:w="0"/>
-        <w:tblLayout w:type="fixed"/>
-        <w:tblLook w:firstColumn="1" w:firstRow="1" w:lastColumn="0" w:lastRow="0" w:noHBand="0" w:noVBand="1" w:val="04A0"/>
-      </w:tblPr>
-      <w:tblGrid>
-        <w:gridCol w:w="8064"/>
-      </w:tblGrid>
-      <w:tr>
-        <w:tc>
-          <w:tcPr>
-            <w:tcW w:type="dxa" w:w="8064"/>
-            <w:tcW w:w="8063" w:type="dxa"/>
-            <w:shd w:val="clear" w:color="auto" w:fill="F3F1EA"/>
-          </w:tcPr>
-          <w:p>
-            <w:pPr>
-              <w:spacing w:after="40" w:before="40"/>
-            </w:pPr>
-            <w:r>
-              <w:rPr>
-                <w:rFonts w:ascii="Calibri" w:hAnsi="Calibri"/>
-                <w:sz w:val="22"/>
-              </w:rPr>
-            </w:r>
-            <w:r>
-              <w:rPr>
-                <w:rFonts w:ascii="Calibri" w:hAnsi="Calibri"/>
-                <w:sz w:val="22"/>
-              </w:rPr>
-              <w:t>Case study: Deep Pocket Monster, a YouTube channel about opening Pokémon card packs, launched in January 2021 with no prior audience in that niche. Its creator has described reaching 100,000 subscribers within about a year and a typical range of $35,000 to $50,000 a month from ad revenue. One 2022 video sat well outside that range. It reached roughly 28 million views, briefly ranked third on YouTube’s trending page, and brought in more than $100,000 in ad revenue on its own, pushing that month past the usual run. A single collectibles video outearning what many channels make in a year in a lower-demand niche is not a trick of virality. Collectibles are a subject advertisers pay well to reach, which is the whole point of this section: the view count did not change. The audience behind it did.</w:t>
-            </w:r>
-          </w:p>
-        </w:tc>
-      </w:tr>
-    </w:tbl>
-    <w:p/>
-    <w:p>
-      <w:r>
-        <w:rPr>
-          <w:rFonts w:ascii="Calibri" w:hAnsi="Calibri"/>
-        </w:rPr>
-        <w:t>None of that changes the mechanics underneath — advertiser demand moves the price per view, not the arithmetic that turns a view into a payment. The arithmetic itself is worth walking through once.</w:t>
+    <w:p>
+      <w:r>
+        <w:rPr>
+          <w:rFonts w:ascii="Calibri" w:hAnsi="Calibri"/>
+        </w:rPr>
+        <w:t>Advertiser demand moves the price per view. It does not change the arithmetic that turns a view into a payment, which is worth walking through once.</w:t>
       </w:r>
     </w:p>
     <w:tbl>
@@ -17432,7 +17130,7 @@
         </w:rPr>
         <w:t xml:space="preserve">Shorts ads run between videos in the Shorts feed, not beside one video, so YouTube pools them. </w:t>
       </w:r>
-      <w:hyperlink r:id="rId109">
+      <w:hyperlink r:id="rId105">
         <w:r>
           <w:rPr>
             <w:rStyle w:val="Hyperlink"/>
@@ -17638,7 +17336,7 @@
         <w:rPr>
           <w:rFonts w:ascii="Calibri" w:hAnsi="Calibri"/>
         </w:rPr>
-        <w:t>For a channel below 10 million Shorts views every 90 days — most new channels — the practical reading (author recommendation): from February 2027, long-form is the ad income, and Shorts are how strangers find the long videos.</w:t>
+        <w:t>For a channel below 10 million Shorts views every 90 days, the practical reading (author recommendation): from February 2027, long-form is the ad income, and Shorts are how strangers find the long videos.</w:t>
       </w:r>
     </w:p>
     <w:p>
@@ -17825,9 +17523,9 @@
           <w:rFonts w:ascii="Calibri" w:hAnsi="Calibri"/>
           <w:i/>
         </w:rPr>
-        <w:t xml:space="preserve">Sources: The Deep Pocket Monster case study is its creator Pat Flynn’s own disclosed account, given on his Smart Passive Income podcast (episode “An Update on My ‘On the Side’ YouTube Channel”) and corroborated across several independent podcast interviews with him on the same channel and figures; this book treats the subscriber, revenue, and single-video figures as the creator’s own disclosed numbers, converged on across independent retellings, not an independently audited record. </w:t>
-      </w:r>
-      <w:hyperlink r:id="rId108">
+        <w:t xml:space="preserve">Sources: </w:t>
+      </w:r>
+      <w:hyperlink r:id="rId104">
         <w:r>
           <w:rPr>
             <w:rStyle w:val="Hyperlink"/>
@@ -17844,7 +17542,7 @@
         </w:rPr>
         <w:t xml:space="preserve"> and </w:t>
       </w:r>
-      <w:hyperlink r:id="rId63">
+      <w:hyperlink r:id="rId62">
         <w:r>
           <w:rPr>
             <w:rStyle w:val="Hyperlink"/>
@@ -17895,7 +17593,7 @@
         </w:rPr>
         <w:t xml:space="preserve"> (CPM, playback-based CPM, RPM). </w:t>
       </w:r>
-      <w:hyperlink r:id="rId107">
+      <w:hyperlink r:id="rId103">
         <w:r>
           <w:rPr>
             <w:rStyle w:val="Hyperlink"/>
@@ -17946,7 +17644,7 @@
         </w:rPr>
         <w:t xml:space="preserve"> (Premium and Premium Lite pools, Shorts floor, targeted Shorts ads). </w:t>
       </w:r>
-      <w:hyperlink r:id="rId109">
+      <w:hyperlink r:id="rId105">
         <w:r>
           <w:rPr>
             <w:rStyle w:val="Hyperlink"/>
@@ -17967,8 +17665,8 @@
     <w:p>
       <w:pPr>
         <w:sectPr>
-          <w:headerReference w:type="default" r:id="rId105"/>
-          <w:footerReference w:type="default" r:id="rId106"/>
+          <w:headerReference w:type="default" r:id="rId101"/>
+          <w:footerReference w:type="default" r:id="rId102"/>
           <w:pgSz w:w="10080" w:h="14400"/>
           <w:pgMar w:top="1008" w:right="1008" w:bottom="1008" w:left="1008" w:header="504" w:footer="504" w:gutter="0"/>
           <w:cols w:space="720"/>
@@ -18013,6 +17711,52 @@
         <w:t>Ad revenue scales with views. Fan funding scales with something else: how many viewers care enough to pay a few dollars a month, or a few dollars once, because the channel matters to them. A channel with modest views and a loyal core can earn more from its fans than from its ads. And in countries with the expanded program, fan funding opens at 500 subscribers, half the ad gate’s subscriber count and well short of its hours.</w:t>
       </w:r>
     </w:p>
+    <w:tbl>
+      <w:tblPr>
+        <w:tblW w:type="auto" w:w="0"/>
+        <w:tblLayout w:type="fixed"/>
+        <w:tblLook w:firstColumn="1" w:firstRow="1" w:lastColumn="0" w:lastRow="0" w:noHBand="0" w:noVBand="1" w:val="04A0"/>
+      </w:tblPr>
+      <w:tblGrid>
+        <w:gridCol w:w="8064"/>
+      </w:tblGrid>
+      <w:tr>
+        <w:tc>
+          <w:tcPr>
+            <w:tcW w:type="dxa" w:w="8064"/>
+            <w:tcW w:w="8063" w:type="dxa"/>
+            <w:shd w:val="clear" w:color="auto" w:fill="F3F1EA"/>
+          </w:tcPr>
+          <w:p>
+            <w:pPr>
+              <w:spacing w:after="40" w:before="40"/>
+            </w:pPr>
+            <w:r>
+              <w:rPr>
+                <w:rFonts w:ascii="Calibri" w:hAnsi="Calibri"/>
+                <w:sz w:val="22"/>
+              </w:rPr>
+            </w:r>
+            <w:r>
+              <w:rPr>
+                <w:rFonts w:ascii="Calibri" w:hAnsi="Calibri"/>
+                <w:b/>
+                <w:sz w:val="22"/>
+              </w:rPr>
+              <w:t>Thresholds change.</w:t>
+            </w:r>
+            <w:r>
+              <w:rPr>
+                <w:rFonts w:ascii="Calibri" w:hAnsi="Calibri"/>
+                <w:sz w:val="22"/>
+              </w:rPr>
+              <w:t xml:space="preserve"> Before planning around any monetization target, check the live Earn tab in YouTube Studio and YouTube’s official Partner Program eligibility page for your country. This book reflects information checked in October 2026.</w:t>
+            </w:r>
+          </w:p>
+        </w:tc>
+      </w:tr>
+    </w:tbl>
+    <w:p/>
     <w:p>
       <w:r>
         <w:rPr>
@@ -18032,7 +17776,7 @@
       <w:bookmarkEnd w:id="104"/>
     </w:p>
     <w:p>
-      <w:hyperlink r:id="rId112">
+      <w:hyperlink r:id="rId108">
         <w:r>
           <w:rPr>
             <w:rStyle w:val="Hyperlink"/>
@@ -18164,7 +17908,7 @@
         </w:rPr>
         <w:t xml:space="preserve">A membership is a monthly payment from a viewer in return for perks you choose. </w:t>
       </w:r>
-      <w:hyperlink r:id="rId113">
+      <w:hyperlink r:id="rId109">
         <w:r>
           <w:rPr>
             <w:rStyle w:val="Hyperlink"/>
@@ -18188,7 +17932,7 @@
         </w:rPr>
         <w:t xml:space="preserve">The structure, from </w:t>
       </w:r>
-      <w:hyperlink r:id="rId114">
+      <w:hyperlink r:id="rId110">
         <w:r>
           <w:rPr>
             <w:rStyle w:val="Hyperlink"/>
@@ -18237,7 +17981,7 @@
         </w:rPr>
         <w:t xml:space="preserve">Prices come from a fixed list for each country. </w:t>
       </w:r>
-      <w:hyperlink r:id="rId115">
+      <w:hyperlink r:id="rId111">
         <w:r>
           <w:rPr>
             <w:rStyle w:val="Hyperlink"/>
@@ -18264,7 +18008,7 @@
         </w:rPr>
         <w:t xml:space="preserve">Documented platform guidance: YouTube’s </w:t>
       </w:r>
-      <w:hyperlink r:id="rId116">
+      <w:hyperlink r:id="rId112">
         <w:r>
           <w:rPr>
             <w:rStyle w:val="Hyperlink"/>
@@ -18336,7 +18080,7 @@
                 <w:rFonts w:ascii="Calibri" w:hAnsi="Calibri"/>
                 <w:sz w:val="22"/>
               </w:rPr>
-              <w:t>Case study: YouTube’s own creator blog has named Rachana Ranade, a chartered accountant who teaches financial literacy on her channel, as one of a handful of creators making the most of memberships. She turned the feature on in 2020 and, by YouTube’s own account, made channel memberships her largest income stream directly from YouTube that year — over $100,000 — with tiers priced at a few dollars a month and a top tier that included a monthly stock-pick breakdown for members only. Her channel’s reach, well over a million subscribers, is not a number a new channel starts with. The structure underneath it is: a small number of priced tiers, each with a perk a regular actually wants, can outearn the ads on the same channel.</w:t>
+              <w:t>Case study: YouTube’s own creator blog featured a financial-education channel as one of three making the most of channel memberships. The post says the channel turned memberships on in 2020 and that they had become the majority of its YouTube revenue, earning over $100,000 by the time it was written. That channel is not a starting point for a new one. The lesson is the order of the money: for it, members paid more than the ads on the same channel.</w:t>
             </w:r>
           </w:p>
         </w:tc>
@@ -18360,7 +18104,7 @@
         </w:rPr>
         <w:t xml:space="preserve">These two belong to live: live streams and premieres with live chat turned on. A viewer pays to highlight a message in the chat, or to send an animated sticker. </w:t>
       </w:r>
-      <w:hyperlink r:id="rId117">
+      <w:hyperlink r:id="rId113">
         <w:r>
           <w:rPr>
             <w:rStyle w:val="Hyperlink"/>
@@ -18378,7 +18122,7 @@
       </w:r>
     </w:p>
     <w:p>
-      <w:hyperlink r:id="rId118">
+      <w:hyperlink r:id="rId114">
         <w:r>
           <w:rPr>
             <w:rStyle w:val="Hyperlink"/>
@@ -18436,7 +18180,7 @@
         </w:rPr>
         <w:t xml:space="preserve">Super Thanks is the one fan-funding feature that does not need you live. A viewer buys a one-time animation on a long-form video or a Short and gets a highlighted comment in the comments section. </w:t>
       </w:r>
-      <w:hyperlink r:id="rId119">
+      <w:hyperlink r:id="rId115">
         <w:r>
           <w:rPr>
             <w:rStyle w:val="Hyperlink"/>
@@ -18476,7 +18220,7 @@
         </w:rPr>
         <w:t xml:space="preserve">Documented platform guidance: YouTube’s </w:t>
       </w:r>
-      <w:hyperlink r:id="rId120">
+      <w:hyperlink r:id="rId116">
         <w:r>
           <w:rPr>
             <w:rStyle w:val="Hyperlink"/>
@@ -18651,9 +18395,9 @@
           <w:rFonts w:ascii="Calibri" w:hAnsi="Calibri"/>
           <w:i/>
         </w:rPr>
-        <w:t xml:space="preserve">Sources: The Rachana Ranade case study is from </w:t>
-      </w:r>
-      <w:hyperlink r:id="rId121">
+        <w:t xml:space="preserve">Sources: The memberships case study is from </w:t>
+      </w:r>
+      <w:hyperlink r:id="rId117">
         <w:r>
           <w:rPr>
             <w:rStyle w:val="Hyperlink"/>
@@ -18668,9 +18412,9 @@
           <w:rFonts w:ascii="Calibri" w:hAnsi="Calibri"/>
           <w:i/>
         </w:rPr>
-        <w:t xml:space="preserve">, corroborated by independent reporting on her channel and tiers; this book treats the $100,000 figure and the “largest income stream” claim as YouTube’s own disclosed account of a creator it chose to feature, not an independently audited number. Minimum requirements, the four features, and the not-a-donation rule are from </w:t>
-      </w:r>
-      <w:hyperlink r:id="rId112">
+        <w:t xml:space="preserve">, the “majority of its YouTube revenue” and $100,000 figures are YouTube’s own account of a creator it chose to feature, not an audited number. Minimum requirements, the four features, and the not-a-donation rule are from </w:t>
+      </w:r>
+      <w:hyperlink r:id="rId108">
         <w:r>
           <w:rPr>
             <w:rStyle w:val="Hyperlink"/>
@@ -18687,7 +18431,7 @@
         </w:rPr>
         <w:t xml:space="preserve">. Membership eligibility, banned perks, and paused mode are from </w:t>
       </w:r>
-      <w:hyperlink r:id="rId113">
+      <w:hyperlink r:id="rId109">
         <w:r>
           <w:rPr>
             <w:rStyle w:val="Hyperlink"/>
@@ -18704,7 +18448,7 @@
         </w:rPr>
         <w:t xml:space="preserve">; levels and perks from </w:t>
       </w:r>
-      <w:hyperlink r:id="rId114">
+      <w:hyperlink r:id="rId110">
         <w:r>
           <w:rPr>
             <w:rStyle w:val="Hyperlink"/>
@@ -18721,7 +18465,7 @@
         </w:rPr>
         <w:t xml:space="preserve">; US prices from </w:t>
       </w:r>
-      <w:hyperlink r:id="rId115">
+      <w:hyperlink r:id="rId111">
         <w:r>
           <w:rPr>
             <w:rStyle w:val="Hyperlink"/>
@@ -18738,7 +18482,7 @@
         </w:rPr>
         <w:t xml:space="preserve">; the 70% share from </w:t>
       </w:r>
-      <w:hyperlink r:id="rId122">
+      <w:hyperlink r:id="rId118">
         <w:r>
           <w:rPr>
             <w:rStyle w:val="Hyperlink"/>
@@ -18755,7 +18499,7 @@
         </w:rPr>
         <w:t xml:space="preserve"> and the pricing guidance from </w:t>
       </w:r>
-      <w:hyperlink r:id="rId116">
+      <w:hyperlink r:id="rId112">
         <w:r>
           <w:rPr>
             <w:rStyle w:val="Hyperlink"/>
@@ -18772,7 +18516,7 @@
         </w:rPr>
         <w:t xml:space="preserve">. Super Chat and Super Stickers rules and the 70% share are from </w:t>
       </w:r>
-      <w:hyperlink r:id="rId117">
+      <w:hyperlink r:id="rId113">
         <w:r>
           <w:rPr>
             <w:rStyle w:val="Hyperlink"/>
@@ -18789,7 +18533,7 @@
         </w:rPr>
         <w:t xml:space="preserve"> and </w:t>
       </w:r>
-      <w:hyperlink r:id="rId118">
+      <w:hyperlink r:id="rId114">
         <w:r>
           <w:rPr>
             <w:rStyle w:val="Hyperlink"/>
@@ -18806,7 +18550,7 @@
         </w:rPr>
         <w:t xml:space="preserve">. Super Thanks rules and its 70% share are from </w:t>
       </w:r>
-      <w:hyperlink r:id="rId119">
+      <w:hyperlink r:id="rId115">
         <w:r>
           <w:rPr>
             <w:rStyle w:val="Hyperlink"/>
@@ -18823,7 +18567,7 @@
         </w:rPr>
         <w:t xml:space="preserve"> and </w:t>
       </w:r>
-      <w:hyperlink r:id="rId123">
+      <w:hyperlink r:id="rId119">
         <w:r>
           <w:rPr>
             <w:rStyle w:val="Hyperlink"/>
@@ -18840,7 +18584,7 @@
         </w:rPr>
         <w:t xml:space="preserve">; the tips from </w:t>
       </w:r>
-      <w:hyperlink r:id="rId120">
+      <w:hyperlink r:id="rId116">
         <w:r>
           <w:rPr>
             <w:rStyle w:val="Hyperlink"/>
@@ -18861,8 +18605,8 @@
     <w:p>
       <w:pPr>
         <w:sectPr>
-          <w:headerReference w:type="default" r:id="rId110"/>
-          <w:footerReference w:type="default" r:id="rId111"/>
+          <w:headerReference w:type="default" r:id="rId106"/>
+          <w:footerReference w:type="default" r:id="rId107"/>
           <w:pgSz w:w="10080" w:h="14400"/>
           <w:pgMar w:top="1008" w:right="1008" w:bottom="1008" w:left="1008" w:header="504" w:footer="504" w:gutter="0"/>
           <w:cols w:space="720"/>
@@ -19004,44 +18748,6 @@
         <w:t>how to reach you, from the email address on the channel’s About section.</w:t>
       </w:r>
     </w:p>
-    <w:tbl>
-      <w:tblPr>
-        <w:tblW w:type="auto" w:w="0"/>
-        <w:tblLayout w:type="fixed"/>
-        <w:tblLook w:firstColumn="1" w:firstRow="1" w:lastColumn="0" w:lastRow="0" w:noHBand="0" w:noVBand="1" w:val="04A0"/>
-      </w:tblPr>
-      <w:tblGrid>
-        <w:gridCol w:w="8064"/>
-      </w:tblGrid>
-      <w:tr>
-        <w:tc>
-          <w:tcPr>
-            <w:tcW w:type="dxa" w:w="8064"/>
-            <w:tcW w:w="8063" w:type="dxa"/>
-            <w:shd w:val="clear" w:color="auto" w:fill="F3F1EA"/>
-          </w:tcPr>
-          <w:p>
-            <w:pPr>
-              <w:spacing w:after="40" w:before="40"/>
-            </w:pPr>
-            <w:r>
-              <w:rPr>
-                <w:rFonts w:ascii="Calibri" w:hAnsi="Calibri"/>
-                <w:sz w:val="22"/>
-              </w:rPr>
-            </w:r>
-            <w:r>
-              <w:rPr>
-                <w:rFonts w:ascii="Calibri" w:hAnsi="Calibri"/>
-                <w:sz w:val="22"/>
-              </w:rPr>
-              <w:t>Case study: Ali Abdaal, a doctor turned YouTuber, has said publicly that his first sponsored video came a full year after he started the channel — by which point he had posted nearly 150 videos and had around 50,000 subscribers. Fifty thousand subscribers is fifty times this book’s ad-gate threshold. The record a sponsor was waiting for was not the subscriber count. It was 150 videos of evidence about who watched and how.</w:t>
-            </w:r>
-          </w:p>
-        </w:tc>
-      </w:tr>
-    </w:tbl>
-    <w:p/>
     <w:p>
       <w:bookmarkStart w:id="112" w:name="toc111"/>
       <w:pPr>
@@ -19405,7 +19111,7 @@
         </w:rPr>
         <w:t xml:space="preserve"> “Affiliate link” in the same line. YouTube’s </w:t>
       </w:r>
-      <w:hyperlink r:id="rId87">
+      <w:hyperlink r:id="rId85">
         <w:r>
           <w:rPr>
             <w:rStyle w:val="Hyperlink"/>
@@ -19504,7 +19210,7 @@
         </w:rPr>
         <w:t xml:space="preserve">An </w:t>
       </w:r>
-      <w:hyperlink r:id="rId126">
+      <w:hyperlink r:id="rId122">
         <w:r>
           <w:rPr>
             <w:rStyle w:val="Hyperlink"/>
@@ -19520,7 +19226,7 @@
         </w:rPr>
         <w:t xml:space="preserve"> or </w:t>
       </w:r>
-      <w:hyperlink r:id="rId65">
+      <w:hyperlink r:id="rId64">
         <w:r>
           <w:rPr>
             <w:rStyle w:val="Hyperlink"/>
@@ -19572,7 +19278,7 @@
       </w:r>
     </w:p>
     <w:p>
-      <w:hyperlink r:id="rId127">
+      <w:hyperlink r:id="rId123">
         <w:r>
           <w:rPr>
             <w:rStyle w:val="Hyperlink"/>
@@ -19690,24 +19396,7 @@
           <w:rFonts w:ascii="Calibri" w:hAnsi="Calibri"/>
           <w:i/>
         </w:rPr>
-        <w:t xml:space="preserve">Sources: The Ali Abdaal case study is his own disclosed account, posted to his X (formerly Twitter) account </w:t>
-      </w:r>
-      <w:hyperlink r:id="rId128">
-        <w:r>
-          <w:rPr>
-            <w:rStyle w:val="Hyperlink"/>
-            <w:sz w:val="22"/>
-            <w:rFonts w:ascii="Calibri" w:hAnsi="Calibri"/>
-          </w:rPr>
-          <w:t xml:space="preserve">@AliAbdaal</w:t>
-        </w:r>
-      </w:hyperlink>
-      <w:r>
-        <w:rPr>
-          <w:rFonts w:ascii="Calibri" w:hAnsi="Calibri"/>
-          <w:i/>
-        </w:rPr>
-        <w:t xml:space="preserve">; this book could not fetch that post directly, so the figures are treated as the verification standard actually met — his own stated numbers, as indexed and quoted consistently by search results, not an independently audited record. Creator Partnerships eligibility is from </w:t>
+        <w:t xml:space="preserve">Sources: Creator Partnerships eligibility is from </w:t>
       </w:r>
       <w:hyperlink r:id="rId27">
         <w:r>
@@ -19743,7 +19432,7 @@
         </w:rPr>
         <w:t xml:space="preserve">. The paid promotion setting is from </w:t>
       </w:r>
-      <w:hyperlink r:id="rId92">
+      <w:hyperlink r:id="rId90">
         <w:r>
           <w:rPr>
             <w:rStyle w:val="Hyperlink"/>
@@ -19777,7 +19466,7 @@
         </w:rPr>
         <w:t xml:space="preserve">; cards and end screens from </w:t>
       </w:r>
-      <w:hyperlink r:id="rId126">
+      <w:hyperlink r:id="rId122">
         <w:r>
           <w:rPr>
             <w:rStyle w:val="Hyperlink"/>
@@ -19794,7 +19483,7 @@
         </w:rPr>
         <w:t xml:space="preserve"> and </w:t>
       </w:r>
-      <w:hyperlink r:id="rId65">
+      <w:hyperlink r:id="rId64">
         <w:r>
           <w:rPr>
             <w:rStyle w:val="Hyperlink"/>
@@ -19811,7 +19500,7 @@
         </w:rPr>
         <w:t xml:space="preserve">. Affiliate content under the Terms of Use is from </w:t>
       </w:r>
-      <w:hyperlink r:id="rId87">
+      <w:hyperlink r:id="rId85">
         <w:r>
           <w:rPr>
             <w:rStyle w:val="Hyperlink"/>
@@ -19845,7 +19534,7 @@
         </w:rPr>
         <w:t xml:space="preserve"> and its conditions from </w:t>
       </w:r>
-      <w:hyperlink r:id="rId127">
+      <w:hyperlink r:id="rId123">
         <w:r>
           <w:rPr>
             <w:rStyle w:val="Hyperlink"/>
@@ -19862,7 +19551,7 @@
         </w:rPr>
         <w:t xml:space="preserve">. US disclosure guidance is the FTC’s </w:t>
       </w:r>
-      <w:hyperlink r:id="rId101">
+      <w:hyperlink r:id="rId97">
         <w:r>
           <w:rPr>
             <w:rStyle w:val="Hyperlink"/>
@@ -19879,7 +19568,7 @@
         </w:rPr>
         <w:t xml:space="preserve"> and </w:t>
       </w:r>
-      <w:hyperlink r:id="rId102">
+      <w:hyperlink r:id="rId98">
         <w:r>
           <w:rPr>
             <w:rStyle w:val="Hyperlink"/>
@@ -19900,8 +19589,8 @@
     <w:p>
       <w:pPr>
         <w:sectPr>
-          <w:headerReference w:type="default" r:id="rId124"/>
-          <w:footerReference w:type="default" r:id="rId125"/>
+          <w:headerReference w:type="default" r:id="rId120"/>
+          <w:footerReference w:type="default" r:id="rId121"/>
           <w:pgSz w:w="10080" w:h="14400"/>
           <w:pgMar w:top="1008" w:right="1008" w:bottom="1008" w:left="1008" w:header="504" w:footer="504" w:gutter="0"/>
           <w:cols w:space="720"/>
@@ -20254,44 +19943,6 @@
         <w:t>No stream needs to be large. The goal is that losing any one of them is a bad month, not the end of the channel.</w:t>
       </w:r>
     </w:p>
-    <w:tbl>
-      <w:tblPr>
-        <w:tblW w:type="auto" w:w="0"/>
-        <w:tblLayout w:type="fixed"/>
-        <w:tblLook w:firstColumn="1" w:firstRow="1" w:lastColumn="0" w:lastRow="0" w:noHBand="0" w:noVBand="1" w:val="04A0"/>
-      </w:tblPr>
-      <w:tblGrid>
-        <w:gridCol w:w="8064"/>
-      </w:tblGrid>
-      <w:tr>
-        <w:tc>
-          <w:tcPr>
-            <w:tcW w:type="dxa" w:w="8064"/>
-            <w:tcW w:w="8063" w:type="dxa"/>
-            <w:shd w:val="clear" w:color="auto" w:fill="F3F1EA"/>
-          </w:tcPr>
-          <w:p>
-            <w:pPr>
-              <w:spacing w:after="40" w:before="40"/>
-            </w:pPr>
-            <w:r>
-              <w:rPr>
-                <w:rFonts w:ascii="Calibri" w:hAnsi="Calibri"/>
-                <w:sz w:val="22"/>
-              </w:rPr>
-            </w:r>
-            <w:r>
-              <w:rPr>
-                <w:rFonts w:ascii="Calibri" w:hAnsi="Calibri"/>
-                <w:sz w:val="22"/>
-              </w:rPr>
-              <w:t>Case study: Colin and Samir, whose channel covers the creator economy, have described their own income in interviews as roughly half to 60 percent brand deals, about 30 percent speaking, consulting, and creative work that never appears on the channel at all, and AdSense around 10 percent — a smaller share than many viewers would guess for two people who make YouTube videos for a living. AdSense only became a substantial stream for them in 2022, reaching $268,000 that year; for years before that it was a minor, inconsistent add-on to income built mostly from elsewhere. Spreading the income is not a hedge against a bad month. For a channel like theirs, it is most of the income.</w:t>
-            </w:r>
-          </w:p>
-        </w:tc>
-      </w:tr>
-    </w:tbl>
-    <w:p/>
     <w:p>
       <w:bookmarkStart w:id="123" w:name="toc122"/>
       <w:pPr>
@@ -20338,7 +19989,7 @@
                     <pic:cNvPicPr/>
                   </pic:nvPicPr>
                   <pic:blipFill>
-                    <a:blip r:embed="rId131"/>
+                    <a:blip r:embed="rId126"/>
                     <a:stretch>
                       <a:fillRect/>
                     </a:stretch>
@@ -20428,7 +20079,7 @@
       </w:r>
     </w:p>
     <w:p>
-      <w:hyperlink r:id="rId132">
+      <w:hyperlink r:id="rId127">
         <w:r>
           <w:rPr>
             <w:rStyle w:val="Hyperlink"/>
@@ -20453,7 +20104,7 @@
       </w:r>
     </w:p>
     <w:p>
-      <w:hyperlink r:id="rId133">
+      <w:hyperlink r:id="rId128">
         <w:r>
           <w:rPr>
             <w:rStyle w:val="Hyperlink"/>
@@ -20478,7 +20129,7 @@
       </w:r>
     </w:p>
     <w:p>
-      <w:hyperlink r:id="rId134">
+      <w:hyperlink r:id="rId129">
         <w:r>
           <w:rPr>
             <w:rStyle w:val="Hyperlink"/>
@@ -20503,7 +20154,7 @@
       </w:r>
     </w:p>
     <w:p>
-      <w:hyperlink r:id="rId135">
+      <w:hyperlink r:id="rId130">
         <w:r>
           <w:rPr>
             <w:rStyle w:val="Hyperlink"/>
@@ -20528,7 +20179,7 @@
       </w:r>
     </w:p>
     <w:p>
-      <w:hyperlink r:id="rId136">
+      <w:hyperlink r:id="rId131">
         <w:r>
           <w:rPr>
             <w:rStyle w:val="Hyperlink"/>
@@ -20848,24 +20499,7 @@
           <w:rFonts w:ascii="Calibri" w:hAnsi="Calibri"/>
           <w:i/>
         </w:rPr>
-        <w:t xml:space="preserve">Sources: The Colin and Samir income-mix figures are the pair’s own numbers, disclosed in public interviews on the creator economy, among them </w:t>
-      </w:r>
-      <w:hyperlink r:id="rId80">
-        <w:r>
-          <w:rPr>
-            <w:rStyle w:val="Hyperlink"/>
-            <w:sz w:val="22"/>
-            <w:rFonts w:ascii="Calibri" w:hAnsi="Calibri"/>
-          </w:rPr>
-          <w:t xml:space="preserve">a Digiday Q&amp;A with Samir Chaudry</w:t>
-        </w:r>
-      </w:hyperlink>
-      <w:r>
-        <w:rPr>
-          <w:rFonts w:ascii="Calibri" w:hAnsi="Calibri"/>
-          <w:i/>
-        </w:rPr>
-        <w:t xml:space="preserve">; this book has not independently audited them. They are also chapter 8's case study, cited again here (including the same $268,000/2022 figure) because they are one of the few creators who have put a full income breakdown on record, not because two chapters happened to land on the same number. That paid campaign views do not count is from </w:t>
+        <w:t xml:space="preserve">Sources: That paid campaign views do not count is from </w:t>
       </w:r>
       <w:hyperlink r:id="rId24">
         <w:r>
@@ -20918,7 +20552,7 @@
         </w:rPr>
         <w:t xml:space="preserve">. Other-platform lines in section IV come from the page linked on each line, opened in October 2026,; X’s page was read in the Internet Archive’s copy of 22 September 2026, because the live page refuses automated requests. Snapchat’s Spotlight Rewards end date is from </w:t>
       </w:r>
-      <w:hyperlink r:id="rId137">
+      <w:hyperlink r:id="rId132">
         <w:r>
           <w:rPr>
             <w:rStyle w:val="Hyperlink"/>
@@ -20939,8 +20573,8 @@
     <w:p>
       <w:pPr>
         <w:sectPr>
-          <w:headerReference w:type="default" r:id="rId129"/>
-          <w:footerReference w:type="default" r:id="rId130"/>
+          <w:headerReference w:type="default" r:id="rId124"/>
+          <w:footerReference w:type="default" r:id="rId125"/>
           <w:pgSz w:w="10080" w:h="14400"/>
           <w:pgMar w:top="1008" w:right="1008" w:bottom="1008" w:left="1008" w:header="504" w:footer="504" w:gutter="0"/>
           <w:cols w:space="720"/>
@@ -22680,7 +22314,7 @@
         </w:rPr>
         <w:t xml:space="preserve">Sources: This workbook is the author’s structure for the rest of this book. The bathroom-repair sheet and its money line are hypothetical illustrations, not a measured channel. The membership share is YouTube’s 70% after taxes and fees, from chapter 12. Affiliate disclosure follows chapter 13 and the FTC’s </w:t>
       </w:r>
-      <w:hyperlink r:id="rId101">
+      <w:hyperlink r:id="rId97">
         <w:r>
           <w:rPr>
             <w:rStyle w:val="Hyperlink"/>
@@ -22701,8 +22335,8 @@
     <w:p>
       <w:pPr>
         <w:sectPr>
-          <w:headerReference w:type="default" r:id="rId138"/>
-          <w:footerReference w:type="default" r:id="rId139"/>
+          <w:headerReference w:type="default" r:id="rId133"/>
+          <w:footerReference w:type="default" r:id="rId134"/>
           <w:pgSz w:w="10080" w:h="14400"/>
           <w:pgMar w:top="1008" w:right="1008" w:bottom="1008" w:left="1008" w:header="504" w:footer="504" w:gutter="0"/>
           <w:cols w:space="720"/>
@@ -22756,8 +22390,8 @@
     <w:p>
       <w:pPr>
         <w:sectPr>
-          <w:headerReference w:type="default" r:id="rId140"/>
-          <w:footerReference w:type="default" r:id="rId141"/>
+          <w:headerReference w:type="default" r:id="rId135"/>
+          <w:footerReference w:type="default" r:id="rId136"/>
           <w:pgSz w:w="10080" w:h="14400"/>
           <w:pgMar w:top="1008" w:right="1008" w:bottom="1008" w:left="1008" w:header="504" w:footer="504" w:gutter="0"/>
           <w:cols w:space="720"/>
@@ -23477,8 +23111,8 @@
     <w:p>
       <w:pPr>
         <w:sectPr>
-          <w:headerReference w:type="default" r:id="rId142"/>
-          <w:footerReference w:type="default" r:id="rId143"/>
+          <w:headerReference w:type="default" r:id="rId137"/>
+          <w:footerReference w:type="default" r:id="rId138"/>
           <w:pgSz w:w="10080" w:h="14400"/>
           <w:pgMar w:top="1008" w:right="1008" w:bottom="1008" w:left="1008" w:header="504" w:footer="504" w:gutter="0"/>
           <w:cols w:space="720"/>
@@ -23719,7 +23353,7 @@
         </w:rPr>
         <w:t xml:space="preserve">, </w:t>
       </w:r>
-      <w:hyperlink r:id="rId96">
+      <w:hyperlink r:id="rId94">
         <w:r>
           <w:rPr>
             <w:rStyle w:val="Hyperlink"/>
@@ -23751,7 +23385,7 @@
         </w:rPr>
         <w:t xml:space="preserve">, </w:t>
       </w:r>
-      <w:hyperlink r:id="rId126">
+      <w:hyperlink r:id="rId122">
         <w:r>
           <w:rPr>
             <w:rStyle w:val="Hyperlink"/>
@@ -23767,7 +23401,7 @@
         </w:rPr>
         <w:t xml:space="preserve">, </w:t>
       </w:r>
-      <w:hyperlink r:id="rId65">
+      <w:hyperlink r:id="rId64">
         <w:r>
           <w:rPr>
             <w:rStyle w:val="Hyperlink"/>
@@ -23785,7 +23419,7 @@
       </w:r>
     </w:p>
     <w:p>
-      <w:hyperlink r:id="rId49">
+      <w:hyperlink r:id="rId48">
         <w:r>
           <w:rPr>
             <w:rStyle w:val="Hyperlink"/>
@@ -23801,7 +23435,7 @@
         </w:rPr>
         <w:t xml:space="preserve">, </w:t>
       </w:r>
-      <w:hyperlink r:id="rId52">
+      <w:hyperlink r:id="rId51">
         <w:r>
           <w:rPr>
             <w:rStyle w:val="Hyperlink"/>
@@ -23817,7 +23451,7 @@
         </w:rPr>
         <w:t xml:space="preserve">, </w:t>
       </w:r>
-      <w:hyperlink r:id="rId41">
+      <w:hyperlink r:id="rId40">
         <w:r>
           <w:rPr>
             <w:rStyle w:val="Hyperlink"/>
@@ -23833,7 +23467,7 @@
         </w:rPr>
         <w:t xml:space="preserve">, </w:t>
       </w:r>
-      <w:hyperlink r:id="rId42">
+      <w:hyperlink r:id="rId41">
         <w:r>
           <w:rPr>
             <w:rStyle w:val="Hyperlink"/>
@@ -23857,7 +23491,7 @@
         </w:rPr>
         <w:t xml:space="preserve">Tools: </w:t>
       </w:r>
-      <w:hyperlink r:id="rId47">
+      <w:hyperlink r:id="rId46">
         <w:r>
           <w:rPr>
             <w:rStyle w:val="Hyperlink"/>
@@ -23873,7 +23507,7 @@
         </w:rPr>
         <w:t xml:space="preserve">, </w:t>
       </w:r>
-      <w:hyperlink r:id="rId59">
+      <w:hyperlink r:id="rId58">
         <w:r>
           <w:rPr>
             <w:rStyle w:val="Hyperlink"/>
@@ -23889,7 +23523,7 @@
         </w:rPr>
         <w:t xml:space="preserve">, </w:t>
       </w:r>
-      <w:hyperlink r:id="rId50">
+      <w:hyperlink r:id="rId49">
         <w:r>
           <w:rPr>
             <w:rStyle w:val="Hyperlink"/>
@@ -23905,7 +23539,7 @@
         </w:rPr>
         <w:t xml:space="preserve">, </w:t>
       </w:r>
-      <w:hyperlink r:id="rId51">
+      <w:hyperlink r:id="rId50">
         <w:r>
           <w:rPr>
             <w:rStyle w:val="Hyperlink"/>
@@ -23921,7 +23555,7 @@
         </w:rPr>
         <w:t xml:space="preserve">, </w:t>
       </w:r>
-      <w:hyperlink r:id="rId53">
+      <w:hyperlink r:id="rId52">
         <w:r>
           <w:rPr>
             <w:rStyle w:val="Hyperlink"/>
@@ -23937,7 +23571,7 @@
         </w:rPr>
         <w:t xml:space="preserve"> and </w:t>
       </w:r>
-      <w:hyperlink r:id="rId60">
+      <w:hyperlink r:id="rId59">
         <w:r>
           <w:rPr>
             <w:rStyle w:val="Hyperlink"/>
@@ -23953,7 +23587,7 @@
         </w:rPr>
         <w:t xml:space="preserve">, </w:t>
       </w:r>
-      <w:hyperlink r:id="rId54">
+      <w:hyperlink r:id="rId53">
         <w:r>
           <w:rPr>
             <w:rStyle w:val="Hyperlink"/>
@@ -23969,7 +23603,7 @@
         </w:rPr>
         <w:t xml:space="preserve">. AI examples: </w:t>
       </w:r>
-      <w:hyperlink r:id="rId55">
+      <w:hyperlink r:id="rId54">
         <w:r>
           <w:rPr>
             <w:rStyle w:val="Hyperlink"/>
@@ -23985,7 +23619,7 @@
         </w:rPr>
         <w:t xml:space="preserve">, </w:t>
       </w:r>
-      <w:hyperlink r:id="rId56">
+      <w:hyperlink r:id="rId55">
         <w:r>
           <w:rPr>
             <w:rStyle w:val="Hyperlink"/>
@@ -24001,7 +23635,7 @@
         </w:rPr>
         <w:t xml:space="preserve"> and </w:t>
       </w:r>
-      <w:hyperlink r:id="rId57">
+      <w:hyperlink r:id="rId56">
         <w:r>
           <w:rPr>
             <w:rStyle w:val="Hyperlink"/>
@@ -24035,7 +23669,7 @@
         </w:rPr>
         <w:t xml:space="preserve">, </w:t>
       </w:r>
-      <w:hyperlink r:id="rId107">
+      <w:hyperlink r:id="rId103">
         <w:r>
           <w:rPr>
             <w:rStyle w:val="Hyperlink"/>
@@ -24051,7 +23685,7 @@
         </w:rPr>
         <w:t xml:space="preserve">, </w:t>
       </w:r>
-      <w:hyperlink r:id="rId108">
+      <w:hyperlink r:id="rId104">
         <w:r>
           <w:rPr>
             <w:rStyle w:val="Hyperlink"/>
@@ -24067,7 +23701,7 @@
         </w:rPr>
         <w:t xml:space="preserve">, </w:t>
       </w:r>
-      <w:hyperlink r:id="rId63">
+      <w:hyperlink r:id="rId62">
         <w:r>
           <w:rPr>
             <w:rStyle w:val="Hyperlink"/>
@@ -24083,7 +23717,7 @@
         </w:rPr>
         <w:t xml:space="preserve">, </w:t>
       </w:r>
-      <w:hyperlink r:id="rId109">
+      <w:hyperlink r:id="rId105">
         <w:r>
           <w:rPr>
             <w:rStyle w:val="Hyperlink"/>
@@ -24099,7 +23733,7 @@
         </w:rPr>
         <w:t xml:space="preserve">, </w:t>
       </w:r>
-      <w:hyperlink r:id="rId43">
+      <w:hyperlink r:id="rId42">
         <w:r>
           <w:rPr>
             <w:rStyle w:val="Hyperlink"/>
@@ -24117,7 +23751,7 @@
       </w:r>
     </w:p>
     <w:p>
-      <w:hyperlink r:id="rId112">
+      <w:hyperlink r:id="rId108">
         <w:r>
           <w:rPr>
             <w:rStyle w:val="Hyperlink"/>
@@ -24133,7 +23767,7 @@
         </w:rPr>
         <w:t xml:space="preserve">, </w:t>
       </w:r>
-      <w:hyperlink r:id="rId113">
+      <w:hyperlink r:id="rId109">
         <w:r>
           <w:rPr>
             <w:rStyle w:val="Hyperlink"/>
@@ -24149,7 +23783,7 @@
         </w:rPr>
         <w:t xml:space="preserve">, </w:t>
       </w:r>
-      <w:hyperlink r:id="rId114">
+      <w:hyperlink r:id="rId110">
         <w:r>
           <w:rPr>
             <w:rStyle w:val="Hyperlink"/>
@@ -24165,7 +23799,7 @@
         </w:rPr>
         <w:t xml:space="preserve">, </w:t>
       </w:r>
-      <w:hyperlink r:id="rId115">
+      <w:hyperlink r:id="rId111">
         <w:r>
           <w:rPr>
             <w:rStyle w:val="Hyperlink"/>
@@ -24181,7 +23815,7 @@
         </w:rPr>
         <w:t xml:space="preserve">, </w:t>
       </w:r>
-      <w:hyperlink r:id="rId117">
+      <w:hyperlink r:id="rId113">
         <w:r>
           <w:rPr>
             <w:rStyle w:val="Hyperlink"/>
@@ -24197,7 +23831,7 @@
         </w:rPr>
         <w:t xml:space="preserve">, </w:t>
       </w:r>
-      <w:hyperlink r:id="rId118">
+      <w:hyperlink r:id="rId114">
         <w:r>
           <w:rPr>
             <w:rStyle w:val="Hyperlink"/>
@@ -24213,7 +23847,7 @@
         </w:rPr>
         <w:t xml:space="preserve">, </w:t>
       </w:r>
-      <w:hyperlink r:id="rId119">
+      <w:hyperlink r:id="rId115">
         <w:r>
           <w:rPr>
             <w:rStyle w:val="Hyperlink"/>
@@ -24229,7 +23863,7 @@
         </w:rPr>
         <w:t xml:space="preserve">, </w:t>
       </w:r>
-      <w:hyperlink r:id="rId120">
+      <w:hyperlink r:id="rId116">
         <w:r>
           <w:rPr>
             <w:rStyle w:val="Hyperlink"/>
@@ -24263,7 +23897,7 @@
         </w:rPr>
         <w:t xml:space="preserve">, </w:t>
       </w:r>
-      <w:hyperlink r:id="rId127">
+      <w:hyperlink r:id="rId123">
         <w:r>
           <w:rPr>
             <w:rStyle w:val="Hyperlink"/>
@@ -24297,7 +23931,7 @@
       </w:r>
     </w:p>
     <w:p>
-      <w:hyperlink r:id="rId146">
+      <w:hyperlink r:id="rId141">
         <w:r>
           <w:rPr>
             <w:rStyle w:val="Hyperlink"/>
@@ -24313,7 +23947,7 @@
         </w:rPr>
         <w:t xml:space="preserve"> and </w:t>
       </w:r>
-      <w:hyperlink r:id="rId147">
+      <w:hyperlink r:id="rId142">
         <w:r>
           <w:rPr>
             <w:rStyle w:val="Hyperlink"/>
@@ -24329,7 +23963,7 @@
         </w:rPr>
         <w:t xml:space="preserve">. </w:t>
       </w:r>
-      <w:hyperlink r:id="rId148">
+      <w:hyperlink r:id="rId143">
         <w:r>
           <w:rPr>
             <w:rStyle w:val="Hyperlink"/>
@@ -24347,7 +23981,7 @@
       </w:r>
     </w:p>
     <w:p>
-      <w:hyperlink r:id="rId101">
+      <w:hyperlink r:id="rId97">
         <w:r>
           <w:rPr>
             <w:rStyle w:val="Hyperlink"/>
@@ -24363,7 +23997,7 @@
         </w:rPr>
         <w:t xml:space="preserve"> and </w:t>
       </w:r>
-      <w:hyperlink r:id="rId102">
+      <w:hyperlink r:id="rId98">
         <w:r>
           <w:rPr>
             <w:rStyle w:val="Hyperlink"/>
@@ -24381,7 +24015,7 @@
       </w:r>
     </w:p>
     <w:p>
-      <w:hyperlink r:id="rId64">
+      <w:hyperlink r:id="rId63">
         <w:r>
           <w:rPr>
             <w:rStyle w:val="Hyperlink"/>
@@ -24397,7 +24031,7 @@
         </w:rPr>
         <w:t xml:space="preserve">. </w:t>
       </w:r>
-      <w:hyperlink r:id="rId72">
+      <w:hyperlink r:id="rId71">
         <w:r>
           <w:rPr>
             <w:rStyle w:val="Hyperlink"/>
@@ -24413,7 +24047,7 @@
         </w:rPr>
         <w:t xml:space="preserve">, </w:t>
       </w:r>
-      <w:hyperlink r:id="rId73">
+      <w:hyperlink r:id="rId72">
         <w:r>
           <w:rPr>
             <w:rStyle w:val="Hyperlink"/>
@@ -24429,7 +24063,7 @@
         </w:rPr>
         <w:t xml:space="preserve">, </w:t>
       </w:r>
-      <w:hyperlink r:id="rId74">
+      <w:hyperlink r:id="rId73">
         <w:r>
           <w:rPr>
             <w:rStyle w:val="Hyperlink"/>
@@ -24445,7 +24079,7 @@
         </w:rPr>
         <w:t xml:space="preserve">, </w:t>
       </w:r>
-      <w:hyperlink r:id="rId75">
+      <w:hyperlink r:id="rId74">
         <w:r>
           <w:rPr>
             <w:rStyle w:val="Hyperlink"/>
@@ -24463,7 +24097,7 @@
       </w:r>
     </w:p>
     <w:p>
-      <w:hyperlink r:id="rId85">
+      <w:hyperlink r:id="rId83">
         <w:r>
           <w:rPr>
             <w:rStyle w:val="Hyperlink"/>
@@ -24479,7 +24113,7 @@
         </w:rPr>
         <w:t xml:space="preserve">, </w:t>
       </w:r>
-      <w:hyperlink r:id="rId88">
+      <w:hyperlink r:id="rId86">
         <w:r>
           <w:rPr>
             <w:rStyle w:val="Hyperlink"/>
@@ -24495,7 +24129,7 @@
         </w:rPr>
         <w:t xml:space="preserve">, </w:t>
       </w:r>
-      <w:hyperlink r:id="rId91">
+      <w:hyperlink r:id="rId89">
         <w:r>
           <w:rPr>
             <w:rStyle w:val="Hyperlink"/>
@@ -24511,7 +24145,7 @@
         </w:rPr>
         <w:t xml:space="preserve">, </w:t>
       </w:r>
-      <w:hyperlink r:id="rId92">
+      <w:hyperlink r:id="rId90">
         <w:r>
           <w:rPr>
             <w:rStyle w:val="Hyperlink"/>
@@ -24527,7 +24161,7 @@
         </w:rPr>
         <w:t xml:space="preserve">, </w:t>
       </w:r>
-      <w:hyperlink r:id="rId58">
+      <w:hyperlink r:id="rId57">
         <w:r>
           <w:rPr>
             <w:rStyle w:val="Hyperlink"/>
@@ -24543,7 +24177,7 @@
         </w:rPr>
         <w:t xml:space="preserve">, </w:t>
       </w:r>
-      <w:hyperlink r:id="rId97">
+      <w:hyperlink r:id="rId95">
         <w:r>
           <w:rPr>
             <w:rStyle w:val="Hyperlink"/>
@@ -24559,7 +24193,7 @@
         </w:rPr>
         <w:t xml:space="preserve">, </w:t>
       </w:r>
-      <w:hyperlink r:id="rId79">
+      <w:hyperlink r:id="rId78">
         <w:r>
           <w:rPr>
             <w:rStyle w:val="Hyperlink"/>
@@ -24575,7 +24209,7 @@
         </w:rPr>
         <w:t xml:space="preserve">, </w:t>
       </w:r>
-      <w:hyperlink r:id="rId78">
+      <w:hyperlink r:id="rId77">
         <w:r>
           <w:rPr>
             <w:rStyle w:val="Hyperlink"/>
@@ -24591,7 +24225,7 @@
         </w:rPr>
         <w:t xml:space="preserve">, </w:t>
       </w:r>
-      <w:hyperlink r:id="rId87">
+      <w:hyperlink r:id="rId85">
         <w:r>
           <w:rPr>
             <w:rStyle w:val="Hyperlink"/>
@@ -24611,8 +24245,8 @@
     <w:p>
       <w:pPr>
         <w:sectPr>
-          <w:headerReference w:type="default" r:id="rId144"/>
-          <w:footerReference w:type="default" r:id="rId145"/>
+          <w:headerReference w:type="default" r:id="rId139"/>
+          <w:footerReference w:type="default" r:id="rId140"/>
           <w:pgSz w:w="10080" w:h="14400"/>
           <w:pgMar w:top="1008" w:right="1008" w:bottom="1008" w:left="1008" w:header="504" w:footer="504" w:gutter="0"/>
           <w:cols w:space="720"/>
@@ -25097,8 +24731,8 @@
       </w:r>
     </w:p>
     <w:sectPr>
-      <w:headerReference w:type="default" r:id="rId149"/>
-      <w:footerReference w:type="default" r:id="rId150"/>
+      <w:headerReference w:type="default" r:id="rId144"/>
+      <w:footerReference w:type="default" r:id="rId145"/>
       <w:pgSz w:w="10080" w:h="14400"/>
       <w:pgMar w:top="1008" w:right="1008" w:bottom="1008" w:left="1008" w:header="504" w:footer="504" w:gutter="0"/>
       <w:cols w:space="720"/>

</xml_diff>

<commit_message>
ch10: drop party names and name-bearing link from h3h3 case
Co-Authored-By: Claude Sonnet 5.5 <noreply@anthropic.com>
Claude-Session: https://claude.ai/code/session_012trHMyb3cJDTwS99K5EPVy
</commit_message>
<xml_diff>
--- a/Your First YouTube Channel That Rocks/Your First YouTube Channel That Rocks.docx
+++ b/Your First YouTube Channel That Rocks/Your First YouTube Channel That Rocks.docx
@@ -16164,7 +16164,7 @@
           <w:rFonts w:ascii="Calibri" w:hAnsi="Calibri"/>
           <w:i/>
         </w:rPr>
-        <w:t xml:space="preserve">. The h3h3Productions case study is docket No. 16-CV-3081 (S.D.N.Y. Aug. 23, 2017), as summarized by the </w:t>
+        <w:t xml:space="preserve">. The h3h3Productions case study is docket No. 16-CV-3081 (S.D.N.Y. Aug. 23, 2017), as summarized in the </w:t>
       </w:r>
       <w:hyperlink r:id="rId96">
         <w:r>
@@ -16181,7 +16181,7 @@
           <w:rFonts w:ascii="Calibri" w:hAnsi="Calibri"/>
           <w:i/>
         </w:rPr>
-        <w:t xml:space="preserve">. Content ID claim policies and the Shorts blocking rule are from </w:t>
+        <w:t xml:space="preserve"> (S.D.N.Y. 2017 summaries). Content ID claim policies and the Shorts blocking rule are from </w:t>
       </w:r>
       <w:hyperlink r:id="rId89">
         <w:r>

</xml_diff>

<commit_message>
ch12: add sourced memberships case study from YouTube's own post
Co-Authored-By: Claude Sonnet 5.5 <noreply@anthropic.com>
Claude-Session: https://claude.ai/code/session_012trHMyb3cJDTwS99K5EPVy
</commit_message>
<xml_diff>
--- a/Your First YouTube Channel That Rocks/Your First YouTube Channel That Rocks.docx
+++ b/Your First YouTube Channel That Rocks/Your First YouTube Channel That Rocks.docx
@@ -18088,6 +18088,52 @@
     </w:tbl>
     <w:p/>
     <w:p>
+      <w:r>
+        <w:rPr>
+          <w:rFonts w:ascii="Calibri" w:hAnsi="Calibri"/>
+        </w:rPr>
+        <w:t>That channel is large. Two much smaller ones show how the tiers get built.</w:t>
+      </w:r>
+    </w:p>
+    <w:tbl>
+      <w:tblPr>
+        <w:tblW w:type="auto" w:w="0"/>
+        <w:tblLayout w:type="fixed"/>
+        <w:tblLook w:firstColumn="1" w:firstRow="1" w:lastColumn="0" w:lastRow="0" w:noHBand="0" w:noVBand="1" w:val="04A0"/>
+      </w:tblPr>
+      <w:tblGrid>
+        <w:gridCol w:w="8064"/>
+      </w:tblGrid>
+      <w:tr>
+        <w:tc>
+          <w:tcPr>
+            <w:tcW w:type="dxa" w:w="8064"/>
+            <w:tcW w:w="8063" w:type="dxa"/>
+            <w:shd w:val="clear" w:color="auto" w:fill="F3F1EA"/>
+          </w:tcPr>
+          <w:p>
+            <w:pPr>
+              <w:spacing w:after="40" w:before="40"/>
+            </w:pPr>
+            <w:r>
+              <w:rPr>
+                <w:rFonts w:ascii="Calibri" w:hAnsi="Calibri"/>
+                <w:sz w:val="22"/>
+              </w:rPr>
+            </w:r>
+            <w:r>
+              <w:rPr>
+                <w:rFonts w:ascii="Calibri" w:hAnsi="Calibri"/>
+                <w:sz w:val="22"/>
+              </w:rPr>
+              <w:t>Case study: YouTube’s July 2025 creator blog post on memberships features two small channels. The channel @careercoachmandy, then at almost 50,000 subscribers, says it started by surveying its own viewers about the perks they wanted and found a preference it had not expected. The channel @becauseisaac says it started memberships for “consistency in revenue and audience engagement.” Neither post gives prices, member counts, or income. What both show is the order of work: ask or decide what regulars want, then build the tier, not the other way around.</w:t>
+            </w:r>
+          </w:p>
+        </w:tc>
+      </w:tr>
+    </w:tbl>
+    <w:p/>
+    <w:p>
       <w:bookmarkStart w:id="106" w:name="toc105"/>
       <w:pPr>
         <w:pStyle w:val="Heading2"/>
@@ -18412,7 +18458,24 @@
           <w:rFonts w:ascii="Calibri" w:hAnsi="Calibri"/>
           <w:i/>
         </w:rPr>
-        <w:t xml:space="preserve">, the “majority of its YouTube revenue” and $100,000 figures are YouTube’s own account of a creator it chose to feature, not an audited number. Minimum requirements, the four features, and the not-a-donation rule are from </w:t>
+        <w:t xml:space="preserve">, the “majority of its YouTube revenue” and $100,000 figures are YouTube’s own account of a creator it chose to feature, not an audited number. The second case study is from </w:t>
+      </w:r>
+      <w:hyperlink r:id="rId118">
+        <w:r>
+          <w:rPr>
+            <w:rStyle w:val="Hyperlink"/>
+            <w:sz w:val="22"/>
+            <w:rFonts w:ascii="Calibri" w:hAnsi="Calibri"/>
+          </w:rPr>
+          <w:t xml:space="preserve">YouTube’s July 2025 channel membership success stories</w:t>
+        </w:r>
+      </w:hyperlink>
+      <w:r>
+        <w:rPr>
+          <w:rFonts w:ascii="Calibri" w:hAnsi="Calibri"/>
+          <w:i/>
+        </w:rPr>
+        <w:t xml:space="preserve">; the quotes are from that post, and it gives no financial figures for either channel. Minimum requirements, the four features, and the not-a-donation rule are from </w:t>
       </w:r>
       <w:hyperlink r:id="rId108">
         <w:r>
@@ -18482,7 +18545,7 @@
         </w:rPr>
         <w:t xml:space="preserve">; the 70% share from </w:t>
       </w:r>
-      <w:hyperlink r:id="rId118">
+      <w:hyperlink r:id="rId119">
         <w:r>
           <w:rPr>
             <w:rStyle w:val="Hyperlink"/>
@@ -18567,7 +18630,7 @@
         </w:rPr>
         <w:t xml:space="preserve"> and </w:t>
       </w:r>
-      <w:hyperlink r:id="rId119">
+      <w:hyperlink r:id="rId120">
         <w:r>
           <w:rPr>
             <w:rStyle w:val="Hyperlink"/>
@@ -19210,7 +19273,7 @@
         </w:rPr>
         <w:t xml:space="preserve">An </w:t>
       </w:r>
-      <w:hyperlink r:id="rId122">
+      <w:hyperlink r:id="rId123">
         <w:r>
           <w:rPr>
             <w:rStyle w:val="Hyperlink"/>
@@ -19278,7 +19341,7 @@
       </w:r>
     </w:p>
     <w:p>
-      <w:hyperlink r:id="rId123">
+      <w:hyperlink r:id="rId124">
         <w:r>
           <w:rPr>
             <w:rStyle w:val="Hyperlink"/>
@@ -19466,7 +19529,7 @@
         </w:rPr>
         <w:t xml:space="preserve">; cards and end screens from </w:t>
       </w:r>
-      <w:hyperlink r:id="rId122">
+      <w:hyperlink r:id="rId123">
         <w:r>
           <w:rPr>
             <w:rStyle w:val="Hyperlink"/>
@@ -19534,7 +19597,7 @@
         </w:rPr>
         <w:t xml:space="preserve"> and its conditions from </w:t>
       </w:r>
-      <w:hyperlink r:id="rId123">
+      <w:hyperlink r:id="rId124">
         <w:r>
           <w:rPr>
             <w:rStyle w:val="Hyperlink"/>
@@ -19589,8 +19652,8 @@
     <w:p>
       <w:pPr>
         <w:sectPr>
-          <w:headerReference w:type="default" r:id="rId120"/>
-          <w:footerReference w:type="default" r:id="rId121"/>
+          <w:headerReference w:type="default" r:id="rId121"/>
+          <w:footerReference w:type="default" r:id="rId122"/>
           <w:pgSz w:w="10080" w:h="14400"/>
           <w:pgMar w:top="1008" w:right="1008" w:bottom="1008" w:left="1008" w:header="504" w:footer="504" w:gutter="0"/>
           <w:cols w:space="720"/>
@@ -19989,7 +20052,7 @@
                     <pic:cNvPicPr/>
                   </pic:nvPicPr>
                   <pic:blipFill>
-                    <a:blip r:embed="rId126"/>
+                    <a:blip r:embed="rId127"/>
                     <a:stretch>
                       <a:fillRect/>
                     </a:stretch>
@@ -20079,7 +20142,7 @@
       </w:r>
     </w:p>
     <w:p>
-      <w:hyperlink r:id="rId127">
+      <w:hyperlink r:id="rId128">
         <w:r>
           <w:rPr>
             <w:rStyle w:val="Hyperlink"/>
@@ -20104,7 +20167,7 @@
       </w:r>
     </w:p>
     <w:p>
-      <w:hyperlink r:id="rId128">
+      <w:hyperlink r:id="rId129">
         <w:r>
           <w:rPr>
             <w:rStyle w:val="Hyperlink"/>
@@ -20129,7 +20192,7 @@
       </w:r>
     </w:p>
     <w:p>
-      <w:hyperlink r:id="rId129">
+      <w:hyperlink r:id="rId130">
         <w:r>
           <w:rPr>
             <w:rStyle w:val="Hyperlink"/>
@@ -20154,7 +20217,7 @@
       </w:r>
     </w:p>
     <w:p>
-      <w:hyperlink r:id="rId130">
+      <w:hyperlink r:id="rId131">
         <w:r>
           <w:rPr>
             <w:rStyle w:val="Hyperlink"/>
@@ -20179,7 +20242,7 @@
       </w:r>
     </w:p>
     <w:p>
-      <w:hyperlink r:id="rId131">
+      <w:hyperlink r:id="rId132">
         <w:r>
           <w:rPr>
             <w:rStyle w:val="Hyperlink"/>
@@ -20552,7 +20615,7 @@
         </w:rPr>
         <w:t xml:space="preserve">. Other-platform lines in section IV come from the page linked on each line, opened in October 2026,; X’s page was read in the Internet Archive’s copy of 22 September 2026, because the live page refuses automated requests. Snapchat’s Spotlight Rewards end date is from </w:t>
       </w:r>
-      <w:hyperlink r:id="rId132">
+      <w:hyperlink r:id="rId133">
         <w:r>
           <w:rPr>
             <w:rStyle w:val="Hyperlink"/>
@@ -20573,8 +20636,8 @@
     <w:p>
       <w:pPr>
         <w:sectPr>
-          <w:headerReference w:type="default" r:id="rId124"/>
-          <w:footerReference w:type="default" r:id="rId125"/>
+          <w:headerReference w:type="default" r:id="rId125"/>
+          <w:footerReference w:type="default" r:id="rId126"/>
           <w:pgSz w:w="10080" w:h="14400"/>
           <w:pgMar w:top="1008" w:right="1008" w:bottom="1008" w:left="1008" w:header="504" w:footer="504" w:gutter="0"/>
           <w:cols w:space="720"/>
@@ -22335,8 +22398,8 @@
     <w:p>
       <w:pPr>
         <w:sectPr>
-          <w:headerReference w:type="default" r:id="rId133"/>
-          <w:footerReference w:type="default" r:id="rId134"/>
+          <w:headerReference w:type="default" r:id="rId134"/>
+          <w:footerReference w:type="default" r:id="rId135"/>
           <w:pgSz w:w="10080" w:h="14400"/>
           <w:pgMar w:top="1008" w:right="1008" w:bottom="1008" w:left="1008" w:header="504" w:footer="504" w:gutter="0"/>
           <w:cols w:space="720"/>
@@ -22390,8 +22453,8 @@
     <w:p>
       <w:pPr>
         <w:sectPr>
-          <w:headerReference w:type="default" r:id="rId135"/>
-          <w:footerReference w:type="default" r:id="rId136"/>
+          <w:headerReference w:type="default" r:id="rId136"/>
+          <w:footerReference w:type="default" r:id="rId137"/>
           <w:pgSz w:w="10080" w:h="14400"/>
           <w:pgMar w:top="1008" w:right="1008" w:bottom="1008" w:left="1008" w:header="504" w:footer="504" w:gutter="0"/>
           <w:cols w:space="720"/>
@@ -23111,8 +23174,8 @@
     <w:p>
       <w:pPr>
         <w:sectPr>
-          <w:headerReference w:type="default" r:id="rId137"/>
-          <w:footerReference w:type="default" r:id="rId138"/>
+          <w:headerReference w:type="default" r:id="rId138"/>
+          <w:footerReference w:type="default" r:id="rId139"/>
           <w:pgSz w:w="10080" w:h="14400"/>
           <w:pgMar w:top="1008" w:right="1008" w:bottom="1008" w:left="1008" w:header="504" w:footer="504" w:gutter="0"/>
           <w:cols w:space="720"/>
@@ -23385,7 +23448,7 @@
         </w:rPr>
         <w:t xml:space="preserve">, </w:t>
       </w:r>
-      <w:hyperlink r:id="rId122">
+      <w:hyperlink r:id="rId123">
         <w:r>
           <w:rPr>
             <w:rStyle w:val="Hyperlink"/>
@@ -23897,7 +23960,7 @@
         </w:rPr>
         <w:t xml:space="preserve">, </w:t>
       </w:r>
-      <w:hyperlink r:id="rId123">
+      <w:hyperlink r:id="rId124">
         <w:r>
           <w:rPr>
             <w:rStyle w:val="Hyperlink"/>
@@ -23931,7 +23994,7 @@
       </w:r>
     </w:p>
     <w:p>
-      <w:hyperlink r:id="rId141">
+      <w:hyperlink r:id="rId142">
         <w:r>
           <w:rPr>
             <w:rStyle w:val="Hyperlink"/>
@@ -23947,7 +24010,7 @@
         </w:rPr>
         <w:t xml:space="preserve"> and </w:t>
       </w:r>
-      <w:hyperlink r:id="rId142">
+      <w:hyperlink r:id="rId143">
         <w:r>
           <w:rPr>
             <w:rStyle w:val="Hyperlink"/>
@@ -23963,7 +24026,7 @@
         </w:rPr>
         <w:t xml:space="preserve">. </w:t>
       </w:r>
-      <w:hyperlink r:id="rId143">
+      <w:hyperlink r:id="rId144">
         <w:r>
           <w:rPr>
             <w:rStyle w:val="Hyperlink"/>
@@ -24245,8 +24308,8 @@
     <w:p>
       <w:pPr>
         <w:sectPr>
-          <w:headerReference w:type="default" r:id="rId139"/>
-          <w:footerReference w:type="default" r:id="rId140"/>
+          <w:headerReference w:type="default" r:id="rId140"/>
+          <w:footerReference w:type="default" r:id="rId141"/>
           <w:pgSz w:w="10080" w:h="14400"/>
           <w:pgMar w:top="1008" w:right="1008" w:bottom="1008" w:left="1008" w:header="504" w:footer="504" w:gutter="0"/>
           <w:cols w:space="720"/>
@@ -24731,8 +24794,8 @@
       </w:r>
     </w:p>
     <w:sectPr>
-      <w:headerReference w:type="default" r:id="rId144"/>
-      <w:footerReference w:type="default" r:id="rId145"/>
+      <w:headerReference w:type="default" r:id="rId145"/>
+      <w:footerReference w:type="default" r:id="rId146"/>
       <w:pgSz w:w="10080" w:h="14400"/>
       <w:pgMar w:top="1008" w:right="1008" w:bottom="1008" w:left="1008" w:header="504" w:footer="504" w:gutter="0"/>
       <w:cols w:space="720"/>

</xml_diff>

<commit_message>
YouTube book audit: remove unverifiable claims, correct h3h3 case (#70)
* YouTube book audit: remove unverifiable case studies, correct h3h3 case, no personal names

Co-Authored-By: Claude Sonnet 5.5 <noreply@anthropic.com>
Claude-Session: https://claude.ai/code/session_012trHMyb3cJDTwS99K5EPVy

* ch10: drop party names and name-bearing link from h3h3 case

Co-Authored-By: Claude Sonnet 5.5 <noreply@anthropic.com>
Claude-Session: https://claude.ai/code/session_012trHMyb3cJDTwS99K5EPVy

* ch12: add sourced memberships case study from YouTube's own post

Co-Authored-By: Claude Sonnet 5.5 <noreply@anthropic.com>
Claude-Session: https://claude.ai/code/session_012trHMyb3cJDTwS99K5EPVy

---------

Co-authored-by: Claude <noreply@anthropic.com>
</commit_message>
<xml_diff>
--- a/Your First YouTube Channel That Rocks/Your First YouTube Channel That Rocks.docx
+++ b/Your First YouTube Channel That Rocks/Your First YouTube Channel That Rocks.docx
@@ -5313,44 +5313,6 @@
         <w:t>, YouTube keeps the version with the highest watch time, not the one with the most clicks.</w:t>
       </w:r>
     </w:p>
-    <w:tbl>
-      <w:tblPr>
-        <w:tblW w:type="auto" w:w="0"/>
-        <w:tblLayout w:type="fixed"/>
-        <w:tblLook w:firstColumn="1" w:firstRow="1" w:lastColumn="0" w:lastRow="0" w:noHBand="0" w:noVBand="1" w:val="04A0"/>
-      </w:tblPr>
-      <w:tblGrid>
-        <w:gridCol w:w="8064"/>
-      </w:tblGrid>
-      <w:tr>
-        <w:tc>
-          <w:tcPr>
-            <w:tcW w:type="dxa" w:w="8064"/>
-            <w:tcW w:w="8063" w:type="dxa"/>
-            <w:shd w:val="clear" w:color="auto" w:fill="F3F1EA"/>
-          </w:tcPr>
-          <w:p>
-            <w:pPr>
-              <w:spacing w:after="40" w:before="40"/>
-            </w:pPr>
-            <w:r>
-              <w:rPr>
-                <w:rFonts w:ascii="Calibri" w:hAnsi="Calibri"/>
-                <w:sz w:val="22"/>
-              </w:rPr>
-            </w:r>
-            <w:r>
-              <w:rPr>
-                <w:rFonts w:ascii="Calibri" w:hAnsi="Calibri"/>
-                <w:sz w:val="22"/>
-              </w:rPr>
-              <w:t>Case study: MrBeast’s thumbnail team has described testing as many as fifty thumbnails for a single video before one goes live. The team has talked publicly about one such test: a closed-mouth expression run against an open-mouth one across roughly thirty videos, where the closed-mouth version won on watch time nearly every time — a small difference per video that held up because it repeated thirty times in a row. The team also points to a simpler habit: putting the same recognizable face in every thumbnail, a practice it started in 2019, specifically to build the kind of trust that lets a subscriber click without reading the title first. Both are tests of what keeps people watching, not just what gets the click.</w:t>
-            </w:r>
-          </w:p>
-        </w:tc>
-      </w:tr>
-    </w:tbl>
-    <w:p/>
     <w:p>
       <w:bookmarkStart w:id="17" w:name="toc16"/>
       <w:pPr>
@@ -6187,24 +6149,7 @@
           <w:rFonts w:ascii="Calibri" w:hAnsi="Calibri"/>
           <w:i/>
         </w:rPr>
-        <w:t xml:space="preserve">Sources: The MrBeast thumbnail case study is drawn from a YouTube-produced interview with the channel’s thumbnail designer, as reported by </w:t>
-      </w:r>
-      <w:hyperlink r:id="rId40">
-        <w:r>
-          <w:rPr>
-            <w:rStyle w:val="Hyperlink"/>
-            <w:sz w:val="22"/>
-            <w:rFonts w:ascii="Calibri" w:hAnsi="Calibri"/>
-          </w:rPr>
-          <w:t xml:space="preserve">Social Media Today</w:t>
-        </w:r>
-      </w:hyperlink>
-      <w:r>
-        <w:rPr>
-          <w:rFonts w:ascii="Calibri" w:hAnsi="Calibri"/>
-          <w:i/>
-        </w:rPr>
-        <w:t xml:space="preserve"> and corroborated by independent coverage of the same interview; this book could not fetch the original interview video directly, so the specific wording is treated as the verification standard actually met — a quote repeated consistently across independent reporting, not a verbatim transcript pulled by this book. </w:t>
+        <w:t xml:space="preserve">Sources: </w:t>
       </w:r>
       <w:hyperlink r:id="rId31">
         <w:r>
@@ -6359,7 +6304,7 @@
         </w:rPr>
         <w:t xml:space="preserve">, </w:t>
       </w:r>
-      <w:hyperlink r:id="rId41">
+      <w:hyperlink r:id="rId40">
         <w:r>
           <w:rPr>
             <w:rStyle w:val="Hyperlink"/>
@@ -6376,7 +6321,7 @@
         </w:rPr>
         <w:t xml:space="preserve">, </w:t>
       </w:r>
-      <w:hyperlink r:id="rId42">
+      <w:hyperlink r:id="rId41">
         <w:r>
           <w:rPr>
             <w:rStyle w:val="Hyperlink"/>
@@ -6393,7 +6338,7 @@
         </w:rPr>
         <w:t xml:space="preserve">, </w:t>
       </w:r>
-      <w:hyperlink r:id="rId43">
+      <w:hyperlink r:id="rId42">
         <w:r>
           <w:rPr>
             <w:rStyle w:val="Hyperlink"/>
@@ -6513,7 +6458,7 @@
                     <pic:cNvPicPr/>
                   </pic:nvPicPr>
                   <pic:blipFill>
-                    <a:blip r:embed="rId46"/>
+                    <a:blip r:embed="rId45"/>
                     <a:stretch>
                       <a:fillRect/>
                     </a:stretch>
@@ -7057,7 +7002,7 @@
       <w:pPr>
         <w:pStyle w:val="ListBullet"/>
       </w:pPr>
-      <w:hyperlink r:id="rId47">
+      <w:hyperlink r:id="rId46">
         <w:r>
           <w:rPr>
             <w:rStyle w:val="Hyperlink"/>
@@ -7078,7 +7023,7 @@
       <w:pPr>
         <w:pStyle w:val="ListBullet"/>
       </w:pPr>
-      <w:hyperlink r:id="rId48">
+      <w:hyperlink r:id="rId47">
         <w:r>
           <w:rPr>
             <w:rStyle w:val="Hyperlink"/>
@@ -7102,7 +7047,7 @@
         </w:rPr>
         <w:t xml:space="preserve">Whatever editor exports the file, match </w:t>
       </w:r>
-      <w:hyperlink r:id="rId49">
+      <w:hyperlink r:id="rId48">
         <w:r>
           <w:rPr>
             <w:rStyle w:val="Hyperlink"/>
@@ -7141,7 +7086,7 @@
       <w:pPr>
         <w:pStyle w:val="ListBullet"/>
       </w:pPr>
-      <w:hyperlink r:id="rId50">
+      <w:hyperlink r:id="rId49">
         <w:r>
           <w:rPr>
             <w:rStyle w:val="Hyperlink"/>
@@ -7162,7 +7107,7 @@
       <w:pPr>
         <w:pStyle w:val="ListBullet"/>
       </w:pPr>
-      <w:hyperlink r:id="rId51">
+      <w:hyperlink r:id="rId50">
         <w:r>
           <w:rPr>
             <w:rStyle w:val="Hyperlink"/>
@@ -7222,7 +7167,7 @@
         </w:rPr>
         <w:t xml:space="preserve"> Official rule: </w:t>
       </w:r>
-      <w:hyperlink r:id="rId52">
+      <w:hyperlink r:id="rId51">
         <w:r>
           <w:rPr>
             <w:rStyle w:val="Hyperlink"/>
@@ -7243,7 +7188,7 @@
       <w:pPr>
         <w:pStyle w:val="ListBullet"/>
       </w:pPr>
-      <w:hyperlink r:id="rId53">
+      <w:hyperlink r:id="rId52">
         <w:r>
           <w:rPr>
             <w:rStyle w:val="Hyperlink"/>
@@ -7382,7 +7327,7 @@
         </w:rPr>
         <w:t xml:space="preserve"> YouTube’s </w:t>
       </w:r>
-      <w:hyperlink r:id="rId41">
+      <w:hyperlink r:id="rId40">
         <w:r>
           <w:rPr>
             <w:rStyle w:val="Hyperlink"/>
@@ -7465,7 +7410,7 @@
       <w:pPr>
         <w:pStyle w:val="ListBullet"/>
       </w:pPr>
-      <w:hyperlink r:id="rId54">
+      <w:hyperlink r:id="rId53">
         <w:r>
           <w:rPr>
             <w:rStyle w:val="Hyperlink"/>
@@ -7581,7 +7526,7 @@
         </w:rPr>
         <w:t xml:space="preserve">Voice: </w:t>
       </w:r>
-      <w:hyperlink r:id="rId55">
+      <w:hyperlink r:id="rId54">
         <w:r>
           <w:rPr>
             <w:rStyle w:val="Hyperlink"/>
@@ -7616,7 +7561,7 @@
         </w:rPr>
         <w:t xml:space="preserve">Footage: </w:t>
       </w:r>
-      <w:hyperlink r:id="rId56">
+      <w:hyperlink r:id="rId55">
         <w:r>
           <w:rPr>
             <w:rStyle w:val="Hyperlink"/>
@@ -7639,7 +7584,7 @@
         </w:rPr>
         <w:t xml:space="preserve"> Text-to-video and image generation. The pricing page lists a free plan with 125 one-time credits, and a Standard plan at $15 a month ($12 billed yearly) with 625 credits a month, listing “No watermarks” among its features. Runway’s </w:t>
       </w:r>
-      <w:hyperlink r:id="rId57">
+      <w:hyperlink r:id="rId56">
         <w:r>
           <w:rPr>
             <w:rStyle w:val="Hyperlink"/>
@@ -7736,44 +7681,6 @@
         <w:t>One path borrows nobody’s words, voice, or picture: rewrite an idea entirely in your own words, record it in your own voice, and pair it with visuals you filmed, drew, or photographed. Everything else in this chapter adds a check. A text-to-speech voice is usable when it is not a clone of someone else. A stock clip is usable after you have read its license. Generated footage is usable after you have read the tool’s commercial-use terms. “I generated it” replaces none of those readings.</w:t>
       </w:r>
     </w:p>
-    <w:tbl>
-      <w:tblPr>
-        <w:tblW w:type="auto" w:w="0"/>
-        <w:tblLayout w:type="fixed"/>
-        <w:tblLook w:firstColumn="1" w:firstRow="1" w:lastColumn="0" w:lastRow="0" w:noHBand="0" w:noVBand="1" w:val="04A0"/>
-      </w:tblPr>
-      <w:tblGrid>
-        <w:gridCol w:w="8064"/>
-      </w:tblGrid>
-      <w:tr>
-        <w:tc>
-          <w:tcPr>
-            <w:tcW w:type="dxa" w:w="8064"/>
-            <w:tcW w:w="8063" w:type="dxa"/>
-            <w:shd w:val="clear" w:color="auto" w:fill="F3F1EA"/>
-          </w:tcPr>
-          <w:p>
-            <w:pPr>
-              <w:spacing w:after="40" w:before="40"/>
-            </w:pPr>
-            <w:r>
-              <w:rPr>
-                <w:rFonts w:ascii="Calibri" w:hAnsi="Calibri"/>
-                <w:sz w:val="22"/>
-              </w:rPr>
-            </w:r>
-            <w:r>
-              <w:rPr>
-                <w:rFonts w:ascii="Calibri" w:hAnsi="Calibri"/>
-                <w:sz w:val="22"/>
-              </w:rPr>
-              <w:t>Case study: The channel Primitive Technology, launched in Far North Queensland, Australia, in May 2015, takes that workflow further than most creators ever need to. Every video shows its creator building a tool or a shelter from materials gathered on camera, with no spoken narration at all — only the ambient sound of the work itself, and short on-screen text captions where a word is needed. There is no script to license, no voice to clone, no stock clip to check, and no music bed that could draw a copyright claim. The channel passed several million subscribers within a few years of launching and has grown well past ten million since, which is proof that “cheap” and “thin” are not the same thing: a video with no budget at all for voice, music, or licensed footage can still be the kind of video a stranger finishes.</w:t>
-            </w:r>
-          </w:p>
-        </w:tc>
-      </w:tr>
-    </w:tbl>
-    <w:p/>
     <w:p>
       <w:r>
         <w:rPr>
@@ -7873,9 +7780,9 @@
           <w:rFonts w:ascii="Calibri" w:hAnsi="Calibri"/>
           <w:i/>
         </w:rPr>
-        <w:t xml:space="preserve">Sources: The Primitive Technology case study (launch date, location, and format) is corroborated across its Wikipedia entry and independent channel-stats coverage; subscriber figures are rounded and approximate, not a number this book pulled from the channel’s own disclosure. </w:t>
-      </w:r>
-      <w:hyperlink r:id="rId49">
+        <w:t xml:space="preserve">Sources: </w:t>
+      </w:r>
+      <w:hyperlink r:id="rId48">
         <w:r>
           <w:rPr>
             <w:rStyle w:val="Hyperlink"/>
@@ -7892,7 +7799,7 @@
         </w:rPr>
         <w:t xml:space="preserve">. </w:t>
       </w:r>
-      <w:hyperlink r:id="rId52">
+      <w:hyperlink r:id="rId51">
         <w:r>
           <w:rPr>
             <w:rStyle w:val="Hyperlink"/>
@@ -7926,7 +7833,7 @@
         </w:rPr>
         <w:t xml:space="preserve"> (rights statement). </w:t>
       </w:r>
-      <w:hyperlink r:id="rId41">
+      <w:hyperlink r:id="rId40">
         <w:r>
           <w:rPr>
             <w:rStyle w:val="Hyperlink"/>
@@ -7943,7 +7850,7 @@
         </w:rPr>
         <w:t xml:space="preserve"> and </w:t>
       </w:r>
-      <w:hyperlink r:id="rId42">
+      <w:hyperlink r:id="rId41">
         <w:r>
           <w:rPr>
             <w:rStyle w:val="Hyperlink"/>
@@ -7960,7 +7867,7 @@
         </w:rPr>
         <w:t xml:space="preserve">. </w:t>
       </w:r>
-      <w:hyperlink r:id="rId58">
+      <w:hyperlink r:id="rId57">
         <w:r>
           <w:rPr>
             <w:rStyle w:val="Hyperlink"/>
@@ -7977,7 +7884,7 @@
         </w:rPr>
         <w:t xml:space="preserve">. Tool facts are from each tool’s own page, opened October 2026: </w:t>
       </w:r>
-      <w:hyperlink r:id="rId47">
+      <w:hyperlink r:id="rId46">
         <w:r>
           <w:rPr>
             <w:rStyle w:val="Hyperlink"/>
@@ -7994,7 +7901,7 @@
         </w:rPr>
         <w:t xml:space="preserve">, </w:t>
       </w:r>
-      <w:hyperlink r:id="rId59">
+      <w:hyperlink r:id="rId58">
         <w:r>
           <w:rPr>
             <w:rStyle w:val="Hyperlink"/>
@@ -8011,7 +7918,7 @@
         </w:rPr>
         <w:t xml:space="preserve">, </w:t>
       </w:r>
-      <w:hyperlink r:id="rId50">
+      <w:hyperlink r:id="rId49">
         <w:r>
           <w:rPr>
             <w:rStyle w:val="Hyperlink"/>
@@ -8028,7 +7935,7 @@
         </w:rPr>
         <w:t xml:space="preserve">, </w:t>
       </w:r>
-      <w:hyperlink r:id="rId51">
+      <w:hyperlink r:id="rId50">
         <w:r>
           <w:rPr>
             <w:rStyle w:val="Hyperlink"/>
@@ -8045,7 +7952,7 @@
         </w:rPr>
         <w:t xml:space="preserve">, </w:t>
       </w:r>
-      <w:hyperlink r:id="rId53">
+      <w:hyperlink r:id="rId52">
         <w:r>
           <w:rPr>
             <w:rStyle w:val="Hyperlink"/>
@@ -8062,7 +7969,7 @@
         </w:rPr>
         <w:t xml:space="preserve"> and </w:t>
       </w:r>
-      <w:hyperlink r:id="rId60">
+      <w:hyperlink r:id="rId59">
         <w:r>
           <w:rPr>
             <w:rStyle w:val="Hyperlink"/>
@@ -8079,7 +7986,7 @@
         </w:rPr>
         <w:t xml:space="preserve">, </w:t>
       </w:r>
-      <w:hyperlink r:id="rId54">
+      <w:hyperlink r:id="rId53">
         <w:r>
           <w:rPr>
             <w:rStyle w:val="Hyperlink"/>
@@ -8096,7 +8003,7 @@
         </w:rPr>
         <w:t xml:space="preserve">. AI examples: </w:t>
       </w:r>
-      <w:hyperlink r:id="rId55">
+      <w:hyperlink r:id="rId54">
         <w:r>
           <w:rPr>
             <w:rStyle w:val="Hyperlink"/>
@@ -8113,7 +8020,7 @@
         </w:rPr>
         <w:t xml:space="preserve">, </w:t>
       </w:r>
-      <w:hyperlink r:id="rId56">
+      <w:hyperlink r:id="rId55">
         <w:r>
           <w:rPr>
             <w:rStyle w:val="Hyperlink"/>
@@ -8130,7 +8037,7 @@
         </w:rPr>
         <w:t xml:space="preserve"> and </w:t>
       </w:r>
-      <w:hyperlink r:id="rId57">
+      <w:hyperlink r:id="rId56">
         <w:r>
           <w:rPr>
             <w:rStyle w:val="Hyperlink"/>
@@ -8151,8 +8058,8 @@
     <w:p>
       <w:pPr>
         <w:sectPr>
-          <w:headerReference w:type="default" r:id="rId44"/>
-          <w:footerReference w:type="default" r:id="rId45"/>
+          <w:headerReference w:type="default" r:id="rId43"/>
+          <w:footerReference w:type="default" r:id="rId44"/>
           <w:pgSz w:w="10080" w:h="14400"/>
           <w:pgMar w:top="1008" w:right="1008" w:bottom="1008" w:left="1008" w:header="504" w:footer="504" w:gutter="0"/>
           <w:cols w:space="720"/>
@@ -8620,7 +8527,7 @@
               </w:rPr>
               <w:t xml:space="preserve">Worked example. Spoken English for a teaching video often lands somewhere around 130 to 160 words a minute. Treat that as a starting guess and time yourself; yours will differ. A 1,200-word script at 150 words a minute is about eight minutes before any demonstration is added. If the method takes three minutes to show on screen, the video is about eleven minutes. Length has one published money rule (official rule): </w:t>
             </w:r>
-            <w:hyperlink r:id="rId63">
+            <w:hyperlink r:id="rId62">
               <w:r>
                 <w:rPr>
                   <w:rStyle w:val="Hyperlink"/>
@@ -8899,7 +8806,7 @@
         </w:rPr>
         <w:t xml:space="preserve">Many of the eight jobs are better as a screen than as a face: the spreadsheet, the checklist, the software. A free screen recorder such as </w:t>
       </w:r>
-      <w:hyperlink r:id="rId54">
+      <w:hyperlink r:id="rId53">
         <w:r>
           <w:rPr>
             <w:rStyle w:val="Hyperlink"/>
@@ -9065,7 +8972,7 @@
         </w:rPr>
         <w:t>Then add video chapters. Official rule (</w:t>
       </w:r>
-      <w:hyperlink r:id="rId64">
+      <w:hyperlink r:id="rId63">
         <w:r>
           <w:rPr>
             <w:rStyle w:val="Hyperlink"/>
@@ -9105,7 +9012,7 @@
         <w:rPr>
           <w:rFonts w:ascii="Calibri" w:hAnsi="Calibri"/>
         </w:rPr>
-        <w:t>The last minute of a teaching video is where most channels stack everything: subscribe, like, comment, the other channel, the newsletter, the sponsor. Author recommendation: one ask and one next video.</w:t>
+        <w:t>The last minute of a teaching video is where it is tempting to stack everything: subscribe, like, comment, the other channel, the newsletter, the sponsor. Author recommendation: one ask and one next video.</w:t>
       </w:r>
     </w:p>
     <w:p>
@@ -9123,7 +9030,7 @@
         </w:rPr>
         <w:t xml:space="preserve">Official rule: </w:t>
       </w:r>
-      <w:hyperlink r:id="rId65">
+      <w:hyperlink r:id="rId64">
         <w:r>
           <w:rPr>
             <w:rStyle w:val="Hyperlink"/>
@@ -9337,7 +9244,7 @@
         </w:rPr>
         <w:t xml:space="preserve">Sources: </w:t>
       </w:r>
-      <w:hyperlink r:id="rId63">
+      <w:hyperlink r:id="rId62">
         <w:r>
           <w:rPr>
             <w:rStyle w:val="Hyperlink"/>
@@ -9354,7 +9261,7 @@
         </w:rPr>
         <w:t xml:space="preserve"> (eight-minute rule, natural breaks). </w:t>
       </w:r>
-      <w:hyperlink r:id="rId64">
+      <w:hyperlink r:id="rId63">
         <w:r>
           <w:rPr>
             <w:rStyle w:val="Hyperlink"/>
@@ -9371,7 +9278,7 @@
         </w:rPr>
         <w:t xml:space="preserve">. </w:t>
       </w:r>
-      <w:hyperlink r:id="rId65">
+      <w:hyperlink r:id="rId64">
         <w:r>
           <w:rPr>
             <w:rStyle w:val="Hyperlink"/>
@@ -9392,8 +9299,8 @@
     <w:p>
       <w:pPr>
         <w:sectPr>
-          <w:headerReference w:type="default" r:id="rId61"/>
-          <w:footerReference w:type="default" r:id="rId62"/>
+          <w:headerReference w:type="default" r:id="rId60"/>
+          <w:footerReference w:type="default" r:id="rId61"/>
           <w:pgSz w:w="10080" w:h="14400"/>
           <w:pgMar w:top="1008" w:right="1008" w:bottom="1008" w:left="1008" w:header="504" w:footer="504" w:gutter="0"/>
           <w:cols w:space="720"/>
@@ -9837,7 +9744,7 @@
         </w:rPr>
         <w:t xml:space="preserve">Sources: </w:t>
       </w:r>
-      <w:hyperlink r:id="rId63">
+      <w:hyperlink r:id="rId62">
         <w:r>
           <w:rPr>
             <w:rStyle w:val="Hyperlink"/>
@@ -9892,8 +9799,8 @@
     <w:p>
       <w:pPr>
         <w:sectPr>
-          <w:headerReference w:type="default" r:id="rId66"/>
-          <w:footerReference w:type="default" r:id="rId67"/>
+          <w:headerReference w:type="default" r:id="rId65"/>
+          <w:footerReference w:type="default" r:id="rId66"/>
           <w:pgSz w:w="10080" w:h="14400"/>
           <w:pgMar w:top="1008" w:right="1008" w:bottom="1008" w:left="1008" w:header="504" w:footer="504" w:gutter="0"/>
           <w:cols w:space="720"/>
@@ -10255,8 +10162,8 @@
     <w:p>
       <w:pPr>
         <w:sectPr>
-          <w:headerReference w:type="default" r:id="rId68"/>
-          <w:footerReference w:type="default" r:id="rId69"/>
+          <w:headerReference w:type="default" r:id="rId67"/>
+          <w:footerReference w:type="default" r:id="rId68"/>
           <w:pgSz w:w="10080" w:h="14400"/>
           <w:pgMar w:top="1008" w:right="1008" w:bottom="1008" w:left="1008" w:header="504" w:footer="504" w:gutter="0"/>
           <w:cols w:space="720"/>
@@ -10742,7 +10649,7 @@
         </w:rPr>
         <w:t xml:space="preserve">An impression, in Studio, is not every time your video exists somewhere. YouTube’s </w:t>
       </w:r>
-      <w:hyperlink r:id="rId72">
+      <w:hyperlink r:id="rId71">
         <w:r>
           <w:rPr>
             <w:rStyle w:val="Hyperlink"/>
@@ -10766,7 +10673,7 @@
         </w:rPr>
         <w:t xml:space="preserve">YouTube’s </w:t>
       </w:r>
-      <w:hyperlink r:id="rId73">
+      <w:hyperlink r:id="rId72">
         <w:r>
           <w:rPr>
             <w:rStyle w:val="Hyperlink"/>
@@ -10880,7 +10787,7 @@
         </w:rPr>
         <w:t xml:space="preserve">Open a video’s Analytics and choose Reach. The report YouTube’s </w:t>
       </w:r>
-      <w:hyperlink r:id="rId74">
+      <w:hyperlink r:id="rId73">
         <w:r>
           <w:rPr>
             <w:rStyle w:val="Hyperlink"/>
@@ -11559,59 +11466,6 @@
         <w:t>Everything else on the Reach tab is context. It is worth a glance once a month. It is not worth a decision once a week.</w:t>
       </w:r>
     </w:p>
-    <w:tbl>
-      <w:tblPr>
-        <w:tblW w:type="auto" w:w="0"/>
-        <w:tblLayout w:type="fixed"/>
-        <w:tblLook w:firstColumn="1" w:firstRow="1" w:lastColumn="0" w:lastRow="0" w:noHBand="0" w:noVBand="1" w:val="04A0"/>
-      </w:tblPr>
-      <w:tblGrid>
-        <w:gridCol w:w="8064"/>
-      </w:tblGrid>
-      <w:tr>
-        <w:tc>
-          <w:tcPr>
-            <w:tcW w:type="dxa" w:w="8064"/>
-            <w:tcW w:w="8063" w:type="dxa"/>
-            <w:shd w:val="clear" w:color="auto" w:fill="F3F1EA"/>
-          </w:tcPr>
-          <w:p>
-            <w:pPr>
-              <w:spacing w:after="40" w:before="40"/>
-            </w:pPr>
-            <w:r>
-              <w:rPr>
-                <w:rFonts w:ascii="Calibri" w:hAnsi="Calibri"/>
-                <w:sz w:val="22"/>
-              </w:rPr>
-            </w:r>
-            <w:r>
-              <w:rPr>
-                <w:rFonts w:ascii="Calibri" w:hAnsi="Calibri"/>
-                <w:sz w:val="22"/>
-              </w:rPr>
-              <w:t xml:space="preserve">Case study: In 2008, Weezer posted a video for their song “Pork and Beans” and picked up close to two million views within days — the kind of number a channel might credit to the song or the YouTube home page. Their team opened YouTube’s traffic-source report of the time (then called Insight) and found something they had not expected: a large share of early viewers had arrived by way of technology blogs linking to the video, not by searching or browsing YouTube itself. Three days in, 38% of viewers had found the video off YouTube entirely. Ben Patterson, who worked on the band’s digital strategy, said what made the report useful was exactly the thing this section is about: not the view count, but </w:t>
-            </w:r>
-            <w:r>
-              <w:rPr>
-                <w:rFonts w:ascii="Calibri" w:hAnsi="Calibri"/>
-                <w:i/>
-                <w:sz w:val="22"/>
-              </w:rPr>
-              <w:t>how</w:t>
-            </w:r>
-            <w:r>
-              <w:rPr>
-                <w:rFonts w:ascii="Calibri" w:hAnsi="Calibri"/>
-                <w:sz w:val="22"/>
-              </w:rPr>
-              <w:t xml:space="preserve"> people found the video. The report has a different name and a different layout today. The question it answers for a creator reading Reach in Studio has not changed.</w:t>
-            </w:r>
-          </w:p>
-        </w:tc>
-      </w:tr>
-    </w:tbl>
-    <w:p/>
     <w:p>
       <w:bookmarkStart w:id="60" w:name="toc59"/>
       <w:pPr>
@@ -11699,7 +11553,7 @@
         </w:rPr>
         <w:t xml:space="preserve">Studio’s </w:t>
       </w:r>
-      <w:hyperlink r:id="rId75">
+      <w:hyperlink r:id="rId74">
         <w:r>
           <w:rPr>
             <w:rStyle w:val="Hyperlink"/>
@@ -11998,7 +11852,7 @@
           <w:rFonts w:ascii="Calibri" w:hAnsi="Calibri"/>
           <w:i/>
         </w:rPr>
-        <w:t xml:space="preserve">Sources: The Weezer case study is from contemporaneous 2008 reporting, including an interview with YouTube’s own product management team conducted by Eric Enge, and independent news coverage of the same episode at the time; this book treats the 38% figure and the Ben Patterson quote as well-corroborated history, not a number audited by this book. YouTube Insight was the analytics tool of that era and is not the current Reach tab; the lesson about reading traffic sources carries over. </w:t>
+        <w:t xml:space="preserve">Sources: </w:t>
       </w:r>
       <w:hyperlink r:id="rId21">
         <w:r>
@@ -12017,7 +11871,7 @@
         </w:rPr>
         <w:t xml:space="preserve"> (what qualifies). </w:t>
       </w:r>
-      <w:hyperlink r:id="rId72">
+      <w:hyperlink r:id="rId71">
         <w:r>
           <w:rPr>
             <w:rStyle w:val="Hyperlink"/>
@@ -12034,7 +11888,7 @@
         </w:rPr>
         <w:t xml:space="preserve">. </w:t>
       </w:r>
-      <w:hyperlink r:id="rId73">
+      <w:hyperlink r:id="rId72">
         <w:r>
           <w:rPr>
             <w:rStyle w:val="Hyperlink"/>
@@ -12051,7 +11905,7 @@
         </w:rPr>
         <w:t xml:space="preserve">. </w:t>
       </w:r>
-      <w:hyperlink r:id="rId74">
+      <w:hyperlink r:id="rId73">
         <w:r>
           <w:rPr>
             <w:rStyle w:val="Hyperlink"/>
@@ -12068,7 +11922,7 @@
         </w:rPr>
         <w:t xml:space="preserve"> (traffic sources, search terms, content suggesting this video). </w:t>
       </w:r>
-      <w:hyperlink r:id="rId75">
+      <w:hyperlink r:id="rId74">
         <w:r>
           <w:rPr>
             <w:rStyle w:val="Hyperlink"/>
@@ -12089,8 +11943,8 @@
     <w:p>
       <w:pPr>
         <w:sectPr>
-          <w:headerReference w:type="default" r:id="rId70"/>
-          <w:footerReference w:type="default" r:id="rId71"/>
+          <w:headerReference w:type="default" r:id="rId69"/>
+          <w:footerReference w:type="default" r:id="rId70"/>
           <w:pgSz w:w="10080" w:h="14400"/>
           <w:pgMar w:top="1008" w:right="1008" w:bottom="1008" w:left="1008" w:header="504" w:footer="504" w:gutter="0"/>
           <w:cols w:space="720"/>
@@ -12274,47 +12128,9 @@
         <w:rPr>
           <w:rFonts w:ascii="Calibri" w:hAnsi="Calibri"/>
         </w:rPr>
-        <w:t>Second, the routes are different sizes. Most new channels can picture 220 long-form views a day sooner than 222,000 Shorts views. That is not a rule against Shorts. It is a reason to choose the route on purpose.</w:t>
-      </w:r>
-    </w:p>
-    <w:tbl>
-      <w:tblPr>
-        <w:tblW w:type="auto" w:w="0"/>
-        <w:tblLayout w:type="fixed"/>
-        <w:tblLook w:firstColumn="1" w:firstRow="1" w:lastColumn="0" w:lastRow="0" w:noHBand="0" w:noVBand="1" w:val="04A0"/>
-      </w:tblPr>
-      <w:tblGrid>
-        <w:gridCol w:w="8064"/>
-      </w:tblGrid>
-      <w:tr>
-        <w:tc>
-          <w:tcPr>
-            <w:tcW w:type="dxa" w:w="8064"/>
-            <w:tcW w:w="8063" w:type="dxa"/>
-            <w:shd w:val="clear" w:color="auto" w:fill="F3F1EA"/>
-          </w:tcPr>
-          <w:p>
-            <w:pPr>
-              <w:spacing w:after="40" w:before="40"/>
-            </w:pPr>
-            <w:r>
-              <w:rPr>
-                <w:rFonts w:ascii="Calibri" w:hAnsi="Calibri"/>
-                <w:sz w:val="22"/>
-              </w:rPr>
-            </w:r>
-            <w:r>
-              <w:rPr>
-                <w:rFonts w:ascii="Calibri" w:hAnsi="Calibri"/>
-                <w:sz w:val="22"/>
-              </w:rPr>
-              <w:t>Case study: Colin and Samir run a YouTube channel that reports on the creator economy itself, which makes their own numbers an unusually well-documented anchor. In interviews, they have described their very first AdSense payment as about forty cents, and said that by December 2019 — several years into the channel — their combined YouTube income was still only around $26,000 each a year. AdSense did not become a substantial stream for them until 2022, when it reached $268,000 for the year. The arithmetic above describes the gate. It says nothing about the years most channels spend on the other side of it before a stream like ads becomes real money.</w:t>
-            </w:r>
-          </w:p>
-        </w:tc>
-      </w:tr>
-    </w:tbl>
-    <w:p/>
+        <w:t>Second, the routes are different sizes. In the example above, the long-form route needs 165 to 330 views a day. The 2027 Shorts route needs about 222,000. That is not a rule against Shorts. It is a reason to choose the route on purpose.</w:t>
+      </w:r>
+    </w:p>
     <w:p>
       <w:bookmarkStart w:id="66" w:name="toc65"/>
       <w:pPr>
@@ -12346,7 +12162,7 @@
         <w:rPr>
           <w:rFonts w:ascii="Calibri" w:hAnsi="Calibri"/>
         </w:rPr>
-        <w:t>Shorts money also has its own floor from 1 February 2027 (chapter 11, §V). For most new channels, that makes long-form the near-term income route either way.</w:t>
+        <w:t>Shorts money also has its own floor from 1 February 2027 (chapter 11, §V). For a channel below that floor, that makes long-form the near-term income route either way.</w:t>
       </w:r>
     </w:p>
     <w:p>
@@ -12486,7 +12302,7 @@
         </w:rPr>
         <w:t xml:space="preserve"> </w:t>
       </w:r>
-      <w:hyperlink r:id="rId65">
+      <w:hyperlink r:id="rId64">
         <w:r>
           <w:rPr>
             <w:rStyle w:val="Hyperlink"/>
@@ -12652,7 +12468,7 @@
         </w:rPr>
         <w:t xml:space="preserve"> YouTube’s </w:t>
       </w:r>
-      <w:hyperlink r:id="rId78">
+      <w:hyperlink r:id="rId77">
         <w:r>
           <w:rPr>
             <w:rStyle w:val="Hyperlink"/>
@@ -12859,7 +12675,7 @@
         </w:rPr>
         <w:t xml:space="preserve"> (paid campaign and follow-on views). </w:t>
       </w:r>
-      <w:hyperlink r:id="rId65">
+      <w:hyperlink r:id="rId64">
         <w:r>
           <w:rPr>
             <w:rStyle w:val="Hyperlink"/>
@@ -12876,7 +12692,7 @@
         </w:rPr>
         <w:t xml:space="preserve">. </w:t>
       </w:r>
-      <w:hyperlink r:id="rId78">
+      <w:hyperlink r:id="rId77">
         <w:r>
           <w:rPr>
             <w:rStyle w:val="Hyperlink"/>
@@ -12893,7 +12709,7 @@
         </w:rPr>
         <w:t xml:space="preserve"> and </w:t>
       </w:r>
-      <w:hyperlink r:id="rId79">
+      <w:hyperlink r:id="rId78">
         <w:r>
           <w:rPr>
             <w:rStyle w:val="Hyperlink"/>
@@ -12908,31 +12724,14 @@
           <w:rFonts w:ascii="Calibri" w:hAnsi="Calibri"/>
           <w:i/>
         </w:rPr>
-        <w:t xml:space="preserve">. The Colin and Samir case study figures are their own disclosed numbers from public interviews on the creator economy, including </w:t>
-      </w:r>
-      <w:hyperlink r:id="rId80">
-        <w:r>
-          <w:rPr>
-            <w:rStyle w:val="Hyperlink"/>
-            <w:sz w:val="22"/>
-            <w:rFonts w:ascii="Calibri" w:hAnsi="Calibri"/>
-          </w:rPr>
-          <w:t xml:space="preserve">a Digiday Q&amp;A with Samir Chaudry</w:t>
-        </w:r>
-      </w:hyperlink>
-      <w:r>
-        <w:rPr>
-          <w:rFonts w:ascii="Calibri" w:hAnsi="Calibri"/>
-          <w:i/>
-        </w:rPr>
-        <w:t>, not independently audited. The worked example is planning arithmetic. Checked October 2026.</w:t>
+        <w:t>. The worked example is planning arithmetic. Checked October 2026.</w:t>
       </w:r>
     </w:p>
     <w:p>
       <w:pPr>
         <w:sectPr>
-          <w:headerReference w:type="default" r:id="rId76"/>
-          <w:footerReference w:type="default" r:id="rId77"/>
+          <w:headerReference w:type="default" r:id="rId75"/>
+          <w:footerReference w:type="default" r:id="rId76"/>
           <w:pgSz w:w="10080" w:h="14400"/>
           <w:pgMar w:top="1008" w:right="1008" w:bottom="1008" w:left="1008" w:header="504" w:footer="504" w:gutter="0"/>
           <w:cols w:space="720"/>
@@ -14333,8 +14132,8 @@
     <w:p>
       <w:pPr>
         <w:sectPr>
-          <w:headerReference w:type="default" r:id="rId81"/>
-          <w:footerReference w:type="default" r:id="rId82"/>
+          <w:headerReference w:type="default" r:id="rId79"/>
+          <w:footerReference w:type="default" r:id="rId80"/>
           <w:pgSz w:w="10080" w:h="14400"/>
           <w:pgMar w:top="1008" w:right="1008" w:bottom="1008" w:left="1008" w:header="504" w:footer="504" w:gutter="0"/>
           <w:cols w:space="720"/>
@@ -14890,7 +14689,7 @@
         </w:rPr>
         <w:t xml:space="preserve">YouTube’s </w:t>
       </w:r>
-      <w:hyperlink r:id="rId85">
+      <w:hyperlink r:id="rId83">
         <w:r>
           <w:rPr>
             <w:rStyle w:val="Hyperlink"/>
@@ -14976,7 +14775,7 @@
         </w:rPr>
         <w:t xml:space="preserve"> stops you posting for one week. YouTube’s </w:t>
       </w:r>
-      <w:hyperlink r:id="rId86">
+      <w:hyperlink r:id="rId84">
         <w:r>
           <w:rPr>
             <w:rStyle w:val="Hyperlink"/>
@@ -15080,7 +14879,7 @@
         </w:rPr>
         <w:t xml:space="preserve"> YouTube’s </w:t>
       </w:r>
-      <w:hyperlink r:id="rId79">
+      <w:hyperlink r:id="rId78">
         <w:r>
           <w:rPr>
             <w:rStyle w:val="Hyperlink"/>
@@ -15114,7 +14913,7 @@
         </w:rPr>
         <w:t xml:space="preserve"> Paying a service for views, subscribers, or likes falls under YouTube’s </w:t>
       </w:r>
-      <w:hyperlink r:id="rId78">
+      <w:hyperlink r:id="rId77">
         <w:r>
           <w:rPr>
             <w:rStyle w:val="Hyperlink"/>
@@ -15148,7 +14947,7 @@
         </w:rPr>
         <w:t xml:space="preserve"> YouTube’s </w:t>
       </w:r>
-      <w:hyperlink r:id="rId87">
+      <w:hyperlink r:id="rId85">
         <w:r>
           <w:rPr>
             <w:rStyle w:val="Hyperlink"/>
@@ -15228,7 +15027,7 @@
         </w:rPr>
         <w:t xml:space="preserve">A copyright strike comes from a person or company sending YouTube a formal removal request. YouTube’s </w:t>
       </w:r>
-      <w:hyperlink r:id="rId88">
+      <w:hyperlink r:id="rId86">
         <w:r>
           <w:rPr>
             <w:rStyle w:val="Hyperlink"/>
@@ -15244,7 +15043,7 @@
         </w:rPr>
         <w:t xml:space="preserve"> says these requests are reviewed, and that if one appears valid, YouTube has to remove the content to comply with copyright law. The </w:t>
       </w:r>
-      <w:hyperlink r:id="rId89">
+      <w:hyperlink r:id="rId87">
         <w:r>
           <w:rPr>
             <w:rStyle w:val="Hyperlink"/>
@@ -15268,7 +15067,7 @@
         </w:rPr>
         <w:t xml:space="preserve">Some removal requests are scheduled. YouTube’s </w:t>
       </w:r>
-      <w:hyperlink r:id="rId90">
+      <w:hyperlink r:id="rId88">
         <w:r>
           <w:rPr>
             <w:rStyle w:val="Hyperlink"/>
@@ -15398,22 +15197,7 @@
                 <w:rFonts w:ascii="Calibri" w:hAnsi="Calibri"/>
                 <w:sz w:val="22"/>
               </w:rPr>
-              <w:t xml:space="preserve">Case study: h3h3Productions, the YouTube channel run by Ethan and Hila Klein, posted a reaction video in 2015 responding to a short film by another creator, Matt Hosseinzadeh, playing short portions of it between their own commentary. Hosseinzadeh skipped YouTube’s copyright process and sued the Kleins directly in federal court for infringement. In August 2017, after roughly a year and a half of litigation, the US District Court for the Southern District of New York ruled for the Kleins on summary judgment in </w:t>
-            </w:r>
-            <w:r>
-              <w:rPr>
-                <w:rFonts w:ascii="Calibri" w:hAnsi="Calibri"/>
-                <w:i/>
-                <w:sz w:val="22"/>
-              </w:rPr>
-              <w:t>Hosseinzadeh v. Klein</w:t>
-            </w:r>
-            <w:r>
-              <w:rPr>
-                <w:rFonts w:ascii="Calibri" w:hAnsi="Calibri"/>
-                <w:sz w:val="22"/>
-              </w:rPr>
-              <w:t>, finding their use fair as a matter of law because the video was, in the court’s words, quintessential criticism and comment. A counter notification or a fair-use defense can win. Reaching that answer in this case took eighteen months and real legal fees, not a form in Studio.</w:t>
+              <w:t>Case study: h3h3Productions made a fourteen-minute reaction video that showed about three minutes of a short skit by another filmmaker between its own commentary. The filmmaker sent YouTube a takedown notification, and YouTube removed the video. The channel answered with a counter notification claiming fair use, and the filmmaker then sued for copyright infringement. On 23 August 2017 the US District Court for the Southern District of New York granted the channel’s owners summary judgment, finding their use fair as a matter of law because the video was “quintessential criticism and comment.” A fair-use defense can win. In this case the counter notification did not end the dispute. A federal court did.</w:t>
             </w:r>
           </w:p>
         </w:tc>
@@ -15437,7 +15221,7 @@
         </w:rPr>
         <w:t xml:space="preserve">A Content ID claim is generated automatically when an upload matches a reference file a rights holder has given YouTube. YouTube’s </w:t>
       </w:r>
-      <w:hyperlink r:id="rId91">
+      <w:hyperlink r:id="rId89">
         <w:r>
           <w:rPr>
             <w:rStyle w:val="Hyperlink"/>
@@ -15541,7 +15325,7 @@
         </w:rPr>
         <w:t xml:space="preserve">Once you are in the Partner Program, every video carries a monetization status. YouTube’s </w:t>
       </w:r>
-      <w:hyperlink r:id="rId43">
+      <w:hyperlink r:id="rId42">
         <w:r>
           <w:rPr>
             <w:rStyle w:val="Hyperlink"/>
@@ -15691,7 +15475,7 @@
         </w:rPr>
         <w:t xml:space="preserve">If a video features branded content, sponsorships, endorsements, or other commercial relationships, YouTube’s </w:t>
       </w:r>
-      <w:hyperlink r:id="rId92">
+      <w:hyperlink r:id="rId90">
         <w:r>
           <w:rPr>
             <w:rStyle w:val="Hyperlink"/>
@@ -15707,7 +15491,7 @@
         </w:rPr>
         <w:t xml:space="preserve"> says you have to tell YouTube by selecting the paid promotion option in the video’s details. In the upload flow it appears under “Paid promotion.” YouTube then adds a disclosure label at the start of the video. YouTube’s </w:t>
       </w:r>
-      <w:hyperlink r:id="rId93">
+      <w:hyperlink r:id="rId91">
         <w:r>
           <w:rPr>
             <w:rStyle w:val="Hyperlink"/>
@@ -15765,7 +15549,7 @@
         </w:rPr>
         <w:t xml:space="preserve">YouTube’s </w:t>
       </w:r>
-      <w:hyperlink r:id="rId58">
+      <w:hyperlink r:id="rId57">
         <w:r>
           <w:rPr>
             <w:rStyle w:val="Hyperlink"/>
@@ -15789,7 +15573,7 @@
         </w:rPr>
         <w:t xml:space="preserve">What does not need it, per the same page and YouTube’s </w:t>
       </w:r>
-      <w:hyperlink r:id="rId94">
+      <w:hyperlink r:id="rId92">
         <w:r>
           <w:rPr>
             <w:rStyle w:val="Hyperlink"/>
@@ -15821,7 +15605,7 @@
         </w:rPr>
         <w:t xml:space="preserve">Two changes are worth knowing. YouTube’s </w:t>
       </w:r>
-      <w:hyperlink r:id="rId95">
+      <w:hyperlink r:id="rId93">
         <w:r>
           <w:rPr>
             <w:rStyle w:val="Hyperlink"/>
@@ -15909,7 +15693,7 @@
         </w:rPr>
         <w:t xml:space="preserve">The policies above judge a video. </w:t>
       </w:r>
-      <w:hyperlink r:id="rId96">
+      <w:hyperlink r:id="rId94">
         <w:r>
           <w:rPr>
             <w:rStyle w:val="Hyperlink"/>
@@ -16041,7 +15825,7 @@
         </w:rPr>
         <w:t xml:space="preserve">Every channel and every video has an audience setting: made for kids, or not. YouTube’s </w:t>
       </w:r>
-      <w:hyperlink r:id="rId97">
+      <w:hyperlink r:id="rId95">
         <w:r>
           <w:rPr>
             <w:rStyle w:val="Hyperlink"/>
@@ -16297,7 +16081,7 @@
         </w:rPr>
         <w:t xml:space="preserve">Sources: Warning, training, strike, and termination rules are from </w:t>
       </w:r>
-      <w:hyperlink r:id="rId85">
+      <w:hyperlink r:id="rId83">
         <w:r>
           <w:rPr>
             <w:rStyle w:val="Hyperlink"/>
@@ -16314,7 +16098,7 @@
         </w:rPr>
         <w:t xml:space="preserve">, its </w:t>
       </w:r>
-      <w:hyperlink r:id="rId86">
+      <w:hyperlink r:id="rId84">
         <w:r>
           <w:rPr>
             <w:rStyle w:val="Hyperlink"/>
@@ -16331,7 +16115,7 @@
         </w:rPr>
         <w:t xml:space="preserve">, and its </w:t>
       </w:r>
-      <w:hyperlink r:id="rId89">
+      <w:hyperlink r:id="rId87">
         <w:r>
           <w:rPr>
             <w:rStyle w:val="Hyperlink"/>
@@ -16348,7 +16132,7 @@
         </w:rPr>
         <w:t xml:space="preserve">. Copyright strike resolution is from </w:t>
       </w:r>
-      <w:hyperlink r:id="rId88">
+      <w:hyperlink r:id="rId86">
         <w:r>
           <w:rPr>
             <w:rStyle w:val="Hyperlink"/>
@@ -16365,7 +16149,7 @@
         </w:rPr>
         <w:t xml:space="preserve"> and its </w:t>
       </w:r>
-      <w:hyperlink r:id="rId90">
+      <w:hyperlink r:id="rId88">
         <w:r>
           <w:rPr>
             <w:rStyle w:val="Hyperlink"/>
@@ -16380,30 +16164,16 @@
           <w:rFonts w:ascii="Calibri" w:hAnsi="Calibri"/>
           <w:i/>
         </w:rPr>
-        <w:t xml:space="preserve">. The h3h3Productions case study is </w:t>
-      </w:r>
-      <w:r>
-        <w:rPr>
-          <w:rFonts w:ascii="Calibri" w:hAnsi="Calibri"/>
-          <w:i/>
-        </w:rPr>
-        <w:t>Hosseinzadeh v. Klein</w:t>
-      </w:r>
-      <w:r>
-        <w:rPr>
-          <w:rFonts w:ascii="Calibri" w:hAnsi="Calibri"/>
-          <w:i/>
-        </w:rPr>
-        <w:t xml:space="preserve">, 276 F. Supp. 3d 34 (S.D.N.Y. 2017); the ruling date, the quoted holding, and the case background are corroborated across the </w:t>
-      </w:r>
-      <w:hyperlink r:id="rId98">
+        <w:t xml:space="preserve">. The h3h3Productions case study is docket No. 16-CV-3081 (S.D.N.Y. Aug. 23, 2017), as summarized in the </w:t>
+      </w:r>
+      <w:hyperlink r:id="rId96">
         <w:r>
           <w:rPr>
             <w:rStyle w:val="Hyperlink"/>
             <w:sz w:val="22"/>
             <w:rFonts w:ascii="Calibri" w:hAnsi="Calibri"/>
           </w:rPr>
-          <w:t xml:space="preserve">US Copyright Office’s own fair-use case summary</w:t>
+          <w:t xml:space="preserve">US Copyright Office’s fair-use index</w:t>
         </w:r>
       </w:hyperlink>
       <w:r>
@@ -16411,43 +16181,9 @@
           <w:rFonts w:ascii="Calibri" w:hAnsi="Calibri"/>
           <w:i/>
         </w:rPr>
-        <w:t xml:space="preserve"> and independent legal reporting at the time, including </w:t>
-      </w:r>
-      <w:hyperlink r:id="rId99">
-        <w:r>
-          <w:rPr>
-            <w:rStyle w:val="Hyperlink"/>
-            <w:sz w:val="22"/>
-            <w:rFonts w:ascii="Calibri" w:hAnsi="Calibri"/>
-          </w:rPr>
-          <w:t xml:space="preserve">Plagiarism Today</w:t>
-        </w:r>
-      </w:hyperlink>
-      <w:r>
-        <w:rPr>
-          <w:rFonts w:ascii="Calibri" w:hAnsi="Calibri"/>
-          <w:i/>
-        </w:rPr>
-        <w:t xml:space="preserve"> and a law firm client alert from </w:t>
-      </w:r>
-      <w:hyperlink r:id="rId100">
-        <w:r>
-          <w:rPr>
-            <w:rStyle w:val="Hyperlink"/>
-            <w:sz w:val="22"/>
-            <w:rFonts w:ascii="Calibri" w:hAnsi="Calibri"/>
-          </w:rPr>
-          <w:t xml:space="preserve">Loeb &amp; Loeb</w:t>
-        </w:r>
-      </w:hyperlink>
-      <w:r>
-        <w:rPr>
-          <w:rFonts w:ascii="Calibri" w:hAnsi="Calibri"/>
-          <w:i/>
-        </w:rPr>
-        <w:t xml:space="preserve">. Content ID claim policies and the Shorts blocking rule are from </w:t>
-      </w:r>
-      <w:hyperlink r:id="rId91">
+        <w:t xml:space="preserve"> (S.D.N.Y. 2017 summaries). Content ID claim policies and the Shorts blocking rule are from </w:t>
+      </w:r>
+      <w:hyperlink r:id="rId89">
         <w:r>
           <w:rPr>
             <w:rStyle w:val="Hyperlink"/>
@@ -16464,7 +16200,7 @@
         </w:rPr>
         <w:t xml:space="preserve">. Limited ads, self-certification, and human review are from </w:t>
       </w:r>
-      <w:hyperlink r:id="rId43">
+      <w:hyperlink r:id="rId42">
         <w:r>
           <w:rPr>
             <w:rStyle w:val="Hyperlink"/>
@@ -16481,7 +16217,7 @@
         </w:rPr>
         <w:t xml:space="preserve">. That claimed videos lose Super Thanks and music-claimed videos count against memberships is from YouTube’s Super Thanks and memberships eligibility pages, cited in chapter 12. The paid promotion setting and disclosure label are from </w:t>
       </w:r>
-      <w:hyperlink r:id="rId92">
+      <w:hyperlink r:id="rId90">
         <w:r>
           <w:rPr>
             <w:rStyle w:val="Hyperlink"/>
@@ -16498,7 +16234,7 @@
         </w:rPr>
         <w:t xml:space="preserve"> and its </w:t>
       </w:r>
-      <w:hyperlink r:id="rId93">
+      <w:hyperlink r:id="rId91">
         <w:r>
           <w:rPr>
             <w:rStyle w:val="Hyperlink"/>
@@ -16515,7 +16251,7 @@
         </w:rPr>
         <w:t xml:space="preserve">. AI disclosure requirements are from </w:t>
       </w:r>
-      <w:hyperlink r:id="rId58">
+      <w:hyperlink r:id="rId57">
         <w:r>
           <w:rPr>
             <w:rStyle w:val="Hyperlink"/>
@@ -16532,7 +16268,7 @@
         </w:rPr>
         <w:t xml:space="preserve">, the </w:t>
       </w:r>
-      <w:hyperlink r:id="rId94">
+      <w:hyperlink r:id="rId92">
         <w:r>
           <w:rPr>
             <w:rStyle w:val="Hyperlink"/>
@@ -16549,7 +16285,7 @@
         </w:rPr>
         <w:t xml:space="preserve">, and the </w:t>
       </w:r>
-      <w:hyperlink r:id="rId95">
+      <w:hyperlink r:id="rId93">
         <w:r>
           <w:rPr>
             <w:rStyle w:val="Hyperlink"/>
@@ -16566,7 +16302,7 @@
         </w:rPr>
         <w:t xml:space="preserve">. The reused content, inauthentic content, and AI persona rules are from </w:t>
       </w:r>
-      <w:hyperlink r:id="rId96">
+      <w:hyperlink r:id="rId94">
         <w:r>
           <w:rPr>
             <w:rStyle w:val="Hyperlink"/>
@@ -16600,7 +16336,7 @@
         </w:rPr>
         <w:t xml:space="preserve">. The FTC’s </w:t>
       </w:r>
-      <w:hyperlink r:id="rId101">
+      <w:hyperlink r:id="rId97">
         <w:r>
           <w:rPr>
             <w:rStyle w:val="Hyperlink"/>
@@ -16617,7 +16353,7 @@
         </w:rPr>
         <w:t xml:space="preserve"> and </w:t>
       </w:r>
-      <w:hyperlink r:id="rId102">
+      <w:hyperlink r:id="rId98">
         <w:r>
           <w:rPr>
             <w:rStyle w:val="Hyperlink"/>
@@ -16634,7 +16370,7 @@
         </w:rPr>
         <w:t xml:space="preserve"> are US guidance. Made-for-kids features are from </w:t>
       </w:r>
-      <w:hyperlink r:id="rId97">
+      <w:hyperlink r:id="rId95">
         <w:r>
           <w:rPr>
             <w:rStyle w:val="Hyperlink"/>
@@ -16651,7 +16387,7 @@
         </w:rPr>
         <w:t xml:space="preserve">. The human-authorship rule is from Thaler v. Perlmutter, 130 F.4th 1039 (D.C. Cir. 2025), cert. denied (U.S. Mar. 2, 2026) — the denial date is corroborated by </w:t>
       </w:r>
-      <w:hyperlink r:id="rId103">
+      <w:hyperlink r:id="rId99">
         <w:r>
           <w:rPr>
             <w:rStyle w:val="Hyperlink"/>
@@ -16668,7 +16404,7 @@
         </w:rPr>
         <w:t xml:space="preserve"> and a </w:t>
       </w:r>
-      <w:hyperlink r:id="rId104">
+      <w:hyperlink r:id="rId100">
         <w:r>
           <w:rPr>
             <w:rStyle w:val="Hyperlink"/>
@@ -16689,8 +16425,8 @@
     <w:p>
       <w:pPr>
         <w:sectPr>
-          <w:headerReference w:type="default" r:id="rId83"/>
-          <w:footerReference w:type="default" r:id="rId84"/>
+          <w:headerReference w:type="default" r:id="rId81"/>
+          <w:footerReference w:type="default" r:id="rId82"/>
           <w:pgSz w:w="10080" w:h="14400"/>
           <w:pgMar w:top="1008" w:right="1008" w:bottom="1008" w:left="1008" w:header="504" w:footer="504" w:gutter="0"/>
           <w:cols w:space="720"/>
@@ -16760,7 +16496,7 @@
         </w:rPr>
         <w:t xml:space="preserve">Inside the Partner Program, with the Watch Page Monetization Module accepted, a long-form video can earn from ads shown before, during, after, and around it on the watch page. That includes the video embedded on another site in YouTube’s player. Official rule: YouTube’s </w:t>
       </w:r>
-      <w:hyperlink r:id="rId107">
+      <w:hyperlink r:id="rId103">
         <w:r>
           <w:rPr>
             <w:rStyle w:val="Hyperlink"/>
@@ -16778,7 +16514,7 @@
       </w:r>
     </w:p>
     <w:p>
-      <w:hyperlink r:id="rId108">
+      <w:hyperlink r:id="rId104">
         <w:r>
           <w:rPr>
             <w:rStyle w:val="Hyperlink"/>
@@ -16830,7 +16566,7 @@
         </w:rPr>
         <w:t xml:space="preserve"> </w:t>
       </w:r>
-      <w:hyperlink r:id="rId63">
+      <w:hyperlink r:id="rId62">
         <w:r>
           <w:rPr>
             <w:rStyle w:val="Hyperlink"/>
@@ -17331,50 +17067,12 @@
         <w:t>To those, add the ones you control: whether the video is advertiser-friendly (chapter 10), whether it is long enough for mid-rolls, and whether viewers stay long enough to see a second break. The subject matters too, through which advertisers want that audience. That is why chapter 1 warned against choosing a subject only for its rate. You cannot hold an audience you do not want to make videos for.</w:t>
       </w:r>
     </w:p>
-    <w:tbl>
-      <w:tblPr>
-        <w:tblW w:type="auto" w:w="0"/>
-        <w:tblLayout w:type="fixed"/>
-        <w:tblLook w:firstColumn="1" w:firstRow="1" w:lastColumn="0" w:lastRow="0" w:noHBand="0" w:noVBand="1" w:val="04A0"/>
-      </w:tblPr>
-      <w:tblGrid>
-        <w:gridCol w:w="8064"/>
-      </w:tblGrid>
-      <w:tr>
-        <w:tc>
-          <w:tcPr>
-            <w:tcW w:type="dxa" w:w="8064"/>
-            <w:tcW w:w="8063" w:type="dxa"/>
-            <w:shd w:val="clear" w:color="auto" w:fill="F3F1EA"/>
-          </w:tcPr>
-          <w:p>
-            <w:pPr>
-              <w:spacing w:after="40" w:before="40"/>
-            </w:pPr>
-            <w:r>
-              <w:rPr>
-                <w:rFonts w:ascii="Calibri" w:hAnsi="Calibri"/>
-                <w:sz w:val="22"/>
-              </w:rPr>
-            </w:r>
-            <w:r>
-              <w:rPr>
-                <w:rFonts w:ascii="Calibri" w:hAnsi="Calibri"/>
-                <w:sz w:val="22"/>
-              </w:rPr>
-              <w:t>Case study: Deep Pocket Monster, a YouTube channel about opening Pokémon card packs, launched in January 2021 with no prior audience in that niche. Its creator has described reaching 100,000 subscribers within about a year and a typical range of $35,000 to $50,000 a month from ad revenue. One 2022 video sat well outside that range. It reached roughly 28 million views, briefly ranked third on YouTube’s trending page, and brought in more than $100,000 in ad revenue on its own, pushing that month past the usual run. A single collectibles video outearning what many channels make in a year in a lower-demand niche is not a trick of virality. Collectibles are a subject advertisers pay well to reach, which is the whole point of this section: the view count did not change. The audience behind it did.</w:t>
-            </w:r>
-          </w:p>
-        </w:tc>
-      </w:tr>
-    </w:tbl>
-    <w:p/>
-    <w:p>
-      <w:r>
-        <w:rPr>
-          <w:rFonts w:ascii="Calibri" w:hAnsi="Calibri"/>
-        </w:rPr>
-        <w:t>None of that changes the mechanics underneath — advertiser demand moves the price per view, not the arithmetic that turns a view into a payment. The arithmetic itself is worth walking through once.</w:t>
+    <w:p>
+      <w:r>
+        <w:rPr>
+          <w:rFonts w:ascii="Calibri" w:hAnsi="Calibri"/>
+        </w:rPr>
+        <w:t>Advertiser demand moves the price per view. It does not change the arithmetic that turns a view into a payment, which is worth walking through once.</w:t>
       </w:r>
     </w:p>
     <w:tbl>
@@ -17432,7 +17130,7 @@
         </w:rPr>
         <w:t xml:space="preserve">Shorts ads run between videos in the Shorts feed, not beside one video, so YouTube pools them. </w:t>
       </w:r>
-      <w:hyperlink r:id="rId109">
+      <w:hyperlink r:id="rId105">
         <w:r>
           <w:rPr>
             <w:rStyle w:val="Hyperlink"/>
@@ -17638,7 +17336,7 @@
         <w:rPr>
           <w:rFonts w:ascii="Calibri" w:hAnsi="Calibri"/>
         </w:rPr>
-        <w:t>For a channel below 10 million Shorts views every 90 days — most new channels — the practical reading (author recommendation): from February 2027, long-form is the ad income, and Shorts are how strangers find the long videos.</w:t>
+        <w:t>For a channel below 10 million Shorts views every 90 days, the practical reading (author recommendation): from February 2027, long-form is the ad income, and Shorts are how strangers find the long videos.</w:t>
       </w:r>
     </w:p>
     <w:p>
@@ -17825,9 +17523,9 @@
           <w:rFonts w:ascii="Calibri" w:hAnsi="Calibri"/>
           <w:i/>
         </w:rPr>
-        <w:t xml:space="preserve">Sources: The Deep Pocket Monster case study is its creator Pat Flynn’s own disclosed account, given on his Smart Passive Income podcast (episode “An Update on My ‘On the Side’ YouTube Channel”) and corroborated across several independent podcast interviews with him on the same channel and figures; this book treats the subscriber, revenue, and single-video figures as the creator’s own disclosed numbers, converged on across independent retellings, not an independently audited record. </w:t>
-      </w:r>
-      <w:hyperlink r:id="rId108">
+        <w:t xml:space="preserve">Sources: </w:t>
+      </w:r>
+      <w:hyperlink r:id="rId104">
         <w:r>
           <w:rPr>
             <w:rStyle w:val="Hyperlink"/>
@@ -17844,7 +17542,7 @@
         </w:rPr>
         <w:t xml:space="preserve"> and </w:t>
       </w:r>
-      <w:hyperlink r:id="rId63">
+      <w:hyperlink r:id="rId62">
         <w:r>
           <w:rPr>
             <w:rStyle w:val="Hyperlink"/>
@@ -17895,7 +17593,7 @@
         </w:rPr>
         <w:t xml:space="preserve"> (CPM, playback-based CPM, RPM). </w:t>
       </w:r>
-      <w:hyperlink r:id="rId107">
+      <w:hyperlink r:id="rId103">
         <w:r>
           <w:rPr>
             <w:rStyle w:val="Hyperlink"/>
@@ -17946,7 +17644,7 @@
         </w:rPr>
         <w:t xml:space="preserve"> (Premium and Premium Lite pools, Shorts floor, targeted Shorts ads). </w:t>
       </w:r>
-      <w:hyperlink r:id="rId109">
+      <w:hyperlink r:id="rId105">
         <w:r>
           <w:rPr>
             <w:rStyle w:val="Hyperlink"/>
@@ -17967,8 +17665,8 @@
     <w:p>
       <w:pPr>
         <w:sectPr>
-          <w:headerReference w:type="default" r:id="rId105"/>
-          <w:footerReference w:type="default" r:id="rId106"/>
+          <w:headerReference w:type="default" r:id="rId101"/>
+          <w:footerReference w:type="default" r:id="rId102"/>
           <w:pgSz w:w="10080" w:h="14400"/>
           <w:pgMar w:top="1008" w:right="1008" w:bottom="1008" w:left="1008" w:header="504" w:footer="504" w:gutter="0"/>
           <w:cols w:space="720"/>
@@ -18013,6 +17711,52 @@
         <w:t>Ad revenue scales with views. Fan funding scales with something else: how many viewers care enough to pay a few dollars a month, or a few dollars once, because the channel matters to them. A channel with modest views and a loyal core can earn more from its fans than from its ads. And in countries with the expanded program, fan funding opens at 500 subscribers, half the ad gate’s subscriber count and well short of its hours.</w:t>
       </w:r>
     </w:p>
+    <w:tbl>
+      <w:tblPr>
+        <w:tblW w:type="auto" w:w="0"/>
+        <w:tblLayout w:type="fixed"/>
+        <w:tblLook w:firstColumn="1" w:firstRow="1" w:lastColumn="0" w:lastRow="0" w:noHBand="0" w:noVBand="1" w:val="04A0"/>
+      </w:tblPr>
+      <w:tblGrid>
+        <w:gridCol w:w="8064"/>
+      </w:tblGrid>
+      <w:tr>
+        <w:tc>
+          <w:tcPr>
+            <w:tcW w:type="dxa" w:w="8064"/>
+            <w:tcW w:w="8063" w:type="dxa"/>
+            <w:shd w:val="clear" w:color="auto" w:fill="F3F1EA"/>
+          </w:tcPr>
+          <w:p>
+            <w:pPr>
+              <w:spacing w:after="40" w:before="40"/>
+            </w:pPr>
+            <w:r>
+              <w:rPr>
+                <w:rFonts w:ascii="Calibri" w:hAnsi="Calibri"/>
+                <w:sz w:val="22"/>
+              </w:rPr>
+            </w:r>
+            <w:r>
+              <w:rPr>
+                <w:rFonts w:ascii="Calibri" w:hAnsi="Calibri"/>
+                <w:b/>
+                <w:sz w:val="22"/>
+              </w:rPr>
+              <w:t>Thresholds change.</w:t>
+            </w:r>
+            <w:r>
+              <w:rPr>
+                <w:rFonts w:ascii="Calibri" w:hAnsi="Calibri"/>
+                <w:sz w:val="22"/>
+              </w:rPr>
+              <w:t xml:space="preserve"> Before planning around any monetization target, check the live Earn tab in YouTube Studio and YouTube’s official Partner Program eligibility page for your country. This book reflects information checked in October 2026.</w:t>
+            </w:r>
+          </w:p>
+        </w:tc>
+      </w:tr>
+    </w:tbl>
+    <w:p/>
     <w:p>
       <w:r>
         <w:rPr>
@@ -18032,7 +17776,7 @@
       <w:bookmarkEnd w:id="104"/>
     </w:p>
     <w:p>
-      <w:hyperlink r:id="rId112">
+      <w:hyperlink r:id="rId108">
         <w:r>
           <w:rPr>
             <w:rStyle w:val="Hyperlink"/>
@@ -18164,7 +17908,7 @@
         </w:rPr>
         <w:t xml:space="preserve">A membership is a monthly payment from a viewer in return for perks you choose. </w:t>
       </w:r>
-      <w:hyperlink r:id="rId113">
+      <w:hyperlink r:id="rId109">
         <w:r>
           <w:rPr>
             <w:rStyle w:val="Hyperlink"/>
@@ -18188,7 +17932,7 @@
         </w:rPr>
         <w:t xml:space="preserve">The structure, from </w:t>
       </w:r>
-      <w:hyperlink r:id="rId114">
+      <w:hyperlink r:id="rId110">
         <w:r>
           <w:rPr>
             <w:rStyle w:val="Hyperlink"/>
@@ -18237,7 +17981,7 @@
         </w:rPr>
         <w:t xml:space="preserve">Prices come from a fixed list for each country. </w:t>
       </w:r>
-      <w:hyperlink r:id="rId115">
+      <w:hyperlink r:id="rId111">
         <w:r>
           <w:rPr>
             <w:rStyle w:val="Hyperlink"/>
@@ -18264,7 +18008,7 @@
         </w:rPr>
         <w:t xml:space="preserve">Documented platform guidance: YouTube’s </w:t>
       </w:r>
-      <w:hyperlink r:id="rId116">
+      <w:hyperlink r:id="rId112">
         <w:r>
           <w:rPr>
             <w:rStyle w:val="Hyperlink"/>
@@ -18336,7 +18080,7 @@
                 <w:rFonts w:ascii="Calibri" w:hAnsi="Calibri"/>
                 <w:sz w:val="22"/>
               </w:rPr>
-              <w:t>Case study: YouTube’s own creator blog has named Rachana Ranade, a chartered accountant who teaches financial literacy on her channel, as one of a handful of creators making the most of memberships. She turned the feature on in 2020 and, by YouTube’s own account, made channel memberships her largest income stream directly from YouTube that year — over $100,000 — with tiers priced at a few dollars a month and a top tier that included a monthly stock-pick breakdown for members only. Her channel’s reach, well over a million subscribers, is not a number a new channel starts with. The structure underneath it is: a small number of priced tiers, each with a perk a regular actually wants, can outearn the ads on the same channel.</w:t>
+              <w:t>Case study: YouTube’s own creator blog featured a financial-education channel as one of three making the most of channel memberships. The post says the channel turned memberships on in 2020 and that they had become the majority of its YouTube revenue, earning over $100,000 by the time it was written. That channel is not a starting point for a new one. The lesson is the order of the money: for it, members paid more than the ads on the same channel.</w:t>
             </w:r>
           </w:p>
         </w:tc>
@@ -18344,664 +18088,11 @@
     </w:tbl>
     <w:p/>
     <w:p>
-      <w:bookmarkStart w:id="106" w:name="toc105"/>
-      <w:pPr>
-        <w:pStyle w:val="Heading2"/>
-      </w:pPr>
-      <w:r>
-        <w:t>III. Super Chat and Super Stickers</w:t>
-      </w:r>
-      <w:bookmarkEnd w:id="106"/>
-    </w:p>
-    <w:p>
-      <w:r>
-        <w:rPr>
-          <w:rFonts w:ascii="Calibri" w:hAnsi="Calibri"/>
-        </w:rPr>
-        <w:t xml:space="preserve">These two belong to live: live streams and premieres with live chat turned on. A viewer pays to highlight a message in the chat, or to send an animated sticker. </w:t>
-      </w:r>
-      <w:hyperlink r:id="rId117">
-        <w:r>
-          <w:rPr>
-            <w:rStyle w:val="Hyperlink"/>
-            <w:sz w:val="22"/>
-            <w:rFonts w:ascii="Calibri" w:hAnsi="Calibri"/>
-          </w:rPr>
-          <w:t xml:space="preserve">YouTube’s Super Chat page</w:t>
-        </w:r>
-      </w:hyperlink>
-      <w:r>
-        <w:rPr>
-          <w:rFonts w:ascii="Calibri" w:hAnsi="Calibri"/>
-        </w:rPr>
-        <w:t xml:space="preserve"> says they are available automatically on eligible streams and premieres once you have switched them on, and that live chat is on by default.</w:t>
-      </w:r>
-    </w:p>
-    <w:p>
-      <w:hyperlink r:id="rId118">
-        <w:r>
-          <w:rPr>
-            <w:rStyle w:val="Hyperlink"/>
-            <w:sz w:val="22"/>
-            <w:rFonts w:ascii="Calibri" w:hAnsi="Calibri"/>
-          </w:rPr>
-          <w:t xml:space="preserve">YouTube’s Super Chat eligibility page</w:t>
-        </w:r>
-      </w:hyperlink>
-      <w:r>
-        <w:rPr>
-          <w:rFonts w:ascii="Calibri" w:hAnsi="Calibri"/>
-        </w:rPr>
-        <w:t xml:space="preserve"> lists where they do not work: age-restricted, unlisted, private, and made-for-kids videos, and videos with YouTube Giving fundraisers.</w:t>
-      </w:r>
-    </w:p>
-    <w:p>
-      <w:r>
-        <w:rPr>
-          <w:rFonts w:ascii="Calibri" w:hAnsi="Calibri"/>
-        </w:rPr>
-        <w:t>Moderate Super Chats the way you moderate any chat. YouTube says a Super Chat removed for breaking its policies has YouTube’s portion donated to charity.</w:t>
-      </w:r>
-    </w:p>
-    <w:p>
-      <w:r>
-        <w:rPr>
-          <w:rFonts w:ascii="Calibri" w:hAnsi="Calibri"/>
-        </w:rPr>
-        <w:t>Creator heuristic: what makes viewers use them is a live stream with a reason to talk. Answer questions from the deep dive. Read the Super Chats aloud and answer them properly, not with a list of names. Thank people without turning the stream into an auction. A viewer pays to be heard. Hear them.</w:t>
-      </w:r>
-    </w:p>
-    <w:p>
-      <w:r>
-        <w:rPr>
-          <w:rFonts w:ascii="Calibri" w:hAnsi="Calibri"/>
-        </w:rPr>
-        <w:t>Chapter 8, §V suggested premieres and live streams before the gate, partly to rehearse this room. If nobody comes to your streams at 300 subscribers, Super Chat will not change that at 500.</w:t>
-      </w:r>
-    </w:p>
-    <w:p>
-      <w:bookmarkStart w:id="107" w:name="toc106"/>
-      <w:pPr>
-        <w:pStyle w:val="Heading2"/>
-      </w:pPr>
-      <w:r>
-        <w:t>IV. Super Thanks</w:t>
-      </w:r>
-      <w:bookmarkEnd w:id="107"/>
-    </w:p>
-    <w:p>
-      <w:r>
-        <w:rPr>
-          <w:rFonts w:ascii="Calibri" w:hAnsi="Calibri"/>
-        </w:rPr>
-        <w:t xml:space="preserve">Super Thanks is the one fan-funding feature that does not need you live. A viewer buys a one-time animation on a long-form video or a Short and gets a highlighted comment in the comments section. </w:t>
-      </w:r>
-      <w:hyperlink r:id="rId119">
-        <w:r>
-          <w:rPr>
-            <w:rStyle w:val="Hyperlink"/>
-            <w:sz w:val="22"/>
-            <w:rFonts w:ascii="Calibri" w:hAnsi="Calibri"/>
-          </w:rPr>
-          <w:t xml:space="preserve">YouTube’s Super Thanks eligibility page</w:t>
-        </w:r>
-      </w:hyperlink>
-      <w:r>
-        <w:rPr>
-          <w:rFonts w:ascii="Calibri" w:hAnsi="Calibri"/>
-        </w:rPr>
-        <w:t xml:space="preserve"> says it is offered at several price points, and that once you switch it on it appears on all your eligible past and future videos.</w:t>
-      </w:r>
-    </w:p>
-    <w:p>
-      <w:r>
-        <w:rPr>
-          <w:rFonts w:ascii="Calibri" w:hAnsi="Calibri"/>
-        </w:rPr>
-        <w:t>It is not available on age-restricted, unlisted, private, or made-for-kids videos; on videos with copyright claims or YouTube Giving fundraisers; on live streams or premieres while live, though the archived video can carry it afterwards; or on videos with comments turned off. The channel must not be set as made for kids or have a significant number of made-for-kids or ineligible videos.</w:t>
-      </w:r>
-    </w:p>
-    <w:p>
-      <w:r>
-        <w:rPr>
-          <w:rFonts w:ascii="Calibri" w:hAnsi="Calibri"/>
-        </w:rPr>
-        <w:t>A claimed music bed costs that video its Super Thanks as well as its ads — one more reason to build the deep dive on audio you can document.</w:t>
-      </w:r>
-    </w:p>
-    <w:p>
-      <w:r>
-        <w:rPr>
-          <w:rFonts w:ascii="Calibri" w:hAnsi="Calibri"/>
-        </w:rPr>
-        <w:t xml:space="preserve">Documented platform guidance: YouTube’s </w:t>
-      </w:r>
-      <w:hyperlink r:id="rId120">
-        <w:r>
-          <w:rPr>
-            <w:rStyle w:val="Hyperlink"/>
-            <w:sz w:val="22"/>
-            <w:rFonts w:ascii="Calibri" w:hAnsi="Calibri"/>
-          </w:rPr>
-          <w:t xml:space="preserve">Super Thanks tips page</w:t>
-        </w:r>
-      </w:hyperlink>
-      <w:r>
-        <w:rPr>
-          <w:rFonts w:ascii="Calibri" w:hAnsi="Calibri"/>
-        </w:rPr>
-        <w:t xml:space="preserve"> suggests replying to each Super Thanks comment, and telling viewers what the money pays for — editing, a new microphone, more videos. Both are honest asks. A viewer who sees their comment answered is the viewer who comes back.</w:t>
-      </w:r>
-    </w:p>
-    <w:p>
-      <w:bookmarkStart w:id="108" w:name="toc107"/>
-      <w:pPr>
-        <w:pStyle w:val="Heading2"/>
-      </w:pPr>
-      <w:r>
-        <w:t>V. Asking without begging</w:t>
-      </w:r>
-      <w:bookmarkEnd w:id="108"/>
-    </w:p>
-    <w:p>
-      <w:r>
-        <w:rPr>
-          <w:rFonts w:ascii="Calibri" w:hAnsi="Calibri"/>
-        </w:rPr>
-        <w:t>Ads need viewers. Fans need a relationship. Three rules keep the asking honest (author recommendation).</w:t>
-      </w:r>
-    </w:p>
-    <w:p>
-      <w:pPr>
-        <w:pStyle w:val="ListBullet"/>
-      </w:pPr>
-      <w:r>
-        <w:rPr>
-          <w:rFonts w:ascii="Calibri" w:hAnsi="Calibri"/>
-          <w:b/>
-        </w:rPr>
-        <w:t>One ask, in its place.</w:t>
-      </w:r>
-      <w:r>
-        <w:rPr>
-          <w:rFonts w:ascii="Calibri" w:hAnsi="Calibri"/>
-        </w:rPr>
-        <w:t xml:space="preserve"> The end of a video already has one ask in chapter 4: subscribe, with a reason. A membership mention belongs in its own place — a pinned comment, a post, a line in a live stream — not stacked on top of the subscribe line.</w:t>
-      </w:r>
-    </w:p>
-    <w:p>
-      <w:pPr>
-        <w:pStyle w:val="ListBullet"/>
-      </w:pPr>
-      <w:r>
-        <w:rPr>
-          <w:rFonts w:ascii="Calibri" w:hAnsi="Calibri"/>
-          <w:b/>
-        </w:rPr>
-        <w:t>Say what the money does.</w:t>
-      </w:r>
-      <w:r>
-        <w:rPr>
-          <w:rFonts w:ascii="Calibri" w:hAnsi="Calibri"/>
-        </w:rPr>
-        <w:t xml:space="preserve"> “Members get the Thursday stream and the long version of every deep dive” is a reason. “Please support the channel” is a request with nothing in it.</w:t>
-      </w:r>
-    </w:p>
-    <w:p>
-      <w:pPr>
-        <w:pStyle w:val="ListBullet"/>
-      </w:pPr>
-      <w:r>
-        <w:rPr>
-          <w:rFonts w:ascii="Calibri" w:hAnsi="Calibri"/>
-          <w:b/>
-        </w:rPr>
-        <w:t>Never trade the public channel for the paid one.</w:t>
-      </w:r>
-      <w:r>
-        <w:rPr>
-          <w:rFonts w:ascii="Calibri" w:hAnsi="Calibri"/>
-        </w:rPr>
-        <w:t xml:space="preserve"> If the public deep dive gets thinner so the members’ version looks better, the public channel stops growing, and so does the pool of future members. The free videos are what the members are paying to keep coming.</w:t>
-      </w:r>
-    </w:p>
-    <w:p>
-      <w:r>
-        <w:rPr>
-          <w:rFonts w:ascii="Calibri" w:hAnsi="Calibri"/>
-          <w:i/>
-        </w:rPr>
-        <w:t>In short:</w:t>
-      </w:r>
-      <w:r>
-        <w:rPr>
-          <w:rFonts w:ascii="Calibri" w:hAnsi="Calibri"/>
-        </w:rPr>
-        <w:t xml:space="preserve"> Fan funding needs the Partner Program, age 18, and the Commerce Product Module, and pays 70% after taxes and fees. Memberships are monthly, with banned perks. Super Chat and Super Stickers are for live streams and premieres. Super Thanks works on long videos and Shorts, but not on claimed ones.</w:t>
-      </w:r>
-    </w:p>
-    <w:p>
-      <w:bookmarkStart w:id="109" w:name="toc108"/>
-      <w:pPr>
-        <w:pStyle w:val="Heading2"/>
-      </w:pPr>
-      <w:r>
-        <w:t>VI. Claims that do not survive the fan-funding pages</w:t>
-      </w:r>
-      <w:bookmarkEnd w:id="109"/>
-    </w:p>
-    <w:p>
-      <w:pPr>
-        <w:pStyle w:val="ListBullet"/>
-      </w:pPr>
-      <w:r>
-        <w:rPr>
-          <w:rFonts w:ascii="Calibri" w:hAnsi="Calibri"/>
-        </w:rPr>
-        <w:t>That fan funding needs the full ad gate. In countries with the expanded program it opens at 500 subscribers, three uploads in 90 days, and 3,000 hours or 3 million Shorts views.</w:t>
-      </w:r>
-    </w:p>
-    <w:p>
-      <w:pPr>
-        <w:pStyle w:val="ListBullet"/>
-      </w:pPr>
-      <w:r>
-        <w:rPr>
-          <w:rFonts w:ascii="Calibri" w:hAnsi="Calibri"/>
-        </w:rPr>
-        <w:t>That a membership perk can be anything. Downloads of YouTube content, in-person one-to-one meetings, and random prizes are banned.</w:t>
-      </w:r>
-    </w:p>
-    <w:p>
-      <w:pPr>
-        <w:pStyle w:val="ListBullet"/>
-      </w:pPr>
-      <w:r>
-        <w:rPr>
-          <w:rFonts w:ascii="Calibri" w:hAnsi="Calibri"/>
-        </w:rPr>
-        <w:t>That Super Chat is a donation. YouTube says it is not a crowdfunding or donation tool, and the money may be treated differently under your local law.</w:t>
-      </w:r>
-    </w:p>
-    <w:p>
-      <w:pPr>
-        <w:pStyle w:val="ListBullet"/>
-      </w:pPr>
-      <w:r>
-        <w:rPr>
-          <w:rFonts w:ascii="Calibri" w:hAnsi="Calibri"/>
-        </w:rPr>
-        <w:t>That Super Thanks works on every video. Not on claimed videos, not while live, not with comments off, not on made-for-kids videos.</w:t>
-      </w:r>
-    </w:p>
-    <w:p>
-      <w:pPr>
-        <w:pStyle w:val="ListBullet"/>
-      </w:pPr>
-      <w:r>
-        <w:rPr>
-          <w:rFonts w:ascii="Calibri" w:hAnsi="Calibri"/>
-        </w:rPr>
-        <w:t>That a paused membership program waits forever. After 120 days it ends, and the refunds come out of your share.</w:t>
-      </w:r>
-    </w:p>
-    <w:p>
-      <w:r>
-        <w:rPr>
-          <w:rFonts w:ascii="Calibri" w:hAnsi="Calibri"/>
-          <w:i/>
-        </w:rPr>
-        <w:t xml:space="preserve">Sources: The Rachana Ranade case study is from </w:t>
-      </w:r>
-      <w:hyperlink r:id="rId121">
-        <w:r>
-          <w:rPr>
-            <w:rStyle w:val="Hyperlink"/>
-            <w:sz w:val="22"/>
-            <w:rFonts w:ascii="Calibri" w:hAnsi="Calibri"/>
-          </w:rPr>
-          <w:t xml:space="preserve">YouTube’s own creator blog</w:t>
-        </w:r>
-      </w:hyperlink>
-      <w:r>
-        <w:rPr>
-          <w:rFonts w:ascii="Calibri" w:hAnsi="Calibri"/>
-          <w:i/>
-        </w:rPr>
-        <w:t xml:space="preserve">, corroborated by independent reporting on her channel and tiers; this book treats the $100,000 figure and the “largest income stream” claim as YouTube’s own disclosed account of a creator it chose to feature, not an independently audited number. Minimum requirements, the four features, and the not-a-donation rule are from </w:t>
-      </w:r>
-      <w:hyperlink r:id="rId112">
-        <w:r>
-          <w:rPr>
-            <w:rStyle w:val="Hyperlink"/>
-            <w:sz w:val="22"/>
-            <w:rFonts w:ascii="Calibri" w:hAnsi="Calibri"/>
-          </w:rPr>
-          <w:t xml:space="preserve">YouTube’s Commerce Products monetization policies</w:t>
-        </w:r>
-      </w:hyperlink>
-      <w:r>
-        <w:rPr>
-          <w:rFonts w:ascii="Calibri" w:hAnsi="Calibri"/>
-          <w:i/>
-        </w:rPr>
-        <w:t xml:space="preserve">. Membership eligibility, banned perks, and paused mode are from </w:t>
-      </w:r>
-      <w:hyperlink r:id="rId113">
-        <w:r>
-          <w:rPr>
-            <w:rStyle w:val="Hyperlink"/>
-            <w:sz w:val="22"/>
-            <w:rFonts w:ascii="Calibri" w:hAnsi="Calibri"/>
-          </w:rPr>
-          <w:t xml:space="preserve">YouTube’s memberships page</w:t>
-        </w:r>
-      </w:hyperlink>
-      <w:r>
-        <w:rPr>
-          <w:rFonts w:ascii="Calibri" w:hAnsi="Calibri"/>
-          <w:i/>
-        </w:rPr>
-        <w:t xml:space="preserve">; levels and perks from </w:t>
-      </w:r>
-      <w:hyperlink r:id="rId114">
-        <w:r>
-          <w:rPr>
-            <w:rStyle w:val="Hyperlink"/>
-            <w:sz w:val="22"/>
-            <w:rFonts w:ascii="Calibri" w:hAnsi="Calibri"/>
-          </w:rPr>
-          <w:t xml:space="preserve">the levels page</w:t>
-        </w:r>
-      </w:hyperlink>
-      <w:r>
-        <w:rPr>
-          <w:rFonts w:ascii="Calibri" w:hAnsi="Calibri"/>
-          <w:i/>
-        </w:rPr>
-        <w:t xml:space="preserve">; US prices from </w:t>
-      </w:r>
-      <w:hyperlink r:id="rId115">
-        <w:r>
-          <w:rPr>
-            <w:rStyle w:val="Hyperlink"/>
-            <w:sz w:val="22"/>
-            <w:rFonts w:ascii="Calibri" w:hAnsi="Calibri"/>
-          </w:rPr>
-          <w:t xml:space="preserve">the US pricing page</w:t>
-        </w:r>
-      </w:hyperlink>
-      <w:r>
-        <w:rPr>
-          <w:rFonts w:ascii="Calibri" w:hAnsi="Calibri"/>
-          <w:i/>
-        </w:rPr>
-        <w:t xml:space="preserve">; the 70% share from </w:t>
-      </w:r>
-      <w:hyperlink r:id="rId122">
-        <w:r>
-          <w:rPr>
-            <w:rStyle w:val="Hyperlink"/>
-            <w:sz w:val="22"/>
-            <w:rFonts w:ascii="Calibri" w:hAnsi="Calibri"/>
-          </w:rPr>
-          <w:t xml:space="preserve">the memberships analytics page</w:t>
-        </w:r>
-      </w:hyperlink>
-      <w:r>
-        <w:rPr>
-          <w:rFonts w:ascii="Calibri" w:hAnsi="Calibri"/>
-          <w:i/>
-        </w:rPr>
-        <w:t xml:space="preserve"> and the pricing guidance from </w:t>
-      </w:r>
-      <w:hyperlink r:id="rId116">
-        <w:r>
-          <w:rPr>
-            <w:rStyle w:val="Hyperlink"/>
-            <w:sz w:val="22"/>
-            <w:rFonts w:ascii="Calibri" w:hAnsi="Calibri"/>
-          </w:rPr>
-          <w:t xml:space="preserve">YouTube’s memberships page for creators</w:t>
-        </w:r>
-      </w:hyperlink>
-      <w:r>
-        <w:rPr>
-          <w:rFonts w:ascii="Calibri" w:hAnsi="Calibri"/>
-          <w:i/>
-        </w:rPr>
-        <w:t xml:space="preserve">. Super Chat and Super Stickers rules and the 70% share are from </w:t>
-      </w:r>
-      <w:hyperlink r:id="rId117">
-        <w:r>
-          <w:rPr>
-            <w:rStyle w:val="Hyperlink"/>
-            <w:sz w:val="22"/>
-            <w:rFonts w:ascii="Calibri" w:hAnsi="Calibri"/>
-          </w:rPr>
-          <w:t xml:space="preserve">YouTube’s Super Chat page</w:t>
-        </w:r>
-      </w:hyperlink>
-      <w:r>
-        <w:rPr>
-          <w:rFonts w:ascii="Calibri" w:hAnsi="Calibri"/>
-          <w:i/>
-        </w:rPr>
-        <w:t xml:space="preserve"> and </w:t>
-      </w:r>
-      <w:hyperlink r:id="rId118">
-        <w:r>
-          <w:rPr>
-            <w:rStyle w:val="Hyperlink"/>
-            <w:sz w:val="22"/>
-            <w:rFonts w:ascii="Calibri" w:hAnsi="Calibri"/>
-          </w:rPr>
-          <w:t xml:space="preserve">eligibility page</w:t>
-        </w:r>
-      </w:hyperlink>
-      <w:r>
-        <w:rPr>
-          <w:rFonts w:ascii="Calibri" w:hAnsi="Calibri"/>
-          <w:i/>
-        </w:rPr>
-        <w:t xml:space="preserve">. Super Thanks rules and its 70% share are from </w:t>
-      </w:r>
-      <w:hyperlink r:id="rId119">
-        <w:r>
-          <w:rPr>
-            <w:rStyle w:val="Hyperlink"/>
-            <w:sz w:val="22"/>
-            <w:rFonts w:ascii="Calibri" w:hAnsi="Calibri"/>
-          </w:rPr>
-          <w:t xml:space="preserve">YouTube’s Super Thanks eligibility page</w:t>
-        </w:r>
-      </w:hyperlink>
-      <w:r>
-        <w:rPr>
-          <w:rFonts w:ascii="Calibri" w:hAnsi="Calibri"/>
-          <w:i/>
-        </w:rPr>
-        <w:t xml:space="preserve"> and </w:t>
-      </w:r>
-      <w:hyperlink r:id="rId123">
-        <w:r>
-          <w:rPr>
-            <w:rStyle w:val="Hyperlink"/>
-            <w:sz w:val="22"/>
-            <w:rFonts w:ascii="Calibri" w:hAnsi="Calibri"/>
-          </w:rPr>
-          <w:t xml:space="preserve">management page</w:t>
-        </w:r>
-      </w:hyperlink>
-      <w:r>
-        <w:rPr>
-          <w:rFonts w:ascii="Calibri" w:hAnsi="Calibri"/>
-          <w:i/>
-        </w:rPr>
-        <w:t xml:space="preserve">; the tips from </w:t>
-      </w:r>
-      <w:hyperlink r:id="rId120">
-        <w:r>
-          <w:rPr>
-            <w:rStyle w:val="Hyperlink"/>
-            <w:sz w:val="22"/>
-            <w:rFonts w:ascii="Calibri" w:hAnsi="Calibri"/>
-          </w:rPr>
-          <w:t xml:space="preserve">YouTube’s Super Thanks tips</w:t>
-        </w:r>
-      </w:hyperlink>
-      <w:r>
-        <w:rPr>
-          <w:rFonts w:ascii="Calibri" w:hAnsi="Calibri"/>
-          <w:i/>
-        </w:rPr>
-        <w:t>. Checked October 2026.</w:t>
-      </w:r>
-    </w:p>
-    <w:p>
-      <w:pPr>
-        <w:sectPr>
-          <w:headerReference w:type="default" r:id="rId110"/>
-          <w:footerReference w:type="default" r:id="rId111"/>
-          <w:pgSz w:w="10080" w:h="14400"/>
-          <w:pgMar w:top="1008" w:right="1008" w:bottom="1008" w:left="1008" w:header="504" w:footer="504" w:gutter="0"/>
-          <w:cols w:space="720"/>
-          <w:titlePg/>
-          <w:docGrid w:linePitch="360"/>
-        </w:sectPr>
-      </w:pPr>
-    </w:p>
-    <w:p>
-      <w:bookmarkStart w:id="110" w:name="toc109"/>
-      <w:pPr>
-        <w:pStyle w:val="Heading1"/>
-      </w:pPr>
-      <w:r>
-        <w:t>13 Sponsors and Affiliate Links</w:t>
-      </w:r>
-      <w:bookmarkEnd w:id="110"/>
-    </w:p>
-    <w:p>
-      <w:r>
-        <w:rPr>
-          <w:rFonts w:ascii="Calibri" w:hAnsi="Calibri"/>
-          <w:i/>
-        </w:rPr>
-        <w:t>Companies can pay the channel directly: a fee for one video, or a commission when a viewer buys something you recommended. Both are income from an audience you already earned, and both need a disclosure every time.</w:t>
-      </w:r>
-    </w:p>
-    <w:p>
-      <w:r>
-        <w:rPr>
-          <w:rFonts w:ascii="Calibri" w:hAnsi="Calibri"/>
-          <w:i/>
-        </w:rPr>
-        <w:t>Layer: Use after publishing for affiliate links and direct sponsors (§I, III–V). Use after eligibility for YouTube Creator Partnerships and the Shopping affiliate program (§II, VI). Workbook: the sponsor and affiliate lines on the money sheet (chapter 15, §V).</w:t>
-      </w:r>
-    </w:p>
-    <w:p>
-      <w:r>
-        <w:rPr>
-          <w:rFonts w:ascii="Calibri" w:hAnsi="Calibri"/>
-        </w:rPr>
-        <w:t>Ads and fan funding are paid through YouTube, on YouTube’s terms. The two streams in this chapter are paid by other companies, on terms you agree with them. That makes them the most flexible income a channel has, and the easiest to get wrong. A sponsor pays for your viewers’ trust. An affiliate program pays a commission on it. Spend that trust carelessly and every other stream in this book shrinks with it.</w:t>
-      </w:r>
-    </w:p>
-    <w:p>
-      <w:r>
-        <w:rPr>
-          <w:rFonts w:ascii="Calibri" w:hAnsi="Calibri"/>
-        </w:rPr>
-        <w:t>Neither stream is selling things of your own. You recommend a product someone else makes, or you carry a message someone else paid for, and you say so.</w:t>
-      </w:r>
-    </w:p>
-    <w:p>
-      <w:bookmarkStart w:id="111" w:name="toc110"/>
-      <w:pPr>
-        <w:pStyle w:val="Heading2"/>
-      </w:pPr>
-      <w:r>
-        <w:t>I. What a sponsor is paying for</w:t>
-      </w:r>
-      <w:bookmarkEnd w:id="111"/>
-    </w:p>
-    <w:p>
-      <w:r>
-        <w:rPr>
-          <w:rFonts w:ascii="Calibri" w:hAnsi="Calibri"/>
-        </w:rPr>
-        <w:t>A sponsorship, or brand deal, is one company paying you to feature its product in a video: a spoken segment, a demonstration, or a whole video built around it. The sponsor is not paying for views in general. It is paying for your particular viewers, the people chapter 1 named, hearing about its product from someone they already watch.</w:t>
-      </w:r>
-    </w:p>
-    <w:p>
-      <w:r>
-        <w:rPr>
-          <w:rFonts w:ascii="Calibri" w:hAnsi="Calibri"/>
-        </w:rPr>
-        <w:t>That is why a small channel with a precise viewer can be worth more to the right sponsor than a large channel with a vague one. It is also why the first sponsor usually arrives after the channel has a record: a sponsor will look at your recent videos, how many people watch each one, and who comments.</w:t>
-      </w:r>
-    </w:p>
-    <w:p>
-      <w:r>
-        <w:rPr>
-          <w:rFonts w:ascii="Calibri" w:hAnsi="Calibri"/>
-        </w:rPr>
-        <w:t>Author recommendation: prepare a one-page summary before anyone asks — creators call it a media kit. It is not a platform form:</w:t>
-      </w:r>
-    </w:p>
-    <w:p>
-      <w:pPr>
-        <w:pStyle w:val="ListBullet"/>
-      </w:pPr>
-      <w:r>
-        <w:rPr>
-          <w:rFonts w:ascii="Calibri" w:hAnsi="Calibri"/>
-        </w:rPr>
-        <w:t>who the channel is for, in the viewer sentence from chapter 1;</w:t>
-      </w:r>
-    </w:p>
-    <w:p>
-      <w:pPr>
-        <w:pStyle w:val="ListBullet"/>
-      </w:pPr>
-      <w:r>
-        <w:rPr>
-          <w:rFonts w:ascii="Calibri" w:hAnsi="Calibri"/>
-        </w:rPr>
-        <w:t>average views per long video over the last ninety days, and average view duration, from chapter 7;</w:t>
-      </w:r>
-    </w:p>
-    <w:p>
-      <w:pPr>
-        <w:pStyle w:val="ListBullet"/>
-      </w:pPr>
-      <w:r>
-        <w:rPr>
-          <w:rFonts w:ascii="Calibri" w:hAnsi="Calibri"/>
-        </w:rPr>
-        <w:t>where the viewers are, by country, and their age range, from Studio’s audience reports;</w:t>
-      </w:r>
-    </w:p>
-    <w:p>
-      <w:pPr>
-        <w:pStyle w:val="ListBullet"/>
-      </w:pPr>
-      <w:r>
-        <w:rPr>
-          <w:rFonts w:ascii="Calibri" w:hAnsi="Calibri"/>
-        </w:rPr>
-        <w:t>two or three videos that show the kind of segment you would make; and</w:t>
-      </w:r>
-    </w:p>
-    <w:p>
-      <w:pPr>
-        <w:pStyle w:val="ListBullet"/>
-      </w:pPr>
-      <w:r>
-        <w:rPr>
-          <w:rFonts w:ascii="Calibri" w:hAnsi="Calibri"/>
-        </w:rPr>
-        <w:t>how to reach you, from the email address on the channel’s About section.</w:t>
+      <w:r>
+        <w:rPr>
+          <w:rFonts w:ascii="Calibri" w:hAnsi="Calibri"/>
+        </w:rPr>
+        <w:t>That channel is large. Two much smaller ones show how the tiers get built.</w:t>
       </w:r>
     </w:p>
     <w:tbl>
@@ -19035,13 +18126,691 @@
                 <w:rFonts w:ascii="Calibri" w:hAnsi="Calibri"/>
                 <w:sz w:val="22"/>
               </w:rPr>
-              <w:t>Case study: Ali Abdaal, a doctor turned YouTuber, has said publicly that his first sponsored video came a full year after he started the channel — by which point he had posted nearly 150 videos and had around 50,000 subscribers. Fifty thousand subscribers is fifty times this book’s ad-gate threshold. The record a sponsor was waiting for was not the subscriber count. It was 150 videos of evidence about who watched and how.</w:t>
+              <w:t>Case study: YouTube’s July 2025 creator blog post on memberships features two small channels. The channel @careercoachmandy, then at almost 50,000 subscribers, says it started by surveying its own viewers about the perks they wanted and found a preference it had not expected. The channel @becauseisaac says it started memberships for “consistency in revenue and audience engagement.” Neither post gives prices, member counts, or income. What both show is the order of work: ask or decide what regulars want, then build the tier, not the other way around.</w:t>
             </w:r>
           </w:p>
         </w:tc>
       </w:tr>
     </w:tbl>
     <w:p/>
+    <w:p>
+      <w:bookmarkStart w:id="106" w:name="toc105"/>
+      <w:pPr>
+        <w:pStyle w:val="Heading2"/>
+      </w:pPr>
+      <w:r>
+        <w:t>III. Super Chat and Super Stickers</w:t>
+      </w:r>
+      <w:bookmarkEnd w:id="106"/>
+    </w:p>
+    <w:p>
+      <w:r>
+        <w:rPr>
+          <w:rFonts w:ascii="Calibri" w:hAnsi="Calibri"/>
+        </w:rPr>
+        <w:t xml:space="preserve">These two belong to live: live streams and premieres with live chat turned on. A viewer pays to highlight a message in the chat, or to send an animated sticker. </w:t>
+      </w:r>
+      <w:hyperlink r:id="rId113">
+        <w:r>
+          <w:rPr>
+            <w:rStyle w:val="Hyperlink"/>
+            <w:sz w:val="22"/>
+            <w:rFonts w:ascii="Calibri" w:hAnsi="Calibri"/>
+          </w:rPr>
+          <w:t xml:space="preserve">YouTube’s Super Chat page</w:t>
+        </w:r>
+      </w:hyperlink>
+      <w:r>
+        <w:rPr>
+          <w:rFonts w:ascii="Calibri" w:hAnsi="Calibri"/>
+        </w:rPr>
+        <w:t xml:space="preserve"> says they are available automatically on eligible streams and premieres once you have switched them on, and that live chat is on by default.</w:t>
+      </w:r>
+    </w:p>
+    <w:p>
+      <w:hyperlink r:id="rId114">
+        <w:r>
+          <w:rPr>
+            <w:rStyle w:val="Hyperlink"/>
+            <w:sz w:val="22"/>
+            <w:rFonts w:ascii="Calibri" w:hAnsi="Calibri"/>
+          </w:rPr>
+          <w:t xml:space="preserve">YouTube’s Super Chat eligibility page</w:t>
+        </w:r>
+      </w:hyperlink>
+      <w:r>
+        <w:rPr>
+          <w:rFonts w:ascii="Calibri" w:hAnsi="Calibri"/>
+        </w:rPr>
+        <w:t xml:space="preserve"> lists where they do not work: age-restricted, unlisted, private, and made-for-kids videos, and videos with YouTube Giving fundraisers.</w:t>
+      </w:r>
+    </w:p>
+    <w:p>
+      <w:r>
+        <w:rPr>
+          <w:rFonts w:ascii="Calibri" w:hAnsi="Calibri"/>
+        </w:rPr>
+        <w:t>Moderate Super Chats the way you moderate any chat. YouTube says a Super Chat removed for breaking its policies has YouTube’s portion donated to charity.</w:t>
+      </w:r>
+    </w:p>
+    <w:p>
+      <w:r>
+        <w:rPr>
+          <w:rFonts w:ascii="Calibri" w:hAnsi="Calibri"/>
+        </w:rPr>
+        <w:t>Creator heuristic: what makes viewers use them is a live stream with a reason to talk. Answer questions from the deep dive. Read the Super Chats aloud and answer them properly, not with a list of names. Thank people without turning the stream into an auction. A viewer pays to be heard. Hear them.</w:t>
+      </w:r>
+    </w:p>
+    <w:p>
+      <w:r>
+        <w:rPr>
+          <w:rFonts w:ascii="Calibri" w:hAnsi="Calibri"/>
+        </w:rPr>
+        <w:t>Chapter 8, §V suggested premieres and live streams before the gate, partly to rehearse this room. If nobody comes to your streams at 300 subscribers, Super Chat will not change that at 500.</w:t>
+      </w:r>
+    </w:p>
+    <w:p>
+      <w:bookmarkStart w:id="107" w:name="toc106"/>
+      <w:pPr>
+        <w:pStyle w:val="Heading2"/>
+      </w:pPr>
+      <w:r>
+        <w:t>IV. Super Thanks</w:t>
+      </w:r>
+      <w:bookmarkEnd w:id="107"/>
+    </w:p>
+    <w:p>
+      <w:r>
+        <w:rPr>
+          <w:rFonts w:ascii="Calibri" w:hAnsi="Calibri"/>
+        </w:rPr>
+        <w:t xml:space="preserve">Super Thanks is the one fan-funding feature that does not need you live. A viewer buys a one-time animation on a long-form video or a Short and gets a highlighted comment in the comments section. </w:t>
+      </w:r>
+      <w:hyperlink r:id="rId115">
+        <w:r>
+          <w:rPr>
+            <w:rStyle w:val="Hyperlink"/>
+            <w:sz w:val="22"/>
+            <w:rFonts w:ascii="Calibri" w:hAnsi="Calibri"/>
+          </w:rPr>
+          <w:t xml:space="preserve">YouTube’s Super Thanks eligibility page</w:t>
+        </w:r>
+      </w:hyperlink>
+      <w:r>
+        <w:rPr>
+          <w:rFonts w:ascii="Calibri" w:hAnsi="Calibri"/>
+        </w:rPr>
+        <w:t xml:space="preserve"> says it is offered at several price points, and that once you switch it on it appears on all your eligible past and future videos.</w:t>
+      </w:r>
+    </w:p>
+    <w:p>
+      <w:r>
+        <w:rPr>
+          <w:rFonts w:ascii="Calibri" w:hAnsi="Calibri"/>
+        </w:rPr>
+        <w:t>It is not available on age-restricted, unlisted, private, or made-for-kids videos; on videos with copyright claims or YouTube Giving fundraisers; on live streams or premieres while live, though the archived video can carry it afterwards; or on videos with comments turned off. The channel must not be set as made for kids or have a significant number of made-for-kids or ineligible videos.</w:t>
+      </w:r>
+    </w:p>
+    <w:p>
+      <w:r>
+        <w:rPr>
+          <w:rFonts w:ascii="Calibri" w:hAnsi="Calibri"/>
+        </w:rPr>
+        <w:t>A claimed music bed costs that video its Super Thanks as well as its ads — one more reason to build the deep dive on audio you can document.</w:t>
+      </w:r>
+    </w:p>
+    <w:p>
+      <w:r>
+        <w:rPr>
+          <w:rFonts w:ascii="Calibri" w:hAnsi="Calibri"/>
+        </w:rPr>
+        <w:t xml:space="preserve">Documented platform guidance: YouTube’s </w:t>
+      </w:r>
+      <w:hyperlink r:id="rId116">
+        <w:r>
+          <w:rPr>
+            <w:rStyle w:val="Hyperlink"/>
+            <w:sz w:val="22"/>
+            <w:rFonts w:ascii="Calibri" w:hAnsi="Calibri"/>
+          </w:rPr>
+          <w:t xml:space="preserve">Super Thanks tips page</w:t>
+        </w:r>
+      </w:hyperlink>
+      <w:r>
+        <w:rPr>
+          <w:rFonts w:ascii="Calibri" w:hAnsi="Calibri"/>
+        </w:rPr>
+        <w:t xml:space="preserve"> suggests replying to each Super Thanks comment, and telling viewers what the money pays for — editing, a new microphone, more videos. Both are honest asks. A viewer who sees their comment answered is the viewer who comes back.</w:t>
+      </w:r>
+    </w:p>
+    <w:p>
+      <w:bookmarkStart w:id="108" w:name="toc107"/>
+      <w:pPr>
+        <w:pStyle w:val="Heading2"/>
+      </w:pPr>
+      <w:r>
+        <w:t>V. Asking without begging</w:t>
+      </w:r>
+      <w:bookmarkEnd w:id="108"/>
+    </w:p>
+    <w:p>
+      <w:r>
+        <w:rPr>
+          <w:rFonts w:ascii="Calibri" w:hAnsi="Calibri"/>
+        </w:rPr>
+        <w:t>Ads need viewers. Fans need a relationship. Three rules keep the asking honest (author recommendation).</w:t>
+      </w:r>
+    </w:p>
+    <w:p>
+      <w:pPr>
+        <w:pStyle w:val="ListBullet"/>
+      </w:pPr>
+      <w:r>
+        <w:rPr>
+          <w:rFonts w:ascii="Calibri" w:hAnsi="Calibri"/>
+          <w:b/>
+        </w:rPr>
+        <w:t>One ask, in its place.</w:t>
+      </w:r>
+      <w:r>
+        <w:rPr>
+          <w:rFonts w:ascii="Calibri" w:hAnsi="Calibri"/>
+        </w:rPr>
+        <w:t xml:space="preserve"> The end of a video already has one ask in chapter 4: subscribe, with a reason. A membership mention belongs in its own place — a pinned comment, a post, a line in a live stream — not stacked on top of the subscribe line.</w:t>
+      </w:r>
+    </w:p>
+    <w:p>
+      <w:pPr>
+        <w:pStyle w:val="ListBullet"/>
+      </w:pPr>
+      <w:r>
+        <w:rPr>
+          <w:rFonts w:ascii="Calibri" w:hAnsi="Calibri"/>
+          <w:b/>
+        </w:rPr>
+        <w:t>Say what the money does.</w:t>
+      </w:r>
+      <w:r>
+        <w:rPr>
+          <w:rFonts w:ascii="Calibri" w:hAnsi="Calibri"/>
+        </w:rPr>
+        <w:t xml:space="preserve"> “Members get the Thursday stream and the long version of every deep dive” is a reason. “Please support the channel” is a request with nothing in it.</w:t>
+      </w:r>
+    </w:p>
+    <w:p>
+      <w:pPr>
+        <w:pStyle w:val="ListBullet"/>
+      </w:pPr>
+      <w:r>
+        <w:rPr>
+          <w:rFonts w:ascii="Calibri" w:hAnsi="Calibri"/>
+          <w:b/>
+        </w:rPr>
+        <w:t>Never trade the public channel for the paid one.</w:t>
+      </w:r>
+      <w:r>
+        <w:rPr>
+          <w:rFonts w:ascii="Calibri" w:hAnsi="Calibri"/>
+        </w:rPr>
+        <w:t xml:space="preserve"> If the public deep dive gets thinner so the members’ version looks better, the public channel stops growing, and so does the pool of future members. The free videos are what the members are paying to keep coming.</w:t>
+      </w:r>
+    </w:p>
+    <w:p>
+      <w:r>
+        <w:rPr>
+          <w:rFonts w:ascii="Calibri" w:hAnsi="Calibri"/>
+          <w:i/>
+        </w:rPr>
+        <w:t>In short:</w:t>
+      </w:r>
+      <w:r>
+        <w:rPr>
+          <w:rFonts w:ascii="Calibri" w:hAnsi="Calibri"/>
+        </w:rPr>
+        <w:t xml:space="preserve"> Fan funding needs the Partner Program, age 18, and the Commerce Product Module, and pays 70% after taxes and fees. Memberships are monthly, with banned perks. Super Chat and Super Stickers are for live streams and premieres. Super Thanks works on long videos and Shorts, but not on claimed ones.</w:t>
+      </w:r>
+    </w:p>
+    <w:p>
+      <w:bookmarkStart w:id="109" w:name="toc108"/>
+      <w:pPr>
+        <w:pStyle w:val="Heading2"/>
+      </w:pPr>
+      <w:r>
+        <w:t>VI. Claims that do not survive the fan-funding pages</w:t>
+      </w:r>
+      <w:bookmarkEnd w:id="109"/>
+    </w:p>
+    <w:p>
+      <w:pPr>
+        <w:pStyle w:val="ListBullet"/>
+      </w:pPr>
+      <w:r>
+        <w:rPr>
+          <w:rFonts w:ascii="Calibri" w:hAnsi="Calibri"/>
+        </w:rPr>
+        <w:t>That fan funding needs the full ad gate. In countries with the expanded program it opens at 500 subscribers, three uploads in 90 days, and 3,000 hours or 3 million Shorts views.</w:t>
+      </w:r>
+    </w:p>
+    <w:p>
+      <w:pPr>
+        <w:pStyle w:val="ListBullet"/>
+      </w:pPr>
+      <w:r>
+        <w:rPr>
+          <w:rFonts w:ascii="Calibri" w:hAnsi="Calibri"/>
+        </w:rPr>
+        <w:t>That a membership perk can be anything. Downloads of YouTube content, in-person one-to-one meetings, and random prizes are banned.</w:t>
+      </w:r>
+    </w:p>
+    <w:p>
+      <w:pPr>
+        <w:pStyle w:val="ListBullet"/>
+      </w:pPr>
+      <w:r>
+        <w:rPr>
+          <w:rFonts w:ascii="Calibri" w:hAnsi="Calibri"/>
+        </w:rPr>
+        <w:t>That Super Chat is a donation. YouTube says it is not a crowdfunding or donation tool, and the money may be treated differently under your local law.</w:t>
+      </w:r>
+    </w:p>
+    <w:p>
+      <w:pPr>
+        <w:pStyle w:val="ListBullet"/>
+      </w:pPr>
+      <w:r>
+        <w:rPr>
+          <w:rFonts w:ascii="Calibri" w:hAnsi="Calibri"/>
+        </w:rPr>
+        <w:t>That Super Thanks works on every video. Not on claimed videos, not while live, not with comments off, not on made-for-kids videos.</w:t>
+      </w:r>
+    </w:p>
+    <w:p>
+      <w:pPr>
+        <w:pStyle w:val="ListBullet"/>
+      </w:pPr>
+      <w:r>
+        <w:rPr>
+          <w:rFonts w:ascii="Calibri" w:hAnsi="Calibri"/>
+        </w:rPr>
+        <w:t>That a paused membership program waits forever. After 120 days it ends, and the refunds come out of your share.</w:t>
+      </w:r>
+    </w:p>
+    <w:p>
+      <w:r>
+        <w:rPr>
+          <w:rFonts w:ascii="Calibri" w:hAnsi="Calibri"/>
+          <w:i/>
+        </w:rPr>
+        <w:t xml:space="preserve">Sources: The memberships case study is from </w:t>
+      </w:r>
+      <w:hyperlink r:id="rId117">
+        <w:r>
+          <w:rPr>
+            <w:rStyle w:val="Hyperlink"/>
+            <w:sz w:val="22"/>
+            <w:rFonts w:ascii="Calibri" w:hAnsi="Calibri"/>
+          </w:rPr>
+          <w:t xml:space="preserve">YouTube’s own creator blog</w:t>
+        </w:r>
+      </w:hyperlink>
+      <w:r>
+        <w:rPr>
+          <w:rFonts w:ascii="Calibri" w:hAnsi="Calibri"/>
+          <w:i/>
+        </w:rPr>
+        <w:t xml:space="preserve">, the “majority of its YouTube revenue” and $100,000 figures are YouTube’s own account of a creator it chose to feature, not an audited number. The second case study is from </w:t>
+      </w:r>
+      <w:hyperlink r:id="rId118">
+        <w:r>
+          <w:rPr>
+            <w:rStyle w:val="Hyperlink"/>
+            <w:sz w:val="22"/>
+            <w:rFonts w:ascii="Calibri" w:hAnsi="Calibri"/>
+          </w:rPr>
+          <w:t xml:space="preserve">YouTube’s July 2025 channel membership success stories</w:t>
+        </w:r>
+      </w:hyperlink>
+      <w:r>
+        <w:rPr>
+          <w:rFonts w:ascii="Calibri" w:hAnsi="Calibri"/>
+          <w:i/>
+        </w:rPr>
+        <w:t xml:space="preserve">; the quotes are from that post, and it gives no financial figures for either channel. Minimum requirements, the four features, and the not-a-donation rule are from </w:t>
+      </w:r>
+      <w:hyperlink r:id="rId108">
+        <w:r>
+          <w:rPr>
+            <w:rStyle w:val="Hyperlink"/>
+            <w:sz w:val="22"/>
+            <w:rFonts w:ascii="Calibri" w:hAnsi="Calibri"/>
+          </w:rPr>
+          <w:t xml:space="preserve">YouTube’s Commerce Products monetization policies</w:t>
+        </w:r>
+      </w:hyperlink>
+      <w:r>
+        <w:rPr>
+          <w:rFonts w:ascii="Calibri" w:hAnsi="Calibri"/>
+          <w:i/>
+        </w:rPr>
+        <w:t xml:space="preserve">. Membership eligibility, banned perks, and paused mode are from </w:t>
+      </w:r>
+      <w:hyperlink r:id="rId109">
+        <w:r>
+          <w:rPr>
+            <w:rStyle w:val="Hyperlink"/>
+            <w:sz w:val="22"/>
+            <w:rFonts w:ascii="Calibri" w:hAnsi="Calibri"/>
+          </w:rPr>
+          <w:t xml:space="preserve">YouTube’s memberships page</w:t>
+        </w:r>
+      </w:hyperlink>
+      <w:r>
+        <w:rPr>
+          <w:rFonts w:ascii="Calibri" w:hAnsi="Calibri"/>
+          <w:i/>
+        </w:rPr>
+        <w:t xml:space="preserve">; levels and perks from </w:t>
+      </w:r>
+      <w:hyperlink r:id="rId110">
+        <w:r>
+          <w:rPr>
+            <w:rStyle w:val="Hyperlink"/>
+            <w:sz w:val="22"/>
+            <w:rFonts w:ascii="Calibri" w:hAnsi="Calibri"/>
+          </w:rPr>
+          <w:t xml:space="preserve">the levels page</w:t>
+        </w:r>
+      </w:hyperlink>
+      <w:r>
+        <w:rPr>
+          <w:rFonts w:ascii="Calibri" w:hAnsi="Calibri"/>
+          <w:i/>
+        </w:rPr>
+        <w:t xml:space="preserve">; US prices from </w:t>
+      </w:r>
+      <w:hyperlink r:id="rId111">
+        <w:r>
+          <w:rPr>
+            <w:rStyle w:val="Hyperlink"/>
+            <w:sz w:val="22"/>
+            <w:rFonts w:ascii="Calibri" w:hAnsi="Calibri"/>
+          </w:rPr>
+          <w:t xml:space="preserve">the US pricing page</w:t>
+        </w:r>
+      </w:hyperlink>
+      <w:r>
+        <w:rPr>
+          <w:rFonts w:ascii="Calibri" w:hAnsi="Calibri"/>
+          <w:i/>
+        </w:rPr>
+        <w:t xml:space="preserve">; the 70% share from </w:t>
+      </w:r>
+      <w:hyperlink r:id="rId119">
+        <w:r>
+          <w:rPr>
+            <w:rStyle w:val="Hyperlink"/>
+            <w:sz w:val="22"/>
+            <w:rFonts w:ascii="Calibri" w:hAnsi="Calibri"/>
+          </w:rPr>
+          <w:t xml:space="preserve">the memberships analytics page</w:t>
+        </w:r>
+      </w:hyperlink>
+      <w:r>
+        <w:rPr>
+          <w:rFonts w:ascii="Calibri" w:hAnsi="Calibri"/>
+          <w:i/>
+        </w:rPr>
+        <w:t xml:space="preserve"> and the pricing guidance from </w:t>
+      </w:r>
+      <w:hyperlink r:id="rId112">
+        <w:r>
+          <w:rPr>
+            <w:rStyle w:val="Hyperlink"/>
+            <w:sz w:val="22"/>
+            <w:rFonts w:ascii="Calibri" w:hAnsi="Calibri"/>
+          </w:rPr>
+          <w:t xml:space="preserve">YouTube’s memberships page for creators</w:t>
+        </w:r>
+      </w:hyperlink>
+      <w:r>
+        <w:rPr>
+          <w:rFonts w:ascii="Calibri" w:hAnsi="Calibri"/>
+          <w:i/>
+        </w:rPr>
+        <w:t xml:space="preserve">. Super Chat and Super Stickers rules and the 70% share are from </w:t>
+      </w:r>
+      <w:hyperlink r:id="rId113">
+        <w:r>
+          <w:rPr>
+            <w:rStyle w:val="Hyperlink"/>
+            <w:sz w:val="22"/>
+            <w:rFonts w:ascii="Calibri" w:hAnsi="Calibri"/>
+          </w:rPr>
+          <w:t xml:space="preserve">YouTube’s Super Chat page</w:t>
+        </w:r>
+      </w:hyperlink>
+      <w:r>
+        <w:rPr>
+          <w:rFonts w:ascii="Calibri" w:hAnsi="Calibri"/>
+          <w:i/>
+        </w:rPr>
+        <w:t xml:space="preserve"> and </w:t>
+      </w:r>
+      <w:hyperlink r:id="rId114">
+        <w:r>
+          <w:rPr>
+            <w:rStyle w:val="Hyperlink"/>
+            <w:sz w:val="22"/>
+            <w:rFonts w:ascii="Calibri" w:hAnsi="Calibri"/>
+          </w:rPr>
+          <w:t xml:space="preserve">eligibility page</w:t>
+        </w:r>
+      </w:hyperlink>
+      <w:r>
+        <w:rPr>
+          <w:rFonts w:ascii="Calibri" w:hAnsi="Calibri"/>
+          <w:i/>
+        </w:rPr>
+        <w:t xml:space="preserve">. Super Thanks rules and its 70% share are from </w:t>
+      </w:r>
+      <w:hyperlink r:id="rId115">
+        <w:r>
+          <w:rPr>
+            <w:rStyle w:val="Hyperlink"/>
+            <w:sz w:val="22"/>
+            <w:rFonts w:ascii="Calibri" w:hAnsi="Calibri"/>
+          </w:rPr>
+          <w:t xml:space="preserve">YouTube’s Super Thanks eligibility page</w:t>
+        </w:r>
+      </w:hyperlink>
+      <w:r>
+        <w:rPr>
+          <w:rFonts w:ascii="Calibri" w:hAnsi="Calibri"/>
+          <w:i/>
+        </w:rPr>
+        <w:t xml:space="preserve"> and </w:t>
+      </w:r>
+      <w:hyperlink r:id="rId120">
+        <w:r>
+          <w:rPr>
+            <w:rStyle w:val="Hyperlink"/>
+            <w:sz w:val="22"/>
+            <w:rFonts w:ascii="Calibri" w:hAnsi="Calibri"/>
+          </w:rPr>
+          <w:t xml:space="preserve">management page</w:t>
+        </w:r>
+      </w:hyperlink>
+      <w:r>
+        <w:rPr>
+          <w:rFonts w:ascii="Calibri" w:hAnsi="Calibri"/>
+          <w:i/>
+        </w:rPr>
+        <w:t xml:space="preserve">; the tips from </w:t>
+      </w:r>
+      <w:hyperlink r:id="rId116">
+        <w:r>
+          <w:rPr>
+            <w:rStyle w:val="Hyperlink"/>
+            <w:sz w:val="22"/>
+            <w:rFonts w:ascii="Calibri" w:hAnsi="Calibri"/>
+          </w:rPr>
+          <w:t xml:space="preserve">YouTube’s Super Thanks tips</w:t>
+        </w:r>
+      </w:hyperlink>
+      <w:r>
+        <w:rPr>
+          <w:rFonts w:ascii="Calibri" w:hAnsi="Calibri"/>
+          <w:i/>
+        </w:rPr>
+        <w:t>. Checked October 2026.</w:t>
+      </w:r>
+    </w:p>
+    <w:p>
+      <w:pPr>
+        <w:sectPr>
+          <w:headerReference w:type="default" r:id="rId106"/>
+          <w:footerReference w:type="default" r:id="rId107"/>
+          <w:pgSz w:w="10080" w:h="14400"/>
+          <w:pgMar w:top="1008" w:right="1008" w:bottom="1008" w:left="1008" w:header="504" w:footer="504" w:gutter="0"/>
+          <w:cols w:space="720"/>
+          <w:titlePg/>
+          <w:docGrid w:linePitch="360"/>
+        </w:sectPr>
+      </w:pPr>
+    </w:p>
+    <w:p>
+      <w:bookmarkStart w:id="110" w:name="toc109"/>
+      <w:pPr>
+        <w:pStyle w:val="Heading1"/>
+      </w:pPr>
+      <w:r>
+        <w:t>13 Sponsors and Affiliate Links</w:t>
+      </w:r>
+      <w:bookmarkEnd w:id="110"/>
+    </w:p>
+    <w:p>
+      <w:r>
+        <w:rPr>
+          <w:rFonts w:ascii="Calibri" w:hAnsi="Calibri"/>
+          <w:i/>
+        </w:rPr>
+        <w:t>Companies can pay the channel directly: a fee for one video, or a commission when a viewer buys something you recommended. Both are income from an audience you already earned, and both need a disclosure every time.</w:t>
+      </w:r>
+    </w:p>
+    <w:p>
+      <w:r>
+        <w:rPr>
+          <w:rFonts w:ascii="Calibri" w:hAnsi="Calibri"/>
+          <w:i/>
+        </w:rPr>
+        <w:t>Layer: Use after publishing for affiliate links and direct sponsors (§I, III–V). Use after eligibility for YouTube Creator Partnerships and the Shopping affiliate program (§II, VI). Workbook: the sponsor and affiliate lines on the money sheet (chapter 15, §V).</w:t>
+      </w:r>
+    </w:p>
+    <w:p>
+      <w:r>
+        <w:rPr>
+          <w:rFonts w:ascii="Calibri" w:hAnsi="Calibri"/>
+        </w:rPr>
+        <w:t>Ads and fan funding are paid through YouTube, on YouTube’s terms. The two streams in this chapter are paid by other companies, on terms you agree with them. That makes them the most flexible income a channel has, and the easiest to get wrong. A sponsor pays for your viewers’ trust. An affiliate program pays a commission on it. Spend that trust carelessly and every other stream in this book shrinks with it.</w:t>
+      </w:r>
+    </w:p>
+    <w:p>
+      <w:r>
+        <w:rPr>
+          <w:rFonts w:ascii="Calibri" w:hAnsi="Calibri"/>
+        </w:rPr>
+        <w:t>Neither stream is selling things of your own. You recommend a product someone else makes, or you carry a message someone else paid for, and you say so.</w:t>
+      </w:r>
+    </w:p>
+    <w:p>
+      <w:bookmarkStart w:id="111" w:name="toc110"/>
+      <w:pPr>
+        <w:pStyle w:val="Heading2"/>
+      </w:pPr>
+      <w:r>
+        <w:t>I. What a sponsor is paying for</w:t>
+      </w:r>
+      <w:bookmarkEnd w:id="111"/>
+    </w:p>
+    <w:p>
+      <w:r>
+        <w:rPr>
+          <w:rFonts w:ascii="Calibri" w:hAnsi="Calibri"/>
+        </w:rPr>
+        <w:t>A sponsorship, or brand deal, is one company paying you to feature its product in a video: a spoken segment, a demonstration, or a whole video built around it. The sponsor is not paying for views in general. It is paying for your particular viewers, the people chapter 1 named, hearing about its product from someone they already watch.</w:t>
+      </w:r>
+    </w:p>
+    <w:p>
+      <w:r>
+        <w:rPr>
+          <w:rFonts w:ascii="Calibri" w:hAnsi="Calibri"/>
+        </w:rPr>
+        <w:t>That is why a small channel with a precise viewer can be worth more to the right sponsor than a large channel with a vague one. It is also why the first sponsor usually arrives after the channel has a record: a sponsor will look at your recent videos, how many people watch each one, and who comments.</w:t>
+      </w:r>
+    </w:p>
+    <w:p>
+      <w:r>
+        <w:rPr>
+          <w:rFonts w:ascii="Calibri" w:hAnsi="Calibri"/>
+        </w:rPr>
+        <w:t>Author recommendation: prepare a one-page summary before anyone asks — creators call it a media kit. It is not a platform form:</w:t>
+      </w:r>
+    </w:p>
+    <w:p>
+      <w:pPr>
+        <w:pStyle w:val="ListBullet"/>
+      </w:pPr>
+      <w:r>
+        <w:rPr>
+          <w:rFonts w:ascii="Calibri" w:hAnsi="Calibri"/>
+        </w:rPr>
+        <w:t>who the channel is for, in the viewer sentence from chapter 1;</w:t>
+      </w:r>
+    </w:p>
+    <w:p>
+      <w:pPr>
+        <w:pStyle w:val="ListBullet"/>
+      </w:pPr>
+      <w:r>
+        <w:rPr>
+          <w:rFonts w:ascii="Calibri" w:hAnsi="Calibri"/>
+        </w:rPr>
+        <w:t>average views per long video over the last ninety days, and average view duration, from chapter 7;</w:t>
+      </w:r>
+    </w:p>
+    <w:p>
+      <w:pPr>
+        <w:pStyle w:val="ListBullet"/>
+      </w:pPr>
+      <w:r>
+        <w:rPr>
+          <w:rFonts w:ascii="Calibri" w:hAnsi="Calibri"/>
+        </w:rPr>
+        <w:t>where the viewers are, by country, and their age range, from Studio’s audience reports;</w:t>
+      </w:r>
+    </w:p>
+    <w:p>
+      <w:pPr>
+        <w:pStyle w:val="ListBullet"/>
+      </w:pPr>
+      <w:r>
+        <w:rPr>
+          <w:rFonts w:ascii="Calibri" w:hAnsi="Calibri"/>
+        </w:rPr>
+        <w:t>two or three videos that show the kind of segment you would make; and</w:t>
+      </w:r>
+    </w:p>
+    <w:p>
+      <w:pPr>
+        <w:pStyle w:val="ListBullet"/>
+      </w:pPr>
+      <w:r>
+        <w:rPr>
+          <w:rFonts w:ascii="Calibri" w:hAnsi="Calibri"/>
+        </w:rPr>
+        <w:t>how to reach you, from the email address on the channel’s About section.</w:t>
+      </w:r>
+    </w:p>
     <w:p>
       <w:bookmarkStart w:id="112" w:name="toc111"/>
       <w:pPr>
@@ -19405,7 +19174,7 @@
         </w:rPr>
         <w:t xml:space="preserve"> “Affiliate link” in the same line. YouTube’s </w:t>
       </w:r>
-      <w:hyperlink r:id="rId87">
+      <w:hyperlink r:id="rId85">
         <w:r>
           <w:rPr>
             <w:rStyle w:val="Hyperlink"/>
@@ -19504,7 +19273,7 @@
         </w:rPr>
         <w:t xml:space="preserve">An </w:t>
       </w:r>
-      <w:hyperlink r:id="rId126">
+      <w:hyperlink r:id="rId123">
         <w:r>
           <w:rPr>
             <w:rStyle w:val="Hyperlink"/>
@@ -19520,7 +19289,7 @@
         </w:rPr>
         <w:t xml:space="preserve"> or </w:t>
       </w:r>
-      <w:hyperlink r:id="rId65">
+      <w:hyperlink r:id="rId64">
         <w:r>
           <w:rPr>
             <w:rStyle w:val="Hyperlink"/>
@@ -19572,7 +19341,7 @@
       </w:r>
     </w:p>
     <w:p>
-      <w:hyperlink r:id="rId127">
+      <w:hyperlink r:id="rId124">
         <w:r>
           <w:rPr>
             <w:rStyle w:val="Hyperlink"/>
@@ -19690,24 +19459,7 @@
           <w:rFonts w:ascii="Calibri" w:hAnsi="Calibri"/>
           <w:i/>
         </w:rPr>
-        <w:t xml:space="preserve">Sources: The Ali Abdaal case study is his own disclosed account, posted to his X (formerly Twitter) account </w:t>
-      </w:r>
-      <w:hyperlink r:id="rId128">
-        <w:r>
-          <w:rPr>
-            <w:rStyle w:val="Hyperlink"/>
-            <w:sz w:val="22"/>
-            <w:rFonts w:ascii="Calibri" w:hAnsi="Calibri"/>
-          </w:rPr>
-          <w:t xml:space="preserve">@AliAbdaal</w:t>
-        </w:r>
-      </w:hyperlink>
-      <w:r>
-        <w:rPr>
-          <w:rFonts w:ascii="Calibri" w:hAnsi="Calibri"/>
-          <w:i/>
-        </w:rPr>
-        <w:t xml:space="preserve">; this book could not fetch that post directly, so the figures are treated as the verification standard actually met — his own stated numbers, as indexed and quoted consistently by search results, not an independently audited record. Creator Partnerships eligibility is from </w:t>
+        <w:t xml:space="preserve">Sources: Creator Partnerships eligibility is from </w:t>
       </w:r>
       <w:hyperlink r:id="rId27">
         <w:r>
@@ -19743,7 +19495,7 @@
         </w:rPr>
         <w:t xml:space="preserve">. The paid promotion setting is from </w:t>
       </w:r>
-      <w:hyperlink r:id="rId92">
+      <w:hyperlink r:id="rId90">
         <w:r>
           <w:rPr>
             <w:rStyle w:val="Hyperlink"/>
@@ -19777,7 +19529,7 @@
         </w:rPr>
         <w:t xml:space="preserve">; cards and end screens from </w:t>
       </w:r>
-      <w:hyperlink r:id="rId126">
+      <w:hyperlink r:id="rId123">
         <w:r>
           <w:rPr>
             <w:rStyle w:val="Hyperlink"/>
@@ -19794,7 +19546,7 @@
         </w:rPr>
         <w:t xml:space="preserve"> and </w:t>
       </w:r>
-      <w:hyperlink r:id="rId65">
+      <w:hyperlink r:id="rId64">
         <w:r>
           <w:rPr>
             <w:rStyle w:val="Hyperlink"/>
@@ -19811,7 +19563,7 @@
         </w:rPr>
         <w:t xml:space="preserve">. Affiliate content under the Terms of Use is from </w:t>
       </w:r>
-      <w:hyperlink r:id="rId87">
+      <w:hyperlink r:id="rId85">
         <w:r>
           <w:rPr>
             <w:rStyle w:val="Hyperlink"/>
@@ -19845,7 +19597,7 @@
         </w:rPr>
         <w:t xml:space="preserve"> and its conditions from </w:t>
       </w:r>
-      <w:hyperlink r:id="rId127">
+      <w:hyperlink r:id="rId124">
         <w:r>
           <w:rPr>
             <w:rStyle w:val="Hyperlink"/>
@@ -19862,7 +19614,7 @@
         </w:rPr>
         <w:t xml:space="preserve">. US disclosure guidance is the FTC’s </w:t>
       </w:r>
-      <w:hyperlink r:id="rId101">
+      <w:hyperlink r:id="rId97">
         <w:r>
           <w:rPr>
             <w:rStyle w:val="Hyperlink"/>
@@ -19879,7 +19631,7 @@
         </w:rPr>
         <w:t xml:space="preserve"> and </w:t>
       </w:r>
-      <w:hyperlink r:id="rId102">
+      <w:hyperlink r:id="rId98">
         <w:r>
           <w:rPr>
             <w:rStyle w:val="Hyperlink"/>
@@ -19900,8 +19652,8 @@
     <w:p>
       <w:pPr>
         <w:sectPr>
-          <w:headerReference w:type="default" r:id="rId124"/>
-          <w:footerReference w:type="default" r:id="rId125"/>
+          <w:headerReference w:type="default" r:id="rId121"/>
+          <w:footerReference w:type="default" r:id="rId122"/>
           <w:pgSz w:w="10080" w:h="14400"/>
           <w:pgMar w:top="1008" w:right="1008" w:bottom="1008" w:left="1008" w:header="504" w:footer="504" w:gutter="0"/>
           <w:cols w:space="720"/>
@@ -20254,44 +20006,6 @@
         <w:t>No stream needs to be large. The goal is that losing any one of them is a bad month, not the end of the channel.</w:t>
       </w:r>
     </w:p>
-    <w:tbl>
-      <w:tblPr>
-        <w:tblW w:type="auto" w:w="0"/>
-        <w:tblLayout w:type="fixed"/>
-        <w:tblLook w:firstColumn="1" w:firstRow="1" w:lastColumn="0" w:lastRow="0" w:noHBand="0" w:noVBand="1" w:val="04A0"/>
-      </w:tblPr>
-      <w:tblGrid>
-        <w:gridCol w:w="8064"/>
-      </w:tblGrid>
-      <w:tr>
-        <w:tc>
-          <w:tcPr>
-            <w:tcW w:type="dxa" w:w="8064"/>
-            <w:tcW w:w="8063" w:type="dxa"/>
-            <w:shd w:val="clear" w:color="auto" w:fill="F3F1EA"/>
-          </w:tcPr>
-          <w:p>
-            <w:pPr>
-              <w:spacing w:after="40" w:before="40"/>
-            </w:pPr>
-            <w:r>
-              <w:rPr>
-                <w:rFonts w:ascii="Calibri" w:hAnsi="Calibri"/>
-                <w:sz w:val="22"/>
-              </w:rPr>
-            </w:r>
-            <w:r>
-              <w:rPr>
-                <w:rFonts w:ascii="Calibri" w:hAnsi="Calibri"/>
-                <w:sz w:val="22"/>
-              </w:rPr>
-              <w:t>Case study: Colin and Samir, whose channel covers the creator economy, have described their own income in interviews as roughly half to 60 percent brand deals, about 30 percent speaking, consulting, and creative work that never appears on the channel at all, and AdSense around 10 percent — a smaller share than many viewers would guess for two people who make YouTube videos for a living. AdSense only became a substantial stream for them in 2022, reaching $268,000 that year; for years before that it was a minor, inconsistent add-on to income built mostly from elsewhere. Spreading the income is not a hedge against a bad month. For a channel like theirs, it is most of the income.</w:t>
-            </w:r>
-          </w:p>
-        </w:tc>
-      </w:tr>
-    </w:tbl>
-    <w:p/>
     <w:p>
       <w:bookmarkStart w:id="123" w:name="toc122"/>
       <w:pPr>
@@ -20338,7 +20052,7 @@
                     <pic:cNvPicPr/>
                   </pic:nvPicPr>
                   <pic:blipFill>
-                    <a:blip r:embed="rId131"/>
+                    <a:blip r:embed="rId127"/>
                     <a:stretch>
                       <a:fillRect/>
                     </a:stretch>
@@ -20428,7 +20142,7 @@
       </w:r>
     </w:p>
     <w:p>
-      <w:hyperlink r:id="rId132">
+      <w:hyperlink r:id="rId128">
         <w:r>
           <w:rPr>
             <w:rStyle w:val="Hyperlink"/>
@@ -20453,7 +20167,7 @@
       </w:r>
     </w:p>
     <w:p>
-      <w:hyperlink r:id="rId133">
+      <w:hyperlink r:id="rId129">
         <w:r>
           <w:rPr>
             <w:rStyle w:val="Hyperlink"/>
@@ -20478,7 +20192,7 @@
       </w:r>
     </w:p>
     <w:p>
-      <w:hyperlink r:id="rId134">
+      <w:hyperlink r:id="rId130">
         <w:r>
           <w:rPr>
             <w:rStyle w:val="Hyperlink"/>
@@ -20503,7 +20217,7 @@
       </w:r>
     </w:p>
     <w:p>
-      <w:hyperlink r:id="rId135">
+      <w:hyperlink r:id="rId131">
         <w:r>
           <w:rPr>
             <w:rStyle w:val="Hyperlink"/>
@@ -20528,7 +20242,7 @@
       </w:r>
     </w:p>
     <w:p>
-      <w:hyperlink r:id="rId136">
+      <w:hyperlink r:id="rId132">
         <w:r>
           <w:rPr>
             <w:rStyle w:val="Hyperlink"/>
@@ -20848,24 +20562,7 @@
           <w:rFonts w:ascii="Calibri" w:hAnsi="Calibri"/>
           <w:i/>
         </w:rPr>
-        <w:t xml:space="preserve">Sources: The Colin and Samir income-mix figures are the pair’s own numbers, disclosed in public interviews on the creator economy, among them </w:t>
-      </w:r>
-      <w:hyperlink r:id="rId80">
-        <w:r>
-          <w:rPr>
-            <w:rStyle w:val="Hyperlink"/>
-            <w:sz w:val="22"/>
-            <w:rFonts w:ascii="Calibri" w:hAnsi="Calibri"/>
-          </w:rPr>
-          <w:t xml:space="preserve">a Digiday Q&amp;A with Samir Chaudry</w:t>
-        </w:r>
-      </w:hyperlink>
-      <w:r>
-        <w:rPr>
-          <w:rFonts w:ascii="Calibri" w:hAnsi="Calibri"/>
-          <w:i/>
-        </w:rPr>
-        <w:t xml:space="preserve">; this book has not independently audited them. They are also chapter 8's case study, cited again here (including the same $268,000/2022 figure) because they are one of the few creators who have put a full income breakdown on record, not because two chapters happened to land on the same number. That paid campaign views do not count is from </w:t>
+        <w:t xml:space="preserve">Sources: That paid campaign views do not count is from </w:t>
       </w:r>
       <w:hyperlink r:id="rId24">
         <w:r>
@@ -20918,7 +20615,7 @@
         </w:rPr>
         <w:t xml:space="preserve">. Other-platform lines in section IV come from the page linked on each line, opened in October 2026,; X’s page was read in the Internet Archive’s copy of 22 September 2026, because the live page refuses automated requests. Snapchat’s Spotlight Rewards end date is from </w:t>
       </w:r>
-      <w:hyperlink r:id="rId137">
+      <w:hyperlink r:id="rId133">
         <w:r>
           <w:rPr>
             <w:rStyle w:val="Hyperlink"/>
@@ -20939,8 +20636,8 @@
     <w:p>
       <w:pPr>
         <w:sectPr>
-          <w:headerReference w:type="default" r:id="rId129"/>
-          <w:footerReference w:type="default" r:id="rId130"/>
+          <w:headerReference w:type="default" r:id="rId125"/>
+          <w:footerReference w:type="default" r:id="rId126"/>
           <w:pgSz w:w="10080" w:h="14400"/>
           <w:pgMar w:top="1008" w:right="1008" w:bottom="1008" w:left="1008" w:header="504" w:footer="504" w:gutter="0"/>
           <w:cols w:space="720"/>
@@ -22680,7 +22377,7 @@
         </w:rPr>
         <w:t xml:space="preserve">Sources: This workbook is the author’s structure for the rest of this book. The bathroom-repair sheet and its money line are hypothetical illustrations, not a measured channel. The membership share is YouTube’s 70% after taxes and fees, from chapter 12. Affiliate disclosure follows chapter 13 and the FTC’s </w:t>
       </w:r>
-      <w:hyperlink r:id="rId101">
+      <w:hyperlink r:id="rId97">
         <w:r>
           <w:rPr>
             <w:rStyle w:val="Hyperlink"/>
@@ -22701,8 +22398,8 @@
     <w:p>
       <w:pPr>
         <w:sectPr>
-          <w:headerReference w:type="default" r:id="rId138"/>
-          <w:footerReference w:type="default" r:id="rId139"/>
+          <w:headerReference w:type="default" r:id="rId134"/>
+          <w:footerReference w:type="default" r:id="rId135"/>
           <w:pgSz w:w="10080" w:h="14400"/>
           <w:pgMar w:top="1008" w:right="1008" w:bottom="1008" w:left="1008" w:header="504" w:footer="504" w:gutter="0"/>
           <w:cols w:space="720"/>
@@ -22756,8 +22453,8 @@
     <w:p>
       <w:pPr>
         <w:sectPr>
-          <w:headerReference w:type="default" r:id="rId140"/>
-          <w:footerReference w:type="default" r:id="rId141"/>
+          <w:headerReference w:type="default" r:id="rId136"/>
+          <w:footerReference w:type="default" r:id="rId137"/>
           <w:pgSz w:w="10080" w:h="14400"/>
           <w:pgMar w:top="1008" w:right="1008" w:bottom="1008" w:left="1008" w:header="504" w:footer="504" w:gutter="0"/>
           <w:cols w:space="720"/>
@@ -23477,8 +23174,8 @@
     <w:p>
       <w:pPr>
         <w:sectPr>
-          <w:headerReference w:type="default" r:id="rId142"/>
-          <w:footerReference w:type="default" r:id="rId143"/>
+          <w:headerReference w:type="default" r:id="rId138"/>
+          <w:footerReference w:type="default" r:id="rId139"/>
           <w:pgSz w:w="10080" w:h="14400"/>
           <w:pgMar w:top="1008" w:right="1008" w:bottom="1008" w:left="1008" w:header="504" w:footer="504" w:gutter="0"/>
           <w:cols w:space="720"/>
@@ -23719,7 +23416,7 @@
         </w:rPr>
         <w:t xml:space="preserve">, </w:t>
       </w:r>
-      <w:hyperlink r:id="rId96">
+      <w:hyperlink r:id="rId94">
         <w:r>
           <w:rPr>
             <w:rStyle w:val="Hyperlink"/>
@@ -23751,7 +23448,7 @@
         </w:rPr>
         <w:t xml:space="preserve">, </w:t>
       </w:r>
-      <w:hyperlink r:id="rId126">
+      <w:hyperlink r:id="rId123">
         <w:r>
           <w:rPr>
             <w:rStyle w:val="Hyperlink"/>
@@ -23767,7 +23464,7 @@
         </w:rPr>
         <w:t xml:space="preserve">, </w:t>
       </w:r>
-      <w:hyperlink r:id="rId65">
+      <w:hyperlink r:id="rId64">
         <w:r>
           <w:rPr>
             <w:rStyle w:val="Hyperlink"/>
@@ -23785,7 +23482,7 @@
       </w:r>
     </w:p>
     <w:p>
-      <w:hyperlink r:id="rId49">
+      <w:hyperlink r:id="rId48">
         <w:r>
           <w:rPr>
             <w:rStyle w:val="Hyperlink"/>
@@ -23801,7 +23498,7 @@
         </w:rPr>
         <w:t xml:space="preserve">, </w:t>
       </w:r>
-      <w:hyperlink r:id="rId52">
+      <w:hyperlink r:id="rId51">
         <w:r>
           <w:rPr>
             <w:rStyle w:val="Hyperlink"/>
@@ -23817,7 +23514,7 @@
         </w:rPr>
         <w:t xml:space="preserve">, </w:t>
       </w:r>
-      <w:hyperlink r:id="rId41">
+      <w:hyperlink r:id="rId40">
         <w:r>
           <w:rPr>
             <w:rStyle w:val="Hyperlink"/>
@@ -23833,7 +23530,7 @@
         </w:rPr>
         <w:t xml:space="preserve">, </w:t>
       </w:r>
-      <w:hyperlink r:id="rId42">
+      <w:hyperlink r:id="rId41">
         <w:r>
           <w:rPr>
             <w:rStyle w:val="Hyperlink"/>
@@ -23857,7 +23554,7 @@
         </w:rPr>
         <w:t xml:space="preserve">Tools: </w:t>
       </w:r>
-      <w:hyperlink r:id="rId47">
+      <w:hyperlink r:id="rId46">
         <w:r>
           <w:rPr>
             <w:rStyle w:val="Hyperlink"/>
@@ -23873,7 +23570,7 @@
         </w:rPr>
         <w:t xml:space="preserve">, </w:t>
       </w:r>
-      <w:hyperlink r:id="rId59">
+      <w:hyperlink r:id="rId58">
         <w:r>
           <w:rPr>
             <w:rStyle w:val="Hyperlink"/>
@@ -23889,7 +23586,7 @@
         </w:rPr>
         <w:t xml:space="preserve">, </w:t>
       </w:r>
-      <w:hyperlink r:id="rId50">
+      <w:hyperlink r:id="rId49">
         <w:r>
           <w:rPr>
             <w:rStyle w:val="Hyperlink"/>
@@ -23905,7 +23602,7 @@
         </w:rPr>
         <w:t xml:space="preserve">, </w:t>
       </w:r>
-      <w:hyperlink r:id="rId51">
+      <w:hyperlink r:id="rId50">
         <w:r>
           <w:rPr>
             <w:rStyle w:val="Hyperlink"/>
@@ -23921,7 +23618,7 @@
         </w:rPr>
         <w:t xml:space="preserve">, </w:t>
       </w:r>
-      <w:hyperlink r:id="rId53">
+      <w:hyperlink r:id="rId52">
         <w:r>
           <w:rPr>
             <w:rStyle w:val="Hyperlink"/>
@@ -23937,7 +23634,7 @@
         </w:rPr>
         <w:t xml:space="preserve"> and </w:t>
       </w:r>
-      <w:hyperlink r:id="rId60">
+      <w:hyperlink r:id="rId59">
         <w:r>
           <w:rPr>
             <w:rStyle w:val="Hyperlink"/>
@@ -23953,7 +23650,7 @@
         </w:rPr>
         <w:t xml:space="preserve">, </w:t>
       </w:r>
-      <w:hyperlink r:id="rId54">
+      <w:hyperlink r:id="rId53">
         <w:r>
           <w:rPr>
             <w:rStyle w:val="Hyperlink"/>
@@ -23969,7 +23666,7 @@
         </w:rPr>
         <w:t xml:space="preserve">. AI examples: </w:t>
       </w:r>
-      <w:hyperlink r:id="rId55">
+      <w:hyperlink r:id="rId54">
         <w:r>
           <w:rPr>
             <w:rStyle w:val="Hyperlink"/>
@@ -23985,7 +23682,7 @@
         </w:rPr>
         <w:t xml:space="preserve">, </w:t>
       </w:r>
-      <w:hyperlink r:id="rId56">
+      <w:hyperlink r:id="rId55">
         <w:r>
           <w:rPr>
             <w:rStyle w:val="Hyperlink"/>
@@ -24001,7 +23698,7 @@
         </w:rPr>
         <w:t xml:space="preserve"> and </w:t>
       </w:r>
-      <w:hyperlink r:id="rId57">
+      <w:hyperlink r:id="rId56">
         <w:r>
           <w:rPr>
             <w:rStyle w:val="Hyperlink"/>
@@ -24035,7 +23732,7 @@
         </w:rPr>
         <w:t xml:space="preserve">, </w:t>
       </w:r>
-      <w:hyperlink r:id="rId107">
+      <w:hyperlink r:id="rId103">
         <w:r>
           <w:rPr>
             <w:rStyle w:val="Hyperlink"/>
@@ -24051,7 +23748,7 @@
         </w:rPr>
         <w:t xml:space="preserve">, </w:t>
       </w:r>
-      <w:hyperlink r:id="rId108">
+      <w:hyperlink r:id="rId104">
         <w:r>
           <w:rPr>
             <w:rStyle w:val="Hyperlink"/>
@@ -24067,7 +23764,7 @@
         </w:rPr>
         <w:t xml:space="preserve">, </w:t>
       </w:r>
-      <w:hyperlink r:id="rId63">
+      <w:hyperlink r:id="rId62">
         <w:r>
           <w:rPr>
             <w:rStyle w:val="Hyperlink"/>
@@ -24083,7 +23780,7 @@
         </w:rPr>
         <w:t xml:space="preserve">, </w:t>
       </w:r>
-      <w:hyperlink r:id="rId109">
+      <w:hyperlink r:id="rId105">
         <w:r>
           <w:rPr>
             <w:rStyle w:val="Hyperlink"/>
@@ -24099,7 +23796,7 @@
         </w:rPr>
         <w:t xml:space="preserve">, </w:t>
       </w:r>
-      <w:hyperlink r:id="rId43">
+      <w:hyperlink r:id="rId42">
         <w:r>
           <w:rPr>
             <w:rStyle w:val="Hyperlink"/>
@@ -24117,7 +23814,7 @@
       </w:r>
     </w:p>
     <w:p>
-      <w:hyperlink r:id="rId112">
+      <w:hyperlink r:id="rId108">
         <w:r>
           <w:rPr>
             <w:rStyle w:val="Hyperlink"/>
@@ -24133,7 +23830,7 @@
         </w:rPr>
         <w:t xml:space="preserve">, </w:t>
       </w:r>
-      <w:hyperlink r:id="rId113">
+      <w:hyperlink r:id="rId109">
         <w:r>
           <w:rPr>
             <w:rStyle w:val="Hyperlink"/>
@@ -24149,7 +23846,7 @@
         </w:rPr>
         <w:t xml:space="preserve">, </w:t>
       </w:r>
-      <w:hyperlink r:id="rId114">
+      <w:hyperlink r:id="rId110">
         <w:r>
           <w:rPr>
             <w:rStyle w:val="Hyperlink"/>
@@ -24165,7 +23862,7 @@
         </w:rPr>
         <w:t xml:space="preserve">, </w:t>
       </w:r>
-      <w:hyperlink r:id="rId115">
+      <w:hyperlink r:id="rId111">
         <w:r>
           <w:rPr>
             <w:rStyle w:val="Hyperlink"/>
@@ -24181,7 +23878,7 @@
         </w:rPr>
         <w:t xml:space="preserve">, </w:t>
       </w:r>
-      <w:hyperlink r:id="rId117">
+      <w:hyperlink r:id="rId113">
         <w:r>
           <w:rPr>
             <w:rStyle w:val="Hyperlink"/>
@@ -24197,7 +23894,7 @@
         </w:rPr>
         <w:t xml:space="preserve">, </w:t>
       </w:r>
-      <w:hyperlink r:id="rId118">
+      <w:hyperlink r:id="rId114">
         <w:r>
           <w:rPr>
             <w:rStyle w:val="Hyperlink"/>
@@ -24213,7 +23910,7 @@
         </w:rPr>
         <w:t xml:space="preserve">, </w:t>
       </w:r>
-      <w:hyperlink r:id="rId119">
+      <w:hyperlink r:id="rId115">
         <w:r>
           <w:rPr>
             <w:rStyle w:val="Hyperlink"/>
@@ -24229,7 +23926,7 @@
         </w:rPr>
         <w:t xml:space="preserve">, </w:t>
       </w:r>
-      <w:hyperlink r:id="rId120">
+      <w:hyperlink r:id="rId116">
         <w:r>
           <w:rPr>
             <w:rStyle w:val="Hyperlink"/>
@@ -24263,7 +23960,7 @@
         </w:rPr>
         <w:t xml:space="preserve">, </w:t>
       </w:r>
-      <w:hyperlink r:id="rId127">
+      <w:hyperlink r:id="rId124">
         <w:r>
           <w:rPr>
             <w:rStyle w:val="Hyperlink"/>
@@ -24297,7 +23994,7 @@
       </w:r>
     </w:p>
     <w:p>
-      <w:hyperlink r:id="rId146">
+      <w:hyperlink r:id="rId142">
         <w:r>
           <w:rPr>
             <w:rStyle w:val="Hyperlink"/>
@@ -24313,7 +24010,7 @@
         </w:rPr>
         <w:t xml:space="preserve"> and </w:t>
       </w:r>
-      <w:hyperlink r:id="rId147">
+      <w:hyperlink r:id="rId143">
         <w:r>
           <w:rPr>
             <w:rStyle w:val="Hyperlink"/>
@@ -24329,7 +24026,7 @@
         </w:rPr>
         <w:t xml:space="preserve">. </w:t>
       </w:r>
-      <w:hyperlink r:id="rId148">
+      <w:hyperlink r:id="rId144">
         <w:r>
           <w:rPr>
             <w:rStyle w:val="Hyperlink"/>
@@ -24347,7 +24044,7 @@
       </w:r>
     </w:p>
     <w:p>
-      <w:hyperlink r:id="rId101">
+      <w:hyperlink r:id="rId97">
         <w:r>
           <w:rPr>
             <w:rStyle w:val="Hyperlink"/>
@@ -24363,7 +24060,7 @@
         </w:rPr>
         <w:t xml:space="preserve"> and </w:t>
       </w:r>
-      <w:hyperlink r:id="rId102">
+      <w:hyperlink r:id="rId98">
         <w:r>
           <w:rPr>
             <w:rStyle w:val="Hyperlink"/>
@@ -24381,7 +24078,7 @@
       </w:r>
     </w:p>
     <w:p>
-      <w:hyperlink r:id="rId64">
+      <w:hyperlink r:id="rId63">
         <w:r>
           <w:rPr>
             <w:rStyle w:val="Hyperlink"/>
@@ -24397,7 +24094,7 @@
         </w:rPr>
         <w:t xml:space="preserve">. </w:t>
       </w:r>
-      <w:hyperlink r:id="rId72">
+      <w:hyperlink r:id="rId71">
         <w:r>
           <w:rPr>
             <w:rStyle w:val="Hyperlink"/>
@@ -24413,7 +24110,7 @@
         </w:rPr>
         <w:t xml:space="preserve">, </w:t>
       </w:r>
-      <w:hyperlink r:id="rId73">
+      <w:hyperlink r:id="rId72">
         <w:r>
           <w:rPr>
             <w:rStyle w:val="Hyperlink"/>
@@ -24429,7 +24126,7 @@
         </w:rPr>
         <w:t xml:space="preserve">, </w:t>
       </w:r>
-      <w:hyperlink r:id="rId74">
+      <w:hyperlink r:id="rId73">
         <w:r>
           <w:rPr>
             <w:rStyle w:val="Hyperlink"/>
@@ -24445,7 +24142,7 @@
         </w:rPr>
         <w:t xml:space="preserve">, </w:t>
       </w:r>
-      <w:hyperlink r:id="rId75">
+      <w:hyperlink r:id="rId74">
         <w:r>
           <w:rPr>
             <w:rStyle w:val="Hyperlink"/>
@@ -24463,7 +24160,7 @@
       </w:r>
     </w:p>
     <w:p>
-      <w:hyperlink r:id="rId85">
+      <w:hyperlink r:id="rId83">
         <w:r>
           <w:rPr>
             <w:rStyle w:val="Hyperlink"/>
@@ -24479,7 +24176,7 @@
         </w:rPr>
         <w:t xml:space="preserve">, </w:t>
       </w:r>
-      <w:hyperlink r:id="rId88">
+      <w:hyperlink r:id="rId86">
         <w:r>
           <w:rPr>
             <w:rStyle w:val="Hyperlink"/>
@@ -24495,7 +24192,7 @@
         </w:rPr>
         <w:t xml:space="preserve">, </w:t>
       </w:r>
-      <w:hyperlink r:id="rId91">
+      <w:hyperlink r:id="rId89">
         <w:r>
           <w:rPr>
             <w:rStyle w:val="Hyperlink"/>
@@ -24511,7 +24208,7 @@
         </w:rPr>
         <w:t xml:space="preserve">, </w:t>
       </w:r>
-      <w:hyperlink r:id="rId92">
+      <w:hyperlink r:id="rId90">
         <w:r>
           <w:rPr>
             <w:rStyle w:val="Hyperlink"/>
@@ -24527,7 +24224,7 @@
         </w:rPr>
         <w:t xml:space="preserve">, </w:t>
       </w:r>
-      <w:hyperlink r:id="rId58">
+      <w:hyperlink r:id="rId57">
         <w:r>
           <w:rPr>
             <w:rStyle w:val="Hyperlink"/>
@@ -24543,7 +24240,7 @@
         </w:rPr>
         <w:t xml:space="preserve">, </w:t>
       </w:r>
-      <w:hyperlink r:id="rId97">
+      <w:hyperlink r:id="rId95">
         <w:r>
           <w:rPr>
             <w:rStyle w:val="Hyperlink"/>
@@ -24559,7 +24256,7 @@
         </w:rPr>
         <w:t xml:space="preserve">, </w:t>
       </w:r>
-      <w:hyperlink r:id="rId79">
+      <w:hyperlink r:id="rId78">
         <w:r>
           <w:rPr>
             <w:rStyle w:val="Hyperlink"/>
@@ -24575,7 +24272,7 @@
         </w:rPr>
         <w:t xml:space="preserve">, </w:t>
       </w:r>
-      <w:hyperlink r:id="rId78">
+      <w:hyperlink r:id="rId77">
         <w:r>
           <w:rPr>
             <w:rStyle w:val="Hyperlink"/>
@@ -24591,7 +24288,7 @@
         </w:rPr>
         <w:t xml:space="preserve">, </w:t>
       </w:r>
-      <w:hyperlink r:id="rId87">
+      <w:hyperlink r:id="rId85">
         <w:r>
           <w:rPr>
             <w:rStyle w:val="Hyperlink"/>
@@ -24611,8 +24308,8 @@
     <w:p>
       <w:pPr>
         <w:sectPr>
-          <w:headerReference w:type="default" r:id="rId144"/>
-          <w:footerReference w:type="default" r:id="rId145"/>
+          <w:headerReference w:type="default" r:id="rId140"/>
+          <w:footerReference w:type="default" r:id="rId141"/>
           <w:pgSz w:w="10080" w:h="14400"/>
           <w:pgMar w:top="1008" w:right="1008" w:bottom="1008" w:left="1008" w:header="504" w:footer="504" w:gutter="0"/>
           <w:cols w:space="720"/>
@@ -25097,8 +24794,8 @@
       </w:r>
     </w:p>
     <w:sectPr>
-      <w:headerReference w:type="default" r:id="rId149"/>
-      <w:footerReference w:type="default" r:id="rId150"/>
+      <w:headerReference w:type="default" r:id="rId145"/>
+      <w:footerReference w:type="default" r:id="rId146"/>
       <w:pgSz w:w="10080" w:h="14400"/>
       <w:pgMar w:top="1008" w:right="1008" w:bottom="1008" w:left="1008" w:header="504" w:footer="504" w:gutter="0"/>
       <w:cols w:space="720"/>

</xml_diff>

<commit_message>
Workbook: fill set-up, week, and rights-log examples in section VIII
Co-Authored-By: Claude Sonnet 5.5 <noreply@anthropic.com>
Claude-Session: https://claude.ai/code/session_012trHMyb3cJDTwS99K5EPVy
</commit_message>
<xml_diff>
--- a/Your First YouTube Channel That Rocks/Your First YouTube Channel That Rocks.docx
+++ b/Your First YouTube Channel That Rocks/Your First YouTube Channel That Rocks.docx
@@ -22160,6 +22160,38 @@
           <w:rFonts w:ascii="Calibri" w:hAnsi="Calibri"/>
         </w:rPr>
         <w:t>A first money line, a year later, still hypothetical: Partner Program accepted in month ten. Ads and Premium on the month’s 40,000 long-form views at an invented RPM of $5: $200. Twelve members at $4.99: about $42 at YouTube’s 70% share, less any sales tax and app-store fees. One affiliate commission from a moisture meter used in the deep dive. No sponsor yet. Hours that month: thirty. Write all of it down. The point is not the size. It is that four streams now exist, and none of them is the whole channel.</w:t>
+      </w:r>
+    </w:p>
+    <w:p>
+      <w:r>
+        <w:rPr>
+          <w:rFonts w:ascii="Calibri" w:hAnsi="Calibri"/>
+        </w:rPr>
+        <w:t>The same channel on the other sheets, with invented numbers:</w:t>
+      </w:r>
+    </w:p>
+    <w:p>
+      <w:r>
+        <w:rPr>
+          <w:rFonts w:ascii="Calibri" w:hAnsi="Calibri"/>
+        </w:rPr>
+        <w:t>Set-up sheet, day 2: channel name, handle, and banner readable on a phone: yes. Description’s first lines say who it helps: no, rewrite them. 2-Step Verification: yes. Phone verification and advanced features: yes. Country: yes. Audience setting: not made for kids. Earn tab notification: yes.</w:t>
+      </w:r>
+    </w:p>
+    <w:p>
+      <w:r>
+        <w:rPr>
+          <w:rFonts w:ascii="Calibri" w:hAnsi="Calibri"/>
+        </w:rPr>
+        <w:t>Week sheet, week three: published the method video. Earn tab: 212 subscribers, 61 long-form watch hours, no Shorts. Deep dive: average view duration 3:50, 41% still watching at thirty seconds, end screen starts at 9:40. Views from your own videos: 38, nearly all under Suggested videos. Top search terms: “bathroom repair quote template,” “what should a repair quote include,” “price a bathroom repair.” Change next: the first thirty seconds of the deep dive, looking again on the fourteenth day. Not changing this week: titles and thumbnails.</w:t>
+      </w:r>
+    </w:p>
+    <w:p>
+      <w:r>
+        <w:rPr>
+          <w:rFonts w:ascii="Calibri" w:hAnsi="Calibri"/>
+        </w:rPr>
+        <w:t>Rights log, one video: a Pexels clip of a tiled wall, downloaded on the upload date, with a screenshot of the license page saved. Attribution: none required, so none in the description. Own voice and own screen recording. Altered or synthetic content: none, so the setting stays No. Paid promotion: no sponsor. Affiliate links: one moisture meter, with “This is an affiliate link. I earn a commission if you buy, at no extra cost to you.” on the line above it. Copyright claims: none.</w:t>
       </w:r>
     </w:p>
     <w:p>

</xml_diff>

<commit_message>
Workbook: fill set-up, week, and rights-log examples in section VIII (#72)
Claude-Session: https://claude.ai/code/session_012trHMyb3cJDTwS99K5EPVy

Co-authored-by: Claude <noreply@anthropic.com>
</commit_message>
<xml_diff>
--- a/Your First YouTube Channel That Rocks/Your First YouTube Channel That Rocks.docx
+++ b/Your First YouTube Channel That Rocks/Your First YouTube Channel That Rocks.docx
@@ -22160,6 +22160,38 @@
           <w:rFonts w:ascii="Calibri" w:hAnsi="Calibri"/>
         </w:rPr>
         <w:t>A first money line, a year later, still hypothetical: Partner Program accepted in month ten. Ads and Premium on the month’s 40,000 long-form views at an invented RPM of $5: $200. Twelve members at $4.99: about $42 at YouTube’s 70% share, less any sales tax and app-store fees. One affiliate commission from a moisture meter used in the deep dive. No sponsor yet. Hours that month: thirty. Write all of it down. The point is not the size. It is that four streams now exist, and none of them is the whole channel.</w:t>
+      </w:r>
+    </w:p>
+    <w:p>
+      <w:r>
+        <w:rPr>
+          <w:rFonts w:ascii="Calibri" w:hAnsi="Calibri"/>
+        </w:rPr>
+        <w:t>The same channel on the other sheets, with invented numbers:</w:t>
+      </w:r>
+    </w:p>
+    <w:p>
+      <w:r>
+        <w:rPr>
+          <w:rFonts w:ascii="Calibri" w:hAnsi="Calibri"/>
+        </w:rPr>
+        <w:t>Set-up sheet, day 2: channel name, handle, and banner readable on a phone: yes. Description’s first lines say who it helps: no, rewrite them. 2-Step Verification: yes. Phone verification and advanced features: yes. Country: yes. Audience setting: not made for kids. Earn tab notification: yes.</w:t>
+      </w:r>
+    </w:p>
+    <w:p>
+      <w:r>
+        <w:rPr>
+          <w:rFonts w:ascii="Calibri" w:hAnsi="Calibri"/>
+        </w:rPr>
+        <w:t>Week sheet, week three: published the method video. Earn tab: 212 subscribers, 61 long-form watch hours, no Shorts. Deep dive: average view duration 3:50, 41% still watching at thirty seconds, end screen starts at 9:40. Views from your own videos: 38, nearly all under Suggested videos. Top search terms: “bathroom repair quote template,” “what should a repair quote include,” “price a bathroom repair.” Change next: the first thirty seconds of the deep dive, looking again on the fourteenth day. Not changing this week: titles and thumbnails.</w:t>
+      </w:r>
+    </w:p>
+    <w:p>
+      <w:r>
+        <w:rPr>
+          <w:rFonts w:ascii="Calibri" w:hAnsi="Calibri"/>
+        </w:rPr>
+        <w:t>Rights log, one video: a Pexels clip of a tiled wall, downloaded on the upload date, with a screenshot of the license page saved. Attribution: none required, so none in the description. Own voice and own screen recording. Altered or synthetic content: none, so the setting stays No. Paid promotion: no sponsor. Affiliate links: one moisture meter, with “This is an affiliate link. I earn a commission if you buy, at no extra cost to you.” on the line above it. Copyright claims: none.</w:t>
       </w:r>
     </w:p>
     <w:p>

</xml_diff>